<commit_message>
T-0106 review: a symlinked or unlistable .crew is unreadable; scan on the one run
Codex round 2: a .crew that cannot be listed read as absent (BLOCK), and a
symlinked .crew was followed (FIX); both now make the candidate unreadable,
so --yes-widen refuses (tests red without the fix). The guide and migrate.md
now say to pass --scan-root on the one apply-migrate run (FIX): a later run
cannot see this repo's stripped opt-in. Troubleshooting guide rebuilt.

Claude-Session: https://claude.ai/code/session_01QLY3kk7DCXpucXGu3wSniW
</commit_message>
<xml_diff>
--- a/docs/guides/crew/crew-troubleshooting.docx
+++ b/docs/guides/crew/crew-troubleshooting.docx
@@ -15018,7 +15018,27 @@
       </w:pPr>
       <w:r>
         <w:rPr/>
-        <w:t xml:space="preserve">Finding the repos to list: when </w:t>
+        <w:t xml:space="preserve">Finding the repos to list: pass </w:t>
+      </w:r>
+      <w:r>
+        <w:rPr>
+          <w:rStyle w:val="SourceText"/>
+        </w:rPr>
+        <w:t>--scan-root &lt;dir&gt;</w:t>
+      </w:r>
+      <w:r>
+        <w:rPr/>
+        <w:t xml:space="preserve"> on the one </w:t>
+      </w:r>
+      <w:r>
+        <w:rPr>
+          <w:rStyle w:val="SourceText"/>
+        </w:rPr>
+        <w:t>apply-migrate</w:t>
+      </w:r>
+      <w:r>
+        <w:rPr/>
+        <w:t xml:space="preserve"> run that </w:t>
       </w:r>
       <w:r>
         <w:rPr>
@@ -15028,7 +15048,7 @@
       </w:r>
       <w:r>
         <w:rPr/>
-        <w:t xml:space="preserve"> reports a widening, run </w:t>
+        <w:t xml:space="preserve"> makes (</w:t>
       </w:r>
       <w:r>
         <w:rPr>
@@ -15038,7 +15058,7 @@
       </w:r>
       <w:r>
         <w:rPr/>
-        <w:t xml:space="preserve">. It looks under </w:t>
+        <w:t xml:space="preserve">); a later run cannot see this repo's own opt-in, which the first run removed. It looks under </w:t>
       </w:r>
       <w:r>
         <w:rPr>

</xml_diff>

<commit_message>
T-0502: review fixes - the hand migration names every block to replace, and the code map lists the new rule (#465)
crew README section 6 and the troubleshooting guide (rebuilt) say to
replace the counter line, the check()/run() function with the CUR_OUT /
cleanup / trap lines above it, and the count line: check() alone fails
under set -u on the first exit 77 in an older smoke.sh, which has no SKIP
counter. .crew/codemap/verification-harness.md records rule 19 (the
templates and their test); .claude/rules regenerated.

Claude-Session: https://claude.ai/code/session_01QLY3kk7DCXpucXGu3wSniW
</commit_message>
<xml_diff>
--- a/docs/guides/crew/crew-troubleshooting.docx
+++ b/docs/guides/crew/crew-troubleshooting.docx
@@ -6759,7 +6759,7 @@
       </w:r>
       <w:r>
         <w:rPr/>
-        <w:t xml:space="preserve">, not a failure. A repo set up earlier keeps its old runners: copy </w:t>
+        <w:t xml:space="preserve">, not a failure. A repo set up earlier keeps its old runners: replace the counter line, the </w:t>
       </w:r>
       <w:r>
         <w:rPr>
@@ -6769,7 +6769,57 @@
       </w:r>
       <w:r>
         <w:rPr/>
-        <w:t xml:space="preserve"> from the template </w:t>
+        <w:t xml:space="preserve"> / </w:t>
+      </w:r>
+      <w:r>
+        <w:rPr>
+          <w:rStyle w:val="SourceText"/>
+        </w:rPr>
+        <w:t>run()</w:t>
+      </w:r>
+      <w:r>
+        <w:rPr/>
+        <w:t xml:space="preserve"> function with the </w:t>
+      </w:r>
+      <w:r>
+        <w:rPr>
+          <w:rStyle w:val="SourceText"/>
+        </w:rPr>
+        <w:t>CUR_OUT</w:t>
+      </w:r>
+      <w:r>
+        <w:rPr/>
+        <w:t xml:space="preserve"> / </w:t>
+      </w:r>
+      <w:r>
+        <w:rPr>
+          <w:rStyle w:val="SourceText"/>
+        </w:rPr>
+        <w:t>cleanup</w:t>
+      </w:r>
+      <w:r>
+        <w:rPr/>
+        <w:t xml:space="preserve"> / </w:t>
+      </w:r>
+      <w:r>
+        <w:rPr>
+          <w:rStyle w:val="SourceText"/>
+        </w:rPr>
+        <w:t>trap</w:t>
+      </w:r>
+      <w:r>
+        <w:rPr/>
+        <w:t xml:space="preserve"> lines above it, and the final count line from the templates. Copying </w:t>
+      </w:r>
+      <w:r>
+        <w:rPr>
+          <w:rStyle w:val="SourceText"/>
+        </w:rPr>
+        <w:t>check()</w:t>
+      </w:r>
+      <w:r>
+        <w:rPr/>
+        <w:t xml:space="preserve"> alone breaks the old </w:t>
       </w:r>
       <w:r>
         <w:rPr>
@@ -6779,27 +6829,27 @@
       </w:r>
       <w:r>
         <w:rPr/>
-        <w:t xml:space="preserve"> and </w:t>
-      </w:r>
-      <w:r>
-        <w:rPr>
-          <w:rStyle w:val="SourceText"/>
-        </w:rPr>
-        <w:t>run()</w:t>
-      </w:r>
-      <w:r>
-        <w:rPr/>
-        <w:t xml:space="preserve"> from the template </w:t>
-      </w:r>
-      <w:r>
-        <w:rPr>
-          <w:rStyle w:val="SourceText"/>
-        </w:rPr>
-        <w:t>run-all.sh</w:t>
-      </w:r>
-      <w:r>
-        <w:rPr/>
-        <w:t xml:space="preserve"> by hand. </w:t>
+        <w:t xml:space="preserve"> on the first exit 77 (</w:t>
+      </w:r>
+      <w:r>
+        <w:rPr>
+          <w:rStyle w:val="SourceText"/>
+        </w:rPr>
+        <w:t>SKIP</w:t>
+      </w:r>
+      <w:r>
+        <w:rPr/>
+        <w:t xml:space="preserve"> is unset under </w:t>
+      </w:r>
+      <w:r>
+        <w:rPr>
+          <w:rStyle w:val="SourceText"/>
+        </w:rPr>
+        <w:t>set -u</w:t>
+      </w:r>
+      <w:r>
+        <w:rPr/>
+        <w:t xml:space="preserve">). </w:t>
       </w:r>
     </w:p>
     <w:p>

</xml_diff>

<commit_message>
L-0665 (PR #473): promote-gate reads the newest PROMOTIONS.md row for an environment and sha, not the first
Both flavours returned on the first row matching the upstream and the sha,
so a failure followed by a fixed re-run stayed blocked and a pass followed
by a later failure still admitted the deploy. passed() / Test-Promoted now
keep the last matching row's verdict; a revoked pass blocks with "the newest
row is not all-pass", no row blocks as before.

test_promote_gate_rows.py: one table over row sequences on both real gates
(ps1 via pwsh 7 on Linux); four mutations (first-match put back, each
flavour, each direction), all red. L-0647's real-gate tests follow: the
forged-row case meets the revoked-pass message, and a pass recorded after
record's not-run row admits. Docs (promote.md no net growth), troubleshooting
guide rebuilt, plan.md; BUDGETS re-measured.

Claude-Session: https://claude.ai/code/session_01QLY3kk7DCXpucXGu3wSniW
</commit_message>
<xml_diff>
--- a/docs/guides/crew/crew-troubleshooting.docx
+++ b/docs/guides/crew/crew-troubleshooting.docx
@@ -7244,6 +7244,84 @@
       <w:r>
         <w:rPr/>
         <w:t xml:space="preserve">, or enter the worktree first. A dirty main checkout no longer blocks a clean worktree. </w:t>
+      </w:r>
+    </w:p>
+    <w:p>
+      <w:pPr>
+        <w:pStyle w:val="BodyText"/>
+        <w:numPr>
+          <w:ilvl w:val="0"/>
+          <w:numId w:val="18"/>
+        </w:numPr>
+        <w:tabs>
+          <w:tab w:val="clear" w:pos="1134"/>
+          <w:tab w:val="left" w:pos="829" w:leader="none"/>
+        </w:tabs>
+        <w:bidi w:val="0"/>
+        <w:spacing w:before="120" w:after="0"/>
+        <w:ind w:hanging="283" w:left="829"/>
+        <w:jc w:val="left"/>
+        <w:rPr/>
+      </w:pPr>
+      <w:r>
+        <w:rPr>
+          <w:rStyle w:val="Strong"/>
+        </w:rPr>
+        <w:t>"has rows for sha X ..., but the newest row is not all-pass"</w:t>
+      </w:r>
+      <w:r>
+        <w:rPr/>
+        <w:t xml:space="preserve"> (L-0665): the newest </w:t>
+      </w:r>
+      <w:r>
+        <w:rPr>
+          <w:rStyle w:val="SourceText"/>
+        </w:rPr>
+        <w:t>.work/PROMOTIONS.md</w:t>
+      </w:r>
+      <w:r>
+        <w:rPr/>
+        <w:t xml:space="preserve"> row for that environment and sha is a failure, a </w:t>
+      </w:r>
+      <w:r>
+        <w:rPr>
+          <w:rStyle w:val="SourceText"/>
+        </w:rPr>
+        <w:t>not-run</w:t>
+      </w:r>
+      <w:r>
+        <w:rPr/>
+        <w:t xml:space="preserve"> row from </w:t>
+      </w:r>
+      <w:r>
+        <w:rPr>
+          <w:rStyle w:val="SourceText"/>
+        </w:rPr>
+        <w:t>crew_ghdeploy.py record</w:t>
+      </w:r>
+      <w:r>
+        <w:rPr/>
+        <w:t xml:space="preserve">, or anything but three </w:t>
+      </w:r>
+      <w:r>
+        <w:rPr>
+          <w:rStyle w:val="SourceText"/>
+        </w:rPr>
+        <w:t>pass</w:t>
+      </w:r>
+      <w:r>
+        <w:rPr/>
+        <w:t xml:space="preserve"> cells; an older pass no longer counts. Re-run </w:t>
+      </w:r>
+      <w:r>
+        <w:rPr>
+          <w:rStyle w:val="SourceText"/>
+        </w:rPr>
+        <w:t>/crew:promote &lt;upstream&gt;</w:t>
+      </w:r>
+      <w:r>
+        <w:rPr/>
+        <w:t xml:space="preserve"> for that sha and let it append its row. </w:t>
       </w:r>
     </w:p>
     <w:p>

</xml_diff>

<commit_message>
crew: T-0032 troubleshooting guide rebuilt (HTML, DOCX, PDF) for the cross-session message entry (#434)
Built with docs/guides/crew/src/build.py --guide troubleshooting (LibreOffice 24.2.7.2).
test_crew_bridge.py's channel fixture now writes a JSON log entry, the shape
T-0030's log.jsonl has.

Claude-Session: https://claude.ai/code/session_01QLY3kk7DCXpucXGu3wSniW
</commit_message>
<xml_diff>
--- a/docs/guides/crew/crew-troubleshooting.docx
+++ b/docs/guides/crew/crew-troubleshooting.docx
@@ -3626,7 +3626,7 @@
       </w:r>
       <w:r>
         <w:rPr/>
-        <w:t xml:space="preserve"> table row) or a line admitting the review fell short ("skipped", "truncated", "could not review") is still INCOMPLETE </w:t>
+        <w:t xml:space="preserve"> table row) or a line matching the shortfall wording list ("skipped", "truncated", "could not review") is still INCOMPLETE </w:t>
       </w:r>
       <w:r>
         <w:rPr>
@@ -3636,7 +3636,7 @@
       </w:r>
       <w:r>
         <w:rPr/>
-        <w:t xml:space="preserve">. </w:t>
+        <w:t xml:space="preserve">. That list cannot catch every admission: one it misses ("I only inspected one of the nine files") is ignored as prose and the round stays FINDINGS, so read the ignored lines. </w:t>
       </w:r>
       <w:r>
         <w:rPr>
@@ -8810,6 +8810,64 @@
         <w:rPr>
           <w:rStyle w:val="Strong"/>
         </w:rPr>
+        <w:t>An older crew wrote the note's id lowercased.</w:t>
+      </w:r>
+      <w:r>
+        <w:rPr/>
+        <w:t xml:space="preserve"> </w:t>
+      </w:r>
+      <w:r>
+        <w:rPr>
+          <w:rStyle w:val="SourceText"/>
+        </w:rPr>
+        <w:t>obsidian: could not update: T-0042 on Board.md belongs to another repo (https://example.invalid/team/app, per T-0042.md), not this one (https://example.invalid/Team/App): give this repo its own obsidian.boardDir; the note may carry this repo's id as an older crew wrote it (lowercased): if the card is this repo's, change the line to 'repo-id: https://example.invalid/Team/App'</w:t>
+      </w:r>
+      <w:r>
+        <w:rPr/>
+        <w:t xml:space="preserve"> </w:t>
+      </w:r>
+      <w:r>
+        <w:rPr>
+          <w:rStyle w:val="Strong"/>
+        </w:rPr>
+        <w:t>Fix:</w:t>
+      </w:r>
+      <w:r>
+        <w:rPr/>
+        <w:t xml:space="preserve"> since T-0071 an origin keeps the case of its user and path. If the card is yours, change the note's </w:t>
+      </w:r>
+      <w:r>
+        <w:rPr>
+          <w:rStyle w:val="SourceText"/>
+        </w:rPr>
+        <w:t>repo-id:</w:t>
+      </w:r>
+      <w:r>
+        <w:rPr/>
+        <w:t xml:space="preserve"> line to the id it names. </w:t>
+      </w:r>
+    </w:p>
+    <w:p>
+      <w:pPr>
+        <w:pStyle w:val="BodyText"/>
+        <w:numPr>
+          <w:ilvl w:val="1"/>
+          <w:numId w:val="21"/>
+        </w:numPr>
+        <w:tabs>
+          <w:tab w:val="clear" w:pos="1134"/>
+          <w:tab w:val="left" w:pos="1538" w:leader="none"/>
+        </w:tabs>
+        <w:bidi w:val="0"/>
+        <w:spacing w:before="120" w:after="0"/>
+        <w:ind w:hanging="283" w:left="1538"/>
+        <w:jc w:val="left"/>
+        <w:rPr/>
+      </w:pPr>
+      <w:r>
+        <w:rPr>
+          <w:rStyle w:val="Strong"/>
+        </w:rPr>
         <w:t>Nobody can tell who owns it.</w:t>
       </w:r>
       <w:r>
@@ -9506,8 +9564,902 @@
         <w:jc w:val="left"/>
         <w:rPr/>
       </w:pPr>
-      <w:bookmarkStart w:id="13" w:name="turning-things-off"/>
+      <w:bookmarkStart w:id="13" w:name="graph-refresh-refused-secrets-denylisted"/>
       <w:bookmarkEnd w:id="13"/>
+      <w:r>
+        <w:rPr/>
+        <w:t>Graph Refresh Refused: Secrets-Denylisted Path</w:t>
+      </w:r>
+    </w:p>
+    <w:p>
+      <w:pPr>
+        <w:pStyle w:val="BodyText"/>
+        <w:bidi w:val="0"/>
+        <w:jc w:val="left"/>
+        <w:rPr/>
+      </w:pPr>
+      <w:r>
+        <w:rPr/>
+        <w:t xml:space="preserve">graphify reads every file its ignore rules do not exclude and records the symbols it finds in </w:t>
+      </w:r>
+      <w:r>
+        <w:rPr>
+          <w:rStyle w:val="SourceText"/>
+        </w:rPr>
+        <w:t>graph.json</w:t>
+      </w:r>
+      <w:r>
+        <w:rPr/>
+        <w:t xml:space="preserve">. For a file git tracks, </w:t>
+      </w:r>
+      <w:r>
+        <w:rPr>
+          <w:rStyle w:val="SourceText"/>
+        </w:rPr>
+        <w:t>.gitignore</w:t>
+      </w:r>
+      <w:r>
+        <w:rPr/>
+        <w:t xml:space="preserve"> does not stop it: only </w:t>
+      </w:r>
+      <w:r>
+        <w:rPr>
+          <w:rStyle w:val="SourceText"/>
+        </w:rPr>
+        <w:t>.graphifyignore</w:t>
+      </w:r>
+      <w:r>
+        <w:rPr/>
+        <w:t xml:space="preserve"> does. So crew checks, before it names or runs a graph build, that the root </w:t>
+      </w:r>
+      <w:r>
+        <w:rPr>
+          <w:rStyle w:val="SourceText"/>
+        </w:rPr>
+        <w:t>.graphifyignore</w:t>
+      </w:r>
+      <w:r>
+        <w:rPr/>
+        <w:t xml:space="preserve"> excludes every file the secrets denylist matches.</w:t>
+      </w:r>
+    </w:p>
+    <w:p>
+      <w:pPr>
+        <w:pStyle w:val="BodyText"/>
+        <w:numPr>
+          <w:ilvl w:val="0"/>
+          <w:numId w:val="23"/>
+        </w:numPr>
+        <w:tabs>
+          <w:tab w:val="clear" w:pos="1134"/>
+          <w:tab w:val="left" w:pos="829" w:leader="none"/>
+        </w:tabs>
+        <w:bidi w:val="0"/>
+        <w:ind w:hanging="283" w:left="829"/>
+        <w:jc w:val="left"/>
+        <w:rPr/>
+      </w:pPr>
+      <w:r>
+        <w:rPr>
+          <w:rStyle w:val="Strong"/>
+        </w:rPr>
+        <w:t xml:space="preserve">Symptom: </w:t>
+      </w:r>
+      <w:r>
+        <w:rPr>
+          <w:rStyle w:val="SourceText"/>
+        </w:rPr>
+        <w:t>refresh-check</w:t>
+      </w:r>
+      <w:r>
+        <w:rPr>
+          <w:rStyle w:val="Strong"/>
+        </w:rPr>
+        <w:t xml:space="preserve"> prints </w:t>
+      </w:r>
+      <w:r>
+        <w:rPr>
+          <w:rStyle w:val="SourceText"/>
+        </w:rPr>
+        <w:t>graph graphify-out: unknown - graphify would read N secrets-denylisted path(s) .graphifyignore does not exclude: ...; stop - a refresh cannot settle this</w:t>
+      </w:r>
+      <w:r>
+        <w:rPr>
+          <w:rStyle w:val="Strong"/>
+        </w:rPr>
+        <w:t>,</w:t>
+      </w:r>
+      <w:r>
+        <w:rPr/>
+        <w:t xml:space="preserve"> or </w:t>
+      </w:r>
+      <w:r>
+        <w:rPr>
+          <w:rStyle w:val="SourceText"/>
+        </w:rPr>
+        <w:t>/crew:status</w:t>
+      </w:r>
+      <w:r>
+        <w:rPr/>
+        <w:t xml:space="preserve"> prints </w:t>
+      </w:r>
+      <w:r>
+        <w:rPr>
+          <w:rStyle w:val="SourceText"/>
+        </w:rPr>
+        <w:t>graph-ignore UNCOVERED</w:t>
+      </w:r>
+      <w:r>
+        <w:rPr/>
+        <w:t xml:space="preserve">. </w:t>
+      </w:r>
+      <w:r>
+        <w:rPr>
+          <w:rStyle w:val="Strong"/>
+        </w:rPr>
+        <w:t>Check:</w:t>
+      </w:r>
+      <w:r>
+        <w:rPr/>
+        <w:t xml:space="preserve"> which files, and from which source. </w:t>
+      </w:r>
+    </w:p>
+    <w:p>
+      <w:pPr>
+        <w:pStyle w:val="PreformattedText"/>
+        <w:bidi w:val="0"/>
+        <w:jc w:val="left"/>
+        <w:rPr/>
+      </w:pPr>
+      <w:r>
+        <w:rPr>
+          <w:rStyle w:val="SourceText"/>
+        </w:rPr>
+        <w:t>python3 "&lt;crew&gt;/hooks/scripts/crew_graph_ignore.py" --root . --check --json</w:t>
+      </w:r>
+    </w:p>
+    <w:p>
+      <w:pPr>
+        <w:pStyle w:val="BodyText"/>
+        <w:bidi w:val="0"/>
+        <w:jc w:val="left"/>
+        <w:rPr/>
+      </w:pPr>
+      <w:r>
+        <w:rPr/>
+        <w:t>The denylist is the built-in patterns (</w:t>
+      </w:r>
+      <w:r>
+        <w:rPr>
+          <w:rStyle w:val="SourceText"/>
+        </w:rPr>
+        <w:t>.env</w:t>
+      </w:r>
+      <w:r>
+        <w:rPr/>
+        <w:t xml:space="preserve">, </w:t>
+      </w:r>
+      <w:r>
+        <w:rPr>
+          <w:rStyle w:val="SourceText"/>
+        </w:rPr>
+        <w:t>.env.*</w:t>
+      </w:r>
+      <w:r>
+        <w:rPr/>
+        <w:t xml:space="preserve"> but not </w:t>
+      </w:r>
+      <w:r>
+        <w:rPr>
+          <w:rStyle w:val="SourceText"/>
+        </w:rPr>
+        <w:t>.env.example</w:t>
+      </w:r>
+      <w:r>
+        <w:rPr/>
+        <w:t xml:space="preserve">, </w:t>
+      </w:r>
+      <w:r>
+        <w:rPr>
+          <w:rStyle w:val="SourceText"/>
+        </w:rPr>
+        <w:t>*.pem</w:t>
+      </w:r>
+      <w:r>
+        <w:rPr/>
+        <w:t xml:space="preserve">, </w:t>
+      </w:r>
+      <w:r>
+        <w:rPr>
+          <w:rStyle w:val="SourceText"/>
+        </w:rPr>
+        <w:t>*.key</w:t>
+      </w:r>
+      <w:r>
+        <w:rPr/>
+        <w:t xml:space="preserve">, </w:t>
+      </w:r>
+      <w:r>
+        <w:rPr>
+          <w:rStyle w:val="SourceText"/>
+        </w:rPr>
+        <w:t>*.p12</w:t>
+      </w:r>
+      <w:r>
+        <w:rPr/>
+        <w:t xml:space="preserve">, </w:t>
+      </w:r>
+      <w:r>
+        <w:rPr>
+          <w:rStyle w:val="SourceText"/>
+        </w:rPr>
+        <w:t>*.pfx</w:t>
+      </w:r>
+      <w:r>
+        <w:rPr/>
+        <w:t xml:space="preserve">, </w:t>
+      </w:r>
+      <w:r>
+        <w:rPr>
+          <w:rStyle w:val="SourceText"/>
+        </w:rPr>
+        <w:t>id_rsa*</w:t>
+      </w:r>
+      <w:r>
+        <w:rPr/>
+        <w:t xml:space="preserve">, </w:t>
+      </w:r>
+      <w:r>
+        <w:rPr>
+          <w:rStyle w:val="SourceText"/>
+        </w:rPr>
+        <w:t>id_ed25519*</w:t>
+      </w:r>
+      <w:r>
+        <w:rPr/>
+        <w:t xml:space="preserve">), </w:t>
+      </w:r>
+      <w:r>
+        <w:rPr>
+          <w:rStyle w:val="SourceText"/>
+        </w:rPr>
+        <w:t>.claude/secrets-denylist</w:t>
+      </w:r>
+      <w:r>
+        <w:rPr/>
+        <w:t xml:space="preserve"> if it exists, and every in-repo </w:t>
+      </w:r>
+      <w:r>
+        <w:rPr>
+          <w:rStyle w:val="SourceText"/>
+        </w:rPr>
+        <w:t>Read(...)</w:t>
+      </w:r>
+      <w:r>
+        <w:rPr/>
+        <w:t xml:space="preserve"> rule in </w:t>
+      </w:r>
+      <w:r>
+        <w:rPr>
+          <w:rStyle w:val="SourceText"/>
+        </w:rPr>
+        <w:t>permissions.deny</w:t>
+      </w:r>
+      <w:r>
+        <w:rPr/>
+        <w:t xml:space="preserve"> of </w:t>
+      </w:r>
+      <w:r>
+        <w:rPr>
+          <w:rStyle w:val="SourceText"/>
+        </w:rPr>
+        <w:t>.claude/settings.json</w:t>
+      </w:r>
+      <w:r>
+        <w:rPr/>
+        <w:t xml:space="preserve"> and </w:t>
+      </w:r>
+      <w:r>
+        <w:rPr>
+          <w:rStyle w:val="SourceText"/>
+        </w:rPr>
+        <w:t>.claude/settings.local.json</w:t>
+      </w:r>
+      <w:r>
+        <w:rPr/>
+        <w:t xml:space="preserve">. </w:t>
+      </w:r>
+      <w:r>
+        <w:rPr>
+          <w:rStyle w:val="SourceText"/>
+        </w:rPr>
+        <w:t>sources</w:t>
+      </w:r>
+      <w:r>
+        <w:rPr/>
+        <w:t xml:space="preserve"> in the JSON names which ones were read. </w:t>
+      </w:r>
+      <w:r>
+        <w:rPr>
+          <w:rStyle w:val="Strong"/>
+        </w:rPr>
+        <w:t>Fix:</w:t>
+      </w:r>
+      <w:r>
+        <w:rPr/>
+        <w:t xml:space="preserve"> add the missing patterns, then check again.</w:t>
+      </w:r>
+    </w:p>
+    <w:p>
+      <w:pPr>
+        <w:pStyle w:val="PreformattedText"/>
+        <w:bidi w:val="0"/>
+        <w:jc w:val="left"/>
+        <w:rPr/>
+      </w:pPr>
+      <w:r>
+        <w:rPr>
+          <w:rStyle w:val="SourceText"/>
+        </w:rPr>
+        <w:t>python3 "&lt;crew&gt;/hooks/scripts/crew_graph_ignore.py" --root . --write</w:t>
+      </w:r>
+    </w:p>
+    <w:p>
+      <w:pPr>
+        <w:pStyle w:val="BodyText"/>
+        <w:bidi w:val="0"/>
+        <w:jc w:val="left"/>
+        <w:rPr/>
+      </w:pPr>
+      <w:r>
+        <w:rPr/>
+        <w:t xml:space="preserve">It appends the missing patterns, then any flagged path they still miss (the denylist ignores case, </w:t>
+      </w:r>
+      <w:r>
+        <w:rPr>
+          <w:rStyle w:val="SourceText"/>
+        </w:rPr>
+        <w:t>.graphifyignore</w:t>
+      </w:r>
+      <w:r>
+        <w:rPr/>
+        <w:t xml:space="preserve"> does not, so </w:t>
+      </w:r>
+      <w:r>
+        <w:rPr>
+          <w:rStyle w:val="SourceText"/>
+        </w:rPr>
+        <w:t>.ENV</w:t>
+      </w:r>
+      <w:r>
+        <w:rPr/>
+        <w:t xml:space="preserve"> gets </w:t>
+      </w:r>
+      <w:r>
+        <w:rPr>
+          <w:rStyle w:val="SourceText"/>
+        </w:rPr>
+        <w:t>/.ENV</w:t>
+      </w:r>
+      <w:r>
+        <w:rPr/>
+        <w:t xml:space="preserve">), under one marked block, and leaves every existing line as it was. Commit </w:t>
+      </w:r>
+      <w:r>
+        <w:rPr>
+          <w:rStyle w:val="SourceText"/>
+        </w:rPr>
+        <w:t>.graphifyignore</w:t>
+      </w:r>
+      <w:r>
+        <w:rPr/>
+        <w:t xml:space="preserve">, then re-run the refresh check. If it prints </w:t>
+      </w:r>
+      <w:r>
+        <w:rPr>
+          <w:rStyle w:val="SourceText"/>
+        </w:rPr>
+        <w:t>line N (`!pattern`) re-includes denylisted &lt;path&gt;; remove that line or accept the exposure</w:t>
+      </w:r>
+      <w:r>
+        <w:rPr/>
+        <w:t xml:space="preserve"> and exits 1, your own </w:t>
+      </w:r>
+      <w:r>
+        <w:rPr>
+          <w:rStyle w:val="SourceText"/>
+        </w:rPr>
+        <w:t>!</w:t>
+      </w:r>
+      <w:r>
+        <w:rPr/>
+        <w:t xml:space="preserve"> line is the reason: </w:t>
+      </w:r>
+      <w:r>
+        <w:rPr>
+          <w:rStyle w:val="SourceText"/>
+        </w:rPr>
+        <w:t>--write</w:t>
+      </w:r>
+      <w:r>
+        <w:rPr/>
+        <w:t xml:space="preserve"> never overrides it. Delete the line, or keep it and accept that graphify reads that file. A path that is not one line of plain text (a name holding a line break or other control character) is never written either; it stays named, escaped, by </w:t>
+      </w:r>
+      <w:r>
+        <w:rPr>
+          <w:rStyle w:val="SourceText"/>
+        </w:rPr>
+        <w:t>--check</w:t>
+      </w:r>
+      <w:r>
+        <w:rPr/>
+        <w:t>: rename the file or exclude it by hand.</w:t>
+      </w:r>
+    </w:p>
+    <w:p>
+      <w:pPr>
+        <w:pStyle w:val="BodyText"/>
+        <w:numPr>
+          <w:ilvl w:val="0"/>
+          <w:numId w:val="24"/>
+        </w:numPr>
+        <w:tabs>
+          <w:tab w:val="clear" w:pos="1134"/>
+          <w:tab w:val="left" w:pos="829" w:leader="none"/>
+        </w:tabs>
+        <w:bidi w:val="0"/>
+        <w:ind w:hanging="283" w:left="829"/>
+        <w:jc w:val="left"/>
+        <w:rPr/>
+      </w:pPr>
+      <w:r>
+        <w:rPr>
+          <w:rStyle w:val="Strong"/>
+        </w:rPr>
+        <w:t xml:space="preserve">Symptom: </w:t>
+      </w:r>
+      <w:r>
+        <w:rPr>
+          <w:rStyle w:val="SourceText"/>
+        </w:rPr>
+        <w:t>denylist coverage unknown: &lt;reason&gt;</w:t>
+      </w:r>
+      <w:r>
+        <w:rPr/>
+        <w:t xml:space="preserve"> (the refresh check) or </w:t>
+      </w:r>
+      <w:r>
+        <w:rPr>
+          <w:rStyle w:val="SourceText"/>
+        </w:rPr>
+        <w:t>graph-ignore unknown</w:t>
+      </w:r>
+      <w:r>
+        <w:rPr/>
+        <w:t xml:space="preserve"> (</w:t>
+      </w:r>
+      <w:r>
+        <w:rPr>
+          <w:rStyle w:val="SourceText"/>
+        </w:rPr>
+        <w:t>/crew:status</w:t>
+      </w:r>
+      <w:r>
+        <w:rPr/>
+        <w:t xml:space="preserve">). </w:t>
+      </w:r>
+      <w:r>
+        <w:rPr>
+          <w:rStyle w:val="Strong"/>
+        </w:rPr>
+        <w:t>Check:</w:t>
+      </w:r>
+      <w:r>
+        <w:rPr/>
+        <w:t xml:space="preserve"> the reason names it: git missing, a settings file that does not parse, an unreadable </w:t>
+      </w:r>
+      <w:r>
+        <w:rPr>
+          <w:rStyle w:val="SourceText"/>
+        </w:rPr>
+        <w:t>.claude/secrets-denylist</w:t>
+      </w:r>
+      <w:r>
+        <w:rPr/>
+        <w:t xml:space="preserve"> or </w:t>
+      </w:r>
+      <w:r>
+        <w:rPr>
+          <w:rStyle w:val="SourceText"/>
+        </w:rPr>
+        <w:t>.graphifyignore</w:t>
+      </w:r>
+      <w:r>
+        <w:rPr/>
+        <w:t xml:space="preserve">, a nested </w:t>
+      </w:r>
+      <w:r>
+        <w:rPr>
+          <w:rStyle w:val="SourceText"/>
+        </w:rPr>
+        <w:t>.graphifyignore</w:t>
+      </w:r>
+      <w:r>
+        <w:rPr/>
+        <w:t xml:space="preserve"> (only the root one is evaluated, and a nested one could re-include a file with </w:t>
+      </w:r>
+      <w:r>
+        <w:rPr>
+          <w:rStyle w:val="SourceText"/>
+        </w:rPr>
+        <w:t>!</w:t>
+      </w:r>
+      <w:r>
+        <w:rPr/>
+        <w:t xml:space="preserve">), a nested repository or submodule </w:t>
+      </w:r>
+      <w:r>
+        <w:rPr>
+          <w:rStyle w:val="SourceText"/>
+        </w:rPr>
+        <w:t>.graphifyignore</w:t>
+      </w:r>
+      <w:r>
+        <w:rPr/>
+        <w:t xml:space="preserve"> does not exclude, a symlink that resolves outside the repository or not at all, or a deny-all </w:t>
+      </w:r>
+      <w:r>
+        <w:rPr>
+          <w:rStyle w:val="SourceText"/>
+        </w:rPr>
+        <w:t>Read</w:t>
+      </w:r>
+      <w:r>
+        <w:rPr/>
+        <w:t xml:space="preserve"> rule. </w:t>
+      </w:r>
+      <w:r>
+        <w:rPr>
+          <w:rStyle w:val="Strong"/>
+        </w:rPr>
+        <w:t>Fix:</w:t>
+      </w:r>
+      <w:r>
+        <w:rPr/>
+        <w:t xml:space="preserve"> repair what it names. An unknown is never read as covered, so no refresh is named until it is fixed.</w:t>
+      </w:r>
+    </w:p>
+    <w:p>
+      <w:pPr>
+        <w:pStyle w:val="BodyText"/>
+        <w:numPr>
+          <w:ilvl w:val="0"/>
+          <w:numId w:val="24"/>
+        </w:numPr>
+        <w:tabs>
+          <w:tab w:val="clear" w:pos="1134"/>
+          <w:tab w:val="left" w:pos="829" w:leader="none"/>
+        </w:tabs>
+        <w:bidi w:val="0"/>
+        <w:ind w:hanging="283" w:left="829"/>
+        <w:jc w:val="left"/>
+        <w:rPr/>
+      </w:pPr>
+      <w:r>
+        <w:rPr>
+          <w:rStyle w:val="Strong"/>
+        </w:rPr>
+        <w:t>Symptom: a graph was built before the fix</w:t>
+      </w:r>
+      <w:r>
+        <w:rPr/>
+        <w:t xml:space="preserve"> (by hand, or by graphify's post-commit hook, which bypasses crew). </w:t>
+      </w:r>
+      <w:r>
+        <w:rPr>
+          <w:rStyle w:val="Strong"/>
+        </w:rPr>
+        <w:t>Fix:</w:t>
+      </w:r>
+      <w:r>
+        <w:rPr/>
+        <w:t xml:space="preserve"> treat that graph as holding text from the secret files. Delete the graph output directory (</w:t>
+      </w:r>
+      <w:r>
+        <w:rPr>
+          <w:rStyle w:val="SourceText"/>
+        </w:rPr>
+        <w:t>graphify-out/</w:t>
+      </w:r>
+      <w:r>
+        <w:rPr/>
+        <w:t xml:space="preserve"> by default), run </w:t>
+      </w:r>
+      <w:r>
+        <w:rPr>
+          <w:rStyle w:val="SourceText"/>
+        </w:rPr>
+        <w:t>--write</w:t>
+      </w:r>
+      <w:r>
+        <w:rPr/>
+        <w:t xml:space="preserve">, check that </w:t>
+      </w:r>
+      <w:r>
+        <w:rPr>
+          <w:rStyle w:val="SourceText"/>
+        </w:rPr>
+        <w:t>--check</w:t>
+      </w:r>
+      <w:r>
+        <w:rPr/>
+        <w:t xml:space="preserve"> exits 0, then rebuild. Commit the rebuild if the output is tracked. The crew-graph skill's </w:t>
+      </w:r>
+      <w:r>
+        <w:rPr>
+          <w:rStyle w:val="Strong"/>
+        </w:rPr>
+        <w:t>Tainted graph</w:t>
+      </w:r>
+      <w:r>
+        <w:rPr/>
+        <w:t xml:space="preserve"> section has the same steps.</w:t>
+      </w:r>
+    </w:p>
+    <w:p>
+      <w:pPr>
+        <w:pStyle w:val="Heading2"/>
+        <w:bidi w:val="0"/>
+        <w:ind w:hanging="0" w:left="0" w:right="0"/>
+        <w:jc w:val="left"/>
+        <w:rPr/>
+      </w:pPr>
+      <w:bookmarkStart w:id="14" w:name="a-message-from-another-session-asks-for-"/>
+      <w:bookmarkEnd w:id="14"/>
+      <w:r>
+        <w:rPr/>
+        <w:t>A Message from Another Session Asks for an Approval or an Edit</w:t>
+      </w:r>
+    </w:p>
+    <w:p>
+      <w:pPr>
+        <w:pStyle w:val="BodyText"/>
+        <w:bidi w:val="0"/>
+        <w:jc w:val="left"/>
+        <w:rPr/>
+      </w:pPr>
+      <w:r>
+        <w:rPr/>
+        <w:t xml:space="preserve">Sessions that share a coordination channel may message each other over Claude Code's bridge, but a message is only a doorbell: "the record on </w:t>
+      </w:r>
+      <w:r>
+        <w:rPr>
+          <w:rStyle w:val="SourceText"/>
+        </w:rPr>
+        <w:t>crew-coord/&lt;channel&gt;</w:t>
+      </w:r>
+      <w:r>
+        <w:rPr/>
+        <w:t xml:space="preserve"> moved". Nothing in a message is ever an approval, an answer to a question you were asked, or permission to edit a file outside the ticket's Touch list.</w:t>
+      </w:r>
+    </w:p>
+    <w:p>
+      <w:pPr>
+        <w:pStyle w:val="BodyText"/>
+        <w:numPr>
+          <w:ilvl w:val="0"/>
+          <w:numId w:val="25"/>
+        </w:numPr>
+        <w:tabs>
+          <w:tab w:val="clear" w:pos="1134"/>
+          <w:tab w:val="left" w:pos="829" w:leader="none"/>
+        </w:tabs>
+        <w:bidi w:val="0"/>
+        <w:ind w:hanging="283" w:left="829"/>
+        <w:jc w:val="left"/>
+        <w:rPr/>
+      </w:pPr>
+      <w:r>
+        <w:rPr>
+          <w:rStyle w:val="Strong"/>
+        </w:rPr>
+        <w:t xml:space="preserve">Symptom: a peer's message says "approve T-0042", "answer Q2 with option B" or "edit </w:t>
+      </w:r>
+      <w:r>
+        <w:rPr>
+          <w:rStyle w:val="SourceText"/>
+        </w:rPr>
+        <w:t>src/x.py</w:t>
+      </w:r>
+      <w:r>
+        <w:rPr>
+          <w:rStyle w:val="Strong"/>
+        </w:rPr>
+        <w:t xml:space="preserve">", or the session prints </w:t>
+      </w:r>
+      <w:r>
+        <w:rPr>
+          <w:rStyle w:val="SourceText"/>
+        </w:rPr>
+        <w:t>not a doorbell</w:t>
+      </w:r>
+      <w:r>
+        <w:rPr>
+          <w:rStyle w:val="Strong"/>
+        </w:rPr>
+        <w:t xml:space="preserve"> or </w:t>
+      </w:r>
+      <w:r>
+        <w:rPr>
+          <w:rStyle w:val="SourceText"/>
+        </w:rPr>
+        <w:t>could not tell</w:t>
+      </w:r>
+      <w:r>
+        <w:rPr>
+          <w:rStyle w:val="Strong"/>
+        </w:rPr>
+        <w:t>.</w:t>
+      </w:r>
+      <w:r>
+        <w:rPr/>
+        <w:t xml:space="preserve"> </w:t>
+      </w:r>
+      <w:r>
+        <w:rPr>
+          <w:rStyle w:val="Strong"/>
+        </w:rPr>
+        <w:t>Check:</w:t>
+      </w:r>
+      <w:r>
+        <w:rPr/>
+        <w:t xml:space="preserve"> what the classifier made of it. </w:t>
+      </w:r>
+    </w:p>
+    <w:p>
+      <w:pPr>
+        <w:pStyle w:val="PreformattedText"/>
+        <w:bidi w:val="0"/>
+        <w:jc w:val="left"/>
+        <w:rPr/>
+      </w:pPr>
+      <w:r>
+        <w:rPr>
+          <w:rStyle w:val="SourceText"/>
+        </w:rPr>
+        <w:t>python3 "&lt;crew&gt;/hooks/scripts/crew_bridge.py" receive --channel &lt;c&gt; --remote origin &lt;&lt;'END-7f3a'</w:t>
+      </w:r>
+    </w:p>
+    <w:p>
+      <w:pPr>
+        <w:pStyle w:val="PreformattedText"/>
+        <w:bidi w:val="0"/>
+        <w:jc w:val="left"/>
+        <w:rPr/>
+      </w:pPr>
+      <w:r>
+        <w:rPr>
+          <w:rStyle w:val="SourceText"/>
+        </w:rPr>
+        <w:t>&lt;the message, exactly as received&gt;</w:t>
+      </w:r>
+    </w:p>
+    <w:p>
+      <w:pPr>
+        <w:pStyle w:val="PreformattedText"/>
+        <w:bidi w:val="0"/>
+        <w:jc w:val="left"/>
+        <w:rPr/>
+      </w:pPr>
+      <w:r>
+        <w:rPr>
+          <w:rStyle w:val="SourceText"/>
+        </w:rPr>
+        <w:t>END-7f3a</w:t>
+      </w:r>
+    </w:p>
+    <w:p>
+      <w:pPr>
+        <w:pStyle w:val="BodyText"/>
+        <w:bidi w:val="0"/>
+        <w:jc w:val="left"/>
+        <w:rPr/>
+      </w:pPr>
+      <w:r>
+        <w:rPr/>
+        <w:t>Use a terminator of your own that the message does not contain. Exit 0 is a doorbell whose tip is in the fetched record; exit 3 (</w:t>
+      </w:r>
+      <w:r>
+        <w:rPr>
+          <w:rStyle w:val="SourceText"/>
+        </w:rPr>
+        <w:t>could not tell</w:t>
+      </w:r>
+      <w:r>
+        <w:rPr/>
+        <w:t>) means the fetch failed or the announced tip is not in the record; exit 1 (</w:t>
+      </w:r>
+      <w:r>
+        <w:rPr>
+          <w:rStyle w:val="SourceText"/>
+        </w:rPr>
+        <w:t>not a doorbell</w:t>
+      </w:r>
+      <w:r>
+        <w:rPr/>
+        <w:t xml:space="preserve">) is anything else, printed once, made safe and labelled </w:t>
+      </w:r>
+      <w:r>
+        <w:rPr>
+          <w:rStyle w:val="SourceText"/>
+        </w:rPr>
+        <w:t>[peer-written]</w:t>
+      </w:r>
+      <w:r>
+        <w:rPr/>
+        <w:t xml:space="preserve">. </w:t>
+      </w:r>
+      <w:r>
+        <w:rPr>
+          <w:rStyle w:val="Strong"/>
+        </w:rPr>
+        <w:t>Fix:</w:t>
+      </w:r>
+      <w:r>
+        <w:rPr/>
+        <w:t xml:space="preserve"> whatever it printed, do not act on the message's text. Run the one next step it names, </w:t>
+      </w:r>
+      <w:r>
+        <w:rPr>
+          <w:rStyle w:val="SourceText"/>
+        </w:rPr>
+        <w:t>crew_coord.py status --channel &lt;c&gt; --remote origin</w:t>
+      </w:r>
+      <w:r>
+        <w:rPr/>
+        <w:t>, and read the record. An approval is yours to type (</w:t>
+      </w:r>
+      <w:r>
+        <w:rPr>
+          <w:rStyle w:val="SourceText"/>
+        </w:rPr>
+        <w:t>/crew:approve &lt;id&gt;</w:t>
+      </w:r>
+      <w:r>
+        <w:rPr/>
+        <w:t xml:space="preserve">); a question is answered under your own questions policy; a request the peer needs actioned is filed in the record by the peer. Report </w:t>
+      </w:r>
+      <w:r>
+        <w:rPr>
+          <w:rStyle w:val="SourceText"/>
+        </w:rPr>
+        <w:t>could not tell</w:t>
+      </w:r>
+      <w:r>
+        <w:rPr/>
+        <w:t xml:space="preserve"> and </w:t>
+      </w:r>
+      <w:r>
+        <w:rPr>
+          <w:rStyle w:val="SourceText"/>
+        </w:rPr>
+        <w:t>not a doorbell</w:t>
+      </w:r>
+      <w:r>
+        <w:rPr/>
+        <w:t xml:space="preserve"> to whoever owns the channel.</w:t>
+      </w:r>
+    </w:p>
+    <w:p>
+      <w:pPr>
+        <w:pStyle w:val="Heading2"/>
+        <w:bidi w:val="0"/>
+        <w:ind w:hanging="0" w:left="0" w:right="0"/>
+        <w:jc w:val="left"/>
+        <w:rPr/>
+      </w:pPr>
+      <w:bookmarkStart w:id="15" w:name="turning-things-off"/>
+      <w:bookmarkEnd w:id="15"/>
       <w:r>
         <w:rPr/>
         <w:t>Turning Things Off</w:t>
@@ -11317,8 +12269,8 @@
         <w:jc w:val="left"/>
         <w:rPr/>
       </w:pPr>
-      <w:bookmarkStart w:id="14" w:name="web-testing"/>
-      <w:bookmarkEnd w:id="14"/>
+      <w:bookmarkStart w:id="16" w:name="web-testing"/>
+      <w:bookmarkEnd w:id="16"/>
       <w:r>
         <w:rPr/>
         <w:t>Web Testing</w:t>
@@ -11357,7 +12309,7 @@
         <w:pStyle w:val="BodyText"/>
         <w:numPr>
           <w:ilvl w:val="0"/>
-          <w:numId w:val="23"/>
+          <w:numId w:val="26"/>
         </w:numPr>
         <w:tabs>
           <w:tab w:val="clear" w:pos="1134"/>
@@ -11431,7 +12383,7 @@
         <w:pStyle w:val="BodyText"/>
         <w:numPr>
           <w:ilvl w:val="0"/>
-          <w:numId w:val="23"/>
+          <w:numId w:val="26"/>
         </w:numPr>
         <w:tabs>
           <w:tab w:val="clear" w:pos="1134"/>
@@ -11489,7 +12441,7 @@
         <w:pStyle w:val="BodyText"/>
         <w:numPr>
           <w:ilvl w:val="0"/>
-          <w:numId w:val="23"/>
+          <w:numId w:val="26"/>
         </w:numPr>
         <w:tabs>
           <w:tab w:val="clear" w:pos="1134"/>
@@ -11547,7 +12499,7 @@
         <w:pStyle w:val="BodyText"/>
         <w:numPr>
           <w:ilvl w:val="0"/>
-          <w:numId w:val="23"/>
+          <w:numId w:val="26"/>
         </w:numPr>
         <w:tabs>
           <w:tab w:val="clear" w:pos="1134"/>
@@ -11647,8 +12599,8 @@
         <w:jc w:val="left"/>
         <w:rPr/>
       </w:pPr>
-      <w:bookmarkStart w:id="15" w:name="windows-notes"/>
-      <w:bookmarkEnd w:id="15"/>
+      <w:bookmarkStart w:id="17" w:name="windows-notes"/>
+      <w:bookmarkEnd w:id="17"/>
       <w:r>
         <w:rPr/>
         <w:t>Windows Notes</w:t>
@@ -11659,7 +12611,7 @@
         <w:pStyle w:val="BodyText"/>
         <w:numPr>
           <w:ilvl w:val="0"/>
-          <w:numId w:val="24"/>
+          <w:numId w:val="27"/>
         </w:numPr>
         <w:tabs>
           <w:tab w:val="clear" w:pos="1134"/>
@@ -11715,7 +12667,7 @@
         <w:pStyle w:val="BodyText"/>
         <w:numPr>
           <w:ilvl w:val="0"/>
-          <w:numId w:val="24"/>
+          <w:numId w:val="27"/>
         </w:numPr>
         <w:tabs>
           <w:tab w:val="clear" w:pos="1134"/>
@@ -11795,7 +12747,7 @@
         <w:pStyle w:val="BodyText"/>
         <w:numPr>
           <w:ilvl w:val="0"/>
-          <w:numId w:val="24"/>
+          <w:numId w:val="27"/>
         </w:numPr>
         <w:tabs>
           <w:tab w:val="clear" w:pos="1134"/>
@@ -11873,7 +12825,7 @@
         <w:pStyle w:val="BodyText"/>
         <w:numPr>
           <w:ilvl w:val="0"/>
-          <w:numId w:val="24"/>
+          <w:numId w:val="27"/>
         </w:numPr>
         <w:tabs>
           <w:tab w:val="clear" w:pos="1134"/>
@@ -12043,8 +12995,8 @@
         <w:jc w:val="left"/>
         <w:rPr/>
       </w:pPr>
-      <w:bookmarkStart w:id="16" w:name="auto-wrap-up-auto-clear-and-auto-resume"/>
-      <w:bookmarkEnd w:id="16"/>
+      <w:bookmarkStart w:id="18" w:name="auto-wrap-up-auto-clear-and-auto-resume"/>
+      <w:bookmarkEnd w:id="18"/>
       <w:r>
         <w:rPr/>
         <w:t>Auto Wrap-Up, Auto-Clear and Auto-Resume</w:t>
@@ -12080,8 +13032,8 @@
         <w:jc w:val="left"/>
         <w:rPr/>
       </w:pPr>
-      <w:bookmarkStart w:id="17" w:name="what-the-cycle-does"/>
-      <w:bookmarkEnd w:id="17"/>
+      <w:bookmarkStart w:id="19" w:name="what-the-cycle-does"/>
+      <w:bookmarkEnd w:id="19"/>
       <w:r>
         <w:rPr/>
         <w:t>What the Cycle Does</w:t>
@@ -12092,7 +13044,7 @@
         <w:pStyle w:val="BodyText"/>
         <w:numPr>
           <w:ilvl w:val="0"/>
-          <w:numId w:val="25"/>
+          <w:numId w:val="28"/>
         </w:numPr>
         <w:tabs>
           <w:tab w:val="clear" w:pos="1134"/>
@@ -12150,7 +13102,7 @@
         <w:pStyle w:val="BodyText"/>
         <w:numPr>
           <w:ilvl w:val="0"/>
-          <w:numId w:val="25"/>
+          <w:numId w:val="28"/>
         </w:numPr>
         <w:tabs>
           <w:tab w:val="clear" w:pos="1134"/>
@@ -12750,8 +13702,8 @@
         <w:jc w:val="left"/>
         <w:rPr/>
       </w:pPr>
-      <w:bookmarkStart w:id="18" w:name="turning-it-on-and-off"/>
-      <w:bookmarkEnd w:id="18"/>
+      <w:bookmarkStart w:id="20" w:name="turning-it-on-and-off"/>
+      <w:bookmarkEnd w:id="20"/>
       <w:r>
         <w:rPr/>
         <w:t>Turning It on and Off</w:t>
@@ -14312,8 +15264,8 @@
         <w:jc w:val="left"/>
         <w:rPr/>
       </w:pPr>
-      <w:bookmarkStart w:id="19" w:name="armed-wrap-up-contextautoclearwrapup"/>
-      <w:bookmarkEnd w:id="19"/>
+      <w:bookmarkStart w:id="21" w:name="armed-wrap-up-contextautoclearwrapup"/>
+      <w:bookmarkEnd w:id="21"/>
       <w:r>
         <w:rPr/>
         <w:t>Armed wrap-up (</w:t>
@@ -14396,7 +15348,7 @@
         <w:pStyle w:val="BodyText"/>
         <w:numPr>
           <w:ilvl w:val="0"/>
-          <w:numId w:val="26"/>
+          <w:numId w:val="29"/>
         </w:numPr>
         <w:tabs>
           <w:tab w:val="clear" w:pos="1134"/>
@@ -14428,7 +15380,7 @@
         <w:pStyle w:val="BodyText"/>
         <w:numPr>
           <w:ilvl w:val="0"/>
-          <w:numId w:val="26"/>
+          <w:numId w:val="29"/>
         </w:numPr>
         <w:tabs>
           <w:tab w:val="clear" w:pos="1134"/>
@@ -14460,7 +15412,7 @@
         <w:pStyle w:val="BodyText"/>
         <w:numPr>
           <w:ilvl w:val="0"/>
-          <w:numId w:val="26"/>
+          <w:numId w:val="29"/>
         </w:numPr>
         <w:tabs>
           <w:tab w:val="clear" w:pos="1134"/>
@@ -14482,7 +15434,7 @@
         <w:pStyle w:val="BodyText"/>
         <w:numPr>
           <w:ilvl w:val="0"/>
-          <w:numId w:val="26"/>
+          <w:numId w:val="29"/>
         </w:numPr>
         <w:tabs>
           <w:tab w:val="clear" w:pos="1134"/>
@@ -14580,8 +15532,8 @@
         <w:jc w:val="left"/>
         <w:rPr/>
       </w:pPr>
-      <w:bookmarkStart w:id="20" w:name="arming-one-scratch-repo-while-other-sess"/>
-      <w:bookmarkEnd w:id="20"/>
+      <w:bookmarkStart w:id="22" w:name="arming-one-scratch-repo-while-other-sess"/>
+      <w:bookmarkEnd w:id="22"/>
       <w:r>
         <w:rPr/>
         <w:t>Arming one scratch repo while other sessions are live</w:t>
@@ -14866,7 +15818,7 @@
         <w:pStyle w:val="BodyText"/>
         <w:numPr>
           <w:ilvl w:val="0"/>
-          <w:numId w:val="27"/>
+          <w:numId w:val="30"/>
         </w:numPr>
         <w:tabs>
           <w:tab w:val="clear" w:pos="1134"/>
@@ -14908,7 +15860,7 @@
         <w:pStyle w:val="BodyText"/>
         <w:numPr>
           <w:ilvl w:val="0"/>
-          <w:numId w:val="27"/>
+          <w:numId w:val="30"/>
         </w:numPr>
         <w:tabs>
           <w:tab w:val="clear" w:pos="1134"/>
@@ -14930,7 +15882,7 @@
         <w:pStyle w:val="BodyText"/>
         <w:numPr>
           <w:ilvl w:val="0"/>
-          <w:numId w:val="27"/>
+          <w:numId w:val="30"/>
         </w:numPr>
         <w:tabs>
           <w:tab w:val="clear" w:pos="1134"/>
@@ -14982,7 +15934,7 @@
         <w:pStyle w:val="BodyText"/>
         <w:numPr>
           <w:ilvl w:val="0"/>
-          <w:numId w:val="27"/>
+          <w:numId w:val="30"/>
         </w:numPr>
         <w:tabs>
           <w:tab w:val="clear" w:pos="1134"/>
@@ -15004,7 +15956,7 @@
         <w:pStyle w:val="BodyText"/>
         <w:numPr>
           <w:ilvl w:val="0"/>
-          <w:numId w:val="27"/>
+          <w:numId w:val="30"/>
         </w:numPr>
         <w:tabs>
           <w:tab w:val="clear" w:pos="1134"/>
@@ -15056,7 +16008,7 @@
         <w:pStyle w:val="BodyText"/>
         <w:numPr>
           <w:ilvl w:val="0"/>
-          <w:numId w:val="27"/>
+          <w:numId w:val="30"/>
         </w:numPr>
         <w:tabs>
           <w:tab w:val="clear" w:pos="1134"/>
@@ -15312,8 +16264,8 @@
         <w:jc w:val="left"/>
         <w:rPr/>
       </w:pPr>
-      <w:bookmarkStart w:id="21" w:name="which-method-and-what-it-does"/>
-      <w:bookmarkEnd w:id="21"/>
+      <w:bookmarkStart w:id="23" w:name="which-method-and-what-it-does"/>
+      <w:bookmarkEnd w:id="23"/>
       <w:r>
         <w:rPr/>
         <w:t>Which Method, and What It Does</w:t>
@@ -15895,8 +16847,8 @@
         <w:jc w:val="left"/>
         <w:rPr/>
       </w:pPr>
-      <w:bookmarkStart w:id="22" w:name="when-it-will-not-clear-or-notify"/>
-      <w:bookmarkEnd w:id="22"/>
+      <w:bookmarkStart w:id="24" w:name="when-it-will-not-clear-or-notify"/>
+      <w:bookmarkEnd w:id="24"/>
       <w:r>
         <w:rPr/>
         <w:t>When It Will Not Clear (or Notify)</w:t>
@@ -17225,8 +18177,8 @@
         <w:jc w:val="left"/>
         <w:rPr/>
       </w:pPr>
-      <w:bookmarkStart w:id="23" w:name="which-window-gets-the-keystroke"/>
-      <w:bookmarkEnd w:id="23"/>
+      <w:bookmarkStart w:id="25" w:name="which-window-gets-the-keystroke"/>
+      <w:bookmarkEnd w:id="25"/>
       <w:r>
         <w:rPr/>
         <w:t>Which Window Gets the Keystroke</w:t>
@@ -17351,7 +18303,7 @@
         <w:pStyle w:val="BodyText"/>
         <w:numPr>
           <w:ilvl w:val="0"/>
-          <w:numId w:val="28"/>
+          <w:numId w:val="31"/>
         </w:numPr>
         <w:tabs>
           <w:tab w:val="clear" w:pos="1134"/>
@@ -17389,7 +18341,7 @@
         <w:pStyle w:val="BodyText"/>
         <w:numPr>
           <w:ilvl w:val="0"/>
-          <w:numId w:val="28"/>
+          <w:numId w:val="31"/>
         </w:numPr>
         <w:tabs>
           <w:tab w:val="clear" w:pos="1134"/>
@@ -17449,7 +18401,7 @@
         <w:pStyle w:val="BodyText"/>
         <w:numPr>
           <w:ilvl w:val="0"/>
-          <w:numId w:val="28"/>
+          <w:numId w:val="31"/>
         </w:numPr>
         <w:tabs>
           <w:tab w:val="clear" w:pos="1134"/>
@@ -20812,8 +21764,8 @@
   <w:abstractNum w:abstractNumId="25">
     <w:lvl w:ilvl="0">
       <w:start w:val="1"/>
-      <w:numFmt w:val="decimal"/>
-      <w:lvlText w:val="%1."/>
+      <w:numFmt w:val="bullet"/>
+      <w:lvlText w:val=""/>
       <w:lvlJc w:val="left"/>
       <w:pPr>
         <w:tabs>
@@ -20821,12 +21773,14 @@
         </w:tabs>
         <w:ind w:left="709" w:hanging="283"/>
       </w:pPr>
-      <w:rPr/>
+      <w:rPr>
+        <w:rFonts w:ascii="Symbol" w:hAnsi="Symbol" w:cs="Symbol" w:hint="default"/>
+      </w:rPr>
     </w:lvl>
     <w:lvl w:ilvl="1">
       <w:start w:val="1"/>
-      <w:numFmt w:val="decimal"/>
-      <w:lvlText w:val="%2."/>
+      <w:numFmt w:val="bullet"/>
+      <w:lvlText w:val=""/>
       <w:lvlJc w:val="left"/>
       <w:pPr>
         <w:tabs>
@@ -20834,12 +21788,14 @@
         </w:tabs>
         <w:ind w:left="1418" w:hanging="283"/>
       </w:pPr>
-      <w:rPr/>
+      <w:rPr>
+        <w:rFonts w:ascii="Symbol" w:hAnsi="Symbol" w:cs="Symbol" w:hint="default"/>
+      </w:rPr>
     </w:lvl>
     <w:lvl w:ilvl="2">
       <w:start w:val="1"/>
-      <w:numFmt w:val="decimal"/>
-      <w:lvlText w:val="%3."/>
+      <w:numFmt w:val="bullet"/>
+      <w:lvlText w:val=""/>
       <w:lvlJc w:val="left"/>
       <w:pPr>
         <w:tabs>
@@ -20847,12 +21803,14 @@
         </w:tabs>
         <w:ind w:left="2127" w:hanging="283"/>
       </w:pPr>
-      <w:rPr/>
+      <w:rPr>
+        <w:rFonts w:ascii="Symbol" w:hAnsi="Symbol" w:cs="Symbol" w:hint="default"/>
+      </w:rPr>
     </w:lvl>
     <w:lvl w:ilvl="3">
       <w:start w:val="1"/>
-      <w:numFmt w:val="decimal"/>
-      <w:lvlText w:val="%4."/>
+      <w:numFmt w:val="bullet"/>
+      <w:lvlText w:val=""/>
       <w:lvlJc w:val="left"/>
       <w:pPr>
         <w:tabs>
@@ -20860,12 +21818,14 @@
         </w:tabs>
         <w:ind w:left="2836" w:hanging="283"/>
       </w:pPr>
-      <w:rPr/>
+      <w:rPr>
+        <w:rFonts w:ascii="Symbol" w:hAnsi="Symbol" w:cs="Symbol" w:hint="default"/>
+      </w:rPr>
     </w:lvl>
     <w:lvl w:ilvl="4">
       <w:start w:val="1"/>
-      <w:numFmt w:val="decimal"/>
-      <w:lvlText w:val="%5."/>
+      <w:numFmt w:val="bullet"/>
+      <w:lvlText w:val=""/>
       <w:lvlJc w:val="left"/>
       <w:pPr>
         <w:tabs>
@@ -20873,12 +21833,14 @@
         </w:tabs>
         <w:ind w:left="3545" w:hanging="283"/>
       </w:pPr>
-      <w:rPr/>
+      <w:rPr>
+        <w:rFonts w:ascii="Symbol" w:hAnsi="Symbol" w:cs="Symbol" w:hint="default"/>
+      </w:rPr>
     </w:lvl>
     <w:lvl w:ilvl="5">
       <w:start w:val="1"/>
-      <w:numFmt w:val="decimal"/>
-      <w:lvlText w:val="%6."/>
+      <w:numFmt w:val="bullet"/>
+      <w:lvlText w:val=""/>
       <w:lvlJc w:val="left"/>
       <w:pPr>
         <w:tabs>
@@ -20886,12 +21848,14 @@
         </w:tabs>
         <w:ind w:left="4254" w:hanging="283"/>
       </w:pPr>
-      <w:rPr/>
+      <w:rPr>
+        <w:rFonts w:ascii="Symbol" w:hAnsi="Symbol" w:cs="Symbol" w:hint="default"/>
+      </w:rPr>
     </w:lvl>
     <w:lvl w:ilvl="6">
       <w:start w:val="1"/>
-      <w:numFmt w:val="decimal"/>
-      <w:lvlText w:val="%7."/>
+      <w:numFmt w:val="bullet"/>
+      <w:lvlText w:val=""/>
       <w:lvlJc w:val="left"/>
       <w:pPr>
         <w:tabs>
@@ -20899,12 +21863,14 @@
         </w:tabs>
         <w:ind w:left="4963" w:hanging="283"/>
       </w:pPr>
-      <w:rPr/>
+      <w:rPr>
+        <w:rFonts w:ascii="Symbol" w:hAnsi="Symbol" w:cs="Symbol" w:hint="default"/>
+      </w:rPr>
     </w:lvl>
     <w:lvl w:ilvl="7">
       <w:start w:val="1"/>
-      <w:numFmt w:val="decimal"/>
-      <w:lvlText w:val="%8."/>
+      <w:numFmt w:val="bullet"/>
+      <w:lvlText w:val=""/>
       <w:lvlJc w:val="left"/>
       <w:pPr>
         <w:tabs>
@@ -20912,12 +21878,14 @@
         </w:tabs>
         <w:ind w:left="5672" w:hanging="283"/>
       </w:pPr>
-      <w:rPr/>
+      <w:rPr>
+        <w:rFonts w:ascii="Symbol" w:hAnsi="Symbol" w:cs="Symbol" w:hint="default"/>
+      </w:rPr>
     </w:lvl>
     <w:lvl w:ilvl="8">
       <w:start w:val="1"/>
-      <w:numFmt w:val="decimal"/>
-      <w:lvlText w:val="%9."/>
+      <w:numFmt w:val="bullet"/>
+      <w:lvlText w:val=""/>
       <w:lvlJc w:val="left"/>
       <w:pPr>
         <w:tabs>
@@ -20925,7 +21893,9 @@
         </w:tabs>
         <w:ind w:left="6381" w:hanging="283"/>
       </w:pPr>
-      <w:rPr/>
+      <w:rPr>
+        <w:rFonts w:ascii="Symbol" w:hAnsi="Symbol" w:cs="Symbol" w:hint="default"/>
+      </w:rPr>
     </w:lvl>
   </w:abstractNum>
   <w:abstractNum w:abstractNumId="26">
@@ -21205,8 +22175,8 @@
   <w:abstractNum w:abstractNumId="28">
     <w:lvl w:ilvl="0">
       <w:start w:val="1"/>
-      <w:numFmt w:val="bullet"/>
-      <w:lvlText w:val=""/>
+      <w:numFmt w:val="decimal"/>
+      <w:lvlText w:val="%1."/>
       <w:lvlJc w:val="left"/>
       <w:pPr>
         <w:tabs>
@@ -21214,14 +22184,12 @@
         </w:tabs>
         <w:ind w:left="709" w:hanging="283"/>
       </w:pPr>
-      <w:rPr>
-        <w:rFonts w:ascii="Symbol" w:hAnsi="Symbol" w:cs="Symbol" w:hint="default"/>
-      </w:rPr>
+      <w:rPr/>
     </w:lvl>
     <w:lvl w:ilvl="1">
       <w:start w:val="1"/>
-      <w:numFmt w:val="bullet"/>
-      <w:lvlText w:val=""/>
+      <w:numFmt w:val="decimal"/>
+      <w:lvlText w:val="%2."/>
       <w:lvlJc w:val="left"/>
       <w:pPr>
         <w:tabs>
@@ -21229,14 +22197,12 @@
         </w:tabs>
         <w:ind w:left="1418" w:hanging="283"/>
       </w:pPr>
-      <w:rPr>
-        <w:rFonts w:ascii="Symbol" w:hAnsi="Symbol" w:cs="Symbol" w:hint="default"/>
-      </w:rPr>
+      <w:rPr/>
     </w:lvl>
     <w:lvl w:ilvl="2">
       <w:start w:val="1"/>
-      <w:numFmt w:val="bullet"/>
-      <w:lvlText w:val=""/>
+      <w:numFmt w:val="decimal"/>
+      <w:lvlText w:val="%3."/>
       <w:lvlJc w:val="left"/>
       <w:pPr>
         <w:tabs>
@@ -21244,14 +22210,12 @@
         </w:tabs>
         <w:ind w:left="2127" w:hanging="283"/>
       </w:pPr>
-      <w:rPr>
-        <w:rFonts w:ascii="Symbol" w:hAnsi="Symbol" w:cs="Symbol" w:hint="default"/>
-      </w:rPr>
+      <w:rPr/>
     </w:lvl>
     <w:lvl w:ilvl="3">
       <w:start w:val="1"/>
-      <w:numFmt w:val="bullet"/>
-      <w:lvlText w:val=""/>
+      <w:numFmt w:val="decimal"/>
+      <w:lvlText w:val="%4."/>
       <w:lvlJc w:val="left"/>
       <w:pPr>
         <w:tabs>
@@ -21259,14 +22223,12 @@
         </w:tabs>
         <w:ind w:left="2836" w:hanging="283"/>
       </w:pPr>
-      <w:rPr>
-        <w:rFonts w:ascii="Symbol" w:hAnsi="Symbol" w:cs="Symbol" w:hint="default"/>
-      </w:rPr>
+      <w:rPr/>
     </w:lvl>
     <w:lvl w:ilvl="4">
       <w:start w:val="1"/>
-      <w:numFmt w:val="bullet"/>
-      <w:lvlText w:val=""/>
+      <w:numFmt w:val="decimal"/>
+      <w:lvlText w:val="%5."/>
       <w:lvlJc w:val="left"/>
       <w:pPr>
         <w:tabs>
@@ -21274,14 +22236,12 @@
         </w:tabs>
         <w:ind w:left="3545" w:hanging="283"/>
       </w:pPr>
-      <w:rPr>
-        <w:rFonts w:ascii="Symbol" w:hAnsi="Symbol" w:cs="Symbol" w:hint="default"/>
-      </w:rPr>
+      <w:rPr/>
     </w:lvl>
     <w:lvl w:ilvl="5">
       <w:start w:val="1"/>
-      <w:numFmt w:val="bullet"/>
-      <w:lvlText w:val=""/>
+      <w:numFmt w:val="decimal"/>
+      <w:lvlText w:val="%6."/>
       <w:lvlJc w:val="left"/>
       <w:pPr>
         <w:tabs>
@@ -21289,14 +22249,12 @@
         </w:tabs>
         <w:ind w:left="4254" w:hanging="283"/>
       </w:pPr>
-      <w:rPr>
-        <w:rFonts w:ascii="Symbol" w:hAnsi="Symbol" w:cs="Symbol" w:hint="default"/>
-      </w:rPr>
+      <w:rPr/>
     </w:lvl>
     <w:lvl w:ilvl="6">
       <w:start w:val="1"/>
-      <w:numFmt w:val="bullet"/>
-      <w:lvlText w:val=""/>
+      <w:numFmt w:val="decimal"/>
+      <w:lvlText w:val="%7."/>
       <w:lvlJc w:val="left"/>
       <w:pPr>
         <w:tabs>
@@ -21304,14 +22262,12 @@
         </w:tabs>
         <w:ind w:left="4963" w:hanging="283"/>
       </w:pPr>
-      <w:rPr>
-        <w:rFonts w:ascii="Symbol" w:hAnsi="Symbol" w:cs="Symbol" w:hint="default"/>
-      </w:rPr>
+      <w:rPr/>
     </w:lvl>
     <w:lvl w:ilvl="7">
       <w:start w:val="1"/>
-      <w:numFmt w:val="bullet"/>
-      <w:lvlText w:val=""/>
+      <w:numFmt w:val="decimal"/>
+      <w:lvlText w:val="%8."/>
       <w:lvlJc w:val="left"/>
       <w:pPr>
         <w:tabs>
@@ -21319,14 +22275,12 @@
         </w:tabs>
         <w:ind w:left="5672" w:hanging="283"/>
       </w:pPr>
-      <w:rPr>
-        <w:rFonts w:ascii="Symbol" w:hAnsi="Symbol" w:cs="Symbol" w:hint="default"/>
-      </w:rPr>
+      <w:rPr/>
     </w:lvl>
     <w:lvl w:ilvl="8">
       <w:start w:val="1"/>
-      <w:numFmt w:val="bullet"/>
-      <w:lvlText w:val=""/>
+      <w:numFmt w:val="decimal"/>
+      <w:lvlText w:val="%9."/>
       <w:lvlJc w:val="left"/>
       <w:pPr>
         <w:tabs>
@@ -21334,12 +22288,421 @@
         </w:tabs>
         <w:ind w:left="6381" w:hanging="283"/>
       </w:pPr>
-      <w:rPr>
-        <w:rFonts w:ascii="Symbol" w:hAnsi="Symbol" w:cs="Symbol" w:hint="default"/>
-      </w:rPr>
+      <w:rPr/>
     </w:lvl>
   </w:abstractNum>
   <w:abstractNum w:abstractNumId="29">
+    <w:lvl w:ilvl="0">
+      <w:start w:val="1"/>
+      <w:numFmt w:val="bullet"/>
+      <w:lvlText w:val=""/>
+      <w:lvlJc w:val="left"/>
+      <w:pPr>
+        <w:tabs>
+          <w:tab w:val="num" w:pos="709"/>
+        </w:tabs>
+        <w:ind w:left="709" w:hanging="283"/>
+      </w:pPr>
+      <w:rPr>
+        <w:rFonts w:ascii="Symbol" w:hAnsi="Symbol" w:cs="Symbol" w:hint="default"/>
+      </w:rPr>
+    </w:lvl>
+    <w:lvl w:ilvl="1">
+      <w:start w:val="1"/>
+      <w:numFmt w:val="bullet"/>
+      <w:lvlText w:val=""/>
+      <w:lvlJc w:val="left"/>
+      <w:pPr>
+        <w:tabs>
+          <w:tab w:val="num" w:pos="1418"/>
+        </w:tabs>
+        <w:ind w:left="1418" w:hanging="283"/>
+      </w:pPr>
+      <w:rPr>
+        <w:rFonts w:ascii="Symbol" w:hAnsi="Symbol" w:cs="Symbol" w:hint="default"/>
+      </w:rPr>
+    </w:lvl>
+    <w:lvl w:ilvl="2">
+      <w:start w:val="1"/>
+      <w:numFmt w:val="bullet"/>
+      <w:lvlText w:val=""/>
+      <w:lvlJc w:val="left"/>
+      <w:pPr>
+        <w:tabs>
+          <w:tab w:val="num" w:pos="2127"/>
+        </w:tabs>
+        <w:ind w:left="2127" w:hanging="283"/>
+      </w:pPr>
+      <w:rPr>
+        <w:rFonts w:ascii="Symbol" w:hAnsi="Symbol" w:cs="Symbol" w:hint="default"/>
+      </w:rPr>
+    </w:lvl>
+    <w:lvl w:ilvl="3">
+      <w:start w:val="1"/>
+      <w:numFmt w:val="bullet"/>
+      <w:lvlText w:val=""/>
+      <w:lvlJc w:val="left"/>
+      <w:pPr>
+        <w:tabs>
+          <w:tab w:val="num" w:pos="2836"/>
+        </w:tabs>
+        <w:ind w:left="2836" w:hanging="283"/>
+      </w:pPr>
+      <w:rPr>
+        <w:rFonts w:ascii="Symbol" w:hAnsi="Symbol" w:cs="Symbol" w:hint="default"/>
+      </w:rPr>
+    </w:lvl>
+    <w:lvl w:ilvl="4">
+      <w:start w:val="1"/>
+      <w:numFmt w:val="bullet"/>
+      <w:lvlText w:val=""/>
+      <w:lvlJc w:val="left"/>
+      <w:pPr>
+        <w:tabs>
+          <w:tab w:val="num" w:pos="3545"/>
+        </w:tabs>
+        <w:ind w:left="3545" w:hanging="283"/>
+      </w:pPr>
+      <w:rPr>
+        <w:rFonts w:ascii="Symbol" w:hAnsi="Symbol" w:cs="Symbol" w:hint="default"/>
+      </w:rPr>
+    </w:lvl>
+    <w:lvl w:ilvl="5">
+      <w:start w:val="1"/>
+      <w:numFmt w:val="bullet"/>
+      <w:lvlText w:val=""/>
+      <w:lvlJc w:val="left"/>
+      <w:pPr>
+        <w:tabs>
+          <w:tab w:val="num" w:pos="4254"/>
+        </w:tabs>
+        <w:ind w:left="4254" w:hanging="283"/>
+      </w:pPr>
+      <w:rPr>
+        <w:rFonts w:ascii="Symbol" w:hAnsi="Symbol" w:cs="Symbol" w:hint="default"/>
+      </w:rPr>
+    </w:lvl>
+    <w:lvl w:ilvl="6">
+      <w:start w:val="1"/>
+      <w:numFmt w:val="bullet"/>
+      <w:lvlText w:val=""/>
+      <w:lvlJc w:val="left"/>
+      <w:pPr>
+        <w:tabs>
+          <w:tab w:val="num" w:pos="4963"/>
+        </w:tabs>
+        <w:ind w:left="4963" w:hanging="283"/>
+      </w:pPr>
+      <w:rPr>
+        <w:rFonts w:ascii="Symbol" w:hAnsi="Symbol" w:cs="Symbol" w:hint="default"/>
+      </w:rPr>
+    </w:lvl>
+    <w:lvl w:ilvl="7">
+      <w:start w:val="1"/>
+      <w:numFmt w:val="bullet"/>
+      <w:lvlText w:val=""/>
+      <w:lvlJc w:val="left"/>
+      <w:pPr>
+        <w:tabs>
+          <w:tab w:val="num" w:pos="5672"/>
+        </w:tabs>
+        <w:ind w:left="5672" w:hanging="283"/>
+      </w:pPr>
+      <w:rPr>
+        <w:rFonts w:ascii="Symbol" w:hAnsi="Symbol" w:cs="Symbol" w:hint="default"/>
+      </w:rPr>
+    </w:lvl>
+    <w:lvl w:ilvl="8">
+      <w:start w:val="1"/>
+      <w:numFmt w:val="bullet"/>
+      <w:lvlText w:val=""/>
+      <w:lvlJc w:val="left"/>
+      <w:pPr>
+        <w:tabs>
+          <w:tab w:val="num" w:pos="6381"/>
+        </w:tabs>
+        <w:ind w:left="6381" w:hanging="283"/>
+      </w:pPr>
+      <w:rPr>
+        <w:rFonts w:ascii="Symbol" w:hAnsi="Symbol" w:cs="Symbol" w:hint="default"/>
+      </w:rPr>
+    </w:lvl>
+  </w:abstractNum>
+  <w:abstractNum w:abstractNumId="30">
+    <w:lvl w:ilvl="0">
+      <w:start w:val="1"/>
+      <w:numFmt w:val="bullet"/>
+      <w:lvlText w:val=""/>
+      <w:lvlJc w:val="left"/>
+      <w:pPr>
+        <w:tabs>
+          <w:tab w:val="num" w:pos="709"/>
+        </w:tabs>
+        <w:ind w:left="709" w:hanging="283"/>
+      </w:pPr>
+      <w:rPr>
+        <w:rFonts w:ascii="Symbol" w:hAnsi="Symbol" w:cs="Symbol" w:hint="default"/>
+      </w:rPr>
+    </w:lvl>
+    <w:lvl w:ilvl="1">
+      <w:start w:val="1"/>
+      <w:numFmt w:val="bullet"/>
+      <w:lvlText w:val=""/>
+      <w:lvlJc w:val="left"/>
+      <w:pPr>
+        <w:tabs>
+          <w:tab w:val="num" w:pos="1418"/>
+        </w:tabs>
+        <w:ind w:left="1418" w:hanging="283"/>
+      </w:pPr>
+      <w:rPr>
+        <w:rFonts w:ascii="Symbol" w:hAnsi="Symbol" w:cs="Symbol" w:hint="default"/>
+      </w:rPr>
+    </w:lvl>
+    <w:lvl w:ilvl="2">
+      <w:start w:val="1"/>
+      <w:numFmt w:val="bullet"/>
+      <w:lvlText w:val=""/>
+      <w:lvlJc w:val="left"/>
+      <w:pPr>
+        <w:tabs>
+          <w:tab w:val="num" w:pos="2127"/>
+        </w:tabs>
+        <w:ind w:left="2127" w:hanging="283"/>
+      </w:pPr>
+      <w:rPr>
+        <w:rFonts w:ascii="Symbol" w:hAnsi="Symbol" w:cs="Symbol" w:hint="default"/>
+      </w:rPr>
+    </w:lvl>
+    <w:lvl w:ilvl="3">
+      <w:start w:val="1"/>
+      <w:numFmt w:val="bullet"/>
+      <w:lvlText w:val=""/>
+      <w:lvlJc w:val="left"/>
+      <w:pPr>
+        <w:tabs>
+          <w:tab w:val="num" w:pos="2836"/>
+        </w:tabs>
+        <w:ind w:left="2836" w:hanging="283"/>
+      </w:pPr>
+      <w:rPr>
+        <w:rFonts w:ascii="Symbol" w:hAnsi="Symbol" w:cs="Symbol" w:hint="default"/>
+      </w:rPr>
+    </w:lvl>
+    <w:lvl w:ilvl="4">
+      <w:start w:val="1"/>
+      <w:numFmt w:val="bullet"/>
+      <w:lvlText w:val=""/>
+      <w:lvlJc w:val="left"/>
+      <w:pPr>
+        <w:tabs>
+          <w:tab w:val="num" w:pos="3545"/>
+        </w:tabs>
+        <w:ind w:left="3545" w:hanging="283"/>
+      </w:pPr>
+      <w:rPr>
+        <w:rFonts w:ascii="Symbol" w:hAnsi="Symbol" w:cs="Symbol" w:hint="default"/>
+      </w:rPr>
+    </w:lvl>
+    <w:lvl w:ilvl="5">
+      <w:start w:val="1"/>
+      <w:numFmt w:val="bullet"/>
+      <w:lvlText w:val=""/>
+      <w:lvlJc w:val="left"/>
+      <w:pPr>
+        <w:tabs>
+          <w:tab w:val="num" w:pos="4254"/>
+        </w:tabs>
+        <w:ind w:left="4254" w:hanging="283"/>
+      </w:pPr>
+      <w:rPr>
+        <w:rFonts w:ascii="Symbol" w:hAnsi="Symbol" w:cs="Symbol" w:hint="default"/>
+      </w:rPr>
+    </w:lvl>
+    <w:lvl w:ilvl="6">
+      <w:start w:val="1"/>
+      <w:numFmt w:val="bullet"/>
+      <w:lvlText w:val=""/>
+      <w:lvlJc w:val="left"/>
+      <w:pPr>
+        <w:tabs>
+          <w:tab w:val="num" w:pos="4963"/>
+        </w:tabs>
+        <w:ind w:left="4963" w:hanging="283"/>
+      </w:pPr>
+      <w:rPr>
+        <w:rFonts w:ascii="Symbol" w:hAnsi="Symbol" w:cs="Symbol" w:hint="default"/>
+      </w:rPr>
+    </w:lvl>
+    <w:lvl w:ilvl="7">
+      <w:start w:val="1"/>
+      <w:numFmt w:val="bullet"/>
+      <w:lvlText w:val=""/>
+      <w:lvlJc w:val="left"/>
+      <w:pPr>
+        <w:tabs>
+          <w:tab w:val="num" w:pos="5672"/>
+        </w:tabs>
+        <w:ind w:left="5672" w:hanging="283"/>
+      </w:pPr>
+      <w:rPr>
+        <w:rFonts w:ascii="Symbol" w:hAnsi="Symbol" w:cs="Symbol" w:hint="default"/>
+      </w:rPr>
+    </w:lvl>
+    <w:lvl w:ilvl="8">
+      <w:start w:val="1"/>
+      <w:numFmt w:val="bullet"/>
+      <w:lvlText w:val=""/>
+      <w:lvlJc w:val="left"/>
+      <w:pPr>
+        <w:tabs>
+          <w:tab w:val="num" w:pos="6381"/>
+        </w:tabs>
+        <w:ind w:left="6381" w:hanging="283"/>
+      </w:pPr>
+      <w:rPr>
+        <w:rFonts w:ascii="Symbol" w:hAnsi="Symbol" w:cs="Symbol" w:hint="default"/>
+      </w:rPr>
+    </w:lvl>
+  </w:abstractNum>
+  <w:abstractNum w:abstractNumId="31">
+    <w:lvl w:ilvl="0">
+      <w:start w:val="1"/>
+      <w:numFmt w:val="bullet"/>
+      <w:lvlText w:val=""/>
+      <w:lvlJc w:val="left"/>
+      <w:pPr>
+        <w:tabs>
+          <w:tab w:val="num" w:pos="709"/>
+        </w:tabs>
+        <w:ind w:left="709" w:hanging="283"/>
+      </w:pPr>
+      <w:rPr>
+        <w:rFonts w:ascii="Symbol" w:hAnsi="Symbol" w:cs="Symbol" w:hint="default"/>
+      </w:rPr>
+    </w:lvl>
+    <w:lvl w:ilvl="1">
+      <w:start w:val="1"/>
+      <w:numFmt w:val="bullet"/>
+      <w:lvlText w:val=""/>
+      <w:lvlJc w:val="left"/>
+      <w:pPr>
+        <w:tabs>
+          <w:tab w:val="num" w:pos="1418"/>
+        </w:tabs>
+        <w:ind w:left="1418" w:hanging="283"/>
+      </w:pPr>
+      <w:rPr>
+        <w:rFonts w:ascii="Symbol" w:hAnsi="Symbol" w:cs="Symbol" w:hint="default"/>
+      </w:rPr>
+    </w:lvl>
+    <w:lvl w:ilvl="2">
+      <w:start w:val="1"/>
+      <w:numFmt w:val="bullet"/>
+      <w:lvlText w:val=""/>
+      <w:lvlJc w:val="left"/>
+      <w:pPr>
+        <w:tabs>
+          <w:tab w:val="num" w:pos="2127"/>
+        </w:tabs>
+        <w:ind w:left="2127" w:hanging="283"/>
+      </w:pPr>
+      <w:rPr>
+        <w:rFonts w:ascii="Symbol" w:hAnsi="Symbol" w:cs="Symbol" w:hint="default"/>
+      </w:rPr>
+    </w:lvl>
+    <w:lvl w:ilvl="3">
+      <w:start w:val="1"/>
+      <w:numFmt w:val="bullet"/>
+      <w:lvlText w:val=""/>
+      <w:lvlJc w:val="left"/>
+      <w:pPr>
+        <w:tabs>
+          <w:tab w:val="num" w:pos="2836"/>
+        </w:tabs>
+        <w:ind w:left="2836" w:hanging="283"/>
+      </w:pPr>
+      <w:rPr>
+        <w:rFonts w:ascii="Symbol" w:hAnsi="Symbol" w:cs="Symbol" w:hint="default"/>
+      </w:rPr>
+    </w:lvl>
+    <w:lvl w:ilvl="4">
+      <w:start w:val="1"/>
+      <w:numFmt w:val="bullet"/>
+      <w:lvlText w:val=""/>
+      <w:lvlJc w:val="left"/>
+      <w:pPr>
+        <w:tabs>
+          <w:tab w:val="num" w:pos="3545"/>
+        </w:tabs>
+        <w:ind w:left="3545" w:hanging="283"/>
+      </w:pPr>
+      <w:rPr>
+        <w:rFonts w:ascii="Symbol" w:hAnsi="Symbol" w:cs="Symbol" w:hint="default"/>
+      </w:rPr>
+    </w:lvl>
+    <w:lvl w:ilvl="5">
+      <w:start w:val="1"/>
+      <w:numFmt w:val="bullet"/>
+      <w:lvlText w:val=""/>
+      <w:lvlJc w:val="left"/>
+      <w:pPr>
+        <w:tabs>
+          <w:tab w:val="num" w:pos="4254"/>
+        </w:tabs>
+        <w:ind w:left="4254" w:hanging="283"/>
+      </w:pPr>
+      <w:rPr>
+        <w:rFonts w:ascii="Symbol" w:hAnsi="Symbol" w:cs="Symbol" w:hint="default"/>
+      </w:rPr>
+    </w:lvl>
+    <w:lvl w:ilvl="6">
+      <w:start w:val="1"/>
+      <w:numFmt w:val="bullet"/>
+      <w:lvlText w:val=""/>
+      <w:lvlJc w:val="left"/>
+      <w:pPr>
+        <w:tabs>
+          <w:tab w:val="num" w:pos="4963"/>
+        </w:tabs>
+        <w:ind w:left="4963" w:hanging="283"/>
+      </w:pPr>
+      <w:rPr>
+        <w:rFonts w:ascii="Symbol" w:hAnsi="Symbol" w:cs="Symbol" w:hint="default"/>
+      </w:rPr>
+    </w:lvl>
+    <w:lvl w:ilvl="7">
+      <w:start w:val="1"/>
+      <w:numFmt w:val="bullet"/>
+      <w:lvlText w:val=""/>
+      <w:lvlJc w:val="left"/>
+      <w:pPr>
+        <w:tabs>
+          <w:tab w:val="num" w:pos="5672"/>
+        </w:tabs>
+        <w:ind w:left="5672" w:hanging="283"/>
+      </w:pPr>
+      <w:rPr>
+        <w:rFonts w:ascii="Symbol" w:hAnsi="Symbol" w:cs="Symbol" w:hint="default"/>
+      </w:rPr>
+    </w:lvl>
+    <w:lvl w:ilvl="8">
+      <w:start w:val="1"/>
+      <w:numFmt w:val="bullet"/>
+      <w:lvlText w:val=""/>
+      <w:lvlJc w:val="left"/>
+      <w:pPr>
+        <w:tabs>
+          <w:tab w:val="num" w:pos="6381"/>
+        </w:tabs>
+        <w:ind w:left="6381" w:hanging="283"/>
+      </w:pPr>
+      <w:rPr>
+        <w:rFonts w:ascii="Symbol" w:hAnsi="Symbol" w:cs="Symbol" w:hint="default"/>
+      </w:rPr>
+    </w:lvl>
+  </w:abstractNum>
+  <w:abstractNum w:abstractNumId="32">
     <w:lvl w:ilvl="0">
       <w:start w:val="1"/>
       <w:numFmt w:val="none"/>
@@ -21547,6 +22910,15 @@
   </w:num>
   <w:num w:numId="29">
     <w:abstractNumId w:val="29"/>
+  </w:num>
+  <w:num w:numId="30">
+    <w:abstractNumId w:val="30"/>
+  </w:num>
+  <w:num w:numId="31">
+    <w:abstractNumId w:val="31"/>
+  </w:num>
+  <w:num w:numId="32">
+    <w:abstractNumId w:val="32"/>
   </w:num>
 </w:numbering>
 </file>

</xml_diff>

<commit_message>
L-0633: <channel>:<id> dependencies in the autopilot wave
crew_wave.py accepts <channel>:<id> and <channel>:<repo>:<id> in a set
file's deps, --deps and an INDEX row's (depends on ...). plan fetches
crew-coord/<channel> from coord.remote once per channel and counts the
dependency closed only on exactly one done claim; working, released and
every could-not-tell refuse the ticket. Local dependencies are judged
first. Plan written by the implementing session; README, troubleshooting
guide (rebuilt), codemap, wave verify rule, CHANGELOG. Sabotage is L-0635.

Claude-Session: https://claude.ai/code/session_01QLY3kk7DCXpucXGu3wSniW
</commit_message>
<xml_diff>
--- a/docs/guides/crew/crew-troubleshooting.docx
+++ b/docs/guides/crew/crew-troubleshooting.docx
@@ -3626,7 +3626,7 @@
       </w:r>
       <w:r>
         <w:rPr/>
-        <w:t xml:space="preserve"> table row) or a line admitting the review fell short ("skipped", "truncated", "could not review") is still INCOMPLETE </w:t>
+        <w:t xml:space="preserve"> table row) or a line matching the shortfall wording list ("skipped", "truncated", "could not review") is still INCOMPLETE </w:t>
       </w:r>
       <w:r>
         <w:rPr>
@@ -3636,7 +3636,7 @@
       </w:r>
       <w:r>
         <w:rPr/>
-        <w:t xml:space="preserve">. </w:t>
+        <w:t xml:space="preserve">. That list cannot catch every admission: one it misses ("I only inspected one of the nine files") is ignored as prose and the round stays FINDINGS, so read the ignored lines. </w:t>
       </w:r>
       <w:r>
         <w:rPr>
@@ -6875,8 +6875,895 @@
         <w:jc w:val="left"/>
         <w:rPr/>
       </w:pPr>
-      <w:bookmarkStart w:id="7" w:name="promote-gate-blocks-a-worktree-deploy"/>
+      <w:bookmarkStart w:id="7" w:name="wave-refuses-a-cross-session-dependency"/>
       <w:bookmarkEnd w:id="7"/>
+      <w:r>
+        <w:rPr/>
+        <w:t>Wave Refuses a Cross-Session Dependency</w:t>
+      </w:r>
+    </w:p>
+    <w:p>
+      <w:pPr>
+        <w:pStyle w:val="BodyText"/>
+        <w:bidi w:val="0"/>
+        <w:jc w:val="left"/>
+        <w:rPr/>
+      </w:pPr>
+      <w:r>
+        <w:rPr/>
+        <w:t xml:space="preserve">A wave ticket may depend on a ticket another session works, written </w:t>
+      </w:r>
+      <w:r>
+        <w:rPr>
+          <w:rStyle w:val="SourceText"/>
+        </w:rPr>
+        <w:t>&lt;channel&gt;:&lt;id&gt;</w:t>
+      </w:r>
+      <w:r>
+        <w:rPr/>
+        <w:t xml:space="preserve"> or </w:t>
+      </w:r>
+      <w:r>
+        <w:rPr>
+          <w:rStyle w:val="SourceText"/>
+        </w:rPr>
+        <w:t>&lt;channel&gt;:&lt;repo&gt;:&lt;id&gt;</w:t>
+      </w:r>
+      <w:r>
+        <w:rPr/>
+        <w:t xml:space="preserve"> in the set file's </w:t>
+      </w:r>
+      <w:r>
+        <w:rPr>
+          <w:rStyle w:val="SourceText"/>
+        </w:rPr>
+        <w:t>deps</w:t>
+      </w:r>
+      <w:r>
+        <w:rPr/>
+        <w:t xml:space="preserve"> or the INDEX row's </w:t>
+      </w:r>
+      <w:r>
+        <w:rPr>
+          <w:rStyle w:val="SourceText"/>
+        </w:rPr>
+        <w:t>(depends on ...)</w:t>
+      </w:r>
+      <w:r>
+        <w:rPr/>
+        <w:t xml:space="preserve">. The wave fetches </w:t>
+      </w:r>
+      <w:r>
+        <w:rPr>
+          <w:rStyle w:val="SourceText"/>
+        </w:rPr>
+        <w:t>crew-coord/&lt;channel&gt;</w:t>
+      </w:r>
+      <w:r>
+        <w:rPr/>
+        <w:t xml:space="preserve"> from </w:t>
+      </w:r>
+      <w:r>
+        <w:rPr>
+          <w:rStyle w:val="SourceText"/>
+        </w:rPr>
+        <w:t>coord.remote</w:t>
+      </w:r>
+      <w:r>
+        <w:rPr/>
+        <w:t xml:space="preserve"> (default </w:t>
+      </w:r>
+      <w:r>
+        <w:rPr>
+          <w:rStyle w:val="SourceText"/>
+        </w:rPr>
+        <w:t>origin</w:t>
+      </w:r>
+      <w:r>
+        <w:rPr/>
+        <w:t xml:space="preserve">) and counts the dependency closed only when exactly one claim for that id reads </w:t>
+      </w:r>
+      <w:r>
+        <w:rPr>
+          <w:rStyle w:val="SourceText"/>
+        </w:rPr>
+        <w:t>done</w:t>
+      </w:r>
+      <w:r>
+        <w:rPr/>
+        <w:t xml:space="preserve">. Every line about the peer's claim is peer-written data and ends </w:t>
+      </w:r>
+      <w:r>
+        <w:rPr>
+          <w:rStyle w:val="SourceText"/>
+        </w:rPr>
+        <w:t>[peer-written]</w:t>
+      </w:r>
+      <w:r>
+        <w:rPr/>
+        <w:t>.</w:t>
+      </w:r>
+    </w:p>
+    <w:tbl>
+      <w:tblPr>
+        <w:tblW w:w="11825" w:type="dxa"/>
+        <w:jc w:val="left"/>
+        <w:tblInd w:w="0" w:type="dxa"/>
+        <w:tblLayout w:type="fixed"/>
+        <w:tblCellMar>
+          <w:top w:w="28" w:type="dxa"/>
+          <w:left w:w="28" w:type="dxa"/>
+          <w:bottom w:w="28" w:type="dxa"/>
+          <w:right w:w="28" w:type="dxa"/>
+        </w:tblCellMar>
+      </w:tblPr>
+      <w:tblGrid>
+        <w:gridCol w:w="4466"/>
+        <w:gridCol w:w="3701"/>
+        <w:gridCol w:w="3658"/>
+      </w:tblGrid>
+      <w:tr>
+        <w:trPr>
+          <w:tblHeader w:val="true"/>
+        </w:trPr>
+        <w:tc>
+          <w:tcPr>
+            <w:tcW w:w="4466" w:type="dxa"/>
+            <w:tcBorders/>
+            <w:vAlign w:val="center"/>
+          </w:tcPr>
+          <w:p>
+            <w:pPr>
+              <w:pStyle w:val="TableHeading"/>
+              <w:suppressLineNumbers/>
+              <w:shd w:fill="434C5E" w:val="clear"/>
+              <w:bidi w:val="0"/>
+              <w:spacing w:before="120" w:after="120"/>
+              <w:jc w:val="left"/>
+              <w:rPr/>
+            </w:pPr>
+            <w:r>
+              <w:rPr>
+                <w:rStyle w:val="SourceText"/>
+              </w:rPr>
+              <w:t>crew_wave.py plan</w:t>
+            </w:r>
+            <w:r>
+              <w:rPr/>
+              <w:t xml:space="preserve"> says</w:t>
+            </w:r>
+          </w:p>
+        </w:tc>
+        <w:tc>
+          <w:tcPr>
+            <w:tcW w:w="3701" w:type="dxa"/>
+            <w:tcBorders/>
+            <w:vAlign w:val="center"/>
+          </w:tcPr>
+          <w:p>
+            <w:pPr>
+              <w:pStyle w:val="TableHeading"/>
+              <w:suppressLineNumbers/>
+              <w:shd w:fill="434C5E" w:val="clear"/>
+              <w:bidi w:val="0"/>
+              <w:spacing w:before="120" w:after="120"/>
+              <w:jc w:val="left"/>
+              <w:rPr/>
+            </w:pPr>
+            <w:r>
+              <w:rPr/>
+              <w:t>Means</w:t>
+            </w:r>
+          </w:p>
+        </w:tc>
+        <w:tc>
+          <w:tcPr>
+            <w:tcW w:w="3658" w:type="dxa"/>
+            <w:tcBorders/>
+            <w:vAlign w:val="center"/>
+          </w:tcPr>
+          <w:p>
+            <w:pPr>
+              <w:pStyle w:val="TableHeading"/>
+              <w:suppressLineNumbers/>
+              <w:shd w:fill="434C5E" w:val="clear"/>
+              <w:bidi w:val="0"/>
+              <w:spacing w:before="120" w:after="120"/>
+              <w:jc w:val="left"/>
+              <w:rPr/>
+            </w:pPr>
+            <w:r>
+              <w:rPr/>
+              <w:t>Do</w:t>
+            </w:r>
+          </w:p>
+        </w:tc>
+      </w:tr>
+      <w:tr>
+        <w:trPr/>
+        <w:tc>
+          <w:tcPr>
+            <w:tcW w:w="4466" w:type="dxa"/>
+            <w:tcBorders/>
+            <w:vAlign w:val="center"/>
+          </w:tcPr>
+          <w:p>
+            <w:pPr>
+              <w:pStyle w:val="TableContents"/>
+              <w:shd w:fill="2E3440" w:val="clear"/>
+              <w:bidi w:val="0"/>
+              <w:spacing w:before="120" w:after="120"/>
+              <w:jc w:val="left"/>
+              <w:rPr/>
+            </w:pPr>
+            <w:r>
+              <w:rPr>
+                <w:rStyle w:val="SourceText"/>
+              </w:rPr>
+              <w:t>dependency &lt;channel&gt;:&lt;id&gt; is not closed: the peer claim reads working (...)</w:t>
+            </w:r>
+          </w:p>
+        </w:tc>
+        <w:tc>
+          <w:tcPr>
+            <w:tcW w:w="3701" w:type="dxa"/>
+            <w:tcBorders/>
+            <w:vAlign w:val="center"/>
+          </w:tcPr>
+          <w:p>
+            <w:pPr>
+              <w:pStyle w:val="TableContents"/>
+              <w:shd w:fill="2E3440" w:val="clear"/>
+              <w:bidi w:val="0"/>
+              <w:spacing w:before="120" w:after="120"/>
+              <w:jc w:val="left"/>
+              <w:rPr/>
+            </w:pPr>
+            <w:r>
+              <w:rPr/>
+              <w:t xml:space="preserve">the peer is still on it; </w:t>
+            </w:r>
+            <w:r>
+              <w:rPr>
+                <w:rStyle w:val="SourceText"/>
+              </w:rPr>
+              <w:t>owner unknown</w:t>
+            </w:r>
+            <w:r>
+              <w:rPr/>
+              <w:t xml:space="preserve"> in the brackets means its heartbeat is past the TTL</w:t>
+            </w:r>
+          </w:p>
+        </w:tc>
+        <w:tc>
+          <w:tcPr>
+            <w:tcW w:w="3658" w:type="dxa"/>
+            <w:tcBorders/>
+            <w:vAlign w:val="center"/>
+          </w:tcPr>
+          <w:p>
+            <w:pPr>
+              <w:pStyle w:val="TableContents"/>
+              <w:shd w:fill="2E3440" w:val="clear"/>
+              <w:bidi w:val="0"/>
+              <w:spacing w:before="120" w:after="120"/>
+              <w:jc w:val="left"/>
+              <w:rPr/>
+            </w:pPr>
+            <w:r>
+              <w:rPr/>
+              <w:t xml:space="preserve">wait for the peer's </w:t>
+            </w:r>
+            <w:r>
+              <w:rPr>
+                <w:rStyle w:val="SourceText"/>
+              </w:rPr>
+              <w:t>done</w:t>
+            </w:r>
+            <w:r>
+              <w:rPr/>
+              <w:t>, or take the ticket out of this wave</w:t>
+            </w:r>
+          </w:p>
+        </w:tc>
+      </w:tr>
+      <w:tr>
+        <w:trPr/>
+        <w:tc>
+          <w:tcPr>
+            <w:tcW w:w="4466" w:type="dxa"/>
+            <w:tcBorders/>
+            <w:vAlign w:val="center"/>
+          </w:tcPr>
+          <w:p>
+            <w:pPr>
+              <w:pStyle w:val="TableContents"/>
+              <w:shd w:fill="2E3440" w:val="clear"/>
+              <w:bidi w:val="0"/>
+              <w:spacing w:before="120" w:after="120"/>
+              <w:jc w:val="left"/>
+              <w:rPr/>
+            </w:pPr>
+            <w:r>
+              <w:rPr>
+                <w:rStyle w:val="SourceText"/>
+              </w:rPr>
+              <w:t>... reads released (...); only done closes it</w:t>
+            </w:r>
+          </w:p>
+        </w:tc>
+        <w:tc>
+          <w:tcPr>
+            <w:tcW w:w="3701" w:type="dxa"/>
+            <w:tcBorders/>
+            <w:vAlign w:val="center"/>
+          </w:tcPr>
+          <w:p>
+            <w:pPr>
+              <w:pStyle w:val="TableContents"/>
+              <w:shd w:fill="2E3440" w:val="clear"/>
+              <w:bidi w:val="0"/>
+              <w:spacing w:before="120" w:after="120"/>
+              <w:jc w:val="left"/>
+              <w:rPr/>
+            </w:pPr>
+            <w:r>
+              <w:rPr/>
+              <w:t>the peer gave the ticket back unfinished</w:t>
+            </w:r>
+          </w:p>
+        </w:tc>
+        <w:tc>
+          <w:tcPr>
+            <w:tcW w:w="3658" w:type="dxa"/>
+            <w:tcBorders/>
+            <w:vAlign w:val="center"/>
+          </w:tcPr>
+          <w:p>
+            <w:pPr>
+              <w:pStyle w:val="TableContents"/>
+              <w:shd w:fill="2E3440" w:val="clear"/>
+              <w:bidi w:val="0"/>
+              <w:spacing w:before="120" w:after="120"/>
+              <w:jc w:val="left"/>
+              <w:rPr/>
+            </w:pPr>
+            <w:r>
+              <w:rPr/>
+              <w:t xml:space="preserve">agree with the peer who finishes it; </w:t>
+            </w:r>
+            <w:r>
+              <w:rPr>
+                <w:rStyle w:val="SourceText"/>
+              </w:rPr>
+              <w:t>released</w:t>
+            </w:r>
+            <w:r>
+              <w:rPr/>
+              <w:t xml:space="preserve"> never closes it</w:t>
+            </w:r>
+          </w:p>
+        </w:tc>
+      </w:tr>
+      <w:tr>
+        <w:trPr/>
+        <w:tc>
+          <w:tcPr>
+            <w:tcW w:w="4466" w:type="dxa"/>
+            <w:tcBorders/>
+            <w:vAlign w:val="center"/>
+          </w:tcPr>
+          <w:p>
+            <w:pPr>
+              <w:pStyle w:val="TableContents"/>
+              <w:shd w:fill="2E3440" w:val="clear"/>
+              <w:bidi w:val="0"/>
+              <w:spacing w:before="120" w:after="120"/>
+              <w:jc w:val="left"/>
+              <w:rPr/>
+            </w:pPr>
+            <w:r>
+              <w:rPr>
+                <w:rStyle w:val="SourceText"/>
+              </w:rPr>
+              <w:t>dependency &lt;channel&gt;:&lt;id&gt; unknown: no claim for &lt;id&gt; on crew-coord/&lt;channel&gt;</w:t>
+            </w:r>
+          </w:p>
+        </w:tc>
+        <w:tc>
+          <w:tcPr>
+            <w:tcW w:w="3701" w:type="dxa"/>
+            <w:tcBorders/>
+            <w:vAlign w:val="center"/>
+          </w:tcPr>
+          <w:p>
+            <w:pPr>
+              <w:pStyle w:val="TableContents"/>
+              <w:shd w:fill="2E3440" w:val="clear"/>
+              <w:bidi w:val="0"/>
+              <w:spacing w:before="120" w:after="120"/>
+              <w:jc w:val="left"/>
+              <w:rPr/>
+            </w:pPr>
+            <w:r>
+              <w:rPr/>
+              <w:t>nobody on the channel has claimed that id</w:t>
+            </w:r>
+          </w:p>
+        </w:tc>
+        <w:tc>
+          <w:tcPr>
+            <w:tcW w:w="3658" w:type="dxa"/>
+            <w:tcBorders/>
+            <w:vAlign w:val="center"/>
+          </w:tcPr>
+          <w:p>
+            <w:pPr>
+              <w:pStyle w:val="TableContents"/>
+              <w:shd w:fill="2E3440" w:val="clear"/>
+              <w:bidi w:val="0"/>
+              <w:spacing w:before="120" w:after="120"/>
+              <w:jc w:val="left"/>
+              <w:rPr/>
+            </w:pPr>
+            <w:r>
+              <w:rPr/>
+              <w:t xml:space="preserve">check the id and channel with </w:t>
+            </w:r>
+            <w:r>
+              <w:rPr>
+                <w:rStyle w:val="SourceText"/>
+              </w:rPr>
+              <w:t>crew_coord.py status --channel &lt;channel&gt;</w:t>
+            </w:r>
+          </w:p>
+        </w:tc>
+      </w:tr>
+      <w:tr>
+        <w:trPr/>
+        <w:tc>
+          <w:tcPr>
+            <w:tcW w:w="4466" w:type="dxa"/>
+            <w:tcBorders/>
+            <w:vAlign w:val="center"/>
+          </w:tcPr>
+          <w:p>
+            <w:pPr>
+              <w:pStyle w:val="TableContents"/>
+              <w:shd w:fill="2E3440" w:val="clear"/>
+              <w:bidi w:val="0"/>
+              <w:spacing w:before="120" w:after="120"/>
+              <w:jc w:val="left"/>
+              <w:rPr/>
+            </w:pPr>
+            <w:r>
+              <w:rPr>
+                <w:rStyle w:val="SourceText"/>
+              </w:rPr>
+              <w:t>... unknown: 2 repositories on crew-coord/&lt;channel&gt; hold &lt;id&gt;; name one as &lt;channel&gt;:&lt;repo&gt;:&lt;id&gt;</w:t>
+            </w:r>
+          </w:p>
+        </w:tc>
+        <w:tc>
+          <w:tcPr>
+            <w:tcW w:w="3701" w:type="dxa"/>
+            <w:tcBorders/>
+            <w:vAlign w:val="center"/>
+          </w:tcPr>
+          <w:p>
+            <w:pPr>
+              <w:pStyle w:val="TableContents"/>
+              <w:shd w:fill="2E3440" w:val="clear"/>
+              <w:bidi w:val="0"/>
+              <w:spacing w:before="120" w:after="120"/>
+              <w:jc w:val="left"/>
+              <w:rPr/>
+            </w:pPr>
+            <w:r>
+              <w:rPr/>
+              <w:t>the short form is ambiguous</w:t>
+            </w:r>
+          </w:p>
+        </w:tc>
+        <w:tc>
+          <w:tcPr>
+            <w:tcW w:w="3658" w:type="dxa"/>
+            <w:tcBorders/>
+            <w:vAlign w:val="center"/>
+          </w:tcPr>
+          <w:p>
+            <w:pPr>
+              <w:pStyle w:val="TableContents"/>
+              <w:shd w:fill="2E3440" w:val="clear"/>
+              <w:bidi w:val="0"/>
+              <w:spacing w:before="120" w:after="120"/>
+              <w:jc w:val="left"/>
+              <w:rPr/>
+            </w:pPr>
+            <w:r>
+              <w:rPr/>
+              <w:t xml:space="preserve">write the long form, with the repo key </w:t>
+            </w:r>
+            <w:r>
+              <w:rPr>
+                <w:rStyle w:val="SourceText"/>
+              </w:rPr>
+              <w:t>status</w:t>
+            </w:r>
+            <w:r>
+              <w:rPr/>
+              <w:t xml:space="preserve"> prints</w:t>
+            </w:r>
+          </w:p>
+        </w:tc>
+      </w:tr>
+      <w:tr>
+        <w:trPr/>
+        <w:tc>
+          <w:tcPr>
+            <w:tcW w:w="4466" w:type="dxa"/>
+            <w:tcBorders/>
+            <w:vAlign w:val="center"/>
+          </w:tcPr>
+          <w:p>
+            <w:pPr>
+              <w:pStyle w:val="TableContents"/>
+              <w:shd w:fill="2E3440" w:val="clear"/>
+              <w:bidi w:val="0"/>
+              <w:spacing w:before="120" w:after="120"/>
+              <w:jc w:val="left"/>
+              <w:rPr/>
+            </w:pPr>
+            <w:r>
+              <w:rPr>
+                <w:rStyle w:val="SourceText"/>
+              </w:rPr>
+              <w:t>... unknown: its claim ... is corrupt (...)</w:t>
+            </w:r>
+          </w:p>
+        </w:tc>
+        <w:tc>
+          <w:tcPr>
+            <w:tcW w:w="3701" w:type="dxa"/>
+            <w:tcBorders/>
+            <w:vAlign w:val="center"/>
+          </w:tcPr>
+          <w:p>
+            <w:pPr>
+              <w:pStyle w:val="TableContents"/>
+              <w:shd w:fill="2E3440" w:val="clear"/>
+              <w:bidi w:val="0"/>
+              <w:spacing w:before="120" w:after="120"/>
+              <w:jc w:val="left"/>
+              <w:rPr/>
+            </w:pPr>
+            <w:r>
+              <w:rPr/>
+              <w:t>the claim file does not parse</w:t>
+            </w:r>
+          </w:p>
+        </w:tc>
+        <w:tc>
+          <w:tcPr>
+            <w:tcW w:w="3658" w:type="dxa"/>
+            <w:tcBorders/>
+            <w:vAlign w:val="center"/>
+          </w:tcPr>
+          <w:p>
+            <w:pPr>
+              <w:pStyle w:val="TableContents"/>
+              <w:shd w:fill="2E3440" w:val="clear"/>
+              <w:bidi w:val="0"/>
+              <w:spacing w:before="120" w:after="120"/>
+              <w:jc w:val="left"/>
+              <w:rPr/>
+            </w:pPr>
+            <w:r>
+              <w:rPr/>
+              <w:t>the claim's holder or the owner repairs it; the wave never guesses</w:t>
+            </w:r>
+          </w:p>
+        </w:tc>
+      </w:tr>
+      <w:tr>
+        <w:trPr/>
+        <w:tc>
+          <w:tcPr>
+            <w:tcW w:w="4466" w:type="dxa"/>
+            <w:tcBorders/>
+            <w:vAlign w:val="center"/>
+          </w:tcPr>
+          <w:p>
+            <w:pPr>
+              <w:pStyle w:val="TableContents"/>
+              <w:shd w:fill="2E3440" w:val="clear"/>
+              <w:bidi w:val="0"/>
+              <w:spacing w:before="120" w:after="120"/>
+              <w:jc w:val="left"/>
+              <w:rPr/>
+            </w:pPr>
+            <w:r>
+              <w:rPr>
+                <w:rStyle w:val="SourceText"/>
+              </w:rPr>
+              <w:t>... unknown: crew-coord/&lt;channel&gt; does not exist on &lt;remote&gt;</w:t>
+            </w:r>
+            <w:r>
+              <w:rPr/>
+              <w:t xml:space="preserve"> or </w:t>
+            </w:r>
+            <w:r>
+              <w:rPr>
+                <w:rStyle w:val="SourceText"/>
+              </w:rPr>
+              <w:t>could not fetch ...</w:t>
+            </w:r>
+          </w:p>
+        </w:tc>
+        <w:tc>
+          <w:tcPr>
+            <w:tcW w:w="3701" w:type="dxa"/>
+            <w:tcBorders/>
+            <w:vAlign w:val="center"/>
+          </w:tcPr>
+          <w:p>
+            <w:pPr>
+              <w:pStyle w:val="TableContents"/>
+              <w:shd w:fill="2E3440" w:val="clear"/>
+              <w:bidi w:val="0"/>
+              <w:spacing w:before="120" w:after="120"/>
+              <w:jc w:val="left"/>
+              <w:rPr/>
+            </w:pPr>
+            <w:r>
+              <w:rPr/>
+              <w:t>the channel is absent, or the remote cannot be reached</w:t>
+            </w:r>
+          </w:p>
+        </w:tc>
+        <w:tc>
+          <w:tcPr>
+            <w:tcW w:w="3658" w:type="dxa"/>
+            <w:tcBorders/>
+            <w:vAlign w:val="center"/>
+          </w:tcPr>
+          <w:p>
+            <w:pPr>
+              <w:pStyle w:val="TableContents"/>
+              <w:shd w:fill="2E3440" w:val="clear"/>
+              <w:bidi w:val="0"/>
+              <w:spacing w:before="120" w:after="120"/>
+              <w:jc w:val="left"/>
+              <w:rPr/>
+            </w:pPr>
+            <w:r>
+              <w:rPr/>
+              <w:t xml:space="preserve">check the channel name and </w:t>
+            </w:r>
+            <w:r>
+              <w:rPr>
+                <w:rStyle w:val="SourceText"/>
+              </w:rPr>
+              <w:t>coord.remote</w:t>
+            </w:r>
+            <w:r>
+              <w:rPr/>
+              <w:t>, then plan again</w:t>
+            </w:r>
+          </w:p>
+        </w:tc>
+      </w:tr>
+      <w:tr>
+        <w:trPr/>
+        <w:tc>
+          <w:tcPr>
+            <w:tcW w:w="4466" w:type="dxa"/>
+            <w:tcBorders/>
+            <w:vAlign w:val="center"/>
+          </w:tcPr>
+          <w:p>
+            <w:pPr>
+              <w:pStyle w:val="TableContents"/>
+              <w:shd w:fill="2E3440" w:val="clear"/>
+              <w:bidi w:val="0"/>
+              <w:spacing w:before="120" w:after="120"/>
+              <w:jc w:val="left"/>
+              <w:rPr/>
+            </w:pPr>
+            <w:r>
+              <w:rPr>
+                <w:rStyle w:val="SourceText"/>
+              </w:rPr>
+              <w:t>... unknown: '&lt;remote&gt;' (coord.remote) is not a configured remote</w:t>
+            </w:r>
+          </w:p>
+        </w:tc>
+        <w:tc>
+          <w:tcPr>
+            <w:tcW w:w="3701" w:type="dxa"/>
+            <w:tcBorders/>
+            <w:vAlign w:val="center"/>
+          </w:tcPr>
+          <w:p>
+            <w:pPr>
+              <w:pStyle w:val="TableContents"/>
+              <w:shd w:fill="2E3440" w:val="clear"/>
+              <w:bidi w:val="0"/>
+              <w:spacing w:before="120" w:after="120"/>
+              <w:jc w:val="left"/>
+              <w:rPr/>
+            </w:pPr>
+            <w:r>
+              <w:rPr>
+                <w:rStyle w:val="SourceText"/>
+              </w:rPr>
+              <w:t>coord.remote</w:t>
+            </w:r>
+            <w:r>
+              <w:rPr/>
+              <w:t xml:space="preserve"> names no remote of this checkout</w:t>
+            </w:r>
+          </w:p>
+        </w:tc>
+        <w:tc>
+          <w:tcPr>
+            <w:tcW w:w="3658" w:type="dxa"/>
+            <w:tcBorders/>
+            <w:vAlign w:val="center"/>
+          </w:tcPr>
+          <w:p>
+            <w:pPr>
+              <w:pStyle w:val="TableContents"/>
+              <w:shd w:fill="2E3440" w:val="clear"/>
+              <w:bidi w:val="0"/>
+              <w:spacing w:before="120" w:after="120"/>
+              <w:jc w:val="left"/>
+              <w:rPr/>
+            </w:pPr>
+            <w:r>
+              <w:rPr>
+                <w:rStyle w:val="SourceText"/>
+              </w:rPr>
+              <w:t>git remote add &lt;remote&gt; &lt;url&gt;</w:t>
+            </w:r>
+            <w:r>
+              <w:rPr/>
+              <w:t xml:space="preserve">, or fix </w:t>
+            </w:r>
+            <w:r>
+              <w:rPr>
+                <w:rStyle w:val="SourceText"/>
+              </w:rPr>
+              <w:t>coord.remote</w:t>
+            </w:r>
+          </w:p>
+        </w:tc>
+      </w:tr>
+      <w:tr>
+        <w:trPr/>
+        <w:tc>
+          <w:tcPr>
+            <w:tcW w:w="4466" w:type="dxa"/>
+            <w:tcBorders/>
+            <w:vAlign w:val="center"/>
+          </w:tcPr>
+          <w:p>
+            <w:pPr>
+              <w:pStyle w:val="TableContents"/>
+              <w:shd w:fill="2E3440" w:val="clear"/>
+              <w:bidi w:val="0"/>
+              <w:spacing w:before="120" w:after="120"/>
+              <w:jc w:val="left"/>
+              <w:rPr/>
+            </w:pPr>
+            <w:r>
+              <w:rPr>
+                <w:rStyle w:val="SourceText"/>
+              </w:rPr>
+              <w:t>dependencies unknown: ...</w:t>
+            </w:r>
+          </w:p>
+        </w:tc>
+        <w:tc>
+          <w:tcPr>
+            <w:tcW w:w="3701" w:type="dxa"/>
+            <w:tcBorders/>
+            <w:vAlign w:val="center"/>
+          </w:tcPr>
+          <w:p>
+            <w:pPr>
+              <w:pStyle w:val="TableContents"/>
+              <w:shd w:fill="2E3440" w:val="clear"/>
+              <w:bidi w:val="0"/>
+              <w:spacing w:before="120" w:after="120"/>
+              <w:jc w:val="left"/>
+              <w:rPr/>
+            </w:pPr>
+            <w:r>
+              <w:rPr/>
+              <w:t xml:space="preserve">a dependency is not </w:t>
+            </w:r>
+            <w:r>
+              <w:rPr>
+                <w:rStyle w:val="SourceText"/>
+              </w:rPr>
+              <w:t>&lt;id&gt;</w:t>
+            </w:r>
+            <w:r>
+              <w:rPr/>
+              <w:t xml:space="preserve">, </w:t>
+            </w:r>
+            <w:r>
+              <w:rPr>
+                <w:rStyle w:val="SourceText"/>
+              </w:rPr>
+              <w:t>&lt;channel&gt;:&lt;id&gt;</w:t>
+            </w:r>
+            <w:r>
+              <w:rPr/>
+              <w:t xml:space="preserve"> or </w:t>
+            </w:r>
+            <w:r>
+              <w:rPr>
+                <w:rStyle w:val="SourceText"/>
+              </w:rPr>
+              <w:t>&lt;channel&gt;:&lt;repo&gt;:&lt;id&gt;</w:t>
+            </w:r>
+          </w:p>
+        </w:tc>
+        <w:tc>
+          <w:tcPr>
+            <w:tcW w:w="3658" w:type="dxa"/>
+            <w:tcBorders/>
+            <w:vAlign w:val="center"/>
+          </w:tcPr>
+          <w:p>
+            <w:pPr>
+              <w:pStyle w:val="TableContents"/>
+              <w:shd w:fill="2E3440" w:val="clear"/>
+              <w:bidi w:val="0"/>
+              <w:spacing w:before="120" w:after="120"/>
+              <w:jc w:val="left"/>
+              <w:rPr/>
+            </w:pPr>
+            <w:r>
+              <w:rPr/>
+              <w:t xml:space="preserve">fix the set file's </w:t>
+            </w:r>
+            <w:r>
+              <w:rPr>
+                <w:rStyle w:val="SourceText"/>
+              </w:rPr>
+              <w:t>deps</w:t>
+            </w:r>
+            <w:r>
+              <w:rPr/>
+              <w:t xml:space="preserve"> or the INDEX row; </w:t>
+            </w:r>
+            <w:r>
+              <w:rPr>
+                <w:rStyle w:val="SourceText"/>
+              </w:rPr>
+              <w:t>crew_wave.py set</w:t>
+            </w:r>
+            <w:r>
+              <w:rPr/>
+              <w:t xml:space="preserve"> refuses a malformed one</w:t>
+            </w:r>
+          </w:p>
+        </w:tc>
+      </w:tr>
+    </w:tbl>
+    <w:p>
+      <w:pPr>
+        <w:pStyle w:val="Heading2"/>
+        <w:bidi w:val="0"/>
+        <w:ind w:hanging="0" w:left="0" w:right="0"/>
+        <w:jc w:val="left"/>
+        <w:rPr/>
+      </w:pPr>
+      <w:bookmarkStart w:id="8" w:name="promote-gate-blocks-a-worktree-deploy"/>
+      <w:bookmarkEnd w:id="8"/>
       <w:r>
         <w:rPr/>
         <w:t>Promote Gate Blocks a Worktree Deploy</w:t>
@@ -7385,8 +8272,8 @@
         <w:jc w:val="left"/>
         <w:rPr/>
       </w:pPr>
-      <w:bookmarkStart w:id="8" w:name="cloud-guard-false-positives"/>
-      <w:bookmarkEnd w:id="8"/>
+      <w:bookmarkStart w:id="9" w:name="cloud-guard-false-positives"/>
+      <w:bookmarkEnd w:id="9"/>
       <w:r>
         <w:rPr/>
         <w:t>Cloud Guard False Positives</w:t>
@@ -8067,8 +8954,8 @@
         <w:jc w:val="left"/>
         <w:rPr/>
       </w:pPr>
-      <w:bookmarkStart w:id="9" w:name="obsidian"/>
-      <w:bookmarkEnd w:id="9"/>
+      <w:bookmarkStart w:id="10" w:name="obsidian"/>
+      <w:bookmarkEnd w:id="10"/>
       <w:r>
         <w:rPr/>
         <w:t>Obsidian</w:t>
@@ -8810,6 +9697,64 @@
         <w:rPr>
           <w:rStyle w:val="Strong"/>
         </w:rPr>
+        <w:t>An older crew wrote the note's id lowercased.</w:t>
+      </w:r>
+      <w:r>
+        <w:rPr/>
+        <w:t xml:space="preserve"> </w:t>
+      </w:r>
+      <w:r>
+        <w:rPr>
+          <w:rStyle w:val="SourceText"/>
+        </w:rPr>
+        <w:t>obsidian: could not update: T-0042 on Board.md belongs to another repo (https://example.invalid/team/app, per T-0042.md), not this one (https://example.invalid/Team/App): give this repo its own obsidian.boardDir; the note may carry this repo's id as an older crew wrote it (lowercased): if the card is this repo's, change the line to 'repo-id: https://example.invalid/Team/App'</w:t>
+      </w:r>
+      <w:r>
+        <w:rPr/>
+        <w:t xml:space="preserve"> </w:t>
+      </w:r>
+      <w:r>
+        <w:rPr>
+          <w:rStyle w:val="Strong"/>
+        </w:rPr>
+        <w:t>Fix:</w:t>
+      </w:r>
+      <w:r>
+        <w:rPr/>
+        <w:t xml:space="preserve"> since T-0071 an origin keeps the case of its user and path. If the card is yours, change the note's </w:t>
+      </w:r>
+      <w:r>
+        <w:rPr>
+          <w:rStyle w:val="SourceText"/>
+        </w:rPr>
+        <w:t>repo-id:</w:t>
+      </w:r>
+      <w:r>
+        <w:rPr/>
+        <w:t xml:space="preserve"> line to the id it names. </w:t>
+      </w:r>
+    </w:p>
+    <w:p>
+      <w:pPr>
+        <w:pStyle w:val="BodyText"/>
+        <w:numPr>
+          <w:ilvl w:val="1"/>
+          <w:numId w:val="21"/>
+        </w:numPr>
+        <w:tabs>
+          <w:tab w:val="clear" w:pos="1134"/>
+          <w:tab w:val="left" w:pos="1538" w:leader="none"/>
+        </w:tabs>
+        <w:bidi w:val="0"/>
+        <w:spacing w:before="120" w:after="0"/>
+        <w:ind w:hanging="283" w:left="1538"/>
+        <w:jc w:val="left"/>
+        <w:rPr/>
+      </w:pPr>
+      <w:r>
+        <w:rPr>
+          <w:rStyle w:val="Strong"/>
+        </w:rPr>
         <w:t>Nobody can tell who owns it.</w:t>
       </w:r>
       <w:r>
@@ -8972,8 +9917,8 @@
         <w:jc w:val="left"/>
         <w:rPr/>
       </w:pPr>
-      <w:bookmarkStart w:id="10" w:name="auto-wrap-up-clear-and-resume"/>
-      <w:bookmarkEnd w:id="10"/>
+      <w:bookmarkStart w:id="11" w:name="auto-wrap-up-clear-and-resume"/>
+      <w:bookmarkEnd w:id="11"/>
       <w:r>
         <w:rPr/>
         <w:t>Auto Wrap-Up, Clear and Resume</w:t>
@@ -9021,8 +9966,8 @@
         <w:jc w:val="left"/>
         <w:rPr/>
       </w:pPr>
-      <w:bookmarkStart w:id="11" w:name="auto-clear-did-nothing-on-windows"/>
-      <w:bookmarkEnd w:id="11"/>
+      <w:bookmarkStart w:id="12" w:name="auto-clear-did-nothing-on-windows"/>
+      <w:bookmarkEnd w:id="12"/>
       <w:r>
         <w:rPr/>
         <w:t>"Auto-Clear Did Nothing on Windows"</w:t>
@@ -9333,8 +10278,8 @@
         <w:jc w:val="left"/>
         <w:rPr/>
       </w:pPr>
-      <w:bookmarkStart w:id="12" w:name="claude-code-compacted-by-itself"/>
-      <w:bookmarkEnd w:id="12"/>
+      <w:bookmarkStart w:id="13" w:name="claude-code-compacted-by-itself"/>
+      <w:bookmarkEnd w:id="13"/>
       <w:r>
         <w:rPr/>
         <w:t>"Claude Code Compacted by Itself"</w:t>
@@ -9506,8 +10451,658 @@
         <w:jc w:val="left"/>
         <w:rPr/>
       </w:pPr>
-      <w:bookmarkStart w:id="13" w:name="turning-things-off"/>
-      <w:bookmarkEnd w:id="13"/>
+      <w:bookmarkStart w:id="14" w:name="graph-refresh-refused-secrets-denylisted"/>
+      <w:bookmarkEnd w:id="14"/>
+      <w:r>
+        <w:rPr/>
+        <w:t>Graph Refresh Refused: Secrets-Denylisted Path</w:t>
+      </w:r>
+    </w:p>
+    <w:p>
+      <w:pPr>
+        <w:pStyle w:val="BodyText"/>
+        <w:bidi w:val="0"/>
+        <w:jc w:val="left"/>
+        <w:rPr/>
+      </w:pPr>
+      <w:r>
+        <w:rPr/>
+        <w:t xml:space="preserve">graphify reads every file its ignore rules do not exclude and records the symbols it finds in </w:t>
+      </w:r>
+      <w:r>
+        <w:rPr>
+          <w:rStyle w:val="SourceText"/>
+        </w:rPr>
+        <w:t>graph.json</w:t>
+      </w:r>
+      <w:r>
+        <w:rPr/>
+        <w:t xml:space="preserve">. For a file git tracks, </w:t>
+      </w:r>
+      <w:r>
+        <w:rPr>
+          <w:rStyle w:val="SourceText"/>
+        </w:rPr>
+        <w:t>.gitignore</w:t>
+      </w:r>
+      <w:r>
+        <w:rPr/>
+        <w:t xml:space="preserve"> does not stop it: only </w:t>
+      </w:r>
+      <w:r>
+        <w:rPr>
+          <w:rStyle w:val="SourceText"/>
+        </w:rPr>
+        <w:t>.graphifyignore</w:t>
+      </w:r>
+      <w:r>
+        <w:rPr/>
+        <w:t xml:space="preserve"> does. So crew checks, before it names or runs a graph build, that the root </w:t>
+      </w:r>
+      <w:r>
+        <w:rPr>
+          <w:rStyle w:val="SourceText"/>
+        </w:rPr>
+        <w:t>.graphifyignore</w:t>
+      </w:r>
+      <w:r>
+        <w:rPr/>
+        <w:t xml:space="preserve"> excludes every file the secrets denylist matches.</w:t>
+      </w:r>
+    </w:p>
+    <w:p>
+      <w:pPr>
+        <w:pStyle w:val="BodyText"/>
+        <w:numPr>
+          <w:ilvl w:val="0"/>
+          <w:numId w:val="23"/>
+        </w:numPr>
+        <w:tabs>
+          <w:tab w:val="clear" w:pos="1134"/>
+          <w:tab w:val="left" w:pos="829" w:leader="none"/>
+        </w:tabs>
+        <w:bidi w:val="0"/>
+        <w:ind w:hanging="283" w:left="829"/>
+        <w:jc w:val="left"/>
+        <w:rPr/>
+      </w:pPr>
+      <w:r>
+        <w:rPr>
+          <w:rStyle w:val="Strong"/>
+        </w:rPr>
+        <w:t xml:space="preserve">Symptom: </w:t>
+      </w:r>
+      <w:r>
+        <w:rPr>
+          <w:rStyle w:val="SourceText"/>
+        </w:rPr>
+        <w:t>refresh-check</w:t>
+      </w:r>
+      <w:r>
+        <w:rPr>
+          <w:rStyle w:val="Strong"/>
+        </w:rPr>
+        <w:t xml:space="preserve"> prints </w:t>
+      </w:r>
+      <w:r>
+        <w:rPr>
+          <w:rStyle w:val="SourceText"/>
+        </w:rPr>
+        <w:t>graph graphify-out: unknown - graphify would read N secrets-denylisted path(s) .graphifyignore does not exclude: ...; stop - a refresh cannot settle this</w:t>
+      </w:r>
+      <w:r>
+        <w:rPr>
+          <w:rStyle w:val="Strong"/>
+        </w:rPr>
+        <w:t>,</w:t>
+      </w:r>
+      <w:r>
+        <w:rPr/>
+        <w:t xml:space="preserve"> or </w:t>
+      </w:r>
+      <w:r>
+        <w:rPr>
+          <w:rStyle w:val="SourceText"/>
+        </w:rPr>
+        <w:t>/crew:status</w:t>
+      </w:r>
+      <w:r>
+        <w:rPr/>
+        <w:t xml:space="preserve"> prints </w:t>
+      </w:r>
+      <w:r>
+        <w:rPr>
+          <w:rStyle w:val="SourceText"/>
+        </w:rPr>
+        <w:t>graph-ignore UNCOVERED</w:t>
+      </w:r>
+      <w:r>
+        <w:rPr/>
+        <w:t xml:space="preserve">. </w:t>
+      </w:r>
+      <w:r>
+        <w:rPr>
+          <w:rStyle w:val="Strong"/>
+        </w:rPr>
+        <w:t>Check:</w:t>
+      </w:r>
+      <w:r>
+        <w:rPr/>
+        <w:t xml:space="preserve"> which files, and from which source. </w:t>
+      </w:r>
+    </w:p>
+    <w:p>
+      <w:pPr>
+        <w:pStyle w:val="PreformattedText"/>
+        <w:bidi w:val="0"/>
+        <w:jc w:val="left"/>
+        <w:rPr/>
+      </w:pPr>
+      <w:r>
+        <w:rPr>
+          <w:rStyle w:val="SourceText"/>
+        </w:rPr>
+        <w:t>python3 "&lt;crew&gt;/hooks/scripts/crew_graph_ignore.py" --root . --check --json</w:t>
+      </w:r>
+    </w:p>
+    <w:p>
+      <w:pPr>
+        <w:pStyle w:val="BodyText"/>
+        <w:bidi w:val="0"/>
+        <w:jc w:val="left"/>
+        <w:rPr/>
+      </w:pPr>
+      <w:r>
+        <w:rPr/>
+        <w:t>The denylist is the built-in patterns (</w:t>
+      </w:r>
+      <w:r>
+        <w:rPr>
+          <w:rStyle w:val="SourceText"/>
+        </w:rPr>
+        <w:t>.env</w:t>
+      </w:r>
+      <w:r>
+        <w:rPr/>
+        <w:t xml:space="preserve">, </w:t>
+      </w:r>
+      <w:r>
+        <w:rPr>
+          <w:rStyle w:val="SourceText"/>
+        </w:rPr>
+        <w:t>.env.*</w:t>
+      </w:r>
+      <w:r>
+        <w:rPr/>
+        <w:t xml:space="preserve"> but not </w:t>
+      </w:r>
+      <w:r>
+        <w:rPr>
+          <w:rStyle w:val="SourceText"/>
+        </w:rPr>
+        <w:t>.env.example</w:t>
+      </w:r>
+      <w:r>
+        <w:rPr/>
+        <w:t xml:space="preserve">, </w:t>
+      </w:r>
+      <w:r>
+        <w:rPr>
+          <w:rStyle w:val="SourceText"/>
+        </w:rPr>
+        <w:t>*.pem</w:t>
+      </w:r>
+      <w:r>
+        <w:rPr/>
+        <w:t xml:space="preserve">, </w:t>
+      </w:r>
+      <w:r>
+        <w:rPr>
+          <w:rStyle w:val="SourceText"/>
+        </w:rPr>
+        <w:t>*.key</w:t>
+      </w:r>
+      <w:r>
+        <w:rPr/>
+        <w:t xml:space="preserve">, </w:t>
+      </w:r>
+      <w:r>
+        <w:rPr>
+          <w:rStyle w:val="SourceText"/>
+        </w:rPr>
+        <w:t>*.p12</w:t>
+      </w:r>
+      <w:r>
+        <w:rPr/>
+        <w:t xml:space="preserve">, </w:t>
+      </w:r>
+      <w:r>
+        <w:rPr>
+          <w:rStyle w:val="SourceText"/>
+        </w:rPr>
+        <w:t>*.pfx</w:t>
+      </w:r>
+      <w:r>
+        <w:rPr/>
+        <w:t xml:space="preserve">, </w:t>
+      </w:r>
+      <w:r>
+        <w:rPr>
+          <w:rStyle w:val="SourceText"/>
+        </w:rPr>
+        <w:t>id_rsa*</w:t>
+      </w:r>
+      <w:r>
+        <w:rPr/>
+        <w:t xml:space="preserve">, </w:t>
+      </w:r>
+      <w:r>
+        <w:rPr>
+          <w:rStyle w:val="SourceText"/>
+        </w:rPr>
+        <w:t>id_ed25519*</w:t>
+      </w:r>
+      <w:r>
+        <w:rPr/>
+        <w:t xml:space="preserve">), </w:t>
+      </w:r>
+      <w:r>
+        <w:rPr>
+          <w:rStyle w:val="SourceText"/>
+        </w:rPr>
+        <w:t>.claude/secrets-denylist</w:t>
+      </w:r>
+      <w:r>
+        <w:rPr/>
+        <w:t xml:space="preserve"> if it exists, and every in-repo </w:t>
+      </w:r>
+      <w:r>
+        <w:rPr>
+          <w:rStyle w:val="SourceText"/>
+        </w:rPr>
+        <w:t>Read(...)</w:t>
+      </w:r>
+      <w:r>
+        <w:rPr/>
+        <w:t xml:space="preserve"> rule in </w:t>
+      </w:r>
+      <w:r>
+        <w:rPr>
+          <w:rStyle w:val="SourceText"/>
+        </w:rPr>
+        <w:t>permissions.deny</w:t>
+      </w:r>
+      <w:r>
+        <w:rPr/>
+        <w:t xml:space="preserve"> of </w:t>
+      </w:r>
+      <w:r>
+        <w:rPr>
+          <w:rStyle w:val="SourceText"/>
+        </w:rPr>
+        <w:t>.claude/settings.json</w:t>
+      </w:r>
+      <w:r>
+        <w:rPr/>
+        <w:t xml:space="preserve"> and </w:t>
+      </w:r>
+      <w:r>
+        <w:rPr>
+          <w:rStyle w:val="SourceText"/>
+        </w:rPr>
+        <w:t>.claude/settings.local.json</w:t>
+      </w:r>
+      <w:r>
+        <w:rPr/>
+        <w:t xml:space="preserve">. </w:t>
+      </w:r>
+      <w:r>
+        <w:rPr>
+          <w:rStyle w:val="SourceText"/>
+        </w:rPr>
+        <w:t>sources</w:t>
+      </w:r>
+      <w:r>
+        <w:rPr/>
+        <w:t xml:space="preserve"> in the JSON names which ones were read. </w:t>
+      </w:r>
+      <w:r>
+        <w:rPr>
+          <w:rStyle w:val="Strong"/>
+        </w:rPr>
+        <w:t>Fix:</w:t>
+      </w:r>
+      <w:r>
+        <w:rPr/>
+        <w:t xml:space="preserve"> add the missing patterns, then check again.</w:t>
+      </w:r>
+    </w:p>
+    <w:p>
+      <w:pPr>
+        <w:pStyle w:val="PreformattedText"/>
+        <w:bidi w:val="0"/>
+        <w:jc w:val="left"/>
+        <w:rPr/>
+      </w:pPr>
+      <w:r>
+        <w:rPr>
+          <w:rStyle w:val="SourceText"/>
+        </w:rPr>
+        <w:t>python3 "&lt;crew&gt;/hooks/scripts/crew_graph_ignore.py" --root . --write</w:t>
+      </w:r>
+    </w:p>
+    <w:p>
+      <w:pPr>
+        <w:pStyle w:val="BodyText"/>
+        <w:bidi w:val="0"/>
+        <w:jc w:val="left"/>
+        <w:rPr/>
+      </w:pPr>
+      <w:r>
+        <w:rPr/>
+        <w:t xml:space="preserve">It appends the missing patterns, then any flagged path they still miss (the denylist ignores case, </w:t>
+      </w:r>
+      <w:r>
+        <w:rPr>
+          <w:rStyle w:val="SourceText"/>
+        </w:rPr>
+        <w:t>.graphifyignore</w:t>
+      </w:r>
+      <w:r>
+        <w:rPr/>
+        <w:t xml:space="preserve"> does not, so </w:t>
+      </w:r>
+      <w:r>
+        <w:rPr>
+          <w:rStyle w:val="SourceText"/>
+        </w:rPr>
+        <w:t>.ENV</w:t>
+      </w:r>
+      <w:r>
+        <w:rPr/>
+        <w:t xml:space="preserve"> gets </w:t>
+      </w:r>
+      <w:r>
+        <w:rPr>
+          <w:rStyle w:val="SourceText"/>
+        </w:rPr>
+        <w:t>/.ENV</w:t>
+      </w:r>
+      <w:r>
+        <w:rPr/>
+        <w:t xml:space="preserve">), under one marked block, and leaves every existing line as it was. Commit </w:t>
+      </w:r>
+      <w:r>
+        <w:rPr>
+          <w:rStyle w:val="SourceText"/>
+        </w:rPr>
+        <w:t>.graphifyignore</w:t>
+      </w:r>
+      <w:r>
+        <w:rPr/>
+        <w:t xml:space="preserve">, then re-run the refresh check. If it prints </w:t>
+      </w:r>
+      <w:r>
+        <w:rPr>
+          <w:rStyle w:val="SourceText"/>
+        </w:rPr>
+        <w:t>line N (`!pattern`) re-includes denylisted &lt;path&gt;; remove that line or accept the exposure</w:t>
+      </w:r>
+      <w:r>
+        <w:rPr/>
+        <w:t xml:space="preserve"> and exits 1, your own </w:t>
+      </w:r>
+      <w:r>
+        <w:rPr>
+          <w:rStyle w:val="SourceText"/>
+        </w:rPr>
+        <w:t>!</w:t>
+      </w:r>
+      <w:r>
+        <w:rPr/>
+        <w:t xml:space="preserve"> line is the reason: </w:t>
+      </w:r>
+      <w:r>
+        <w:rPr>
+          <w:rStyle w:val="SourceText"/>
+        </w:rPr>
+        <w:t>--write</w:t>
+      </w:r>
+      <w:r>
+        <w:rPr/>
+        <w:t xml:space="preserve"> never overrides it. Delete the line, or keep it and accept that graphify reads that file. A path that is not one line of plain text (a name holding a line break or other control character) is never written either; it stays named, escaped, by </w:t>
+      </w:r>
+      <w:r>
+        <w:rPr>
+          <w:rStyle w:val="SourceText"/>
+        </w:rPr>
+        <w:t>--check</w:t>
+      </w:r>
+      <w:r>
+        <w:rPr/>
+        <w:t>: rename the file or exclude it by hand.</w:t>
+      </w:r>
+    </w:p>
+    <w:p>
+      <w:pPr>
+        <w:pStyle w:val="BodyText"/>
+        <w:numPr>
+          <w:ilvl w:val="0"/>
+          <w:numId w:val="24"/>
+        </w:numPr>
+        <w:tabs>
+          <w:tab w:val="clear" w:pos="1134"/>
+          <w:tab w:val="left" w:pos="829" w:leader="none"/>
+        </w:tabs>
+        <w:bidi w:val="0"/>
+        <w:ind w:hanging="283" w:left="829"/>
+        <w:jc w:val="left"/>
+        <w:rPr/>
+      </w:pPr>
+      <w:r>
+        <w:rPr>
+          <w:rStyle w:val="Strong"/>
+        </w:rPr>
+        <w:t xml:space="preserve">Symptom: </w:t>
+      </w:r>
+      <w:r>
+        <w:rPr>
+          <w:rStyle w:val="SourceText"/>
+        </w:rPr>
+        <w:t>denylist coverage unknown: &lt;reason&gt;</w:t>
+      </w:r>
+      <w:r>
+        <w:rPr/>
+        <w:t xml:space="preserve"> (the refresh check) or </w:t>
+      </w:r>
+      <w:r>
+        <w:rPr>
+          <w:rStyle w:val="SourceText"/>
+        </w:rPr>
+        <w:t>graph-ignore unknown</w:t>
+      </w:r>
+      <w:r>
+        <w:rPr/>
+        <w:t xml:space="preserve"> (</w:t>
+      </w:r>
+      <w:r>
+        <w:rPr>
+          <w:rStyle w:val="SourceText"/>
+        </w:rPr>
+        <w:t>/crew:status</w:t>
+      </w:r>
+      <w:r>
+        <w:rPr/>
+        <w:t xml:space="preserve">). </w:t>
+      </w:r>
+      <w:r>
+        <w:rPr>
+          <w:rStyle w:val="Strong"/>
+        </w:rPr>
+        <w:t>Check:</w:t>
+      </w:r>
+      <w:r>
+        <w:rPr/>
+        <w:t xml:space="preserve"> the reason names it: git missing, a settings file that does not parse, an unreadable </w:t>
+      </w:r>
+      <w:r>
+        <w:rPr>
+          <w:rStyle w:val="SourceText"/>
+        </w:rPr>
+        <w:t>.claude/secrets-denylist</w:t>
+      </w:r>
+      <w:r>
+        <w:rPr/>
+        <w:t xml:space="preserve"> or </w:t>
+      </w:r>
+      <w:r>
+        <w:rPr>
+          <w:rStyle w:val="SourceText"/>
+        </w:rPr>
+        <w:t>.graphifyignore</w:t>
+      </w:r>
+      <w:r>
+        <w:rPr/>
+        <w:t xml:space="preserve">, a nested </w:t>
+      </w:r>
+      <w:r>
+        <w:rPr>
+          <w:rStyle w:val="SourceText"/>
+        </w:rPr>
+        <w:t>.graphifyignore</w:t>
+      </w:r>
+      <w:r>
+        <w:rPr/>
+        <w:t xml:space="preserve"> (only the root one is evaluated, and a nested one could re-include a file with </w:t>
+      </w:r>
+      <w:r>
+        <w:rPr>
+          <w:rStyle w:val="SourceText"/>
+        </w:rPr>
+        <w:t>!</w:t>
+      </w:r>
+      <w:r>
+        <w:rPr/>
+        <w:t xml:space="preserve">), a nested repository or submodule </w:t>
+      </w:r>
+      <w:r>
+        <w:rPr>
+          <w:rStyle w:val="SourceText"/>
+        </w:rPr>
+        <w:t>.graphifyignore</w:t>
+      </w:r>
+      <w:r>
+        <w:rPr/>
+        <w:t xml:space="preserve"> does not exclude, a symlink that resolves outside the repository or not at all, or a deny-all </w:t>
+      </w:r>
+      <w:r>
+        <w:rPr>
+          <w:rStyle w:val="SourceText"/>
+        </w:rPr>
+        <w:t>Read</w:t>
+      </w:r>
+      <w:r>
+        <w:rPr/>
+        <w:t xml:space="preserve"> rule. </w:t>
+      </w:r>
+      <w:r>
+        <w:rPr>
+          <w:rStyle w:val="Strong"/>
+        </w:rPr>
+        <w:t>Fix:</w:t>
+      </w:r>
+      <w:r>
+        <w:rPr/>
+        <w:t xml:space="preserve"> repair what it names. An unknown is never read as covered, so no refresh is named until it is fixed.</w:t>
+      </w:r>
+    </w:p>
+    <w:p>
+      <w:pPr>
+        <w:pStyle w:val="BodyText"/>
+        <w:numPr>
+          <w:ilvl w:val="0"/>
+          <w:numId w:val="24"/>
+        </w:numPr>
+        <w:tabs>
+          <w:tab w:val="clear" w:pos="1134"/>
+          <w:tab w:val="left" w:pos="829" w:leader="none"/>
+        </w:tabs>
+        <w:bidi w:val="0"/>
+        <w:ind w:hanging="283" w:left="829"/>
+        <w:jc w:val="left"/>
+        <w:rPr/>
+      </w:pPr>
+      <w:r>
+        <w:rPr>
+          <w:rStyle w:val="Strong"/>
+        </w:rPr>
+        <w:t>Symptom: a graph was built before the fix</w:t>
+      </w:r>
+      <w:r>
+        <w:rPr/>
+        <w:t xml:space="preserve"> (by hand, or by graphify's post-commit hook, which bypasses crew). </w:t>
+      </w:r>
+      <w:r>
+        <w:rPr>
+          <w:rStyle w:val="Strong"/>
+        </w:rPr>
+        <w:t>Fix:</w:t>
+      </w:r>
+      <w:r>
+        <w:rPr/>
+        <w:t xml:space="preserve"> treat that graph as holding text from the secret files. Delete the graph output directory (</w:t>
+      </w:r>
+      <w:r>
+        <w:rPr>
+          <w:rStyle w:val="SourceText"/>
+        </w:rPr>
+        <w:t>graphify-out/</w:t>
+      </w:r>
+      <w:r>
+        <w:rPr/>
+        <w:t xml:space="preserve"> by default), run </w:t>
+      </w:r>
+      <w:r>
+        <w:rPr>
+          <w:rStyle w:val="SourceText"/>
+        </w:rPr>
+        <w:t>--write</w:t>
+      </w:r>
+      <w:r>
+        <w:rPr/>
+        <w:t xml:space="preserve">, check that </w:t>
+      </w:r>
+      <w:r>
+        <w:rPr>
+          <w:rStyle w:val="SourceText"/>
+        </w:rPr>
+        <w:t>--check</w:t>
+      </w:r>
+      <w:r>
+        <w:rPr/>
+        <w:t xml:space="preserve"> exits 0, then rebuild. Commit the rebuild if the output is tracked. The crew-graph skill's </w:t>
+      </w:r>
+      <w:r>
+        <w:rPr>
+          <w:rStyle w:val="Strong"/>
+        </w:rPr>
+        <w:t>Tainted graph</w:t>
+      </w:r>
+      <w:r>
+        <w:rPr/>
+        <w:t xml:space="preserve"> section has the same steps.</w:t>
+      </w:r>
+    </w:p>
+    <w:p>
+      <w:pPr>
+        <w:pStyle w:val="Heading2"/>
+        <w:bidi w:val="0"/>
+        <w:ind w:hanging="0" w:left="0" w:right="0"/>
+        <w:jc w:val="left"/>
+        <w:rPr/>
+      </w:pPr>
+      <w:bookmarkStart w:id="15" w:name="turning-things-off"/>
+      <w:bookmarkEnd w:id="15"/>
       <w:r>
         <w:rPr/>
         <w:t>Turning Things Off</w:t>
@@ -11317,8 +12912,8 @@
         <w:jc w:val="left"/>
         <w:rPr/>
       </w:pPr>
-      <w:bookmarkStart w:id="14" w:name="web-testing"/>
-      <w:bookmarkEnd w:id="14"/>
+      <w:bookmarkStart w:id="16" w:name="web-testing"/>
+      <w:bookmarkEnd w:id="16"/>
       <w:r>
         <w:rPr/>
         <w:t>Web Testing</w:t>
@@ -11357,7 +12952,7 @@
         <w:pStyle w:val="BodyText"/>
         <w:numPr>
           <w:ilvl w:val="0"/>
-          <w:numId w:val="23"/>
+          <w:numId w:val="25"/>
         </w:numPr>
         <w:tabs>
           <w:tab w:val="clear" w:pos="1134"/>
@@ -11431,7 +13026,7 @@
         <w:pStyle w:val="BodyText"/>
         <w:numPr>
           <w:ilvl w:val="0"/>
-          <w:numId w:val="23"/>
+          <w:numId w:val="25"/>
         </w:numPr>
         <w:tabs>
           <w:tab w:val="clear" w:pos="1134"/>
@@ -11482,609 +13077,6 @@
       <w:r>
         <w:rPr/>
         <w:t xml:space="preserve">) skips the OS packages Chromium needs and produces a browser that launches, then crashes on first navigation. </w:t>
-      </w:r>
-    </w:p>
-    <w:p>
-      <w:pPr>
-        <w:pStyle w:val="BodyText"/>
-        <w:numPr>
-          <w:ilvl w:val="0"/>
-          <w:numId w:val="23"/>
-        </w:numPr>
-        <w:tabs>
-          <w:tab w:val="clear" w:pos="1134"/>
-          <w:tab w:val="left" w:pos="829" w:leader="none"/>
-        </w:tabs>
-        <w:bidi w:val="0"/>
-        <w:spacing w:before="120" w:after="0"/>
-        <w:ind w:hanging="283" w:left="829"/>
-        <w:jc w:val="left"/>
-        <w:rPr/>
-      </w:pPr>
-      <w:r>
-        <w:rPr>
-          <w:rStyle w:val="Strong"/>
-        </w:rPr>
-        <w:t>Docker absent -&gt; visual UNVERIFIED, not a fail.</w:t>
-      </w:r>
-      <w:r>
-        <w:rPr/>
-        <w:t xml:space="preserve"> </w:t>
-      </w:r>
-      <w:r>
-        <w:rPr>
-          <w:rStyle w:val="SourceText"/>
-        </w:rPr>
-        <w:t>toHaveScreenshot</w:t>
-      </w:r>
-      <w:r>
-        <w:rPr/>
-        <w:t xml:space="preserve"> baselines are only meaningful when generated inside </w:t>
-      </w:r>
-      <w:r>
-        <w:rPr>
-          <w:rStyle w:val="SourceText"/>
-        </w:rPr>
-        <w:t>mcr.microsoft.com/playwright:v1.63.0-noble</w:t>
-      </w:r>
-      <w:r>
-        <w:rPr/>
-        <w:t xml:space="preserve"> — the installer warns rather than blocking when Docker is missing, and the visual </w:t>
-      </w:r>
-      <w:r>
-        <w:rPr>
-          <w:rStyle w:val="SourceText"/>
-        </w:rPr>
-        <w:t>verify.json</w:t>
-      </w:r>
-      <w:r>
-        <w:rPr/>
-        <w:t xml:space="preserve"> rule is written to skip (report UNVERIFIED) outside that image rather than compare against a baseline that can never match. </w:t>
-      </w:r>
-    </w:p>
-    <w:p>
-      <w:pPr>
-        <w:pStyle w:val="BodyText"/>
-        <w:numPr>
-          <w:ilvl w:val="0"/>
-          <w:numId w:val="23"/>
-        </w:numPr>
-        <w:tabs>
-          <w:tab w:val="clear" w:pos="1134"/>
-          <w:tab w:val="left" w:pos="829" w:leader="none"/>
-        </w:tabs>
-        <w:bidi w:val="0"/>
-        <w:ind w:hanging="283" w:left="829"/>
-        <w:jc w:val="left"/>
-        <w:rPr/>
-      </w:pPr>
-      <w:r>
-        <w:rPr>
-          <w:rStyle w:val="Strong"/>
-        </w:rPr>
-        <w:t>MCP server won't connect on Windows.</w:t>
-      </w:r>
-      <w:r>
-        <w:rPr/>
-        <w:t xml:space="preserve"> Both </w:t>
-      </w:r>
-      <w:r>
-        <w:rPr>
-          <w:rStyle w:val="SourceText"/>
-        </w:rPr>
-        <w:t>@playwright/mcp</w:t>
-      </w:r>
-      <w:r>
-        <w:rPr/>
-        <w:t xml:space="preserve"> and </w:t>
-      </w:r>
-      <w:r>
-        <w:rPr>
-          <w:rStyle w:val="SourceText"/>
-        </w:rPr>
-        <w:t>chrome-devtools-mcp</w:t>
-      </w:r>
-      <w:r>
-        <w:rPr/>
-        <w:t xml:space="preserve"> are launched with </w:t>
-      </w:r>
-      <w:r>
-        <w:rPr>
-          <w:rStyle w:val="SourceText"/>
-        </w:rPr>
-        <w:t>npx</w:t>
-      </w:r>
-      <w:r>
-        <w:rPr/>
-        <w:t xml:space="preserve">, which the MCP host cannot invoke directly on Windows — wrap the entry as </w:t>
-      </w:r>
-      <w:r>
-        <w:rPr>
-          <w:rStyle w:val="SourceText"/>
-        </w:rPr>
-        <w:t>"command": "cmd", "args": ["/c", "npx", ...]</w:t>
-      </w:r>
-      <w:r>
-        <w:rPr/>
-        <w:t xml:space="preserve"> in </w:t>
-      </w:r>
-      <w:r>
-        <w:rPr>
-          <w:rStyle w:val="SourceText"/>
-        </w:rPr>
-        <w:t>.mcp.json</w:t>
-      </w:r>
-      <w:r>
-        <w:rPr/>
-        <w:t xml:space="preserve"> (documented in chrome-devtools-mcp's own troubleshooting for the "Connection closed" failure); the </w:t>
-      </w:r>
-      <w:r>
-        <w:rPr>
-          <w:rStyle w:val="SourceText"/>
-        </w:rPr>
-        <w:t>stack-web</w:t>
-      </w:r>
-      <w:r>
-        <w:rPr/>
-        <w:t xml:space="preserve"> skill's </w:t>
-      </w:r>
-      <w:r>
-        <w:rPr>
-          <w:rStyle w:val="SourceText"/>
-        </w:rPr>
-        <w:t>.mcp.json</w:t>
-      </w:r>
-      <w:r>
-        <w:rPr/>
-        <w:t xml:space="preserve"> example already shows this. </w:t>
-      </w:r>
-    </w:p>
-    <w:p>
-      <w:pPr>
-        <w:pStyle w:val="Heading2"/>
-        <w:bidi w:val="0"/>
-        <w:ind w:hanging="0" w:left="0" w:right="0"/>
-        <w:jc w:val="left"/>
-        <w:rPr/>
-      </w:pPr>
-      <w:bookmarkStart w:id="15" w:name="windows-notes"/>
-      <w:bookmarkEnd w:id="15"/>
-      <w:r>
-        <w:rPr/>
-        <w:t>Windows Notes</w:t>
-      </w:r>
-    </w:p>
-    <w:p>
-      <w:pPr>
-        <w:pStyle w:val="BodyText"/>
-        <w:numPr>
-          <w:ilvl w:val="0"/>
-          <w:numId w:val="24"/>
-        </w:numPr>
-        <w:tabs>
-          <w:tab w:val="clear" w:pos="1134"/>
-          <w:tab w:val="left" w:pos="829" w:leader="none"/>
-        </w:tabs>
-        <w:bidi w:val="0"/>
-        <w:spacing w:before="120" w:after="0"/>
-        <w:ind w:hanging="283" w:left="829"/>
-        <w:jc w:val="left"/>
-        <w:rPr/>
-      </w:pPr>
-      <w:r>
-        <w:rPr>
-          <w:rStyle w:val="SourceText"/>
-        </w:rPr>
-        <w:t>pwsh</w:t>
-      </w:r>
-      <w:r>
-        <w:rPr>
-          <w:rStyle w:val="Strong"/>
-        </w:rPr>
-        <w:t xml:space="preserve"> is not on Git Bash's </w:t>
-      </w:r>
-      <w:r>
-        <w:rPr>
-          <w:rStyle w:val="SourceText"/>
-        </w:rPr>
-        <w:t>PATH</w:t>
-      </w:r>
-      <w:r>
-        <w:rPr>
-          <w:rStyle w:val="Strong"/>
-        </w:rPr>
-        <w:t>.</w:t>
-      </w:r>
-      <w:r>
-        <w:rPr/>
-        <w:t xml:space="preserve"> Every script that shells out to PowerShell names it by an absolute path or resolves it explicitly; a bare </w:t>
-      </w:r>
-      <w:r>
-        <w:rPr>
-          <w:rStyle w:val="SourceText"/>
-        </w:rPr>
-        <w:t>pwsh</w:t>
-      </w:r>
-      <w:r>
-        <w:rPr/>
-        <w:t xml:space="preserve"> in a hand-typed command fails as "command not found", which is easy to misread as PowerShell itself being broken. </w:t>
-      </w:r>
-    </w:p>
-    <w:p>
-      <w:pPr>
-        <w:pStyle w:val="BodyText"/>
-        <w:numPr>
-          <w:ilvl w:val="0"/>
-          <w:numId w:val="24"/>
-        </w:numPr>
-        <w:tabs>
-          <w:tab w:val="clear" w:pos="1134"/>
-          <w:tab w:val="left" w:pos="829" w:leader="none"/>
-        </w:tabs>
-        <w:bidi w:val="0"/>
-        <w:spacing w:before="120" w:after="0"/>
-        <w:ind w:hanging="283" w:left="829"/>
-        <w:jc w:val="left"/>
-        <w:rPr/>
-      </w:pPr>
-      <w:r>
-        <w:rPr>
-          <w:rStyle w:val="Strong"/>
-        </w:rPr>
-        <w:t xml:space="preserve">Git Bash ships without </w:t>
-      </w:r>
-      <w:r>
-        <w:rPr>
-          <w:rStyle w:val="SourceText"/>
-        </w:rPr>
-        <w:t>python3</w:t>
-      </w:r>
-      <w:r>
-        <w:rPr>
-          <w:rStyle w:val="Strong"/>
-        </w:rPr>
-        <w:t>.</w:t>
-      </w:r>
-      <w:r>
-        <w:rPr/>
-        <w:t xml:space="preserve"> Every hook wrapper here resolves </w:t>
-      </w:r>
-      <w:r>
-        <w:rPr>
-          <w:rStyle w:val="SourceText"/>
-        </w:rPr>
-        <w:t>python3</w:t>
-      </w:r>
-      <w:r>
-        <w:rPr/>
-        <w:t xml:space="preserve">, then </w:t>
-      </w:r>
-      <w:r>
-        <w:rPr>
-          <w:rStyle w:val="SourceText"/>
-        </w:rPr>
-        <w:t>python</w:t>
-      </w:r>
-      <w:r>
-        <w:rPr/>
-        <w:t xml:space="preserve">, then </w:t>
-      </w:r>
-      <w:r>
-        <w:rPr>
-          <w:rStyle w:val="SourceText"/>
-        </w:rPr>
-        <w:t>py</w:t>
-      </w:r>
-      <w:r>
-        <w:rPr/>
-        <w:t xml:space="preserve">, and fails loudly on stderr rather than silently standing down when none resolves (see "no-python fail-closed", above). If a hook you expect to run says nothing at all, check for a usable Python on </w:t>
-      </w:r>
-      <w:r>
-        <w:rPr>
-          <w:rStyle w:val="SourceText"/>
-        </w:rPr>
-        <w:t>PATH</w:t>
-      </w:r>
-      <w:r>
-        <w:rPr/>
-        <w:t xml:space="preserve"> first. </w:t>
-      </w:r>
-    </w:p>
-    <w:p>
-      <w:pPr>
-        <w:pStyle w:val="BodyText"/>
-        <w:numPr>
-          <w:ilvl w:val="0"/>
-          <w:numId w:val="24"/>
-        </w:numPr>
-        <w:tabs>
-          <w:tab w:val="clear" w:pos="1134"/>
-          <w:tab w:val="left" w:pos="829" w:leader="none"/>
-        </w:tabs>
-        <w:bidi w:val="0"/>
-        <w:spacing w:before="120" w:after="0"/>
-        <w:ind w:hanging="283" w:left="829"/>
-        <w:jc w:val="left"/>
-        <w:rPr/>
-      </w:pPr>
-      <w:r>
-        <w:rPr>
-          <w:rStyle w:val="Strong"/>
-        </w:rPr>
-        <w:t>Both flavours are always registered.</w:t>
-      </w:r>
-      <w:r>
-        <w:rPr/>
-        <w:t xml:space="preserve"> </w:t>
-      </w:r>
-      <w:r>
-        <w:rPr>
-          <w:rStyle w:val="SourceText"/>
-        </w:rPr>
-        <w:t>hooks.json</w:t>
-      </w:r>
-      <w:r>
-        <w:rPr/>
-        <w:t xml:space="preserve"> pairs every bash command with a </w:t>
-      </w:r>
-      <w:r>
-        <w:rPr>
-          <w:rStyle w:val="SourceText"/>
-        </w:rPr>
-        <w:t>shell: "powershell"</w:t>
-      </w:r>
-      <w:r>
-        <w:rPr/>
-        <w:t xml:space="preserve"> sibling on the same event, so a machine with both </w:t>
-      </w:r>
-      <w:r>
-        <w:rPr>
-          <w:rStyle w:val="SourceText"/>
-        </w:rPr>
-        <w:t>bash</w:t>
-      </w:r>
-      <w:r>
-        <w:rPr/>
-        <w:t xml:space="preserve"> and </w:t>
-      </w:r>
-      <w:r>
-        <w:rPr>
-          <w:rStyle w:val="SourceText"/>
-        </w:rPr>
-        <w:t>pwsh</w:t>
-      </w:r>
-      <w:r>
-        <w:rPr/>
-        <w:t xml:space="preserve"> present runs both. This is not double-firing to fix — it is how the same hook reaches both shells; each PowerShell twin stands itself down on the wrong platform (</w:t>
-      </w:r>
-      <w:r>
-        <w:rPr>
-          <w:rStyle w:val="SourceText"/>
-        </w:rPr>
-        <w:t>$env:OS -ne 'Windows_NT'</w:t>
-      </w:r>
-      <w:r>
-        <w:rPr/>
-        <w:t xml:space="preserve">) rather than the bash twin doing that job. </w:t>
-      </w:r>
-    </w:p>
-    <w:p>
-      <w:pPr>
-        <w:pStyle w:val="BodyText"/>
-        <w:numPr>
-          <w:ilvl w:val="0"/>
-          <w:numId w:val="24"/>
-        </w:numPr>
-        <w:tabs>
-          <w:tab w:val="clear" w:pos="1134"/>
-          <w:tab w:val="left" w:pos="829" w:leader="none"/>
-        </w:tabs>
-        <w:bidi w:val="0"/>
-        <w:ind w:hanging="283" w:left="829"/>
-        <w:jc w:val="left"/>
-        <w:rPr/>
-      </w:pPr>
-      <w:r>
-        <w:rPr>
-          <w:rStyle w:val="Strong"/>
-        </w:rPr>
-        <w:t>Tests and checks are slow on Windows.</w:t>
-      </w:r>
-      <w:r>
-        <w:rPr/>
-        <w:t xml:space="preserve"> Read </w:t>
-      </w:r>
-      <w:r>
-        <w:rPr>
-          <w:rStyle w:val="SourceText"/>
-        </w:rPr>
-        <w:t>/crew:status</w:t>
-      </w:r>
-      <w:r>
-        <w:rPr/>
-        <w:t xml:space="preserve">'s </w:t>
-      </w:r>
-      <w:r>
-        <w:rPr>
-          <w:rStyle w:val="SourceText"/>
-        </w:rPr>
-        <w:t>shell</w:t>
-      </w:r>
-      <w:r>
-        <w:rPr/>
-        <w:t xml:space="preserve"> line first. It names the shell route crew's jobs take (</w:t>
-      </w:r>
-      <w:r>
-        <w:rPr>
-          <w:rStyle w:val="SourceText"/>
-        </w:rPr>
-        <w:t>shellRoute.mode</w:t>
-      </w:r>
-      <w:r>
-        <w:rPr/>
-        <w:t xml:space="preserve">: </w:t>
-      </w:r>
-      <w:r>
-        <w:rPr>
-          <w:rStyle w:val="SourceText"/>
-        </w:rPr>
-        <w:t>auto</w:t>
-      </w:r>
-      <w:r>
-        <w:rPr/>
-        <w:t xml:space="preserve">, </w:t>
-      </w:r>
-      <w:r>
-        <w:rPr>
-          <w:rStyle w:val="SourceText"/>
-        </w:rPr>
-        <w:t>wsl</w:t>
-      </w:r>
-      <w:r>
-        <w:rPr/>
-        <w:t xml:space="preserve">, </w:t>
-      </w:r>
-      <w:r>
-        <w:rPr>
-          <w:rStyle w:val="SourceText"/>
-        </w:rPr>
-        <w:t>powershell</w:t>
-      </w:r>
-      <w:r>
-        <w:rPr/>
-        <w:t xml:space="preserve">, </w:t>
-      </w:r>
-      <w:r>
-        <w:rPr>
-          <w:rStyle w:val="SourceText"/>
-        </w:rPr>
-        <w:t>gitbash</w:t>
-      </w:r>
-      <w:r>
-        <w:rPr/>
-        <w:t xml:space="preserve">) and why. </w:t>
-      </w:r>
-      <w:r>
-        <w:rPr>
-          <w:rStyle w:val="SourceText"/>
-        </w:rPr>
-        <w:t>WSL never probed</w:t>
-      </w:r>
-      <w:r>
-        <w:rPr/>
-        <w:t xml:space="preserve"> means nobody ran </w:t>
-      </w:r>
-      <w:r>
-        <w:rPr>
-          <w:rStyle w:val="SourceText"/>
-        </w:rPr>
-        <w:t>crew_shell.py probe --write</w:t>
-      </w:r>
-      <w:r>
-        <w:rPr/>
-        <w:t xml:space="preserve">; </w:t>
-      </w:r>
-      <w:r>
-        <w:rPr>
-          <w:rStyle w:val="SourceText"/>
-        </w:rPr>
-        <w:t>not-installed</w:t>
-      </w:r>
-      <w:r>
-        <w:rPr/>
-        <w:t xml:space="preserve"> comes with the </w:t>
-      </w:r>
-      <w:r>
-        <w:rPr>
-          <w:rStyle w:val="SourceText"/>
-        </w:rPr>
-        <w:t>wsl --install -d Ubuntu</w:t>
-      </w:r>
-      <w:r>
-        <w:rPr/>
-        <w:t xml:space="preserve"> recommendation, which crew prints and never runs. A repo on a Windows drive goes to WSL under </w:t>
-      </w:r>
-      <w:r>
-        <w:rPr>
-          <w:rStyle w:val="SourceText"/>
-        </w:rPr>
-        <w:t>auto</w:t>
-      </w:r>
-      <w:r>
-        <w:rPr/>
-        <w:t xml:space="preserve"> only after </w:t>
-      </w:r>
-      <w:r>
-        <w:rPr>
-          <w:rStyle w:val="SourceText"/>
-        </w:rPr>
-        <w:t>crew_shell.py measure --write</w:t>
-      </w:r>
-      <w:r>
-        <w:rPr/>
-        <w:t xml:space="preserve"> has shown WSL faster there. See "Choosing the shell route on Windows" in </w:t>
-      </w:r>
-      <w:r>
-        <w:rPr>
-          <w:rStyle w:val="SourceText"/>
-        </w:rPr>
-        <w:t>plugin/crew/skills/crew-setup/platform.md</w:t>
-      </w:r>
-      <w:r>
-        <w:rPr/>
-        <w:t xml:space="preserve">. </w:t>
-      </w:r>
-    </w:p>
-    <w:p>
-      <w:pPr>
-        <w:pStyle w:val="Heading2"/>
-        <w:bidi w:val="0"/>
-        <w:ind w:hanging="0" w:left="0" w:right="0"/>
-        <w:jc w:val="left"/>
-        <w:rPr/>
-      </w:pPr>
-      <w:bookmarkStart w:id="16" w:name="auto-wrap-up-auto-clear-and-auto-resume"/>
-      <w:bookmarkEnd w:id="16"/>
-      <w:r>
-        <w:rPr/>
-        <w:t>Auto Wrap-Up, Auto-Clear and Auto-Resume</w:t>
-      </w:r>
-    </w:p>
-    <w:p>
-      <w:pPr>
-        <w:pStyle w:val="BodyText"/>
-        <w:bidi w:val="0"/>
-        <w:jc w:val="left"/>
-        <w:rPr/>
-      </w:pPr>
-      <w:r>
-        <w:rPr/>
-        <w:t>This section is folded into the troubleshooting guide (</w:t>
-      </w:r>
-      <w:r>
-        <w:rPr>
-          <w:rStyle w:val="SourceText"/>
-        </w:rPr>
-        <w:t>troubleshooting.md</w:t>
-      </w:r>
-      <w:r>
-        <w:rPr/>
-        <w:t>), linked from it as "Auto wrap-up, clear and resume". It covers the cycle that lets a long session finish itself cleanly, clear, and pick up where it stopped.</w:t>
-      </w:r>
-    </w:p>
-    <w:p>
-      <w:pPr>
-        <w:pStyle w:val="Heading3"/>
-        <w:bidi w:val="0"/>
-        <w:ind w:hanging="0" w:left="0" w:right="0"/>
-        <w:jc w:val="left"/>
-        <w:rPr/>
-      </w:pPr>
-      <w:bookmarkStart w:id="17" w:name="what-the-cycle-does"/>
-      <w:bookmarkEnd w:id="17"/>
-      <w:r>
-        <w:rPr/>
-        <w:t>What the Cycle Does</w:t>
       </w:r>
     </w:p>
     <w:p>
@@ -12108,41 +13100,41 @@
         <w:rPr>
           <w:rStyle w:val="Strong"/>
         </w:rPr>
-        <w:t>Wrap-up.</w:t>
-      </w:r>
-      <w:r>
-        <w:rPr/>
-        <w:t xml:space="preserve"> When the context window crosses its threshold, the </w:t>
-      </w:r>
-      <w:r>
-        <w:rPr>
-          <w:rStyle w:val="SourceText"/>
-        </w:rPr>
-        <w:t>Stop</w:t>
-      </w:r>
-      <w:r>
-        <w:rPr/>
-        <w:t xml:space="preserve"> hook blocks once. It asks the session to finish or park the change in flight, write </w:t>
-      </w:r>
-      <w:r>
-        <w:rPr>
-          <w:rStyle w:val="SourceText"/>
-        </w:rPr>
-        <w:t>.work/HANDOFF.md</w:t>
-      </w:r>
-      <w:r>
-        <w:rPr/>
-        <w:t xml:space="preserve">, and update the ticket. This happens once for each threshold crossing in each session. It never happens on the forced continuation that follows a block. With </w:t>
-      </w:r>
-      <w:r>
-        <w:rPr>
-          <w:rStyle w:val="SourceText"/>
-        </w:rPr>
-        <w:t>context.autoClear.wrapUp</w:t>
-      </w:r>
-      <w:r>
-        <w:rPr/>
-        <w:t xml:space="preserve"> armed (below), the block carries the wrap-up procedure instead, and the clear waits for its results. </w:t>
+        <w:t>Docker absent -&gt; visual UNVERIFIED, not a fail.</w:t>
+      </w:r>
+      <w:r>
+        <w:rPr/>
+        <w:t xml:space="preserve"> </w:t>
+      </w:r>
+      <w:r>
+        <w:rPr>
+          <w:rStyle w:val="SourceText"/>
+        </w:rPr>
+        <w:t>toHaveScreenshot</w:t>
+      </w:r>
+      <w:r>
+        <w:rPr/>
+        <w:t xml:space="preserve"> baselines are only meaningful when generated inside </w:t>
+      </w:r>
+      <w:r>
+        <w:rPr>
+          <w:rStyle w:val="SourceText"/>
+        </w:rPr>
+        <w:t>mcr.microsoft.com/playwright:v1.63.0-noble</w:t>
+      </w:r>
+      <w:r>
+        <w:rPr/>
+        <w:t xml:space="preserve"> — the installer warns rather than blocking when Docker is missing, and the visual </w:t>
+      </w:r>
+      <w:r>
+        <w:rPr>
+          <w:rStyle w:val="SourceText"/>
+        </w:rPr>
+        <w:t>verify.json</w:t>
+      </w:r>
+      <w:r>
+        <w:rPr/>
+        <w:t xml:space="preserve"> rule is written to skip (report UNVERIFIED) outside that image rather than compare against a baseline that can never match. </w:t>
       </w:r>
     </w:p>
     <w:p>
@@ -12165,57 +13157,373 @@
         <w:rPr>
           <w:rStyle w:val="Strong"/>
         </w:rPr>
-        <w:t>Clear, or notify.</w:t>
-      </w:r>
-      <w:r>
-        <w:rPr/>
-        <w:t xml:space="preserve"> After the handoff is written, auto-clear acts on it. What it does depends on </w:t>
-      </w:r>
-      <w:r>
-        <w:rPr>
-          <w:rStyle w:val="SourceText"/>
-        </w:rPr>
-        <w:t>method</w:t>
-      </w:r>
-      <w:r>
-        <w:rPr/>
-        <w:t xml:space="preserve"> (below): </w:t>
-      </w:r>
-      <w:r>
-        <w:rPr>
-          <w:rStyle w:val="SourceText"/>
-        </w:rPr>
-        <w:t>notify</w:t>
-      </w:r>
-      <w:r>
-        <w:rPr/>
-        <w:t xml:space="preserve"> (the default on native Windows) prints a message telling you the handoff is written and it is safe to run </w:t>
-      </w:r>
-      <w:r>
-        <w:rPr>
-          <w:rStyle w:val="SourceText"/>
-        </w:rPr>
-        <w:t>/clear</w:t>
-      </w:r>
-      <w:r>
-        <w:rPr/>
-        <w:t xml:space="preserve"> (or </w:t>
-      </w:r>
-      <w:r>
-        <w:rPr>
-          <w:rStyle w:val="SourceText"/>
-        </w:rPr>
-        <w:t>/compact</w:t>
-      </w:r>
-      <w:r>
-        <w:rPr/>
-        <w:t xml:space="preserve">) yourself — it types nothing. </w:t>
-      </w:r>
-      <w:r>
-        <w:rPr>
-          <w:rStyle w:val="SourceText"/>
-        </w:rPr>
-        <w:t>tmux</w:t>
+        <w:t>MCP server won't connect on Windows.</w:t>
+      </w:r>
+      <w:r>
+        <w:rPr/>
+        <w:t xml:space="preserve"> Both </w:t>
+      </w:r>
+      <w:r>
+        <w:rPr>
+          <w:rStyle w:val="SourceText"/>
+        </w:rPr>
+        <w:t>@playwright/mcp</w:t>
+      </w:r>
+      <w:r>
+        <w:rPr/>
+        <w:t xml:space="preserve"> and </w:t>
+      </w:r>
+      <w:r>
+        <w:rPr>
+          <w:rStyle w:val="SourceText"/>
+        </w:rPr>
+        <w:t>chrome-devtools-mcp</w:t>
+      </w:r>
+      <w:r>
+        <w:rPr/>
+        <w:t xml:space="preserve"> are launched with </w:t>
+      </w:r>
+      <w:r>
+        <w:rPr>
+          <w:rStyle w:val="SourceText"/>
+        </w:rPr>
+        <w:t>npx</w:t>
+      </w:r>
+      <w:r>
+        <w:rPr/>
+        <w:t xml:space="preserve">, which the MCP host cannot invoke directly on Windows — wrap the entry as </w:t>
+      </w:r>
+      <w:r>
+        <w:rPr>
+          <w:rStyle w:val="SourceText"/>
+        </w:rPr>
+        <w:t>"command": "cmd", "args": ["/c", "npx", ...]</w:t>
+      </w:r>
+      <w:r>
+        <w:rPr/>
+        <w:t xml:space="preserve"> in </w:t>
+      </w:r>
+      <w:r>
+        <w:rPr>
+          <w:rStyle w:val="SourceText"/>
+        </w:rPr>
+        <w:t>.mcp.json</w:t>
+      </w:r>
+      <w:r>
+        <w:rPr/>
+        <w:t xml:space="preserve"> (documented in chrome-devtools-mcp's own troubleshooting for the "Connection closed" failure); the </w:t>
+      </w:r>
+      <w:r>
+        <w:rPr>
+          <w:rStyle w:val="SourceText"/>
+        </w:rPr>
+        <w:t>stack-web</w:t>
+      </w:r>
+      <w:r>
+        <w:rPr/>
+        <w:t xml:space="preserve"> skill's </w:t>
+      </w:r>
+      <w:r>
+        <w:rPr>
+          <w:rStyle w:val="SourceText"/>
+        </w:rPr>
+        <w:t>.mcp.json</w:t>
+      </w:r>
+      <w:r>
+        <w:rPr/>
+        <w:t xml:space="preserve"> example already shows this. </w:t>
+      </w:r>
+    </w:p>
+    <w:p>
+      <w:pPr>
+        <w:pStyle w:val="Heading2"/>
+        <w:bidi w:val="0"/>
+        <w:ind w:hanging="0" w:left="0" w:right="0"/>
+        <w:jc w:val="left"/>
+        <w:rPr/>
+      </w:pPr>
+      <w:bookmarkStart w:id="17" w:name="windows-notes"/>
+      <w:bookmarkEnd w:id="17"/>
+      <w:r>
+        <w:rPr/>
+        <w:t>Windows Notes</w:t>
+      </w:r>
+    </w:p>
+    <w:p>
+      <w:pPr>
+        <w:pStyle w:val="BodyText"/>
+        <w:numPr>
+          <w:ilvl w:val="0"/>
+          <w:numId w:val="26"/>
+        </w:numPr>
+        <w:tabs>
+          <w:tab w:val="clear" w:pos="1134"/>
+          <w:tab w:val="left" w:pos="829" w:leader="none"/>
+        </w:tabs>
+        <w:bidi w:val="0"/>
+        <w:spacing w:before="120" w:after="0"/>
+        <w:ind w:hanging="283" w:left="829"/>
+        <w:jc w:val="left"/>
+        <w:rPr/>
+      </w:pPr>
+      <w:r>
+        <w:rPr>
+          <w:rStyle w:val="SourceText"/>
+        </w:rPr>
+        <w:t>pwsh</w:t>
+      </w:r>
+      <w:r>
+        <w:rPr>
+          <w:rStyle w:val="Strong"/>
+        </w:rPr>
+        <w:t xml:space="preserve"> is not on Git Bash's </w:t>
+      </w:r>
+      <w:r>
+        <w:rPr>
+          <w:rStyle w:val="SourceText"/>
+        </w:rPr>
+        <w:t>PATH</w:t>
+      </w:r>
+      <w:r>
+        <w:rPr>
+          <w:rStyle w:val="Strong"/>
+        </w:rPr>
+        <w:t>.</w:t>
+      </w:r>
+      <w:r>
+        <w:rPr/>
+        <w:t xml:space="preserve"> Every script that shells out to PowerShell names it by an absolute path or resolves it explicitly; a bare </w:t>
+      </w:r>
+      <w:r>
+        <w:rPr>
+          <w:rStyle w:val="SourceText"/>
+        </w:rPr>
+        <w:t>pwsh</w:t>
+      </w:r>
+      <w:r>
+        <w:rPr/>
+        <w:t xml:space="preserve"> in a hand-typed command fails as "command not found", which is easy to misread as PowerShell itself being broken. </w:t>
+      </w:r>
+    </w:p>
+    <w:p>
+      <w:pPr>
+        <w:pStyle w:val="BodyText"/>
+        <w:numPr>
+          <w:ilvl w:val="0"/>
+          <w:numId w:val="26"/>
+        </w:numPr>
+        <w:tabs>
+          <w:tab w:val="clear" w:pos="1134"/>
+          <w:tab w:val="left" w:pos="829" w:leader="none"/>
+        </w:tabs>
+        <w:bidi w:val="0"/>
+        <w:spacing w:before="120" w:after="0"/>
+        <w:ind w:hanging="283" w:left="829"/>
+        <w:jc w:val="left"/>
+        <w:rPr/>
+      </w:pPr>
+      <w:r>
+        <w:rPr>
+          <w:rStyle w:val="Strong"/>
+        </w:rPr>
+        <w:t xml:space="preserve">Git Bash ships without </w:t>
+      </w:r>
+      <w:r>
+        <w:rPr>
+          <w:rStyle w:val="SourceText"/>
+        </w:rPr>
+        <w:t>python3</w:t>
+      </w:r>
+      <w:r>
+        <w:rPr>
+          <w:rStyle w:val="Strong"/>
+        </w:rPr>
+        <w:t>.</w:t>
+      </w:r>
+      <w:r>
+        <w:rPr/>
+        <w:t xml:space="preserve"> Every hook wrapper here resolves </w:t>
+      </w:r>
+      <w:r>
+        <w:rPr>
+          <w:rStyle w:val="SourceText"/>
+        </w:rPr>
+        <w:t>python3</w:t>
+      </w:r>
+      <w:r>
+        <w:rPr/>
+        <w:t xml:space="preserve">, then </w:t>
+      </w:r>
+      <w:r>
+        <w:rPr>
+          <w:rStyle w:val="SourceText"/>
+        </w:rPr>
+        <w:t>python</w:t>
+      </w:r>
+      <w:r>
+        <w:rPr/>
+        <w:t xml:space="preserve">, then </w:t>
+      </w:r>
+      <w:r>
+        <w:rPr>
+          <w:rStyle w:val="SourceText"/>
+        </w:rPr>
+        <w:t>py</w:t>
+      </w:r>
+      <w:r>
+        <w:rPr/>
+        <w:t xml:space="preserve">, and fails loudly on stderr rather than silently standing down when none resolves (see "no-python fail-closed", above). If a hook you expect to run says nothing at all, check for a usable Python on </w:t>
+      </w:r>
+      <w:r>
+        <w:rPr>
+          <w:rStyle w:val="SourceText"/>
+        </w:rPr>
+        <w:t>PATH</w:t>
+      </w:r>
+      <w:r>
+        <w:rPr/>
+        <w:t xml:space="preserve"> first. </w:t>
+      </w:r>
+    </w:p>
+    <w:p>
+      <w:pPr>
+        <w:pStyle w:val="BodyText"/>
+        <w:numPr>
+          <w:ilvl w:val="0"/>
+          <w:numId w:val="26"/>
+        </w:numPr>
+        <w:tabs>
+          <w:tab w:val="clear" w:pos="1134"/>
+          <w:tab w:val="left" w:pos="829" w:leader="none"/>
+        </w:tabs>
+        <w:bidi w:val="0"/>
+        <w:spacing w:before="120" w:after="0"/>
+        <w:ind w:hanging="283" w:left="829"/>
+        <w:jc w:val="left"/>
+        <w:rPr/>
+      </w:pPr>
+      <w:r>
+        <w:rPr>
+          <w:rStyle w:val="Strong"/>
+        </w:rPr>
+        <w:t>Both flavours are always registered.</w:t>
+      </w:r>
+      <w:r>
+        <w:rPr/>
+        <w:t xml:space="preserve"> </w:t>
+      </w:r>
+      <w:r>
+        <w:rPr>
+          <w:rStyle w:val="SourceText"/>
+        </w:rPr>
+        <w:t>hooks.json</w:t>
+      </w:r>
+      <w:r>
+        <w:rPr/>
+        <w:t xml:space="preserve"> pairs every bash command with a </w:t>
+      </w:r>
+      <w:r>
+        <w:rPr>
+          <w:rStyle w:val="SourceText"/>
+        </w:rPr>
+        <w:t>shell: "powershell"</w:t>
+      </w:r>
+      <w:r>
+        <w:rPr/>
+        <w:t xml:space="preserve"> sibling on the same event, so a machine with both </w:t>
+      </w:r>
+      <w:r>
+        <w:rPr>
+          <w:rStyle w:val="SourceText"/>
+        </w:rPr>
+        <w:t>bash</w:t>
+      </w:r>
+      <w:r>
+        <w:rPr/>
+        <w:t xml:space="preserve"> and </w:t>
+      </w:r>
+      <w:r>
+        <w:rPr>
+          <w:rStyle w:val="SourceText"/>
+        </w:rPr>
+        <w:t>pwsh</w:t>
+      </w:r>
+      <w:r>
+        <w:rPr/>
+        <w:t xml:space="preserve"> present runs both. This is not double-firing to fix — it is how the same hook reaches both shells; each PowerShell twin stands itself down on the wrong platform (</w:t>
+      </w:r>
+      <w:r>
+        <w:rPr>
+          <w:rStyle w:val="SourceText"/>
+        </w:rPr>
+        <w:t>$env:OS -ne 'Windows_NT'</w:t>
+      </w:r>
+      <w:r>
+        <w:rPr/>
+        <w:t xml:space="preserve">) rather than the bash twin doing that job. </w:t>
+      </w:r>
+    </w:p>
+    <w:p>
+      <w:pPr>
+        <w:pStyle w:val="BodyText"/>
+        <w:numPr>
+          <w:ilvl w:val="0"/>
+          <w:numId w:val="26"/>
+        </w:numPr>
+        <w:tabs>
+          <w:tab w:val="clear" w:pos="1134"/>
+          <w:tab w:val="left" w:pos="829" w:leader="none"/>
+        </w:tabs>
+        <w:bidi w:val="0"/>
+        <w:ind w:hanging="283" w:left="829"/>
+        <w:jc w:val="left"/>
+        <w:rPr/>
+      </w:pPr>
+      <w:r>
+        <w:rPr>
+          <w:rStyle w:val="Strong"/>
+        </w:rPr>
+        <w:t>Tests and checks are slow on Windows.</w:t>
+      </w:r>
+      <w:r>
+        <w:rPr/>
+        <w:t xml:space="preserve"> Read </w:t>
+      </w:r>
+      <w:r>
+        <w:rPr>
+          <w:rStyle w:val="SourceText"/>
+        </w:rPr>
+        <w:t>/crew:status</w:t>
+      </w:r>
+      <w:r>
+        <w:rPr/>
+        <w:t xml:space="preserve">'s </w:t>
+      </w:r>
+      <w:r>
+        <w:rPr>
+          <w:rStyle w:val="SourceText"/>
+        </w:rPr>
+        <w:t>shell</w:t>
+      </w:r>
+      <w:r>
+        <w:rPr/>
+        <w:t xml:space="preserve"> line first. It names the shell route crew's jobs take (</w:t>
+      </w:r>
+      <w:r>
+        <w:rPr>
+          <w:rStyle w:val="SourceText"/>
+        </w:rPr>
+        <w:t>shellRoute.mode</w:t>
+      </w:r>
+      <w:r>
+        <w:rPr/>
+        <w:t xml:space="preserve">: </w:t>
+      </w:r>
+      <w:r>
+        <w:rPr>
+          <w:rStyle w:val="SourceText"/>
+        </w:rPr>
+        <w:t>auto</w:t>
       </w:r>
       <w:r>
         <w:rPr/>
@@ -12225,71 +13533,116 @@
         <w:rPr>
           <w:rStyle w:val="SourceText"/>
         </w:rPr>
-        <w:t>xdotool</w:t>
-      </w:r>
-      <w:r>
-        <w:rPr/>
-        <w:t xml:space="preserve"> and </w:t>
-      </w:r>
-      <w:r>
-        <w:rPr>
-          <w:rStyle w:val="SourceText"/>
-        </w:rPr>
-        <w:t>sendkeys</w:t>
-      </w:r>
-      <w:r>
-        <w:rPr/>
-        <w:t xml:space="preserve"> actually type the configured command into the terminal that runs this session. Whichever method is in force, it acts only when all five of these hold: - this machine opted in; - the handoff was written by this session after the wrap-up request, is longer than a stub, and is not the automatic PreCompact skeleton; - the context reading that caused the wrap-up was a real measurement (see "When it will not clear"); - this session is bound to its own Claude Code process, and that process has a terminal of its own (see "Which window gets the keystroke") — a headless session, such as a </w:t>
-      </w:r>
-      <w:r>
-        <w:rPr>
-          <w:rStyle w:val="SourceText"/>
-        </w:rPr>
-        <w:t>claude -p</w:t>
-      </w:r>
-      <w:r>
-        <w:rPr/>
-        <w:t xml:space="preserve"> child, gets one message instead, naming its handoff and saying the process that started it must start a new one; - for a method that types (</w:t>
-      </w:r>
-      <w:r>
-        <w:rPr>
-          <w:rStyle w:val="SourceText"/>
-        </w:rPr>
-        <w:t>tmux</w:t>
-      </w:r>
-      <w:r>
-        <w:rPr/>
-        <w:t>/</w:t>
-      </w:r>
-      <w:r>
-        <w:rPr>
-          <w:rStyle w:val="SourceText"/>
-        </w:rPr>
-        <w:t>xdotool</w:t>
-      </w:r>
-      <w:r>
-        <w:rPr/>
-        <w:t>/</w:t>
-      </w:r>
-      <w:r>
-        <w:rPr>
-          <w:rStyle w:val="SourceText"/>
-        </w:rPr>
-        <w:t>sendkeys</w:t>
-      </w:r>
-      <w:r>
-        <w:rPr/>
-        <w:t xml:space="preserve">), the target window can be identified exactly, from that process — </w:t>
-      </w:r>
-      <w:r>
-        <w:rPr>
-          <w:rStyle w:val="SourceText"/>
-        </w:rPr>
-        <w:t>notify</w:t>
-      </w:r>
-      <w:r>
-        <w:rPr/>
-        <w:t xml:space="preserve"> needs none of this, since it identifies no window. </w:t>
+        <w:t>wsl</w:t>
+      </w:r>
+      <w:r>
+        <w:rPr/>
+        <w:t xml:space="preserve">, </w:t>
+      </w:r>
+      <w:r>
+        <w:rPr>
+          <w:rStyle w:val="SourceText"/>
+        </w:rPr>
+        <w:t>powershell</w:t>
+      </w:r>
+      <w:r>
+        <w:rPr/>
+        <w:t xml:space="preserve">, </w:t>
+      </w:r>
+      <w:r>
+        <w:rPr>
+          <w:rStyle w:val="SourceText"/>
+        </w:rPr>
+        <w:t>gitbash</w:t>
+      </w:r>
+      <w:r>
+        <w:rPr/>
+        <w:t xml:space="preserve">) and why. </w:t>
+      </w:r>
+      <w:r>
+        <w:rPr>
+          <w:rStyle w:val="SourceText"/>
+        </w:rPr>
+        <w:t>WSL never probed</w:t>
+      </w:r>
+      <w:r>
+        <w:rPr/>
+        <w:t xml:space="preserve"> means nobody ran </w:t>
+      </w:r>
+      <w:r>
+        <w:rPr>
+          <w:rStyle w:val="SourceText"/>
+        </w:rPr>
+        <w:t>crew_shell.py probe --write</w:t>
+      </w:r>
+      <w:r>
+        <w:rPr/>
+        <w:t xml:space="preserve">; </w:t>
+      </w:r>
+      <w:r>
+        <w:rPr>
+          <w:rStyle w:val="SourceText"/>
+        </w:rPr>
+        <w:t>not-installed</w:t>
+      </w:r>
+      <w:r>
+        <w:rPr/>
+        <w:t xml:space="preserve"> comes with the </w:t>
+      </w:r>
+      <w:r>
+        <w:rPr>
+          <w:rStyle w:val="SourceText"/>
+        </w:rPr>
+        <w:t>wsl --install -d Ubuntu</w:t>
+      </w:r>
+      <w:r>
+        <w:rPr/>
+        <w:t xml:space="preserve"> recommendation, which crew prints and never runs. A repo on a Windows drive goes to WSL under </w:t>
+      </w:r>
+      <w:r>
+        <w:rPr>
+          <w:rStyle w:val="SourceText"/>
+        </w:rPr>
+        <w:t>auto</w:t>
+      </w:r>
+      <w:r>
+        <w:rPr/>
+        <w:t xml:space="preserve"> only after </w:t>
+      </w:r>
+      <w:r>
+        <w:rPr>
+          <w:rStyle w:val="SourceText"/>
+        </w:rPr>
+        <w:t>crew_shell.py measure --write</w:t>
+      </w:r>
+      <w:r>
+        <w:rPr/>
+        <w:t xml:space="preserve"> has shown WSL faster there. See "Choosing the shell route on Windows" in </w:t>
+      </w:r>
+      <w:r>
+        <w:rPr>
+          <w:rStyle w:val="SourceText"/>
+        </w:rPr>
+        <w:t>plugin/crew/skills/crew-setup/platform.md</w:t>
+      </w:r>
+      <w:r>
+        <w:rPr/>
+        <w:t xml:space="preserve">. </w:t>
+      </w:r>
+    </w:p>
+    <w:p>
+      <w:pPr>
+        <w:pStyle w:val="Heading2"/>
+        <w:bidi w:val="0"/>
+        <w:ind w:hanging="0" w:left="0" w:right="0"/>
+        <w:jc w:val="left"/>
+        <w:rPr/>
+      </w:pPr>
+      <w:bookmarkStart w:id="18" w:name="auto-wrap-up-auto-clear-and-auto-resume"/>
+      <w:bookmarkEnd w:id="18"/>
+      <w:r>
+        <w:rPr/>
+        <w:t>Auto Wrap-Up, Auto-Clear and Auto-Resume</w:t>
       </w:r>
     </w:p>
     <w:p>
@@ -12300,446 +13653,18 @@
         <w:rPr/>
       </w:pPr>
       <w:r>
-        <w:rPr>
-          <w:rStyle w:val="Strong"/>
-        </w:rPr>
-        <w:t>Crew neither causes nor tunes Claude Code's own auto-compact.</w:t>
-      </w:r>
-      <w:r>
-        <w:rPr/>
-        <w:t xml:space="preserve"> That is a separate, built-in behaviour that fires whenever Claude Code itself decides to; this cycle only reacts to a handoff once one exists, and nothing here makes auto-compact happen sooner, later, or at all. 3. </w:t>
-      </w:r>
-      <w:r>
-        <w:rPr>
-          <w:rStyle w:val="Strong"/>
-        </w:rPr>
-        <w:t>Resume.</w:t>
-      </w:r>
-      <w:r>
-        <w:rPr/>
-        <w:t xml:space="preserve"> The new session starts with the handoff and its next action already in context, within the 3,000-character resume budget. Nothing starts working unprompted: crew does not use </w:t>
-      </w:r>
-      <w:r>
-        <w:rPr>
-          <w:rStyle w:val="SourceText"/>
-        </w:rPr>
-        <w:t>initialUserMessage</w:t>
-      </w:r>
-      <w:r>
-        <w:rPr/>
-        <w:t xml:space="preserve">, so you press Enter to continue. Claude Code 2.1.282 drops it in an interactive session anyway (spike, 2026-09-25): it is honoured by </w:t>
-      </w:r>
-      <w:r>
-        <w:rPr>
-          <w:rStyle w:val="SourceText"/>
-        </w:rPr>
-        <w:t>claude -p</w:t>
-      </w:r>
-      <w:r>
-        <w:rPr/>
-        <w:t xml:space="preserve"> only.</w:t>
-      </w:r>
-    </w:p>
-    <w:p>
-      <w:pPr>
-        <w:pStyle w:val="BodyText"/>
-        <w:bidi w:val="0"/>
-        <w:jc w:val="left"/>
-        <w:rPr/>
-      </w:pPr>
-      <w:r>
-        <w:rPr/>
-        <w:t xml:space="preserve">With </w:t>
-      </w:r>
-      <w:r>
-        <w:rPr>
-          <w:rStyle w:val="SourceText"/>
-        </w:rPr>
-        <w:t>resume.auto: true</w:t>
-      </w:r>
-      <w:r>
-        <w:rPr/>
-        <w:t xml:space="preserve"> in the machine-global config, the handoff after </w:t>
-      </w:r>
-      <w:r>
-        <w:rPr>
-          <w:rStyle w:val="SourceText"/>
-        </w:rPr>
-        <w:t>/clear</w:t>
-      </w:r>
-      <w:r>
-        <w:rPr/>
-        <w:t xml:space="preserve"> or a manual </w:t>
-      </w:r>
-      <w:r>
-        <w:rPr>
-          <w:rStyle w:val="SourceText"/>
-        </w:rPr>
-        <w:t>/compact</w:t>
-      </w:r>
-      <w:r>
-        <w:rPr/>
-        <w:t xml:space="preserve"> also names the exact next command, read from the note's </w:t>
-      </w:r>
-      <w:r>
-        <w:rPr>
-          <w:rStyle w:val="SourceText"/>
-        </w:rPr>
-        <w:t>resume:</w:t>
-      </w:r>
-      <w:r>
-        <w:rPr/>
-        <w:t xml:space="preserve"> line (</w:t>
-      </w:r>
-      <w:r>
-        <w:rPr>
-          <w:rStyle w:val="SourceText"/>
-        </w:rPr>
-        <w:t>resume: /crew:done T-0001</w:t>
-      </w:r>
-      <w:r>
-        <w:rPr/>
-        <w:t xml:space="preserve">): </w:t>
-      </w:r>
-      <w:r>
-        <w:rPr>
-          <w:rStyle w:val="SourceText"/>
-        </w:rPr>
-        <w:t>Auto-resume: ready to run /crew:done T-0001.</w:t>
-      </w:r>
-      <w:r>
-        <w:rPr/>
-        <w:t xml:space="preserve"> — or </w:t>
-      </w:r>
-      <w:r>
-        <w:rPr>
-          <w:rStyle w:val="SourceText"/>
-        </w:rPr>
-        <w:t>Auto-resume did not start: &lt;reason&gt;.</w:t>
-      </w:r>
-      <w:r>
-        <w:rPr/>
-        <w:t xml:space="preserve"> when a check refuses it. It does not start from the hook: you press Enter or type it, or crew types it where the terminal can be identified (below). The refusal reasons are: compact was not a manual /compact; no handoff note, or it was archived as stale, or is stale and could not be archived; the handoff is the automatic PreCompact skeleton; no resume line, </w:t>
-      </w:r>
-      <w:r>
-        <w:rPr>
-          <w:rStyle w:val="SourceText"/>
-        </w:rPr>
-        <w:t>resume: none</w:t>
-      </w:r>
-      <w:r>
-        <w:rPr/>
-        <w:t xml:space="preserve">, or a line the grammar refuses (a second line, trailing text, an unknown command, or an excluded one such as </w:t>
-      </w:r>
-      <w:r>
-        <w:rPr>
-          <w:rStyle w:val="SourceText"/>
-        </w:rPr>
-        <w:t>/crew:approve</w:t>
-      </w:r>
-      <w:r>
-        <w:rPr/>
-        <w:t xml:space="preserve">); the note's </w:t>
-      </w:r>
-      <w:r>
-        <w:rPr>
-          <w:rStyle w:val="SourceText"/>
-        </w:rPr>
-        <w:t>branch:</w:t>
-      </w:r>
-      <w:r>
-        <w:rPr/>
-        <w:t xml:space="preserve"> or </w:t>
-      </w:r>
-      <w:r>
-        <w:rPr>
-          <w:rStyle w:val="SourceText"/>
-        </w:rPr>
-        <w:t>head:</w:t>
-      </w:r>
-      <w:r>
-        <w:rPr/>
-        <w:t xml:space="preserve"> does not match the checkout; the ticket directory or goal file is missing; the command is not installed; </w:t>
-      </w:r>
-      <w:r>
-        <w:rPr>
-          <w:rStyle w:val="SourceText"/>
-        </w:rPr>
-        <w:t>handoff-author.json</w:t>
-      </w:r>
-      <w:r>
-        <w:rPr/>
-        <w:t xml:space="preserve"> could not be read; no record of which session wrote this handoff; a later handoff write could not replace or remove </w:t>
-      </w:r>
-      <w:r>
-        <w:rPr>
-          <w:rStyle w:val="SourceText"/>
-        </w:rPr>
-        <w:t>handoff-author.json</w:t>
-      </w:r>
-      <w:r>
-        <w:rPr/>
-        <w:t xml:space="preserve"> (</w:t>
-      </w:r>
-      <w:r>
-        <w:rPr>
-          <w:rStyle w:val="SourceText"/>
-        </w:rPr>
-        <w:t>handoff-author.json.stuck</w:t>
-      </w:r>
-      <w:r>
-        <w:rPr/>
-        <w:t xml:space="preserve">), or the file and its directory are both read-only so it can be neither replaced nor removed; the handoff changed since its author session wrote it; the handoff was written by another session; this session's process could not be identified (always on a host without </w:t>
-      </w:r>
-      <w:r>
-        <w:rPr>
-          <w:rStyle w:val="SourceText"/>
-        </w:rPr>
-        <w:t>/proc</w:t>
-      </w:r>
-      <w:r>
-        <w:rPr/>
-        <w:t>, such as native Windows or macOS); the record of past auto-resumes (</w:t>
-      </w:r>
-      <w:r>
-        <w:rPr>
-          <w:rStyle w:val="SourceText"/>
-        </w:rPr>
-        <w:t>resume-state.json</w:t>
-      </w:r>
-      <w:r>
-        <w:rPr/>
-        <w:t xml:space="preserve">) could not be read, or its directory cannot be searched; this handoff was already resumed; the progress fingerprint could not be computed; the same command with no progress since the last auto-resume; </w:t>
-      </w:r>
-      <w:r>
-        <w:rPr>
-          <w:rStyle w:val="SourceText"/>
-        </w:rPr>
-        <w:t>internal error</w:t>
-      </w:r>
-      <w:r>
-        <w:rPr/>
-        <w:t xml:space="preserve"> (the decision itself failed, and the handoff is still injected). Never on a plain </w:t>
-      </w:r>
-      <w:r>
-        <w:rPr>
-          <w:rStyle w:val="SourceText"/>
-        </w:rPr>
-        <w:t>startup</w:t>
-      </w:r>
-      <w:r>
-        <w:rPr/>
-        <w:t>.</w:t>
-      </w:r>
-    </w:p>
-    <w:p>
-      <w:pPr>
-        <w:pStyle w:val="BodyText"/>
-        <w:bidi w:val="0"/>
-        <w:jc w:val="left"/>
-        <w:rPr/>
-      </w:pPr>
-      <w:r>
-        <w:rPr>
-          <w:rStyle w:val="Strong"/>
-        </w:rPr>
-        <w:t>Crew types it where it can (T-0013).</w:t>
-      </w:r>
-      <w:r>
-        <w:rPr/>
-        <w:t xml:space="preserve"> The context hook runs its own flavour's </w:t>
-      </w:r>
-      <w:r>
-        <w:rPr>
-          <w:rStyle w:val="SourceText"/>
-        </w:rPr>
-        <w:t>auto-clear</w:t>
-      </w:r>
-      <w:r>
-        <w:rPr/>
-        <w:t xml:space="preserve"> sender in resume mode. Consent is </w:t>
-      </w:r>
-      <w:r>
-        <w:rPr>
-          <w:rStyle w:val="SourceText"/>
-        </w:rPr>
-        <w:t>resume.auto</w:t>
-      </w:r>
-      <w:r>
-        <w:rPr/>
-        <w:t xml:space="preserve">; </w:t>
-      </w:r>
-      <w:r>
-        <w:rPr>
-          <w:rStyle w:val="SourceText"/>
-        </w:rPr>
-        <w:t>context.autoClear</w:t>
-      </w:r>
-      <w:r>
-        <w:rPr/>
-        <w:t xml:space="preserve"> only describes the terminal. In tmux it waits </w:t>
-      </w:r>
-      <w:r>
-        <w:rPr>
-          <w:rStyle w:val="SourceText"/>
-        </w:rPr>
-        <w:t>resume.typeDelaySeconds</w:t>
-      </w:r>
-      <w:r>
-        <w:rPr/>
-        <w:t xml:space="preserve"> (default 2), polls the pane for an idle, empty input line for up to </w:t>
-      </w:r>
-      <w:r>
-        <w:rPr>
-          <w:rStyle w:val="SourceText"/>
-        </w:rPr>
-        <w:t>resume.readyTimeoutSeconds</w:t>
-      </w:r>
-      <w:r>
-        <w:rPr/>
-        <w:t xml:space="preserve"> (default 15), then sends the command and, half a second later, Enter. On native Windows it types only under an explicit </w:t>
-      </w:r>
-      <w:r>
-        <w:rPr>
-          <w:rStyle w:val="SourceText"/>
-        </w:rPr>
-        <w:t>method: sendkeys</w:t>
-      </w:r>
-      <w:r>
-        <w:rPr/>
-        <w:t xml:space="preserve">, after the delay, with the focus and tab rechecks; </w:t>
-      </w:r>
-      <w:r>
-        <w:rPr>
-          <w:rStyle w:val="SourceText"/>
-        </w:rPr>
-        <w:t>auto</w:t>
-      </w:r>
-      <w:r>
-        <w:rPr/>
-        <w:t xml:space="preserve"> there types nothing. It types once per handoff (a marker under </w:t>
-      </w:r>
-      <w:r>
-        <w:rPr>
-          <w:rStyle w:val="SourceText"/>
-        </w:rPr>
-        <w:t>&lt;git-common-dir&gt;/crew/</w:t>
-      </w:r>
-      <w:r>
-        <w:rPr/>
-        <w:t xml:space="preserve">) and records the run first, so a run that could not be recorded is never typed. The context then says </w:t>
-      </w:r>
-      <w:r>
-        <w:rPr>
-          <w:rStyle w:val="SourceText"/>
-        </w:rPr>
-        <w:t>Auto-resume: typing /crew:done T-0001 into this session in 2s (method tmux)</w:t>
-      </w:r>
-      <w:r>
-        <w:rPr/>
-        <w:t xml:space="preserve">, or keeps the line above and adds </w:t>
-      </w:r>
-      <w:r>
-        <w:rPr>
-          <w:rStyle w:val="SourceText"/>
-        </w:rPr>
-        <w:t>Auto-resume was not typed: &lt;reason&gt;.</w:t>
-      </w:r>
-      <w:r>
-        <w:rPr/>
-        <w:t xml:space="preserve"> Every refusal is in </w:t>
-      </w:r>
-      <w:r>
-        <w:rPr>
-          <w:rStyle w:val="SourceText"/>
-        </w:rPr>
-        <w:t>.crew/.autoclear.log</w:t>
-      </w:r>
-      <w:r>
-        <w:rPr/>
-        <w:t xml:space="preserve">: decide did not say run; no usable method, </w:t>
-      </w:r>
-      <w:r>
-        <w:rPr>
-          <w:rStyle w:val="SourceText"/>
-        </w:rPr>
-        <w:t>$TMUX</w:t>
-      </w:r>
-      <w:r>
-        <w:rPr/>
-        <w:t xml:space="preserve"> unset or a pane that is not this session's; </w:t>
-      </w:r>
-      <w:r>
-        <w:rPr>
-          <w:rStyle w:val="SourceText"/>
-        </w:rPr>
-        <w:t>wtype</w:t>
-      </w:r>
-      <w:r>
-        <w:rPr/>
-        <w:t xml:space="preserve"> or </w:t>
-      </w:r>
-      <w:r>
-        <w:rPr>
-          <w:rStyle w:val="SourceText"/>
-        </w:rPr>
-        <w:t>xdotool</w:t>
-      </w:r>
-      <w:r>
-        <w:rPr/>
-        <w:t>; already typed; the run could not be recorded; the input line is not empty; not ready in time; on Windows, focus lost or a tab not provable. The 2 s default comes from a measurement (input ready by 0.134 s after SessionStart on Claude Code 2.1.282); a delay is still a guess, and Windows has no probe.</w:t>
-      </w:r>
-    </w:p>
-    <w:p>
-      <w:pPr>
-        <w:pStyle w:val="BodyText"/>
-        <w:bidi w:val="0"/>
-        <w:jc w:val="left"/>
-        <w:rPr/>
-      </w:pPr>
-      <w:r>
-        <w:rPr/>
-        <w:t xml:space="preserve">A note resumes only in the session that wrote it. Write it with the Write tool (as </w:t>
-      </w:r>
-      <w:r>
-        <w:rPr>
-          <w:rStyle w:val="SourceText"/>
-        </w:rPr>
-        <w:t>/crew:handoff</w:t>
-      </w:r>
-      <w:r>
-        <w:rPr/>
-        <w:t xml:space="preserve"> does): the context hook then records which session and which Claude Code process wrote it. After </w:t>
-      </w:r>
-      <w:r>
-        <w:rPr>
-          <w:rStyle w:val="SourceText"/>
-        </w:rPr>
-        <w:t>/compact</w:t>
-      </w:r>
-      <w:r>
-        <w:rPr/>
-        <w:t xml:space="preserve"> the session must match; after </w:t>
-      </w:r>
-      <w:r>
-        <w:rPr>
-          <w:rStyle w:val="SourceText"/>
-        </w:rPr>
-        <w:t>/clear</w:t>
-      </w:r>
-      <w:r>
-        <w:rPr/>
-        <w:t xml:space="preserve"> the process must, so a </w:t>
-      </w:r>
-      <w:r>
-        <w:rPr>
-          <w:rStyle w:val="SourceText"/>
-        </w:rPr>
-        <w:t>/clear</w:t>
-      </w:r>
-      <w:r>
-        <w:rPr/>
-        <w:t xml:space="preserve"> in another terminal on the same worktree waits. A note written by Bash or by hand waits.</w:t>
+        <w:rPr/>
+        <w:t>This section is folded into the troubleshooting guide (</w:t>
+      </w:r>
+      <w:r>
+        <w:rPr>
+          <w:rStyle w:val="SourceText"/>
+        </w:rPr>
+        <w:t>troubleshooting.md</w:t>
+      </w:r>
+      <w:r>
+        <w:rPr/>
+        <w:t>), linked from it as "Auto wrap-up, clear and resume". It covers the cycle that lets a long session finish itself cleanly, clear, and pick up where it stopped.</w:t>
       </w:r>
     </w:p>
     <w:p>
@@ -12750,8 +13675,678 @@
         <w:jc w:val="left"/>
         <w:rPr/>
       </w:pPr>
-      <w:bookmarkStart w:id="18" w:name="turning-it-on-and-off"/>
-      <w:bookmarkEnd w:id="18"/>
+      <w:bookmarkStart w:id="19" w:name="what-the-cycle-does"/>
+      <w:bookmarkEnd w:id="19"/>
+      <w:r>
+        <w:rPr/>
+        <w:t>What the Cycle Does</w:t>
+      </w:r>
+    </w:p>
+    <w:p>
+      <w:pPr>
+        <w:pStyle w:val="BodyText"/>
+        <w:numPr>
+          <w:ilvl w:val="0"/>
+          <w:numId w:val="27"/>
+        </w:numPr>
+        <w:tabs>
+          <w:tab w:val="clear" w:pos="1134"/>
+          <w:tab w:val="left" w:pos="829" w:leader="none"/>
+        </w:tabs>
+        <w:bidi w:val="0"/>
+        <w:spacing w:before="120" w:after="0"/>
+        <w:ind w:hanging="283" w:left="829"/>
+        <w:jc w:val="left"/>
+        <w:rPr/>
+      </w:pPr>
+      <w:r>
+        <w:rPr>
+          <w:rStyle w:val="Strong"/>
+        </w:rPr>
+        <w:t>Wrap-up.</w:t>
+      </w:r>
+      <w:r>
+        <w:rPr/>
+        <w:t xml:space="preserve"> When the context window crosses its threshold, the </w:t>
+      </w:r>
+      <w:r>
+        <w:rPr>
+          <w:rStyle w:val="SourceText"/>
+        </w:rPr>
+        <w:t>Stop</w:t>
+      </w:r>
+      <w:r>
+        <w:rPr/>
+        <w:t xml:space="preserve"> hook blocks once. It asks the session to finish or park the change in flight, write </w:t>
+      </w:r>
+      <w:r>
+        <w:rPr>
+          <w:rStyle w:val="SourceText"/>
+        </w:rPr>
+        <w:t>.work/HANDOFF.md</w:t>
+      </w:r>
+      <w:r>
+        <w:rPr/>
+        <w:t xml:space="preserve">, and update the ticket. This happens once for each threshold crossing in each session. It never happens on the forced continuation that follows a block. With </w:t>
+      </w:r>
+      <w:r>
+        <w:rPr>
+          <w:rStyle w:val="SourceText"/>
+        </w:rPr>
+        <w:t>context.autoClear.wrapUp</w:t>
+      </w:r>
+      <w:r>
+        <w:rPr/>
+        <w:t xml:space="preserve"> armed (below), the block carries the wrap-up procedure instead, and the clear waits for its results. </w:t>
+      </w:r>
+    </w:p>
+    <w:p>
+      <w:pPr>
+        <w:pStyle w:val="BodyText"/>
+        <w:numPr>
+          <w:ilvl w:val="0"/>
+          <w:numId w:val="27"/>
+        </w:numPr>
+        <w:tabs>
+          <w:tab w:val="clear" w:pos="1134"/>
+          <w:tab w:val="left" w:pos="829" w:leader="none"/>
+        </w:tabs>
+        <w:bidi w:val="0"/>
+        <w:ind w:hanging="283" w:left="829"/>
+        <w:jc w:val="left"/>
+        <w:rPr/>
+      </w:pPr>
+      <w:r>
+        <w:rPr>
+          <w:rStyle w:val="Strong"/>
+        </w:rPr>
+        <w:t>Clear, or notify.</w:t>
+      </w:r>
+      <w:r>
+        <w:rPr/>
+        <w:t xml:space="preserve"> After the handoff is written, auto-clear acts on it. What it does depends on </w:t>
+      </w:r>
+      <w:r>
+        <w:rPr>
+          <w:rStyle w:val="SourceText"/>
+        </w:rPr>
+        <w:t>method</w:t>
+      </w:r>
+      <w:r>
+        <w:rPr/>
+        <w:t xml:space="preserve"> (below): </w:t>
+      </w:r>
+      <w:r>
+        <w:rPr>
+          <w:rStyle w:val="SourceText"/>
+        </w:rPr>
+        <w:t>notify</w:t>
+      </w:r>
+      <w:r>
+        <w:rPr/>
+        <w:t xml:space="preserve"> (the default on native Windows) prints a message telling you the handoff is written and it is safe to run </w:t>
+      </w:r>
+      <w:r>
+        <w:rPr>
+          <w:rStyle w:val="SourceText"/>
+        </w:rPr>
+        <w:t>/clear</w:t>
+      </w:r>
+      <w:r>
+        <w:rPr/>
+        <w:t xml:space="preserve"> (or </w:t>
+      </w:r>
+      <w:r>
+        <w:rPr>
+          <w:rStyle w:val="SourceText"/>
+        </w:rPr>
+        <w:t>/compact</w:t>
+      </w:r>
+      <w:r>
+        <w:rPr/>
+        <w:t xml:space="preserve">) yourself — it types nothing. </w:t>
+      </w:r>
+      <w:r>
+        <w:rPr>
+          <w:rStyle w:val="SourceText"/>
+        </w:rPr>
+        <w:t>tmux</w:t>
+      </w:r>
+      <w:r>
+        <w:rPr/>
+        <w:t xml:space="preserve">, </w:t>
+      </w:r>
+      <w:r>
+        <w:rPr>
+          <w:rStyle w:val="SourceText"/>
+        </w:rPr>
+        <w:t>xdotool</w:t>
+      </w:r>
+      <w:r>
+        <w:rPr/>
+        <w:t xml:space="preserve"> and </w:t>
+      </w:r>
+      <w:r>
+        <w:rPr>
+          <w:rStyle w:val="SourceText"/>
+        </w:rPr>
+        <w:t>sendkeys</w:t>
+      </w:r>
+      <w:r>
+        <w:rPr/>
+        <w:t xml:space="preserve"> actually type the configured command into the terminal that runs this session. Whichever method is in force, it acts only when all five of these hold: - this machine opted in; - the handoff was written by this session after the wrap-up request, is longer than a stub, and is not the automatic PreCompact skeleton; - the context reading that caused the wrap-up was a real measurement (see "When it will not clear"); - this session is bound to its own Claude Code process, and that process has a terminal of its own (see "Which window gets the keystroke") — a headless session, such as a </w:t>
+      </w:r>
+      <w:r>
+        <w:rPr>
+          <w:rStyle w:val="SourceText"/>
+        </w:rPr>
+        <w:t>claude -p</w:t>
+      </w:r>
+      <w:r>
+        <w:rPr/>
+        <w:t xml:space="preserve"> child, gets one message instead, naming its handoff and saying the process that started it must start a new one; - for a method that types (</w:t>
+      </w:r>
+      <w:r>
+        <w:rPr>
+          <w:rStyle w:val="SourceText"/>
+        </w:rPr>
+        <w:t>tmux</w:t>
+      </w:r>
+      <w:r>
+        <w:rPr/>
+        <w:t>/</w:t>
+      </w:r>
+      <w:r>
+        <w:rPr>
+          <w:rStyle w:val="SourceText"/>
+        </w:rPr>
+        <w:t>xdotool</w:t>
+      </w:r>
+      <w:r>
+        <w:rPr/>
+        <w:t>/</w:t>
+      </w:r>
+      <w:r>
+        <w:rPr>
+          <w:rStyle w:val="SourceText"/>
+        </w:rPr>
+        <w:t>sendkeys</w:t>
+      </w:r>
+      <w:r>
+        <w:rPr/>
+        <w:t xml:space="preserve">), the target window can be identified exactly, from that process — </w:t>
+      </w:r>
+      <w:r>
+        <w:rPr>
+          <w:rStyle w:val="SourceText"/>
+        </w:rPr>
+        <w:t>notify</w:t>
+      </w:r>
+      <w:r>
+        <w:rPr/>
+        <w:t xml:space="preserve"> needs none of this, since it identifies no window. </w:t>
+      </w:r>
+    </w:p>
+    <w:p>
+      <w:pPr>
+        <w:pStyle w:val="BodyText"/>
+        <w:bidi w:val="0"/>
+        <w:jc w:val="left"/>
+        <w:rPr/>
+      </w:pPr>
+      <w:r>
+        <w:rPr>
+          <w:rStyle w:val="Strong"/>
+        </w:rPr>
+        <w:t>Crew neither causes nor tunes Claude Code's own auto-compact.</w:t>
+      </w:r>
+      <w:r>
+        <w:rPr/>
+        <w:t xml:space="preserve"> That is a separate, built-in behaviour that fires whenever Claude Code itself decides to; this cycle only reacts to a handoff once one exists, and nothing here makes auto-compact happen sooner, later, or at all. 3. </w:t>
+      </w:r>
+      <w:r>
+        <w:rPr>
+          <w:rStyle w:val="Strong"/>
+        </w:rPr>
+        <w:t>Resume.</w:t>
+      </w:r>
+      <w:r>
+        <w:rPr/>
+        <w:t xml:space="preserve"> The new session starts with the handoff and its next action already in context, within the 3,000-character resume budget. Nothing starts working unprompted: crew does not use </w:t>
+      </w:r>
+      <w:r>
+        <w:rPr>
+          <w:rStyle w:val="SourceText"/>
+        </w:rPr>
+        <w:t>initialUserMessage</w:t>
+      </w:r>
+      <w:r>
+        <w:rPr/>
+        <w:t xml:space="preserve">, so you press Enter to continue. Claude Code 2.1.282 drops it in an interactive session anyway (spike, 2026-09-25): it is honoured by </w:t>
+      </w:r>
+      <w:r>
+        <w:rPr>
+          <w:rStyle w:val="SourceText"/>
+        </w:rPr>
+        <w:t>claude -p</w:t>
+      </w:r>
+      <w:r>
+        <w:rPr/>
+        <w:t xml:space="preserve"> only.</w:t>
+      </w:r>
+    </w:p>
+    <w:p>
+      <w:pPr>
+        <w:pStyle w:val="BodyText"/>
+        <w:bidi w:val="0"/>
+        <w:jc w:val="left"/>
+        <w:rPr/>
+      </w:pPr>
+      <w:r>
+        <w:rPr/>
+        <w:t xml:space="preserve">With </w:t>
+      </w:r>
+      <w:r>
+        <w:rPr>
+          <w:rStyle w:val="SourceText"/>
+        </w:rPr>
+        <w:t>resume.auto: true</w:t>
+      </w:r>
+      <w:r>
+        <w:rPr/>
+        <w:t xml:space="preserve"> in the machine-global config, the handoff after </w:t>
+      </w:r>
+      <w:r>
+        <w:rPr>
+          <w:rStyle w:val="SourceText"/>
+        </w:rPr>
+        <w:t>/clear</w:t>
+      </w:r>
+      <w:r>
+        <w:rPr/>
+        <w:t xml:space="preserve"> or a manual </w:t>
+      </w:r>
+      <w:r>
+        <w:rPr>
+          <w:rStyle w:val="SourceText"/>
+        </w:rPr>
+        <w:t>/compact</w:t>
+      </w:r>
+      <w:r>
+        <w:rPr/>
+        <w:t xml:space="preserve"> also names the exact next command, read from the note's </w:t>
+      </w:r>
+      <w:r>
+        <w:rPr>
+          <w:rStyle w:val="SourceText"/>
+        </w:rPr>
+        <w:t>resume:</w:t>
+      </w:r>
+      <w:r>
+        <w:rPr/>
+        <w:t xml:space="preserve"> line (</w:t>
+      </w:r>
+      <w:r>
+        <w:rPr>
+          <w:rStyle w:val="SourceText"/>
+        </w:rPr>
+        <w:t>resume: /crew:done T-0001</w:t>
+      </w:r>
+      <w:r>
+        <w:rPr/>
+        <w:t xml:space="preserve">): </w:t>
+      </w:r>
+      <w:r>
+        <w:rPr>
+          <w:rStyle w:val="SourceText"/>
+        </w:rPr>
+        <w:t>Auto-resume: ready to run /crew:done T-0001.</w:t>
+      </w:r>
+      <w:r>
+        <w:rPr/>
+        <w:t xml:space="preserve"> — or </w:t>
+      </w:r>
+      <w:r>
+        <w:rPr>
+          <w:rStyle w:val="SourceText"/>
+        </w:rPr>
+        <w:t>Auto-resume did not start: &lt;reason&gt;.</w:t>
+      </w:r>
+      <w:r>
+        <w:rPr/>
+        <w:t xml:space="preserve"> when a check refuses it. It does not start from the hook: you press Enter or type it, or crew types it where the terminal can be identified (below). The refusal reasons are: compact was not a manual /compact; no handoff note, or it was archived as stale, or is stale and could not be archived; the handoff is the automatic PreCompact skeleton; no resume line, </w:t>
+      </w:r>
+      <w:r>
+        <w:rPr>
+          <w:rStyle w:val="SourceText"/>
+        </w:rPr>
+        <w:t>resume: none</w:t>
+      </w:r>
+      <w:r>
+        <w:rPr/>
+        <w:t xml:space="preserve">, or a line the grammar refuses (a second line, trailing text, an unknown command, or an excluded one such as </w:t>
+      </w:r>
+      <w:r>
+        <w:rPr>
+          <w:rStyle w:val="SourceText"/>
+        </w:rPr>
+        <w:t>/crew:approve</w:t>
+      </w:r>
+      <w:r>
+        <w:rPr/>
+        <w:t xml:space="preserve">); the note's </w:t>
+      </w:r>
+      <w:r>
+        <w:rPr>
+          <w:rStyle w:val="SourceText"/>
+        </w:rPr>
+        <w:t>branch:</w:t>
+      </w:r>
+      <w:r>
+        <w:rPr/>
+        <w:t xml:space="preserve"> or </w:t>
+      </w:r>
+      <w:r>
+        <w:rPr>
+          <w:rStyle w:val="SourceText"/>
+        </w:rPr>
+        <w:t>head:</w:t>
+      </w:r>
+      <w:r>
+        <w:rPr/>
+        <w:t xml:space="preserve"> does not match the checkout; the ticket directory or goal file is missing; the command is not installed; </w:t>
+      </w:r>
+      <w:r>
+        <w:rPr>
+          <w:rStyle w:val="SourceText"/>
+        </w:rPr>
+        <w:t>handoff-author.json</w:t>
+      </w:r>
+      <w:r>
+        <w:rPr/>
+        <w:t xml:space="preserve"> could not be read; no record of which session wrote this handoff; a later handoff write could not replace or remove </w:t>
+      </w:r>
+      <w:r>
+        <w:rPr>
+          <w:rStyle w:val="SourceText"/>
+        </w:rPr>
+        <w:t>handoff-author.json</w:t>
+      </w:r>
+      <w:r>
+        <w:rPr/>
+        <w:t xml:space="preserve"> (</w:t>
+      </w:r>
+      <w:r>
+        <w:rPr>
+          <w:rStyle w:val="SourceText"/>
+        </w:rPr>
+        <w:t>handoff-author.json.stuck</w:t>
+      </w:r>
+      <w:r>
+        <w:rPr/>
+        <w:t xml:space="preserve">), or the file and its directory are both read-only so it can be neither replaced nor removed; the handoff changed since its author session wrote it; the handoff was written by another session; this session's process could not be identified (always on a host without </w:t>
+      </w:r>
+      <w:r>
+        <w:rPr>
+          <w:rStyle w:val="SourceText"/>
+        </w:rPr>
+        <w:t>/proc</w:t>
+      </w:r>
+      <w:r>
+        <w:rPr/>
+        <w:t>, such as native Windows or macOS); the record of past auto-resumes (</w:t>
+      </w:r>
+      <w:r>
+        <w:rPr>
+          <w:rStyle w:val="SourceText"/>
+        </w:rPr>
+        <w:t>resume-state.json</w:t>
+      </w:r>
+      <w:r>
+        <w:rPr/>
+        <w:t xml:space="preserve">) could not be read, or its directory cannot be searched; this handoff was already resumed; the progress fingerprint could not be computed; the same command with no progress since the last auto-resume; </w:t>
+      </w:r>
+      <w:r>
+        <w:rPr>
+          <w:rStyle w:val="SourceText"/>
+        </w:rPr>
+        <w:t>internal error</w:t>
+      </w:r>
+      <w:r>
+        <w:rPr/>
+        <w:t xml:space="preserve"> (the decision itself failed, and the handoff is still injected). Never on a plain </w:t>
+      </w:r>
+      <w:r>
+        <w:rPr>
+          <w:rStyle w:val="SourceText"/>
+        </w:rPr>
+        <w:t>startup</w:t>
+      </w:r>
+      <w:r>
+        <w:rPr/>
+        <w:t>.</w:t>
+      </w:r>
+    </w:p>
+    <w:p>
+      <w:pPr>
+        <w:pStyle w:val="BodyText"/>
+        <w:bidi w:val="0"/>
+        <w:jc w:val="left"/>
+        <w:rPr/>
+      </w:pPr>
+      <w:r>
+        <w:rPr>
+          <w:rStyle w:val="Strong"/>
+        </w:rPr>
+        <w:t>Crew types it where it can (T-0013).</w:t>
+      </w:r>
+      <w:r>
+        <w:rPr/>
+        <w:t xml:space="preserve"> The context hook runs its own flavour's </w:t>
+      </w:r>
+      <w:r>
+        <w:rPr>
+          <w:rStyle w:val="SourceText"/>
+        </w:rPr>
+        <w:t>auto-clear</w:t>
+      </w:r>
+      <w:r>
+        <w:rPr/>
+        <w:t xml:space="preserve"> sender in resume mode. Consent is </w:t>
+      </w:r>
+      <w:r>
+        <w:rPr>
+          <w:rStyle w:val="SourceText"/>
+        </w:rPr>
+        <w:t>resume.auto</w:t>
+      </w:r>
+      <w:r>
+        <w:rPr/>
+        <w:t xml:space="preserve">; </w:t>
+      </w:r>
+      <w:r>
+        <w:rPr>
+          <w:rStyle w:val="SourceText"/>
+        </w:rPr>
+        <w:t>context.autoClear</w:t>
+      </w:r>
+      <w:r>
+        <w:rPr/>
+        <w:t xml:space="preserve"> only describes the terminal. In tmux it waits </w:t>
+      </w:r>
+      <w:r>
+        <w:rPr>
+          <w:rStyle w:val="SourceText"/>
+        </w:rPr>
+        <w:t>resume.typeDelaySeconds</w:t>
+      </w:r>
+      <w:r>
+        <w:rPr/>
+        <w:t xml:space="preserve"> (default 2), polls the pane for an idle, empty input line for up to </w:t>
+      </w:r>
+      <w:r>
+        <w:rPr>
+          <w:rStyle w:val="SourceText"/>
+        </w:rPr>
+        <w:t>resume.readyTimeoutSeconds</w:t>
+      </w:r>
+      <w:r>
+        <w:rPr/>
+        <w:t xml:space="preserve"> (default 15), then sends the command and, half a second later, Enter. On native Windows it types only under an explicit </w:t>
+      </w:r>
+      <w:r>
+        <w:rPr>
+          <w:rStyle w:val="SourceText"/>
+        </w:rPr>
+        <w:t>method: sendkeys</w:t>
+      </w:r>
+      <w:r>
+        <w:rPr/>
+        <w:t xml:space="preserve">, after the delay, with the focus and tab rechecks; </w:t>
+      </w:r>
+      <w:r>
+        <w:rPr>
+          <w:rStyle w:val="SourceText"/>
+        </w:rPr>
+        <w:t>auto</w:t>
+      </w:r>
+      <w:r>
+        <w:rPr/>
+        <w:t xml:space="preserve"> there types nothing. It types once per handoff (a marker under </w:t>
+      </w:r>
+      <w:r>
+        <w:rPr>
+          <w:rStyle w:val="SourceText"/>
+        </w:rPr>
+        <w:t>&lt;git-common-dir&gt;/crew/</w:t>
+      </w:r>
+      <w:r>
+        <w:rPr/>
+        <w:t xml:space="preserve">) and records the run first, so a run that could not be recorded is never typed. The context then says </w:t>
+      </w:r>
+      <w:r>
+        <w:rPr>
+          <w:rStyle w:val="SourceText"/>
+        </w:rPr>
+        <w:t>Auto-resume: typing /crew:done T-0001 into this session in 2s (method tmux)</w:t>
+      </w:r>
+      <w:r>
+        <w:rPr/>
+        <w:t xml:space="preserve">, or keeps the line above and adds </w:t>
+      </w:r>
+      <w:r>
+        <w:rPr>
+          <w:rStyle w:val="SourceText"/>
+        </w:rPr>
+        <w:t>Auto-resume was not typed: &lt;reason&gt;.</w:t>
+      </w:r>
+      <w:r>
+        <w:rPr/>
+        <w:t xml:space="preserve"> Every refusal is in </w:t>
+      </w:r>
+      <w:r>
+        <w:rPr>
+          <w:rStyle w:val="SourceText"/>
+        </w:rPr>
+        <w:t>.crew/.autoclear.log</w:t>
+      </w:r>
+      <w:r>
+        <w:rPr/>
+        <w:t xml:space="preserve">: decide did not say run; no usable method, </w:t>
+      </w:r>
+      <w:r>
+        <w:rPr>
+          <w:rStyle w:val="SourceText"/>
+        </w:rPr>
+        <w:t>$TMUX</w:t>
+      </w:r>
+      <w:r>
+        <w:rPr/>
+        <w:t xml:space="preserve"> unset or a pane that is not this session's; </w:t>
+      </w:r>
+      <w:r>
+        <w:rPr>
+          <w:rStyle w:val="SourceText"/>
+        </w:rPr>
+        <w:t>wtype</w:t>
+      </w:r>
+      <w:r>
+        <w:rPr/>
+        <w:t xml:space="preserve"> or </w:t>
+      </w:r>
+      <w:r>
+        <w:rPr>
+          <w:rStyle w:val="SourceText"/>
+        </w:rPr>
+        <w:t>xdotool</w:t>
+      </w:r>
+      <w:r>
+        <w:rPr/>
+        <w:t>; already typed; the run could not be recorded; the input line is not empty; not ready in time; on Windows, focus lost or a tab not provable. The 2 s default comes from a measurement (input ready by 0.134 s after SessionStart on Claude Code 2.1.282); a delay is still a guess, and Windows has no probe.</w:t>
+      </w:r>
+    </w:p>
+    <w:p>
+      <w:pPr>
+        <w:pStyle w:val="BodyText"/>
+        <w:bidi w:val="0"/>
+        <w:jc w:val="left"/>
+        <w:rPr/>
+      </w:pPr>
+      <w:r>
+        <w:rPr/>
+        <w:t xml:space="preserve">A note resumes only in the session that wrote it. Write it with the Write tool (as </w:t>
+      </w:r>
+      <w:r>
+        <w:rPr>
+          <w:rStyle w:val="SourceText"/>
+        </w:rPr>
+        <w:t>/crew:handoff</w:t>
+      </w:r>
+      <w:r>
+        <w:rPr/>
+        <w:t xml:space="preserve"> does): the context hook then records which session and which Claude Code process wrote it. After </w:t>
+      </w:r>
+      <w:r>
+        <w:rPr>
+          <w:rStyle w:val="SourceText"/>
+        </w:rPr>
+        <w:t>/compact</w:t>
+      </w:r>
+      <w:r>
+        <w:rPr/>
+        <w:t xml:space="preserve"> the session must match; after </w:t>
+      </w:r>
+      <w:r>
+        <w:rPr>
+          <w:rStyle w:val="SourceText"/>
+        </w:rPr>
+        <w:t>/clear</w:t>
+      </w:r>
+      <w:r>
+        <w:rPr/>
+        <w:t xml:space="preserve"> the process must, so a </w:t>
+      </w:r>
+      <w:r>
+        <w:rPr>
+          <w:rStyle w:val="SourceText"/>
+        </w:rPr>
+        <w:t>/clear</w:t>
+      </w:r>
+      <w:r>
+        <w:rPr/>
+        <w:t xml:space="preserve"> in another terminal on the same worktree waits. A note written by Bash or by hand waits.</w:t>
+      </w:r>
+    </w:p>
+    <w:p>
+      <w:pPr>
+        <w:pStyle w:val="Heading3"/>
+        <w:bidi w:val="0"/>
+        <w:ind w:hanging="0" w:left="0" w:right="0"/>
+        <w:jc w:val="left"/>
+        <w:rPr/>
+      </w:pPr>
+      <w:bookmarkStart w:id="20" w:name="turning-it-on-and-off"/>
+      <w:bookmarkEnd w:id="20"/>
       <w:r>
         <w:rPr/>
         <w:t>Turning It on and Off</w:t>
@@ -14312,8 +15907,8 @@
         <w:jc w:val="left"/>
         <w:rPr/>
       </w:pPr>
-      <w:bookmarkStart w:id="19" w:name="armed-wrap-up-contextautoclearwrapup"/>
-      <w:bookmarkEnd w:id="19"/>
+      <w:bookmarkStart w:id="21" w:name="armed-wrap-up-contextautoclearwrapup"/>
+      <w:bookmarkEnd w:id="21"/>
       <w:r>
         <w:rPr/>
         <w:t>Armed wrap-up (</w:t>
@@ -14396,7 +15991,7 @@
         <w:pStyle w:val="BodyText"/>
         <w:numPr>
           <w:ilvl w:val="0"/>
-          <w:numId w:val="26"/>
+          <w:numId w:val="28"/>
         </w:numPr>
         <w:tabs>
           <w:tab w:val="clear" w:pos="1134"/>
@@ -14428,7 +16023,7 @@
         <w:pStyle w:val="BodyText"/>
         <w:numPr>
           <w:ilvl w:val="0"/>
-          <w:numId w:val="26"/>
+          <w:numId w:val="28"/>
         </w:numPr>
         <w:tabs>
           <w:tab w:val="clear" w:pos="1134"/>
@@ -14460,7 +16055,7 @@
         <w:pStyle w:val="BodyText"/>
         <w:numPr>
           <w:ilvl w:val="0"/>
-          <w:numId w:val="26"/>
+          <w:numId w:val="28"/>
         </w:numPr>
         <w:tabs>
           <w:tab w:val="clear" w:pos="1134"/>
@@ -14482,7 +16077,7 @@
         <w:pStyle w:val="BodyText"/>
         <w:numPr>
           <w:ilvl w:val="0"/>
-          <w:numId w:val="26"/>
+          <w:numId w:val="28"/>
         </w:numPr>
         <w:tabs>
           <w:tab w:val="clear" w:pos="1134"/>
@@ -14580,8 +16175,8 @@
         <w:jc w:val="left"/>
         <w:rPr/>
       </w:pPr>
-      <w:bookmarkStart w:id="20" w:name="arming-one-scratch-repo-while-other-sess"/>
-      <w:bookmarkEnd w:id="20"/>
+      <w:bookmarkStart w:id="22" w:name="arming-one-scratch-repo-while-other-sess"/>
+      <w:bookmarkEnd w:id="22"/>
       <w:r>
         <w:rPr/>
         <w:t>Arming one scratch repo while other sessions are live</w:t>
@@ -14866,7 +16461,7 @@
         <w:pStyle w:val="BodyText"/>
         <w:numPr>
           <w:ilvl w:val="0"/>
-          <w:numId w:val="27"/>
+          <w:numId w:val="29"/>
         </w:numPr>
         <w:tabs>
           <w:tab w:val="clear" w:pos="1134"/>
@@ -14908,7 +16503,7 @@
         <w:pStyle w:val="BodyText"/>
         <w:numPr>
           <w:ilvl w:val="0"/>
-          <w:numId w:val="27"/>
+          <w:numId w:val="29"/>
         </w:numPr>
         <w:tabs>
           <w:tab w:val="clear" w:pos="1134"/>
@@ -14930,7 +16525,7 @@
         <w:pStyle w:val="BodyText"/>
         <w:numPr>
           <w:ilvl w:val="0"/>
-          <w:numId w:val="27"/>
+          <w:numId w:val="29"/>
         </w:numPr>
         <w:tabs>
           <w:tab w:val="clear" w:pos="1134"/>
@@ -14982,7 +16577,7 @@
         <w:pStyle w:val="BodyText"/>
         <w:numPr>
           <w:ilvl w:val="0"/>
-          <w:numId w:val="27"/>
+          <w:numId w:val="29"/>
         </w:numPr>
         <w:tabs>
           <w:tab w:val="clear" w:pos="1134"/>
@@ -15004,7 +16599,7 @@
         <w:pStyle w:val="BodyText"/>
         <w:numPr>
           <w:ilvl w:val="0"/>
-          <w:numId w:val="27"/>
+          <w:numId w:val="29"/>
         </w:numPr>
         <w:tabs>
           <w:tab w:val="clear" w:pos="1134"/>
@@ -15056,7 +16651,7 @@
         <w:pStyle w:val="BodyText"/>
         <w:numPr>
           <w:ilvl w:val="0"/>
-          <w:numId w:val="27"/>
+          <w:numId w:val="29"/>
         </w:numPr>
         <w:tabs>
           <w:tab w:val="clear" w:pos="1134"/>
@@ -15312,8 +16907,8 @@
         <w:jc w:val="left"/>
         <w:rPr/>
       </w:pPr>
-      <w:bookmarkStart w:id="21" w:name="which-method-and-what-it-does"/>
-      <w:bookmarkEnd w:id="21"/>
+      <w:bookmarkStart w:id="23" w:name="which-method-and-what-it-does"/>
+      <w:bookmarkEnd w:id="23"/>
       <w:r>
         <w:rPr/>
         <w:t>Which Method, and What It Does</w:t>
@@ -15895,8 +17490,8 @@
         <w:jc w:val="left"/>
         <w:rPr/>
       </w:pPr>
-      <w:bookmarkStart w:id="22" w:name="when-it-will-not-clear-or-notify"/>
-      <w:bookmarkEnd w:id="22"/>
+      <w:bookmarkStart w:id="24" w:name="when-it-will-not-clear-or-notify"/>
+      <w:bookmarkEnd w:id="24"/>
       <w:r>
         <w:rPr/>
         <w:t>When It Will Not Clear (or Notify)</w:t>
@@ -17225,8 +18820,8 @@
         <w:jc w:val="left"/>
         <w:rPr/>
       </w:pPr>
-      <w:bookmarkStart w:id="23" w:name="which-window-gets-the-keystroke"/>
-      <w:bookmarkEnd w:id="23"/>
+      <w:bookmarkStart w:id="25" w:name="which-window-gets-the-keystroke"/>
+      <w:bookmarkEnd w:id="25"/>
       <w:r>
         <w:rPr/>
         <w:t>Which Window Gets the Keystroke</w:t>
@@ -17351,7 +18946,7 @@
         <w:pStyle w:val="BodyText"/>
         <w:numPr>
           <w:ilvl w:val="0"/>
-          <w:numId w:val="28"/>
+          <w:numId w:val="30"/>
         </w:numPr>
         <w:tabs>
           <w:tab w:val="clear" w:pos="1134"/>
@@ -17389,7 +18984,7 @@
         <w:pStyle w:val="BodyText"/>
         <w:numPr>
           <w:ilvl w:val="0"/>
-          <w:numId w:val="28"/>
+          <w:numId w:val="30"/>
         </w:numPr>
         <w:tabs>
           <w:tab w:val="clear" w:pos="1134"/>
@@ -17449,7 +19044,7 @@
         <w:pStyle w:val="BodyText"/>
         <w:numPr>
           <w:ilvl w:val="0"/>
-          <w:numId w:val="28"/>
+          <w:numId w:val="30"/>
         </w:numPr>
         <w:tabs>
           <w:tab w:val="clear" w:pos="1134"/>
@@ -20812,8 +22407,8 @@
   <w:abstractNum w:abstractNumId="25">
     <w:lvl w:ilvl="0">
       <w:start w:val="1"/>
-      <w:numFmt w:val="decimal"/>
-      <w:lvlText w:val="%1."/>
+      <w:numFmt w:val="bullet"/>
+      <w:lvlText w:val=""/>
       <w:lvlJc w:val="left"/>
       <w:pPr>
         <w:tabs>
@@ -20821,12 +22416,14 @@
         </w:tabs>
         <w:ind w:left="709" w:hanging="283"/>
       </w:pPr>
-      <w:rPr/>
+      <w:rPr>
+        <w:rFonts w:ascii="Symbol" w:hAnsi="Symbol" w:cs="Symbol" w:hint="default"/>
+      </w:rPr>
     </w:lvl>
     <w:lvl w:ilvl="1">
       <w:start w:val="1"/>
-      <w:numFmt w:val="decimal"/>
-      <w:lvlText w:val="%2."/>
+      <w:numFmt w:val="bullet"/>
+      <w:lvlText w:val=""/>
       <w:lvlJc w:val="left"/>
       <w:pPr>
         <w:tabs>
@@ -20834,12 +22431,14 @@
         </w:tabs>
         <w:ind w:left="1418" w:hanging="283"/>
       </w:pPr>
-      <w:rPr/>
+      <w:rPr>
+        <w:rFonts w:ascii="Symbol" w:hAnsi="Symbol" w:cs="Symbol" w:hint="default"/>
+      </w:rPr>
     </w:lvl>
     <w:lvl w:ilvl="2">
       <w:start w:val="1"/>
-      <w:numFmt w:val="decimal"/>
-      <w:lvlText w:val="%3."/>
+      <w:numFmt w:val="bullet"/>
+      <w:lvlText w:val=""/>
       <w:lvlJc w:val="left"/>
       <w:pPr>
         <w:tabs>
@@ -20847,12 +22446,14 @@
         </w:tabs>
         <w:ind w:left="2127" w:hanging="283"/>
       </w:pPr>
-      <w:rPr/>
+      <w:rPr>
+        <w:rFonts w:ascii="Symbol" w:hAnsi="Symbol" w:cs="Symbol" w:hint="default"/>
+      </w:rPr>
     </w:lvl>
     <w:lvl w:ilvl="3">
       <w:start w:val="1"/>
-      <w:numFmt w:val="decimal"/>
-      <w:lvlText w:val="%4."/>
+      <w:numFmt w:val="bullet"/>
+      <w:lvlText w:val=""/>
       <w:lvlJc w:val="left"/>
       <w:pPr>
         <w:tabs>
@@ -20860,12 +22461,14 @@
         </w:tabs>
         <w:ind w:left="2836" w:hanging="283"/>
       </w:pPr>
-      <w:rPr/>
+      <w:rPr>
+        <w:rFonts w:ascii="Symbol" w:hAnsi="Symbol" w:cs="Symbol" w:hint="default"/>
+      </w:rPr>
     </w:lvl>
     <w:lvl w:ilvl="4">
       <w:start w:val="1"/>
-      <w:numFmt w:val="decimal"/>
-      <w:lvlText w:val="%5."/>
+      <w:numFmt w:val="bullet"/>
+      <w:lvlText w:val=""/>
       <w:lvlJc w:val="left"/>
       <w:pPr>
         <w:tabs>
@@ -20873,12 +22476,14 @@
         </w:tabs>
         <w:ind w:left="3545" w:hanging="283"/>
       </w:pPr>
-      <w:rPr/>
+      <w:rPr>
+        <w:rFonts w:ascii="Symbol" w:hAnsi="Symbol" w:cs="Symbol" w:hint="default"/>
+      </w:rPr>
     </w:lvl>
     <w:lvl w:ilvl="5">
       <w:start w:val="1"/>
-      <w:numFmt w:val="decimal"/>
-      <w:lvlText w:val="%6."/>
+      <w:numFmt w:val="bullet"/>
+      <w:lvlText w:val=""/>
       <w:lvlJc w:val="left"/>
       <w:pPr>
         <w:tabs>
@@ -20886,12 +22491,14 @@
         </w:tabs>
         <w:ind w:left="4254" w:hanging="283"/>
       </w:pPr>
-      <w:rPr/>
+      <w:rPr>
+        <w:rFonts w:ascii="Symbol" w:hAnsi="Symbol" w:cs="Symbol" w:hint="default"/>
+      </w:rPr>
     </w:lvl>
     <w:lvl w:ilvl="6">
       <w:start w:val="1"/>
-      <w:numFmt w:val="decimal"/>
-      <w:lvlText w:val="%7."/>
+      <w:numFmt w:val="bullet"/>
+      <w:lvlText w:val=""/>
       <w:lvlJc w:val="left"/>
       <w:pPr>
         <w:tabs>
@@ -20899,12 +22506,14 @@
         </w:tabs>
         <w:ind w:left="4963" w:hanging="283"/>
       </w:pPr>
-      <w:rPr/>
+      <w:rPr>
+        <w:rFonts w:ascii="Symbol" w:hAnsi="Symbol" w:cs="Symbol" w:hint="default"/>
+      </w:rPr>
     </w:lvl>
     <w:lvl w:ilvl="7">
       <w:start w:val="1"/>
-      <w:numFmt w:val="decimal"/>
-      <w:lvlText w:val="%8."/>
+      <w:numFmt w:val="bullet"/>
+      <w:lvlText w:val=""/>
       <w:lvlJc w:val="left"/>
       <w:pPr>
         <w:tabs>
@@ -20912,12 +22521,14 @@
         </w:tabs>
         <w:ind w:left="5672" w:hanging="283"/>
       </w:pPr>
-      <w:rPr/>
+      <w:rPr>
+        <w:rFonts w:ascii="Symbol" w:hAnsi="Symbol" w:cs="Symbol" w:hint="default"/>
+      </w:rPr>
     </w:lvl>
     <w:lvl w:ilvl="8">
       <w:start w:val="1"/>
-      <w:numFmt w:val="decimal"/>
-      <w:lvlText w:val="%9."/>
+      <w:numFmt w:val="bullet"/>
+      <w:lvlText w:val=""/>
       <w:lvlJc w:val="left"/>
       <w:pPr>
         <w:tabs>
@@ -20925,7 +22536,9 @@
         </w:tabs>
         <w:ind w:left="6381" w:hanging="283"/>
       </w:pPr>
-      <w:rPr/>
+      <w:rPr>
+        <w:rFonts w:ascii="Symbol" w:hAnsi="Symbol" w:cs="Symbol" w:hint="default"/>
+      </w:rPr>
     </w:lvl>
   </w:abstractNum>
   <w:abstractNum w:abstractNumId="26">
@@ -21068,8 +22681,8 @@
   <w:abstractNum w:abstractNumId="27">
     <w:lvl w:ilvl="0">
       <w:start w:val="1"/>
-      <w:numFmt w:val="bullet"/>
-      <w:lvlText w:val=""/>
+      <w:numFmt w:val="decimal"/>
+      <w:lvlText w:val="%1."/>
       <w:lvlJc w:val="left"/>
       <w:pPr>
         <w:tabs>
@@ -21077,14 +22690,12 @@
         </w:tabs>
         <w:ind w:left="709" w:hanging="283"/>
       </w:pPr>
-      <w:rPr>
-        <w:rFonts w:ascii="Symbol" w:hAnsi="Symbol" w:cs="Symbol" w:hint="default"/>
-      </w:rPr>
+      <w:rPr/>
     </w:lvl>
     <w:lvl w:ilvl="1">
       <w:start w:val="1"/>
-      <w:numFmt w:val="bullet"/>
-      <w:lvlText w:val=""/>
+      <w:numFmt w:val="decimal"/>
+      <w:lvlText w:val="%2."/>
       <w:lvlJc w:val="left"/>
       <w:pPr>
         <w:tabs>
@@ -21092,14 +22703,12 @@
         </w:tabs>
         <w:ind w:left="1418" w:hanging="283"/>
       </w:pPr>
-      <w:rPr>
-        <w:rFonts w:ascii="Symbol" w:hAnsi="Symbol" w:cs="Symbol" w:hint="default"/>
-      </w:rPr>
+      <w:rPr/>
     </w:lvl>
     <w:lvl w:ilvl="2">
       <w:start w:val="1"/>
-      <w:numFmt w:val="bullet"/>
-      <w:lvlText w:val=""/>
+      <w:numFmt w:val="decimal"/>
+      <w:lvlText w:val="%3."/>
       <w:lvlJc w:val="left"/>
       <w:pPr>
         <w:tabs>
@@ -21107,14 +22716,12 @@
         </w:tabs>
         <w:ind w:left="2127" w:hanging="283"/>
       </w:pPr>
-      <w:rPr>
-        <w:rFonts w:ascii="Symbol" w:hAnsi="Symbol" w:cs="Symbol" w:hint="default"/>
-      </w:rPr>
+      <w:rPr/>
     </w:lvl>
     <w:lvl w:ilvl="3">
       <w:start w:val="1"/>
-      <w:numFmt w:val="bullet"/>
-      <w:lvlText w:val=""/>
+      <w:numFmt w:val="decimal"/>
+      <w:lvlText w:val="%4."/>
       <w:lvlJc w:val="left"/>
       <w:pPr>
         <w:tabs>
@@ -21122,14 +22729,12 @@
         </w:tabs>
         <w:ind w:left="2836" w:hanging="283"/>
       </w:pPr>
-      <w:rPr>
-        <w:rFonts w:ascii="Symbol" w:hAnsi="Symbol" w:cs="Symbol" w:hint="default"/>
-      </w:rPr>
+      <w:rPr/>
     </w:lvl>
     <w:lvl w:ilvl="4">
       <w:start w:val="1"/>
-      <w:numFmt w:val="bullet"/>
-      <w:lvlText w:val=""/>
+      <w:numFmt w:val="decimal"/>
+      <w:lvlText w:val="%5."/>
       <w:lvlJc w:val="left"/>
       <w:pPr>
         <w:tabs>
@@ -21137,14 +22742,12 @@
         </w:tabs>
         <w:ind w:left="3545" w:hanging="283"/>
       </w:pPr>
-      <w:rPr>
-        <w:rFonts w:ascii="Symbol" w:hAnsi="Symbol" w:cs="Symbol" w:hint="default"/>
-      </w:rPr>
+      <w:rPr/>
     </w:lvl>
     <w:lvl w:ilvl="5">
       <w:start w:val="1"/>
-      <w:numFmt w:val="bullet"/>
-      <w:lvlText w:val=""/>
+      <w:numFmt w:val="decimal"/>
+      <w:lvlText w:val="%6."/>
       <w:lvlJc w:val="left"/>
       <w:pPr>
         <w:tabs>
@@ -21152,14 +22755,12 @@
         </w:tabs>
         <w:ind w:left="4254" w:hanging="283"/>
       </w:pPr>
-      <w:rPr>
-        <w:rFonts w:ascii="Symbol" w:hAnsi="Symbol" w:cs="Symbol" w:hint="default"/>
-      </w:rPr>
+      <w:rPr/>
     </w:lvl>
     <w:lvl w:ilvl="6">
       <w:start w:val="1"/>
-      <w:numFmt w:val="bullet"/>
-      <w:lvlText w:val=""/>
+      <w:numFmt w:val="decimal"/>
+      <w:lvlText w:val="%7."/>
       <w:lvlJc w:val="left"/>
       <w:pPr>
         <w:tabs>
@@ -21167,14 +22768,12 @@
         </w:tabs>
         <w:ind w:left="4963" w:hanging="283"/>
       </w:pPr>
-      <w:rPr>
-        <w:rFonts w:ascii="Symbol" w:hAnsi="Symbol" w:cs="Symbol" w:hint="default"/>
-      </w:rPr>
+      <w:rPr/>
     </w:lvl>
     <w:lvl w:ilvl="7">
       <w:start w:val="1"/>
-      <w:numFmt w:val="bullet"/>
-      <w:lvlText w:val=""/>
+      <w:numFmt w:val="decimal"/>
+      <w:lvlText w:val="%8."/>
       <w:lvlJc w:val="left"/>
       <w:pPr>
         <w:tabs>
@@ -21182,14 +22781,12 @@
         </w:tabs>
         <w:ind w:left="5672" w:hanging="283"/>
       </w:pPr>
-      <w:rPr>
-        <w:rFonts w:ascii="Symbol" w:hAnsi="Symbol" w:cs="Symbol" w:hint="default"/>
-      </w:rPr>
+      <w:rPr/>
     </w:lvl>
     <w:lvl w:ilvl="8">
       <w:start w:val="1"/>
-      <w:numFmt w:val="bullet"/>
-      <w:lvlText w:val=""/>
+      <w:numFmt w:val="decimal"/>
+      <w:lvlText w:val="%9."/>
       <w:lvlJc w:val="left"/>
       <w:pPr>
         <w:tabs>
@@ -21197,9 +22794,7 @@
         </w:tabs>
         <w:ind w:left="6381" w:hanging="283"/>
       </w:pPr>
-      <w:rPr>
-        <w:rFonts w:ascii="Symbol" w:hAnsi="Symbol" w:cs="Symbol" w:hint="default"/>
-      </w:rPr>
+      <w:rPr/>
     </w:lvl>
   </w:abstractNum>
   <w:abstractNum w:abstractNumId="28">
@@ -21340,6 +22935,280 @@
     </w:lvl>
   </w:abstractNum>
   <w:abstractNum w:abstractNumId="29">
+    <w:lvl w:ilvl="0">
+      <w:start w:val="1"/>
+      <w:numFmt w:val="bullet"/>
+      <w:lvlText w:val=""/>
+      <w:lvlJc w:val="left"/>
+      <w:pPr>
+        <w:tabs>
+          <w:tab w:val="num" w:pos="709"/>
+        </w:tabs>
+        <w:ind w:left="709" w:hanging="283"/>
+      </w:pPr>
+      <w:rPr>
+        <w:rFonts w:ascii="Symbol" w:hAnsi="Symbol" w:cs="Symbol" w:hint="default"/>
+      </w:rPr>
+    </w:lvl>
+    <w:lvl w:ilvl="1">
+      <w:start w:val="1"/>
+      <w:numFmt w:val="bullet"/>
+      <w:lvlText w:val=""/>
+      <w:lvlJc w:val="left"/>
+      <w:pPr>
+        <w:tabs>
+          <w:tab w:val="num" w:pos="1418"/>
+        </w:tabs>
+        <w:ind w:left="1418" w:hanging="283"/>
+      </w:pPr>
+      <w:rPr>
+        <w:rFonts w:ascii="Symbol" w:hAnsi="Symbol" w:cs="Symbol" w:hint="default"/>
+      </w:rPr>
+    </w:lvl>
+    <w:lvl w:ilvl="2">
+      <w:start w:val="1"/>
+      <w:numFmt w:val="bullet"/>
+      <w:lvlText w:val=""/>
+      <w:lvlJc w:val="left"/>
+      <w:pPr>
+        <w:tabs>
+          <w:tab w:val="num" w:pos="2127"/>
+        </w:tabs>
+        <w:ind w:left="2127" w:hanging="283"/>
+      </w:pPr>
+      <w:rPr>
+        <w:rFonts w:ascii="Symbol" w:hAnsi="Symbol" w:cs="Symbol" w:hint="default"/>
+      </w:rPr>
+    </w:lvl>
+    <w:lvl w:ilvl="3">
+      <w:start w:val="1"/>
+      <w:numFmt w:val="bullet"/>
+      <w:lvlText w:val=""/>
+      <w:lvlJc w:val="left"/>
+      <w:pPr>
+        <w:tabs>
+          <w:tab w:val="num" w:pos="2836"/>
+        </w:tabs>
+        <w:ind w:left="2836" w:hanging="283"/>
+      </w:pPr>
+      <w:rPr>
+        <w:rFonts w:ascii="Symbol" w:hAnsi="Symbol" w:cs="Symbol" w:hint="default"/>
+      </w:rPr>
+    </w:lvl>
+    <w:lvl w:ilvl="4">
+      <w:start w:val="1"/>
+      <w:numFmt w:val="bullet"/>
+      <w:lvlText w:val=""/>
+      <w:lvlJc w:val="left"/>
+      <w:pPr>
+        <w:tabs>
+          <w:tab w:val="num" w:pos="3545"/>
+        </w:tabs>
+        <w:ind w:left="3545" w:hanging="283"/>
+      </w:pPr>
+      <w:rPr>
+        <w:rFonts w:ascii="Symbol" w:hAnsi="Symbol" w:cs="Symbol" w:hint="default"/>
+      </w:rPr>
+    </w:lvl>
+    <w:lvl w:ilvl="5">
+      <w:start w:val="1"/>
+      <w:numFmt w:val="bullet"/>
+      <w:lvlText w:val=""/>
+      <w:lvlJc w:val="left"/>
+      <w:pPr>
+        <w:tabs>
+          <w:tab w:val="num" w:pos="4254"/>
+        </w:tabs>
+        <w:ind w:left="4254" w:hanging="283"/>
+      </w:pPr>
+      <w:rPr>
+        <w:rFonts w:ascii="Symbol" w:hAnsi="Symbol" w:cs="Symbol" w:hint="default"/>
+      </w:rPr>
+    </w:lvl>
+    <w:lvl w:ilvl="6">
+      <w:start w:val="1"/>
+      <w:numFmt w:val="bullet"/>
+      <w:lvlText w:val=""/>
+      <w:lvlJc w:val="left"/>
+      <w:pPr>
+        <w:tabs>
+          <w:tab w:val="num" w:pos="4963"/>
+        </w:tabs>
+        <w:ind w:left="4963" w:hanging="283"/>
+      </w:pPr>
+      <w:rPr>
+        <w:rFonts w:ascii="Symbol" w:hAnsi="Symbol" w:cs="Symbol" w:hint="default"/>
+      </w:rPr>
+    </w:lvl>
+    <w:lvl w:ilvl="7">
+      <w:start w:val="1"/>
+      <w:numFmt w:val="bullet"/>
+      <w:lvlText w:val=""/>
+      <w:lvlJc w:val="left"/>
+      <w:pPr>
+        <w:tabs>
+          <w:tab w:val="num" w:pos="5672"/>
+        </w:tabs>
+        <w:ind w:left="5672" w:hanging="283"/>
+      </w:pPr>
+      <w:rPr>
+        <w:rFonts w:ascii="Symbol" w:hAnsi="Symbol" w:cs="Symbol" w:hint="default"/>
+      </w:rPr>
+    </w:lvl>
+    <w:lvl w:ilvl="8">
+      <w:start w:val="1"/>
+      <w:numFmt w:val="bullet"/>
+      <w:lvlText w:val=""/>
+      <w:lvlJc w:val="left"/>
+      <w:pPr>
+        <w:tabs>
+          <w:tab w:val="num" w:pos="6381"/>
+        </w:tabs>
+        <w:ind w:left="6381" w:hanging="283"/>
+      </w:pPr>
+      <w:rPr>
+        <w:rFonts w:ascii="Symbol" w:hAnsi="Symbol" w:cs="Symbol" w:hint="default"/>
+      </w:rPr>
+    </w:lvl>
+  </w:abstractNum>
+  <w:abstractNum w:abstractNumId="30">
+    <w:lvl w:ilvl="0">
+      <w:start w:val="1"/>
+      <w:numFmt w:val="bullet"/>
+      <w:lvlText w:val=""/>
+      <w:lvlJc w:val="left"/>
+      <w:pPr>
+        <w:tabs>
+          <w:tab w:val="num" w:pos="709"/>
+        </w:tabs>
+        <w:ind w:left="709" w:hanging="283"/>
+      </w:pPr>
+      <w:rPr>
+        <w:rFonts w:ascii="Symbol" w:hAnsi="Symbol" w:cs="Symbol" w:hint="default"/>
+      </w:rPr>
+    </w:lvl>
+    <w:lvl w:ilvl="1">
+      <w:start w:val="1"/>
+      <w:numFmt w:val="bullet"/>
+      <w:lvlText w:val=""/>
+      <w:lvlJc w:val="left"/>
+      <w:pPr>
+        <w:tabs>
+          <w:tab w:val="num" w:pos="1418"/>
+        </w:tabs>
+        <w:ind w:left="1418" w:hanging="283"/>
+      </w:pPr>
+      <w:rPr>
+        <w:rFonts w:ascii="Symbol" w:hAnsi="Symbol" w:cs="Symbol" w:hint="default"/>
+      </w:rPr>
+    </w:lvl>
+    <w:lvl w:ilvl="2">
+      <w:start w:val="1"/>
+      <w:numFmt w:val="bullet"/>
+      <w:lvlText w:val=""/>
+      <w:lvlJc w:val="left"/>
+      <w:pPr>
+        <w:tabs>
+          <w:tab w:val="num" w:pos="2127"/>
+        </w:tabs>
+        <w:ind w:left="2127" w:hanging="283"/>
+      </w:pPr>
+      <w:rPr>
+        <w:rFonts w:ascii="Symbol" w:hAnsi="Symbol" w:cs="Symbol" w:hint="default"/>
+      </w:rPr>
+    </w:lvl>
+    <w:lvl w:ilvl="3">
+      <w:start w:val="1"/>
+      <w:numFmt w:val="bullet"/>
+      <w:lvlText w:val=""/>
+      <w:lvlJc w:val="left"/>
+      <w:pPr>
+        <w:tabs>
+          <w:tab w:val="num" w:pos="2836"/>
+        </w:tabs>
+        <w:ind w:left="2836" w:hanging="283"/>
+      </w:pPr>
+      <w:rPr>
+        <w:rFonts w:ascii="Symbol" w:hAnsi="Symbol" w:cs="Symbol" w:hint="default"/>
+      </w:rPr>
+    </w:lvl>
+    <w:lvl w:ilvl="4">
+      <w:start w:val="1"/>
+      <w:numFmt w:val="bullet"/>
+      <w:lvlText w:val=""/>
+      <w:lvlJc w:val="left"/>
+      <w:pPr>
+        <w:tabs>
+          <w:tab w:val="num" w:pos="3545"/>
+        </w:tabs>
+        <w:ind w:left="3545" w:hanging="283"/>
+      </w:pPr>
+      <w:rPr>
+        <w:rFonts w:ascii="Symbol" w:hAnsi="Symbol" w:cs="Symbol" w:hint="default"/>
+      </w:rPr>
+    </w:lvl>
+    <w:lvl w:ilvl="5">
+      <w:start w:val="1"/>
+      <w:numFmt w:val="bullet"/>
+      <w:lvlText w:val=""/>
+      <w:lvlJc w:val="left"/>
+      <w:pPr>
+        <w:tabs>
+          <w:tab w:val="num" w:pos="4254"/>
+        </w:tabs>
+        <w:ind w:left="4254" w:hanging="283"/>
+      </w:pPr>
+      <w:rPr>
+        <w:rFonts w:ascii="Symbol" w:hAnsi="Symbol" w:cs="Symbol" w:hint="default"/>
+      </w:rPr>
+    </w:lvl>
+    <w:lvl w:ilvl="6">
+      <w:start w:val="1"/>
+      <w:numFmt w:val="bullet"/>
+      <w:lvlText w:val=""/>
+      <w:lvlJc w:val="left"/>
+      <w:pPr>
+        <w:tabs>
+          <w:tab w:val="num" w:pos="4963"/>
+        </w:tabs>
+        <w:ind w:left="4963" w:hanging="283"/>
+      </w:pPr>
+      <w:rPr>
+        <w:rFonts w:ascii="Symbol" w:hAnsi="Symbol" w:cs="Symbol" w:hint="default"/>
+      </w:rPr>
+    </w:lvl>
+    <w:lvl w:ilvl="7">
+      <w:start w:val="1"/>
+      <w:numFmt w:val="bullet"/>
+      <w:lvlText w:val=""/>
+      <w:lvlJc w:val="left"/>
+      <w:pPr>
+        <w:tabs>
+          <w:tab w:val="num" w:pos="5672"/>
+        </w:tabs>
+        <w:ind w:left="5672" w:hanging="283"/>
+      </w:pPr>
+      <w:rPr>
+        <w:rFonts w:ascii="Symbol" w:hAnsi="Symbol" w:cs="Symbol" w:hint="default"/>
+      </w:rPr>
+    </w:lvl>
+    <w:lvl w:ilvl="8">
+      <w:start w:val="1"/>
+      <w:numFmt w:val="bullet"/>
+      <w:lvlText w:val=""/>
+      <w:lvlJc w:val="left"/>
+      <w:pPr>
+        <w:tabs>
+          <w:tab w:val="num" w:pos="6381"/>
+        </w:tabs>
+        <w:ind w:left="6381" w:hanging="283"/>
+      </w:pPr>
+      <w:rPr>
+        <w:rFonts w:ascii="Symbol" w:hAnsi="Symbol" w:cs="Symbol" w:hint="default"/>
+      </w:rPr>
+    </w:lvl>
+  </w:abstractNum>
+  <w:abstractNum w:abstractNumId="31">
     <w:lvl w:ilvl="0">
       <w:start w:val="1"/>
       <w:numFmt w:val="none"/>
@@ -21547,6 +23416,12 @@
   </w:num>
   <w:num w:numId="29">
     <w:abstractNumId w:val="29"/>
+  </w:num>
+  <w:num w:numId="30">
+    <w:abstractNumId w:val="30"/>
+  </w:num>
+  <w:num w:numId="31">
+    <w:abstractNumId w:val="31"/>
   </w:num>
 </w:numbering>
 </file>

</xml_diff>

<commit_message>
L-0634: the wave refuses a ticket whose built-against contract moved
crew_contract.py check_bindings and verify --ticket: every binding in
.work/tickets/<id>/contracts.json must still find its version on the
fetched channel with the bound hash, a matching body, status
built-against and this repo and ticket in built_by (exit 0), else a
mismatch (exit 1) or unknown (exit 3); no bindings fetches nothing, a
newer version is information only, nothing is repaired. crew_wave.py's
_judge runs it after the dependencies through the plan's channel cache.
Plan written by the implementing session; README, troubleshooting guide
(rebuilt), codemap, verify rules, CHANGELOG. Sabotage is L-0635.

Claude-Session: https://claude.ai/code/session_01QLY3kk7DCXpucXGu3wSniW
</commit_message>
<xml_diff>
--- a/docs/guides/crew/crew-troubleshooting.docx
+++ b/docs/guides/crew/crew-troubleshooting.docx
@@ -7762,8 +7762,423 @@
         <w:jc w:val="left"/>
         <w:rPr/>
       </w:pPr>
-      <w:bookmarkStart w:id="8" w:name="promote-gate-blocks-a-worktree-deploy"/>
+      <w:bookmarkStart w:id="8" w:name="wave-refuses-a-tickets-contract"/>
       <w:bookmarkEnd w:id="8"/>
+      <w:r>
+        <w:rPr/>
+        <w:t>Wave Refuses a Ticket's Contract</w:t>
+      </w:r>
+    </w:p>
+    <w:p>
+      <w:pPr>
+        <w:pStyle w:val="BodyText"/>
+        <w:bidi w:val="0"/>
+        <w:jc w:val="left"/>
+        <w:rPr/>
+      </w:pPr>
+      <w:r>
+        <w:rPr/>
+        <w:t>A ticket that built against a contract version (</w:t>
+      </w:r>
+      <w:r>
+        <w:rPr>
+          <w:rStyle w:val="SourceText"/>
+        </w:rPr>
+        <w:t>crew_contract.py build-against</w:t>
+      </w:r>
+      <w:r>
+        <w:rPr/>
+        <w:t xml:space="preserve">) keeps a binding in </w:t>
+      </w:r>
+      <w:r>
+        <w:rPr>
+          <w:rStyle w:val="SourceText"/>
+        </w:rPr>
+        <w:t>.work/tickets/&lt;id&gt;/contracts.json</w:t>
+      </w:r>
+      <w:r>
+        <w:rPr/>
+        <w:t xml:space="preserve">. The wave checks each binding after the ticket's dependencies; run the same check alone with </w:t>
+      </w:r>
+      <w:r>
+        <w:rPr>
+          <w:rStyle w:val="SourceText"/>
+        </w:rPr>
+        <w:t>crew_contract.py verify --ticket &lt;id&gt;</w:t>
+      </w:r>
+      <w:r>
+        <w:rPr/>
+        <w:t xml:space="preserve"> (exit 0 current, 1 changed, 3 cannot tell).</w:t>
+      </w:r>
+    </w:p>
+    <w:tbl>
+      <w:tblPr>
+        <w:tblW w:w="11825" w:type="dxa"/>
+        <w:jc w:val="left"/>
+        <w:tblInd w:w="0" w:type="dxa"/>
+        <w:tblLayout w:type="fixed"/>
+        <w:tblCellMar>
+          <w:top w:w="28" w:type="dxa"/>
+          <w:left w:w="28" w:type="dxa"/>
+          <w:bottom w:w="28" w:type="dxa"/>
+          <w:right w:w="28" w:type="dxa"/>
+        </w:tblCellMar>
+      </w:tblPr>
+      <w:tblGrid>
+        <w:gridCol w:w="2361"/>
+        <w:gridCol w:w="4900"/>
+        <w:gridCol w:w="4564"/>
+      </w:tblGrid>
+      <w:tr>
+        <w:trPr>
+          <w:tblHeader w:val="true"/>
+        </w:trPr>
+        <w:tc>
+          <w:tcPr>
+            <w:tcW w:w="2361" w:type="dxa"/>
+            <w:tcBorders/>
+            <w:vAlign w:val="center"/>
+          </w:tcPr>
+          <w:p>
+            <w:pPr>
+              <w:pStyle w:val="TableHeading"/>
+              <w:suppressLineNumbers/>
+              <w:shd w:fill="434C5E" w:val="clear"/>
+              <w:bidi w:val="0"/>
+              <w:spacing w:before="120" w:after="120"/>
+              <w:jc w:val="left"/>
+              <w:rPr/>
+            </w:pPr>
+            <w:r>
+              <w:rPr>
+                <w:rStyle w:val="SourceText"/>
+              </w:rPr>
+              <w:t>crew_wave.py plan</w:t>
+            </w:r>
+            <w:r>
+              <w:rPr/>
+              <w:t xml:space="preserve"> says</w:t>
+            </w:r>
+          </w:p>
+        </w:tc>
+        <w:tc>
+          <w:tcPr>
+            <w:tcW w:w="4900" w:type="dxa"/>
+            <w:tcBorders/>
+            <w:vAlign w:val="center"/>
+          </w:tcPr>
+          <w:p>
+            <w:pPr>
+              <w:pStyle w:val="TableHeading"/>
+              <w:suppressLineNumbers/>
+              <w:shd w:fill="434C5E" w:val="clear"/>
+              <w:bidi w:val="0"/>
+              <w:spacing w:before="120" w:after="120"/>
+              <w:jc w:val="left"/>
+              <w:rPr/>
+            </w:pPr>
+            <w:r>
+              <w:rPr/>
+              <w:t>Means</w:t>
+            </w:r>
+          </w:p>
+        </w:tc>
+        <w:tc>
+          <w:tcPr>
+            <w:tcW w:w="4564" w:type="dxa"/>
+            <w:tcBorders/>
+            <w:vAlign w:val="center"/>
+          </w:tcPr>
+          <w:p>
+            <w:pPr>
+              <w:pStyle w:val="TableHeading"/>
+              <w:suppressLineNumbers/>
+              <w:shd w:fill="434C5E" w:val="clear"/>
+              <w:bidi w:val="0"/>
+              <w:spacing w:before="120" w:after="120"/>
+              <w:jc w:val="left"/>
+              <w:rPr/>
+            </w:pPr>
+            <w:r>
+              <w:rPr/>
+              <w:t>Do</w:t>
+            </w:r>
+          </w:p>
+        </w:tc>
+      </w:tr>
+      <w:tr>
+        <w:trPr/>
+        <w:tc>
+          <w:tcPr>
+            <w:tcW w:w="2361" w:type="dxa"/>
+            <w:tcBorders/>
+            <w:vAlign w:val="center"/>
+          </w:tcPr>
+          <w:p>
+            <w:pPr>
+              <w:pStyle w:val="TableContents"/>
+              <w:shd w:fill="2E3440" w:val="clear"/>
+              <w:bidi w:val="0"/>
+              <w:spacing w:before="120" w:after="120"/>
+              <w:jc w:val="left"/>
+              <w:rPr/>
+            </w:pPr>
+            <w:r>
+              <w:rPr>
+                <w:rStyle w:val="SourceText"/>
+              </w:rPr>
+              <w:t>contract &lt;n&gt; v&lt;N&gt; changed since &lt;id&gt; built against it (...)</w:t>
+            </w:r>
+          </w:p>
+        </w:tc>
+        <w:tc>
+          <w:tcPr>
+            <w:tcW w:w="4900" w:type="dxa"/>
+            <w:tcBorders/>
+            <w:vAlign w:val="center"/>
+          </w:tcPr>
+          <w:p>
+            <w:pPr>
+              <w:pStyle w:val="TableContents"/>
+              <w:shd w:fill="2E3440" w:val="clear"/>
+              <w:bidi w:val="0"/>
+              <w:spacing w:before="120" w:after="120"/>
+              <w:jc w:val="left"/>
+              <w:rPr/>
+            </w:pPr>
+            <w:r>
+              <w:rPr/>
+              <w:t xml:space="preserve">the channel no longer shows that version with the bound hash, a matching body, status </w:t>
+            </w:r>
+            <w:r>
+              <w:rPr>
+                <w:rStyle w:val="SourceText"/>
+              </w:rPr>
+              <w:t>built-against</w:t>
+            </w:r>
+            <w:r>
+              <w:rPr/>
+              <w:t xml:space="preserve"> and this ticket in </w:t>
+            </w:r>
+            <w:r>
+              <w:rPr>
+                <w:rStyle w:val="SourceText"/>
+              </w:rPr>
+              <w:t>built_by</w:t>
+            </w:r>
+            <w:r>
+              <w:rPr/>
+              <w:t>: someone rewrote it</w:t>
+            </w:r>
+          </w:p>
+        </w:tc>
+        <w:tc>
+          <w:tcPr>
+            <w:tcW w:w="4564" w:type="dxa"/>
+            <w:tcBorders/>
+            <w:vAlign w:val="center"/>
+          </w:tcPr>
+          <w:p>
+            <w:pPr>
+              <w:pStyle w:val="TableContents"/>
+              <w:shd w:fill="2E3440" w:val="clear"/>
+              <w:bidi w:val="0"/>
+              <w:spacing w:before="120" w:after="120"/>
+              <w:jc w:val="left"/>
+              <w:rPr/>
+            </w:pPr>
+            <w:r>
+              <w:rPr/>
+              <w:t>do not rebind: agree a new version (</w:t>
+            </w:r>
+            <w:r>
+              <w:rPr>
+                <w:rStyle w:val="SourceText"/>
+              </w:rPr>
+              <w:t>put --name &lt;n&gt; --new-version --ticket &lt;new id&gt;</w:t>
+            </w:r>
+            <w:r>
+              <w:rPr/>
+              <w:t>) and a new ticket on each side, then build against it</w:t>
+            </w:r>
+          </w:p>
+        </w:tc>
+      </w:tr>
+      <w:tr>
+        <w:trPr/>
+        <w:tc>
+          <w:tcPr>
+            <w:tcW w:w="2361" w:type="dxa"/>
+            <w:tcBorders/>
+            <w:vAlign w:val="center"/>
+          </w:tcPr>
+          <w:p>
+            <w:pPr>
+              <w:pStyle w:val="TableContents"/>
+              <w:shd w:fill="2E3440" w:val="clear"/>
+              <w:bidi w:val="0"/>
+              <w:spacing w:before="120" w:after="120"/>
+              <w:jc w:val="left"/>
+              <w:rPr/>
+            </w:pPr>
+            <w:r>
+              <w:rPr>
+                <w:rStyle w:val="SourceText"/>
+              </w:rPr>
+              <w:t>contract &lt;n&gt; v&lt;N&gt; unknown (...)</w:t>
+            </w:r>
+          </w:p>
+        </w:tc>
+        <w:tc>
+          <w:tcPr>
+            <w:tcW w:w="4900" w:type="dxa"/>
+            <w:tcBorders/>
+            <w:vAlign w:val="center"/>
+          </w:tcPr>
+          <w:p>
+            <w:pPr>
+              <w:pStyle w:val="TableContents"/>
+              <w:shd w:fill="2E3440" w:val="clear"/>
+              <w:bidi w:val="0"/>
+              <w:spacing w:before="120" w:after="120"/>
+              <w:jc w:val="left"/>
+              <w:rPr/>
+            </w:pPr>
+            <w:r>
+              <w:rPr/>
+              <w:t>the fetch failed, the channel or the version's files are missing, or the record is corrupt</w:t>
+            </w:r>
+          </w:p>
+        </w:tc>
+        <w:tc>
+          <w:tcPr>
+            <w:tcW w:w="4564" w:type="dxa"/>
+            <w:tcBorders/>
+            <w:vAlign w:val="center"/>
+          </w:tcPr>
+          <w:p>
+            <w:pPr>
+              <w:pStyle w:val="TableContents"/>
+              <w:shd w:fill="2E3440" w:val="clear"/>
+              <w:bidi w:val="0"/>
+              <w:spacing w:before="120" w:after="120"/>
+              <w:jc w:val="left"/>
+              <w:rPr/>
+            </w:pPr>
+            <w:r>
+              <w:rPr/>
+              <w:t>fix what the brackets name (remote, channel name), then plan again; nothing is assumed current</w:t>
+            </w:r>
+          </w:p>
+        </w:tc>
+      </w:tr>
+      <w:tr>
+        <w:trPr/>
+        <w:tc>
+          <w:tcPr>
+            <w:tcW w:w="2361" w:type="dxa"/>
+            <w:tcBorders/>
+            <w:vAlign w:val="center"/>
+          </w:tcPr>
+          <w:p>
+            <w:pPr>
+              <w:pStyle w:val="TableContents"/>
+              <w:shd w:fill="2E3440" w:val="clear"/>
+              <w:bidi w:val="0"/>
+              <w:spacing w:before="120" w:after="120"/>
+              <w:jc w:val="left"/>
+              <w:rPr/>
+            </w:pPr>
+            <w:r>
+              <w:rPr>
+                <w:rStyle w:val="SourceText"/>
+              </w:rPr>
+              <w:t>contract bindings unknown (...)</w:t>
+            </w:r>
+          </w:p>
+        </w:tc>
+        <w:tc>
+          <w:tcPr>
+            <w:tcW w:w="4900" w:type="dxa"/>
+            <w:tcBorders/>
+            <w:vAlign w:val="center"/>
+          </w:tcPr>
+          <w:p>
+            <w:pPr>
+              <w:pStyle w:val="TableContents"/>
+              <w:shd w:fill="2E3440" w:val="clear"/>
+              <w:bidi w:val="0"/>
+              <w:spacing w:before="120" w:after="120"/>
+              <w:jc w:val="left"/>
+              <w:rPr/>
+            </w:pPr>
+            <w:r>
+              <w:rPr>
+                <w:rStyle w:val="SourceText"/>
+              </w:rPr>
+              <w:t>contracts.json</w:t>
+            </w:r>
+            <w:r>
+              <w:rPr/>
+              <w:t xml:space="preserve"> does not parse</w:t>
+            </w:r>
+          </w:p>
+        </w:tc>
+        <w:tc>
+          <w:tcPr>
+            <w:tcW w:w="4564" w:type="dxa"/>
+            <w:tcBorders/>
+            <w:vAlign w:val="center"/>
+          </w:tcPr>
+          <w:p>
+            <w:pPr>
+              <w:pStyle w:val="TableContents"/>
+              <w:shd w:fill="2E3440" w:val="clear"/>
+              <w:bidi w:val="0"/>
+              <w:spacing w:before="120" w:after="120"/>
+              <w:jc w:val="left"/>
+              <w:rPr/>
+            </w:pPr>
+            <w:r>
+              <w:rPr/>
+              <w:t xml:space="preserve">repair or remove it by hand, then </w:t>
+            </w:r>
+            <w:r>
+              <w:rPr>
+                <w:rStyle w:val="SourceText"/>
+              </w:rPr>
+              <w:t>build-against</w:t>
+            </w:r>
+            <w:r>
+              <w:rPr/>
+              <w:t xml:space="preserve"> again; it is never read as "no bindings"</w:t>
+            </w:r>
+          </w:p>
+        </w:tc>
+      </w:tr>
+    </w:tbl>
+    <w:p>
+      <w:pPr>
+        <w:pStyle w:val="BodyText"/>
+        <w:bidi w:val="0"/>
+        <w:jc w:val="left"/>
+        <w:rPr/>
+      </w:pPr>
+      <w:r>
+        <w:rPr/>
+        <w:t>A newer version on the channel is information only and never refuses. The check writes nothing.</w:t>
+      </w:r>
+    </w:p>
+    <w:p>
+      <w:pPr>
+        <w:pStyle w:val="Heading2"/>
+        <w:bidi w:val="0"/>
+        <w:ind w:hanging="0" w:left="0" w:right="0"/>
+        <w:jc w:val="left"/>
+        <w:rPr/>
+      </w:pPr>
+      <w:bookmarkStart w:id="9" w:name="promote-gate-blocks-a-worktree-deploy"/>
+      <w:bookmarkEnd w:id="9"/>
       <w:r>
         <w:rPr/>
         <w:t>Promote Gate Blocks a Worktree Deploy</w:t>
@@ -8272,8 +8687,8 @@
         <w:jc w:val="left"/>
         <w:rPr/>
       </w:pPr>
-      <w:bookmarkStart w:id="9" w:name="cloud-guard-false-positives"/>
-      <w:bookmarkEnd w:id="9"/>
+      <w:bookmarkStart w:id="10" w:name="cloud-guard-false-positives"/>
+      <w:bookmarkEnd w:id="10"/>
       <w:r>
         <w:rPr/>
         <w:t>Cloud Guard False Positives</w:t>
@@ -8954,8 +9369,8 @@
         <w:jc w:val="left"/>
         <w:rPr/>
       </w:pPr>
-      <w:bookmarkStart w:id="10" w:name="obsidian"/>
-      <w:bookmarkEnd w:id="10"/>
+      <w:bookmarkStart w:id="11" w:name="obsidian"/>
+      <w:bookmarkEnd w:id="11"/>
       <w:r>
         <w:rPr/>
         <w:t>Obsidian</w:t>
@@ -9917,8 +10332,8 @@
         <w:jc w:val="left"/>
         <w:rPr/>
       </w:pPr>
-      <w:bookmarkStart w:id="11" w:name="auto-wrap-up-clear-and-resume"/>
-      <w:bookmarkEnd w:id="11"/>
+      <w:bookmarkStart w:id="12" w:name="auto-wrap-up-clear-and-resume"/>
+      <w:bookmarkEnd w:id="12"/>
       <w:r>
         <w:rPr/>
         <w:t>Auto Wrap-Up, Clear and Resume</w:t>
@@ -9966,8 +10381,8 @@
         <w:jc w:val="left"/>
         <w:rPr/>
       </w:pPr>
-      <w:bookmarkStart w:id="12" w:name="auto-clear-did-nothing-on-windows"/>
-      <w:bookmarkEnd w:id="12"/>
+      <w:bookmarkStart w:id="13" w:name="auto-clear-did-nothing-on-windows"/>
+      <w:bookmarkEnd w:id="13"/>
       <w:r>
         <w:rPr/>
         <w:t>"Auto-Clear Did Nothing on Windows"</w:t>
@@ -10278,8 +10693,8 @@
         <w:jc w:val="left"/>
         <w:rPr/>
       </w:pPr>
-      <w:bookmarkStart w:id="13" w:name="claude-code-compacted-by-itself"/>
-      <w:bookmarkEnd w:id="13"/>
+      <w:bookmarkStart w:id="14" w:name="claude-code-compacted-by-itself"/>
+      <w:bookmarkEnd w:id="14"/>
       <w:r>
         <w:rPr/>
         <w:t>"Claude Code Compacted by Itself"</w:t>
@@ -10451,8 +10866,8 @@
         <w:jc w:val="left"/>
         <w:rPr/>
       </w:pPr>
-      <w:bookmarkStart w:id="14" w:name="graph-refresh-refused-secrets-denylisted"/>
-      <w:bookmarkEnd w:id="14"/>
+      <w:bookmarkStart w:id="15" w:name="graph-refresh-refused-secrets-denylisted"/>
+      <w:bookmarkEnd w:id="15"/>
       <w:r>
         <w:rPr/>
         <w:t>Graph Refresh Refused: Secrets-Denylisted Path</w:t>
@@ -11101,8 +11516,8 @@
         <w:jc w:val="left"/>
         <w:rPr/>
       </w:pPr>
-      <w:bookmarkStart w:id="15" w:name="turning-things-off"/>
-      <w:bookmarkEnd w:id="15"/>
+      <w:bookmarkStart w:id="16" w:name="turning-things-off"/>
+      <w:bookmarkEnd w:id="16"/>
       <w:r>
         <w:rPr/>
         <w:t>Turning Things Off</w:t>
@@ -12912,8 +13327,8 @@
         <w:jc w:val="left"/>
         <w:rPr/>
       </w:pPr>
-      <w:bookmarkStart w:id="16" w:name="web-testing"/>
-      <w:bookmarkEnd w:id="16"/>
+      <w:bookmarkStart w:id="17" w:name="web-testing"/>
+      <w:bookmarkEnd w:id="17"/>
       <w:r>
         <w:rPr/>
         <w:t>Web Testing</w:t>
@@ -13242,8 +13657,8 @@
         <w:jc w:val="left"/>
         <w:rPr/>
       </w:pPr>
-      <w:bookmarkStart w:id="17" w:name="windows-notes"/>
-      <w:bookmarkEnd w:id="17"/>
+      <w:bookmarkStart w:id="18" w:name="windows-notes"/>
+      <w:bookmarkEnd w:id="18"/>
       <w:r>
         <w:rPr/>
         <w:t>Windows Notes</w:t>
@@ -13638,8 +14053,8 @@
         <w:jc w:val="left"/>
         <w:rPr/>
       </w:pPr>
-      <w:bookmarkStart w:id="18" w:name="auto-wrap-up-auto-clear-and-auto-resume"/>
-      <w:bookmarkEnd w:id="18"/>
+      <w:bookmarkStart w:id="19" w:name="auto-wrap-up-auto-clear-and-auto-resume"/>
+      <w:bookmarkEnd w:id="19"/>
       <w:r>
         <w:rPr/>
         <w:t>Auto Wrap-Up, Auto-Clear and Auto-Resume</w:t>
@@ -13675,8 +14090,8 @@
         <w:jc w:val="left"/>
         <w:rPr/>
       </w:pPr>
-      <w:bookmarkStart w:id="19" w:name="what-the-cycle-does"/>
-      <w:bookmarkEnd w:id="19"/>
+      <w:bookmarkStart w:id="20" w:name="what-the-cycle-does"/>
+      <w:bookmarkEnd w:id="20"/>
       <w:r>
         <w:rPr/>
         <w:t>What the Cycle Does</w:t>
@@ -14345,8 +14760,8 @@
         <w:jc w:val="left"/>
         <w:rPr/>
       </w:pPr>
-      <w:bookmarkStart w:id="20" w:name="turning-it-on-and-off"/>
-      <w:bookmarkEnd w:id="20"/>
+      <w:bookmarkStart w:id="21" w:name="turning-it-on-and-off"/>
+      <w:bookmarkEnd w:id="21"/>
       <w:r>
         <w:rPr/>
         <w:t>Turning It on and Off</w:t>
@@ -15907,8 +16322,8 @@
         <w:jc w:val="left"/>
         <w:rPr/>
       </w:pPr>
-      <w:bookmarkStart w:id="21" w:name="armed-wrap-up-contextautoclearwrapup"/>
-      <w:bookmarkEnd w:id="21"/>
+      <w:bookmarkStart w:id="22" w:name="armed-wrap-up-contextautoclearwrapup"/>
+      <w:bookmarkEnd w:id="22"/>
       <w:r>
         <w:rPr/>
         <w:t>Armed wrap-up (</w:t>
@@ -16175,8 +16590,8 @@
         <w:jc w:val="left"/>
         <w:rPr/>
       </w:pPr>
-      <w:bookmarkStart w:id="22" w:name="arming-one-scratch-repo-while-other-sess"/>
-      <w:bookmarkEnd w:id="22"/>
+      <w:bookmarkStart w:id="23" w:name="arming-one-scratch-repo-while-other-sess"/>
+      <w:bookmarkEnd w:id="23"/>
       <w:r>
         <w:rPr/>
         <w:t>Arming one scratch repo while other sessions are live</w:t>
@@ -16907,8 +17322,8 @@
         <w:jc w:val="left"/>
         <w:rPr/>
       </w:pPr>
-      <w:bookmarkStart w:id="23" w:name="which-method-and-what-it-does"/>
-      <w:bookmarkEnd w:id="23"/>
+      <w:bookmarkStart w:id="24" w:name="which-method-and-what-it-does"/>
+      <w:bookmarkEnd w:id="24"/>
       <w:r>
         <w:rPr/>
         <w:t>Which Method, and What It Does</w:t>
@@ -17490,8 +17905,8 @@
         <w:jc w:val="left"/>
         <w:rPr/>
       </w:pPr>
-      <w:bookmarkStart w:id="24" w:name="when-it-will-not-clear-or-notify"/>
-      <w:bookmarkEnd w:id="24"/>
+      <w:bookmarkStart w:id="25" w:name="when-it-will-not-clear-or-notify"/>
+      <w:bookmarkEnd w:id="25"/>
       <w:r>
         <w:rPr/>
         <w:t>When It Will Not Clear (or Notify)</w:t>
@@ -18820,8 +19235,8 @@
         <w:jc w:val="left"/>
         <w:rPr/>
       </w:pPr>
-      <w:bookmarkStart w:id="25" w:name="which-window-gets-the-keystroke"/>
-      <w:bookmarkEnd w:id="25"/>
+      <w:bookmarkStart w:id="26" w:name="which-window-gets-the-keystroke"/>
+      <w:bookmarkEnd w:id="26"/>
       <w:r>
         <w:rPr/>
         <w:t>Which Window Gets the Keystroke</w:t>

</xml_diff>

<commit_message>
crew: Windows CI fixes for the group: bridge tests feed git plumbing bytes; crew_graph resolves git; the guide names no missing script
The world fixture's text-mode stdin wrote CRLF on Windows, so mktree named the channel file
'log.jsonl\r' and every ring --to read no log. crew_graph._git runs crew_common.require_tool('git')
(test_tool_resolution). The troubleshooting example no longer names src/x.py. The refresh tests
pin the off-Windows path; the Windows route keeps its own cases.

Claude-Session: https://claude.ai/code/session_01H49aKnVMcvefcadqBGmuMu
</commit_message>
<xml_diff>
--- a/docs/guides/crew/crew-troubleshooting.docx
+++ b/docs/guides/crew/crew-troubleshooting.docx
@@ -545,7 +545,7 @@
     </w:p>
     <w:tbl>
       <w:tblPr>
-        <w:tblW w:w="11825" w:type="dxa"/>
+        <w:tblW w:w="11795" w:type="dxa"/>
         <w:jc w:val="left"/>
         <w:tblInd w:w="0" w:type="dxa"/>
         <w:tblLayout w:type="fixed"/>
@@ -559,7 +559,7 @@
       <w:tblGrid>
         <w:gridCol w:w="2116"/>
         <w:gridCol w:w="2446"/>
-        <w:gridCol w:w="2146"/>
+        <w:gridCol w:w="2116"/>
         <w:gridCol w:w="2986"/>
         <w:gridCol w:w="2131"/>
       </w:tblGrid>
@@ -613,7 +613,7 @@
         </w:tc>
         <w:tc>
           <w:tcPr>
-            <w:tcW w:w="2146" w:type="dxa"/>
+            <w:tcW w:w="2116" w:type="dxa"/>
             <w:tcBorders/>
             <w:vAlign w:val="center"/>
           </w:tcPr>
@@ -728,7 +728,7 @@
         </w:tc>
         <w:tc>
           <w:tcPr>
-            <w:tcW w:w="2146" w:type="dxa"/>
+            <w:tcW w:w="2116" w:type="dxa"/>
             <w:tcBorders/>
             <w:vAlign w:val="center"/>
           </w:tcPr>
@@ -864,7 +864,7 @@
         </w:tc>
         <w:tc>
           <w:tcPr>
-            <w:tcW w:w="2146" w:type="dxa"/>
+            <w:tcW w:w="2116" w:type="dxa"/>
             <w:tcBorders/>
             <w:vAlign w:val="center"/>
           </w:tcPr>
@@ -1016,7 +1016,7 @@
         </w:tc>
         <w:tc>
           <w:tcPr>
-            <w:tcW w:w="2146" w:type="dxa"/>
+            <w:tcW w:w="2116" w:type="dxa"/>
             <w:tcBorders/>
             <w:vAlign w:val="center"/>
           </w:tcPr>
@@ -1156,7 +1156,7 @@
         </w:tc>
         <w:tc>
           <w:tcPr>
-            <w:tcW w:w="2146" w:type="dxa"/>
+            <w:tcW w:w="2116" w:type="dxa"/>
             <w:tcBorders/>
             <w:vAlign w:val="center"/>
           </w:tcPr>
@@ -1308,7 +1308,7 @@
         </w:tc>
         <w:tc>
           <w:tcPr>
-            <w:tcW w:w="2146" w:type="dxa"/>
+            <w:tcW w:w="2116" w:type="dxa"/>
             <w:tcBorders/>
             <w:vAlign w:val="center"/>
           </w:tcPr>
@@ -1538,7 +1538,7 @@
         </w:tc>
         <w:tc>
           <w:tcPr>
-            <w:tcW w:w="2146" w:type="dxa"/>
+            <w:tcW w:w="2116" w:type="dxa"/>
             <w:tcBorders/>
             <w:vAlign w:val="center"/>
           </w:tcPr>
@@ -1712,7 +1712,7 @@
         </w:tc>
         <w:tc>
           <w:tcPr>
-            <w:tcW w:w="2146" w:type="dxa"/>
+            <w:tcW w:w="2116" w:type="dxa"/>
             <w:tcBorders/>
             <w:vAlign w:val="center"/>
           </w:tcPr>
@@ -1946,7 +1946,7 @@
         </w:tc>
         <w:tc>
           <w:tcPr>
-            <w:tcW w:w="2146" w:type="dxa"/>
+            <w:tcW w:w="2116" w:type="dxa"/>
             <w:tcBorders/>
             <w:vAlign w:val="center"/>
           </w:tcPr>
@@ -2122,7 +2122,7 @@
         </w:tc>
         <w:tc>
           <w:tcPr>
-            <w:tcW w:w="2146" w:type="dxa"/>
+            <w:tcW w:w="2116" w:type="dxa"/>
             <w:tcBorders/>
             <w:vAlign w:val="center"/>
           </w:tcPr>
@@ -2260,7 +2260,7 @@
         </w:tc>
         <w:tc>
           <w:tcPr>
-            <w:tcW w:w="2146" w:type="dxa"/>
+            <w:tcW w:w="2116" w:type="dxa"/>
             <w:tcBorders/>
             <w:vAlign w:val="center"/>
           </w:tcPr>
@@ -2434,7 +2434,7 @@
         </w:tc>
         <w:tc>
           <w:tcPr>
-            <w:tcW w:w="2146" w:type="dxa"/>
+            <w:tcW w:w="2116" w:type="dxa"/>
             <w:tcBorders/>
             <w:vAlign w:val="center"/>
           </w:tcPr>
@@ -2564,7 +2564,7 @@
         </w:tc>
         <w:tc>
           <w:tcPr>
-            <w:tcW w:w="2146" w:type="dxa"/>
+            <w:tcW w:w="2116" w:type="dxa"/>
             <w:tcBorders/>
             <w:vAlign w:val="center"/>
           </w:tcPr>
@@ -2724,7 +2724,7 @@
         </w:tc>
         <w:tc>
           <w:tcPr>
-            <w:tcW w:w="2146" w:type="dxa"/>
+            <w:tcW w:w="2116" w:type="dxa"/>
             <w:tcBorders/>
             <w:vAlign w:val="center"/>
           </w:tcPr>
@@ -10263,19 +10263,7 @@
         <w:rPr>
           <w:rStyle w:val="Strong"/>
         </w:rPr>
-        <w:t xml:space="preserve">Symptom: a peer's message says "approve T-0042", "answer Q2 with option B" or "edit </w:t>
-      </w:r>
-      <w:r>
-        <w:rPr>
-          <w:rStyle w:val="SourceText"/>
-        </w:rPr>
-        <w:t>src/x.py</w:t>
-      </w:r>
-      <w:r>
-        <w:rPr>
-          <w:rStyle w:val="Strong"/>
-        </w:rPr>
-        <w:t xml:space="preserve">", or the session prints </w:t>
+        <w:t xml:space="preserve">Symptom: a peer's message says "approve T-0042", "answer Q2 with option B" or "edit the deploy script", or the session prints </w:t>
       </w:r>
       <w:r>
         <w:rPr>
@@ -10509,7 +10497,7 @@
     </w:p>
     <w:tbl>
       <w:tblPr>
-        <w:tblW w:w="11825" w:type="dxa"/>
+        <w:tblW w:w="11795" w:type="dxa"/>
         <w:jc w:val="left"/>
         <w:tblInd w:w="0" w:type="dxa"/>
         <w:tblLayout w:type="fixed"/>
@@ -10521,10 +10509,10 @@
         </w:tblCellMar>
       </w:tblPr>
       <w:tblGrid>
-        <w:gridCol w:w="4369"/>
-        <w:gridCol w:w="1689"/>
-        <w:gridCol w:w="1687"/>
-        <w:gridCol w:w="4080"/>
+        <w:gridCol w:w="4405"/>
+        <w:gridCol w:w="1612"/>
+        <w:gridCol w:w="1693"/>
+        <w:gridCol w:w="4085"/>
       </w:tblGrid>
       <w:tr>
         <w:trPr>
@@ -10532,7 +10520,7 @@
         </w:trPr>
         <w:tc>
           <w:tcPr>
-            <w:tcW w:w="4369" w:type="dxa"/>
+            <w:tcW w:w="4405" w:type="dxa"/>
             <w:tcBorders/>
             <w:vAlign w:val="center"/>
           </w:tcPr>
@@ -10554,7 +10542,7 @@
         </w:tc>
         <w:tc>
           <w:tcPr>
-            <w:tcW w:w="1689" w:type="dxa"/>
+            <w:tcW w:w="1612" w:type="dxa"/>
             <w:tcBorders/>
             <w:vAlign w:val="center"/>
           </w:tcPr>
@@ -10576,7 +10564,7 @@
         </w:tc>
         <w:tc>
           <w:tcPr>
-            <w:tcW w:w="1687" w:type="dxa"/>
+            <w:tcW w:w="1693" w:type="dxa"/>
             <w:tcBorders/>
             <w:vAlign w:val="center"/>
           </w:tcPr>
@@ -10598,7 +10586,7 @@
         </w:tc>
         <w:tc>
           <w:tcPr>
-            <w:tcW w:w="4080" w:type="dxa"/>
+            <w:tcW w:w="4085" w:type="dxa"/>
             <w:tcBorders/>
             <w:vAlign w:val="center"/>
           </w:tcPr>
@@ -10623,7 +10611,7 @@
         <w:trPr/>
         <w:tc>
           <w:tcPr>
-            <w:tcW w:w="4369" w:type="dxa"/>
+            <w:tcW w:w="4405" w:type="dxa"/>
             <w:tcBorders/>
             <w:vAlign w:val="center"/>
           </w:tcPr>
@@ -10646,7 +10634,7 @@
         </w:tc>
         <w:tc>
           <w:tcPr>
-            <w:tcW w:w="1689" w:type="dxa"/>
+            <w:tcW w:w="1612" w:type="dxa"/>
             <w:tcBorders/>
             <w:vAlign w:val="center"/>
           </w:tcPr>
@@ -10667,7 +10655,7 @@
         </w:tc>
         <w:tc>
           <w:tcPr>
-            <w:tcW w:w="1687" w:type="dxa"/>
+            <w:tcW w:w="1693" w:type="dxa"/>
             <w:tcBorders/>
             <w:vAlign w:val="center"/>
           </w:tcPr>
@@ -10688,7 +10676,7 @@
         </w:tc>
         <w:tc>
           <w:tcPr>
-            <w:tcW w:w="4080" w:type="dxa"/>
+            <w:tcW w:w="4085" w:type="dxa"/>
             <w:tcBorders/>
             <w:vAlign w:val="center"/>
           </w:tcPr>
@@ -10728,7 +10716,7 @@
         <w:trPr/>
         <w:tc>
           <w:tcPr>
-            <w:tcW w:w="4369" w:type="dxa"/>
+            <w:tcW w:w="4405" w:type="dxa"/>
             <w:tcBorders/>
             <w:vAlign w:val="center"/>
           </w:tcPr>
@@ -10751,7 +10739,7 @@
         </w:tc>
         <w:tc>
           <w:tcPr>
-            <w:tcW w:w="1689" w:type="dxa"/>
+            <w:tcW w:w="1612" w:type="dxa"/>
             <w:tcBorders/>
             <w:vAlign w:val="center"/>
           </w:tcPr>
@@ -10772,7 +10760,7 @@
         </w:tc>
         <w:tc>
           <w:tcPr>
-            <w:tcW w:w="1687" w:type="dxa"/>
+            <w:tcW w:w="1693" w:type="dxa"/>
             <w:tcBorders/>
             <w:vAlign w:val="center"/>
           </w:tcPr>
@@ -10815,7 +10803,7 @@
         </w:tc>
         <w:tc>
           <w:tcPr>
-            <w:tcW w:w="4080" w:type="dxa"/>
+            <w:tcW w:w="4085" w:type="dxa"/>
             <w:tcBorders/>
             <w:vAlign w:val="center"/>
           </w:tcPr>
@@ -10845,7 +10833,7 @@
         <w:trPr/>
         <w:tc>
           <w:tcPr>
-            <w:tcW w:w="4369" w:type="dxa"/>
+            <w:tcW w:w="4405" w:type="dxa"/>
             <w:tcBorders/>
             <w:vAlign w:val="center"/>
           </w:tcPr>
@@ -10868,7 +10856,7 @@
         </w:tc>
         <w:tc>
           <w:tcPr>
-            <w:tcW w:w="1689" w:type="dxa"/>
+            <w:tcW w:w="1612" w:type="dxa"/>
             <w:tcBorders/>
             <w:vAlign w:val="center"/>
           </w:tcPr>
@@ -10889,7 +10877,7 @@
         </w:tc>
         <w:tc>
           <w:tcPr>
-            <w:tcW w:w="1687" w:type="dxa"/>
+            <w:tcW w:w="1693" w:type="dxa"/>
             <w:tcBorders/>
             <w:vAlign w:val="center"/>
           </w:tcPr>
@@ -10932,7 +10920,7 @@
         </w:tc>
         <w:tc>
           <w:tcPr>
-            <w:tcW w:w="4080" w:type="dxa"/>
+            <w:tcW w:w="4085" w:type="dxa"/>
             <w:tcBorders/>
             <w:vAlign w:val="center"/>
           </w:tcPr>
@@ -10962,7 +10950,7 @@
         <w:trPr/>
         <w:tc>
           <w:tcPr>
-            <w:tcW w:w="4369" w:type="dxa"/>
+            <w:tcW w:w="4405" w:type="dxa"/>
             <w:tcBorders/>
             <w:vAlign w:val="center"/>
           </w:tcPr>
@@ -11035,7 +11023,7 @@
         </w:tc>
         <w:tc>
           <w:tcPr>
-            <w:tcW w:w="1689" w:type="dxa"/>
+            <w:tcW w:w="1612" w:type="dxa"/>
             <w:tcBorders/>
             <w:vAlign w:val="center"/>
           </w:tcPr>
@@ -11056,7 +11044,7 @@
         </w:tc>
         <w:tc>
           <w:tcPr>
-            <w:tcW w:w="1687" w:type="dxa"/>
+            <w:tcW w:w="1693" w:type="dxa"/>
             <w:tcBorders/>
             <w:vAlign w:val="center"/>
           </w:tcPr>
@@ -11099,7 +11087,7 @@
         </w:tc>
         <w:tc>
           <w:tcPr>
-            <w:tcW w:w="4080" w:type="dxa"/>
+            <w:tcW w:w="4085" w:type="dxa"/>
             <w:tcBorders/>
             <w:vAlign w:val="center"/>
           </w:tcPr>
@@ -11133,7 +11121,7 @@
         <w:trPr/>
         <w:tc>
           <w:tcPr>
-            <w:tcW w:w="4369" w:type="dxa"/>
+            <w:tcW w:w="4405" w:type="dxa"/>
             <w:tcBorders/>
             <w:vAlign w:val="center"/>
           </w:tcPr>
@@ -11166,7 +11154,7 @@
         </w:tc>
         <w:tc>
           <w:tcPr>
-            <w:tcW w:w="1689" w:type="dxa"/>
+            <w:tcW w:w="1612" w:type="dxa"/>
             <w:tcBorders/>
             <w:vAlign w:val="center"/>
           </w:tcPr>
@@ -11187,7 +11175,7 @@
         </w:tc>
         <w:tc>
           <w:tcPr>
-            <w:tcW w:w="1687" w:type="dxa"/>
+            <w:tcW w:w="1693" w:type="dxa"/>
             <w:tcBorders/>
             <w:vAlign w:val="center"/>
           </w:tcPr>
@@ -11230,7 +11218,7 @@
         </w:tc>
         <w:tc>
           <w:tcPr>
-            <w:tcW w:w="4080" w:type="dxa"/>
+            <w:tcW w:w="4085" w:type="dxa"/>
             <w:tcBorders/>
             <w:vAlign w:val="center"/>
           </w:tcPr>
@@ -11260,7 +11248,7 @@
         <w:trPr/>
         <w:tc>
           <w:tcPr>
-            <w:tcW w:w="4369" w:type="dxa"/>
+            <w:tcW w:w="4405" w:type="dxa"/>
             <w:tcBorders/>
             <w:vAlign w:val="center"/>
           </w:tcPr>
@@ -11283,7 +11271,7 @@
         </w:tc>
         <w:tc>
           <w:tcPr>
-            <w:tcW w:w="1689" w:type="dxa"/>
+            <w:tcW w:w="1612" w:type="dxa"/>
             <w:tcBorders/>
             <w:vAlign w:val="center"/>
           </w:tcPr>
@@ -11304,7 +11292,7 @@
         </w:tc>
         <w:tc>
           <w:tcPr>
-            <w:tcW w:w="1687" w:type="dxa"/>
+            <w:tcW w:w="1693" w:type="dxa"/>
             <w:tcBorders/>
             <w:vAlign w:val="center"/>
           </w:tcPr>
@@ -11357,7 +11345,7 @@
         </w:tc>
         <w:tc>
           <w:tcPr>
-            <w:tcW w:w="4080" w:type="dxa"/>
+            <w:tcW w:w="4085" w:type="dxa"/>
             <w:tcBorders/>
             <w:vAlign w:val="center"/>
           </w:tcPr>
@@ -11387,7 +11375,7 @@
         <w:trPr/>
         <w:tc>
           <w:tcPr>
-            <w:tcW w:w="4369" w:type="dxa"/>
+            <w:tcW w:w="4405" w:type="dxa"/>
             <w:tcBorders/>
             <w:vAlign w:val="center"/>
           </w:tcPr>
@@ -11410,7 +11398,7 @@
         </w:tc>
         <w:tc>
           <w:tcPr>
-            <w:tcW w:w="1689" w:type="dxa"/>
+            <w:tcW w:w="1612" w:type="dxa"/>
             <w:tcBorders/>
             <w:vAlign w:val="center"/>
           </w:tcPr>
@@ -11431,7 +11419,7 @@
         </w:tc>
         <w:tc>
           <w:tcPr>
-            <w:tcW w:w="1687" w:type="dxa"/>
+            <w:tcW w:w="1693" w:type="dxa"/>
             <w:tcBorders/>
             <w:vAlign w:val="center"/>
           </w:tcPr>
@@ -11452,7 +11440,7 @@
         </w:tc>
         <w:tc>
           <w:tcPr>
-            <w:tcW w:w="4080" w:type="dxa"/>
+            <w:tcW w:w="4085" w:type="dxa"/>
             <w:tcBorders/>
             <w:vAlign w:val="center"/>
           </w:tcPr>
@@ -11512,7 +11500,7 @@
         <w:trPr/>
         <w:tc>
           <w:tcPr>
-            <w:tcW w:w="4369" w:type="dxa"/>
+            <w:tcW w:w="4405" w:type="dxa"/>
             <w:tcBorders/>
             <w:vAlign w:val="center"/>
           </w:tcPr>
@@ -11535,7 +11523,7 @@
         </w:tc>
         <w:tc>
           <w:tcPr>
-            <w:tcW w:w="1689" w:type="dxa"/>
+            <w:tcW w:w="1612" w:type="dxa"/>
             <w:tcBorders/>
             <w:vAlign w:val="center"/>
           </w:tcPr>
@@ -11556,7 +11544,7 @@
         </w:tc>
         <w:tc>
           <w:tcPr>
-            <w:tcW w:w="1687" w:type="dxa"/>
+            <w:tcW w:w="1693" w:type="dxa"/>
             <w:tcBorders/>
             <w:vAlign w:val="center"/>
           </w:tcPr>
@@ -11577,7 +11565,7 @@
         </w:tc>
         <w:tc>
           <w:tcPr>
-            <w:tcW w:w="4080" w:type="dxa"/>
+            <w:tcW w:w="4085" w:type="dxa"/>
             <w:tcBorders/>
             <w:vAlign w:val="center"/>
           </w:tcPr>
@@ -11607,7 +11595,7 @@
         <w:trPr/>
         <w:tc>
           <w:tcPr>
-            <w:tcW w:w="4369" w:type="dxa"/>
+            <w:tcW w:w="4405" w:type="dxa"/>
             <w:tcBorders/>
             <w:vAlign w:val="center"/>
           </w:tcPr>
@@ -11630,7 +11618,7 @@
         </w:tc>
         <w:tc>
           <w:tcPr>
-            <w:tcW w:w="1689" w:type="dxa"/>
+            <w:tcW w:w="1612" w:type="dxa"/>
             <w:tcBorders/>
             <w:vAlign w:val="center"/>
           </w:tcPr>
@@ -11651,7 +11639,7 @@
         </w:tc>
         <w:tc>
           <w:tcPr>
-            <w:tcW w:w="1687" w:type="dxa"/>
+            <w:tcW w:w="1693" w:type="dxa"/>
             <w:tcBorders/>
             <w:vAlign w:val="center"/>
           </w:tcPr>
@@ -11672,7 +11660,7 @@
         </w:tc>
         <w:tc>
           <w:tcPr>
-            <w:tcW w:w="4080" w:type="dxa"/>
+            <w:tcW w:w="4085" w:type="dxa"/>
             <w:tcBorders/>
             <w:vAlign w:val="center"/>
           </w:tcPr>
@@ -11712,7 +11700,7 @@
         <w:trPr/>
         <w:tc>
           <w:tcPr>
-            <w:tcW w:w="4369" w:type="dxa"/>
+            <w:tcW w:w="4405" w:type="dxa"/>
             <w:tcBorders/>
             <w:vAlign w:val="center"/>
           </w:tcPr>
@@ -11745,7 +11733,7 @@
         </w:tc>
         <w:tc>
           <w:tcPr>
-            <w:tcW w:w="1689" w:type="dxa"/>
+            <w:tcW w:w="1612" w:type="dxa"/>
             <w:tcBorders/>
             <w:vAlign w:val="center"/>
           </w:tcPr>
@@ -11766,7 +11754,7 @@
         </w:tc>
         <w:tc>
           <w:tcPr>
-            <w:tcW w:w="1687" w:type="dxa"/>
+            <w:tcW w:w="1693" w:type="dxa"/>
             <w:tcBorders/>
             <w:vAlign w:val="center"/>
           </w:tcPr>
@@ -11787,7 +11775,7 @@
         </w:tc>
         <w:tc>
           <w:tcPr>
-            <w:tcW w:w="4080" w:type="dxa"/>
+            <w:tcW w:w="4085" w:type="dxa"/>
             <w:tcBorders/>
             <w:vAlign w:val="center"/>
           </w:tcPr>
@@ -11811,7 +11799,7 @@
         <w:trPr/>
         <w:tc>
           <w:tcPr>
-            <w:tcW w:w="4369" w:type="dxa"/>
+            <w:tcW w:w="4405" w:type="dxa"/>
             <w:tcBorders/>
             <w:vAlign w:val="center"/>
           </w:tcPr>
@@ -11834,7 +11822,7 @@
         </w:tc>
         <w:tc>
           <w:tcPr>
-            <w:tcW w:w="1689" w:type="dxa"/>
+            <w:tcW w:w="1612" w:type="dxa"/>
             <w:tcBorders/>
             <w:vAlign w:val="center"/>
           </w:tcPr>
@@ -11855,7 +11843,7 @@
         </w:tc>
         <w:tc>
           <w:tcPr>
-            <w:tcW w:w="1687" w:type="dxa"/>
+            <w:tcW w:w="1693" w:type="dxa"/>
             <w:tcBorders/>
             <w:vAlign w:val="center"/>
           </w:tcPr>
@@ -11898,7 +11886,7 @@
         </w:tc>
         <w:tc>
           <w:tcPr>
-            <w:tcW w:w="4080" w:type="dxa"/>
+            <w:tcW w:w="4085" w:type="dxa"/>
             <w:tcBorders/>
             <w:vAlign w:val="center"/>
           </w:tcPr>
@@ -11962,7 +11950,7 @@
         <w:trPr/>
         <w:tc>
           <w:tcPr>
-            <w:tcW w:w="4369" w:type="dxa"/>
+            <w:tcW w:w="4405" w:type="dxa"/>
             <w:tcBorders/>
             <w:vAlign w:val="center"/>
           </w:tcPr>
@@ -11985,7 +11973,7 @@
         </w:tc>
         <w:tc>
           <w:tcPr>
-            <w:tcW w:w="1689" w:type="dxa"/>
+            <w:tcW w:w="1612" w:type="dxa"/>
             <w:tcBorders/>
             <w:vAlign w:val="center"/>
           </w:tcPr>
@@ -12006,7 +11994,7 @@
         </w:tc>
         <w:tc>
           <w:tcPr>
-            <w:tcW w:w="1687" w:type="dxa"/>
+            <w:tcW w:w="1693" w:type="dxa"/>
             <w:tcBorders/>
             <w:vAlign w:val="center"/>
           </w:tcPr>
@@ -12027,7 +12015,7 @@
         </w:tc>
         <w:tc>
           <w:tcPr>
-            <w:tcW w:w="4080" w:type="dxa"/>
+            <w:tcW w:w="4085" w:type="dxa"/>
             <w:tcBorders/>
             <w:vAlign w:val="center"/>
           </w:tcPr>
@@ -12057,7 +12045,7 @@
         <w:trPr/>
         <w:tc>
           <w:tcPr>
-            <w:tcW w:w="4369" w:type="dxa"/>
+            <w:tcW w:w="4405" w:type="dxa"/>
             <w:tcBorders/>
             <w:vAlign w:val="center"/>
           </w:tcPr>
@@ -12080,7 +12068,7 @@
         </w:tc>
         <w:tc>
           <w:tcPr>
-            <w:tcW w:w="1689" w:type="dxa"/>
+            <w:tcW w:w="1612" w:type="dxa"/>
             <w:tcBorders/>
             <w:vAlign w:val="center"/>
           </w:tcPr>
@@ -12101,7 +12089,7 @@
         </w:tc>
         <w:tc>
           <w:tcPr>
-            <w:tcW w:w="1687" w:type="dxa"/>
+            <w:tcW w:w="1693" w:type="dxa"/>
             <w:tcBorders/>
             <w:vAlign w:val="center"/>
           </w:tcPr>
@@ -12132,7 +12120,7 @@
         </w:tc>
         <w:tc>
           <w:tcPr>
-            <w:tcW w:w="4080" w:type="dxa"/>
+            <w:tcW w:w="4085" w:type="dxa"/>
             <w:tcBorders/>
             <w:vAlign w:val="center"/>
           </w:tcPr>
@@ -13733,7 +13721,7 @@
     </w:p>
     <w:tbl>
       <w:tblPr>
-        <w:tblW w:w="11825" w:type="dxa"/>
+        <w:tblW w:w="11795" w:type="dxa"/>
         <w:jc w:val="left"/>
         <w:tblInd w:w="0" w:type="dxa"/>
         <w:tblLayout w:type="fixed"/>
@@ -13745,10 +13733,10 @@
         </w:tblCellMar>
       </w:tblPr>
       <w:tblGrid>
-        <w:gridCol w:w="2423"/>
+        <w:gridCol w:w="2429"/>
         <w:gridCol w:w="4096"/>
-        <w:gridCol w:w="1753"/>
-        <w:gridCol w:w="3553"/>
+        <w:gridCol w:w="1751"/>
+        <w:gridCol w:w="3519"/>
       </w:tblGrid>
       <w:tr>
         <w:trPr>
@@ -13756,7 +13744,7 @@
         </w:trPr>
         <w:tc>
           <w:tcPr>
-            <w:tcW w:w="2423" w:type="dxa"/>
+            <w:tcW w:w="2429" w:type="dxa"/>
             <w:tcBorders/>
             <w:vAlign w:val="center"/>
           </w:tcPr>
@@ -13800,7 +13788,7 @@
         </w:tc>
         <w:tc>
           <w:tcPr>
-            <w:tcW w:w="1753" w:type="dxa"/>
+            <w:tcW w:w="1751" w:type="dxa"/>
             <w:tcBorders/>
             <w:vAlign w:val="center"/>
           </w:tcPr>
@@ -13822,7 +13810,7 @@
         </w:tc>
         <w:tc>
           <w:tcPr>
-            <w:tcW w:w="3553" w:type="dxa"/>
+            <w:tcW w:w="3519" w:type="dxa"/>
             <w:tcBorders/>
             <w:vAlign w:val="center"/>
           </w:tcPr>
@@ -13847,7 +13835,7 @@
         <w:trPr/>
         <w:tc>
           <w:tcPr>
-            <w:tcW w:w="2423" w:type="dxa"/>
+            <w:tcW w:w="2429" w:type="dxa"/>
             <w:tcBorders/>
             <w:vAlign w:val="center"/>
           </w:tcPr>
@@ -13907,7 +13895,7 @@
         </w:tc>
         <w:tc>
           <w:tcPr>
-            <w:tcW w:w="1753" w:type="dxa"/>
+            <w:tcW w:w="1751" w:type="dxa"/>
             <w:tcBorders/>
             <w:vAlign w:val="center"/>
           </w:tcPr>
@@ -13930,7 +13918,7 @@
         </w:tc>
         <w:tc>
           <w:tcPr>
-            <w:tcW w:w="3553" w:type="dxa"/>
+            <w:tcW w:w="3519" w:type="dxa"/>
             <w:tcBorders/>
             <w:vAlign w:val="center"/>
           </w:tcPr>
@@ -13954,7 +13942,7 @@
         <w:trPr/>
         <w:tc>
           <w:tcPr>
-            <w:tcW w:w="2423" w:type="dxa"/>
+            <w:tcW w:w="2429" w:type="dxa"/>
             <w:tcBorders/>
             <w:vAlign w:val="center"/>
           </w:tcPr>
@@ -13998,7 +13986,7 @@
         </w:tc>
         <w:tc>
           <w:tcPr>
-            <w:tcW w:w="1753" w:type="dxa"/>
+            <w:tcW w:w="1751" w:type="dxa"/>
             <w:tcBorders/>
             <w:vAlign w:val="center"/>
           </w:tcPr>
@@ -14071,7 +14059,7 @@
         </w:tc>
         <w:tc>
           <w:tcPr>
-            <w:tcW w:w="3553" w:type="dxa"/>
+            <w:tcW w:w="3519" w:type="dxa"/>
             <w:tcBorders/>
             <w:vAlign w:val="center"/>
           </w:tcPr>
@@ -14095,7 +14083,7 @@
         <w:trPr/>
         <w:tc>
           <w:tcPr>
-            <w:tcW w:w="2423" w:type="dxa"/>
+            <w:tcW w:w="2429" w:type="dxa"/>
             <w:tcBorders/>
             <w:vAlign w:val="center"/>
           </w:tcPr>
@@ -14139,7 +14127,7 @@
         </w:tc>
         <w:tc>
           <w:tcPr>
-            <w:tcW w:w="1753" w:type="dxa"/>
+            <w:tcW w:w="1751" w:type="dxa"/>
             <w:tcBorders/>
             <w:vAlign w:val="center"/>
           </w:tcPr>
@@ -14160,7 +14148,7 @@
         </w:tc>
         <w:tc>
           <w:tcPr>
-            <w:tcW w:w="3553" w:type="dxa"/>
+            <w:tcW w:w="3519" w:type="dxa"/>
             <w:tcBorders/>
             <w:vAlign w:val="center"/>
           </w:tcPr>
@@ -14184,7 +14172,7 @@
         <w:trPr/>
         <w:tc>
           <w:tcPr>
-            <w:tcW w:w="2423" w:type="dxa"/>
+            <w:tcW w:w="2429" w:type="dxa"/>
             <w:tcBorders/>
             <w:vAlign w:val="center"/>
           </w:tcPr>
@@ -14228,7 +14216,7 @@
         </w:tc>
         <w:tc>
           <w:tcPr>
-            <w:tcW w:w="1753" w:type="dxa"/>
+            <w:tcW w:w="1751" w:type="dxa"/>
             <w:tcBorders/>
             <w:vAlign w:val="center"/>
           </w:tcPr>
@@ -14251,7 +14239,7 @@
         </w:tc>
         <w:tc>
           <w:tcPr>
-            <w:tcW w:w="3553" w:type="dxa"/>
+            <w:tcW w:w="3519" w:type="dxa"/>
             <w:tcBorders/>
             <w:vAlign w:val="center"/>
           </w:tcPr>
@@ -14275,7 +14263,7 @@
         <w:trPr/>
         <w:tc>
           <w:tcPr>
-            <w:tcW w:w="2423" w:type="dxa"/>
+            <w:tcW w:w="2429" w:type="dxa"/>
             <w:tcBorders/>
             <w:vAlign w:val="center"/>
           </w:tcPr>
@@ -14319,7 +14307,7 @@
         </w:tc>
         <w:tc>
           <w:tcPr>
-            <w:tcW w:w="1753" w:type="dxa"/>
+            <w:tcW w:w="1751" w:type="dxa"/>
             <w:tcBorders/>
             <w:vAlign w:val="center"/>
           </w:tcPr>
@@ -14342,7 +14330,7 @@
         </w:tc>
         <w:tc>
           <w:tcPr>
-            <w:tcW w:w="3553" w:type="dxa"/>
+            <w:tcW w:w="3519" w:type="dxa"/>
             <w:tcBorders/>
             <w:vAlign w:val="center"/>
           </w:tcPr>
@@ -14366,7 +14354,7 @@
         <w:trPr/>
         <w:tc>
           <w:tcPr>
-            <w:tcW w:w="2423" w:type="dxa"/>
+            <w:tcW w:w="2429" w:type="dxa"/>
             <w:tcBorders/>
             <w:vAlign w:val="center"/>
           </w:tcPr>
@@ -14416,7 +14404,7 @@
         </w:tc>
         <w:tc>
           <w:tcPr>
-            <w:tcW w:w="1753" w:type="dxa"/>
+            <w:tcW w:w="1751" w:type="dxa"/>
             <w:tcBorders/>
             <w:vAlign w:val="center"/>
           </w:tcPr>
@@ -14439,7 +14427,7 @@
         </w:tc>
         <w:tc>
           <w:tcPr>
-            <w:tcW w:w="3553" w:type="dxa"/>
+            <w:tcW w:w="3519" w:type="dxa"/>
             <w:tcBorders/>
             <w:vAlign w:val="center"/>
           </w:tcPr>
@@ -14473,7 +14461,7 @@
         <w:trPr/>
         <w:tc>
           <w:tcPr>
-            <w:tcW w:w="2423" w:type="dxa"/>
+            <w:tcW w:w="2429" w:type="dxa"/>
             <w:tcBorders/>
             <w:vAlign w:val="center"/>
           </w:tcPr>
@@ -14519,7 +14507,7 @@
         </w:tc>
         <w:tc>
           <w:tcPr>
-            <w:tcW w:w="1753" w:type="dxa"/>
+            <w:tcW w:w="1751" w:type="dxa"/>
             <w:tcBorders/>
             <w:vAlign w:val="center"/>
           </w:tcPr>
@@ -14542,7 +14530,7 @@
         </w:tc>
         <w:tc>
           <w:tcPr>
-            <w:tcW w:w="3553" w:type="dxa"/>
+            <w:tcW w:w="3519" w:type="dxa"/>
             <w:tcBorders/>
             <w:vAlign w:val="center"/>
           </w:tcPr>
@@ -14596,7 +14584,7 @@
         <w:trPr/>
         <w:tc>
           <w:tcPr>
-            <w:tcW w:w="2423" w:type="dxa"/>
+            <w:tcW w:w="2429" w:type="dxa"/>
             <w:tcBorders/>
             <w:vAlign w:val="center"/>
           </w:tcPr>
@@ -14656,7 +14644,7 @@
         </w:tc>
         <w:tc>
           <w:tcPr>
-            <w:tcW w:w="1753" w:type="dxa"/>
+            <w:tcW w:w="1751" w:type="dxa"/>
             <w:tcBorders/>
             <w:vAlign w:val="center"/>
           </w:tcPr>
@@ -14679,7 +14667,7 @@
         </w:tc>
         <w:tc>
           <w:tcPr>
-            <w:tcW w:w="3553" w:type="dxa"/>
+            <w:tcW w:w="3519" w:type="dxa"/>
             <w:tcBorders/>
             <w:vAlign w:val="center"/>
           </w:tcPr>
@@ -14713,7 +14701,7 @@
         <w:trPr/>
         <w:tc>
           <w:tcPr>
-            <w:tcW w:w="2423" w:type="dxa"/>
+            <w:tcW w:w="2429" w:type="dxa"/>
             <w:tcBorders/>
             <w:vAlign w:val="center"/>
           </w:tcPr>
@@ -14759,7 +14747,7 @@
         </w:tc>
         <w:tc>
           <w:tcPr>
-            <w:tcW w:w="1753" w:type="dxa"/>
+            <w:tcW w:w="1751" w:type="dxa"/>
             <w:tcBorders/>
             <w:vAlign w:val="center"/>
           </w:tcPr>
@@ -14782,7 +14770,7 @@
         </w:tc>
         <w:tc>
           <w:tcPr>
-            <w:tcW w:w="3553" w:type="dxa"/>
+            <w:tcW w:w="3519" w:type="dxa"/>
             <w:tcBorders/>
             <w:vAlign w:val="center"/>
           </w:tcPr>
@@ -14836,7 +14824,7 @@
         <w:trPr/>
         <w:tc>
           <w:tcPr>
-            <w:tcW w:w="2423" w:type="dxa"/>
+            <w:tcW w:w="2429" w:type="dxa"/>
             <w:tcBorders/>
             <w:vAlign w:val="center"/>
           </w:tcPr>
@@ -14882,7 +14870,7 @@
         </w:tc>
         <w:tc>
           <w:tcPr>
-            <w:tcW w:w="1753" w:type="dxa"/>
+            <w:tcW w:w="1751" w:type="dxa"/>
             <w:tcBorders/>
             <w:vAlign w:val="center"/>
           </w:tcPr>
@@ -14905,7 +14893,7 @@
         </w:tc>
         <w:tc>
           <w:tcPr>
-            <w:tcW w:w="3553" w:type="dxa"/>
+            <w:tcW w:w="3519" w:type="dxa"/>
             <w:tcBorders/>
             <w:vAlign w:val="center"/>
           </w:tcPr>
@@ -14939,7 +14927,7 @@
         <w:trPr/>
         <w:tc>
           <w:tcPr>
-            <w:tcW w:w="2423" w:type="dxa"/>
+            <w:tcW w:w="2429" w:type="dxa"/>
             <w:tcBorders/>
             <w:vAlign w:val="center"/>
           </w:tcPr>
@@ -14985,7 +14973,7 @@
         </w:tc>
         <w:tc>
           <w:tcPr>
-            <w:tcW w:w="1753" w:type="dxa"/>
+            <w:tcW w:w="1751" w:type="dxa"/>
             <w:tcBorders/>
             <w:vAlign w:val="center"/>
           </w:tcPr>
@@ -15008,7 +14996,7 @@
         </w:tc>
         <w:tc>
           <w:tcPr>
-            <w:tcW w:w="3553" w:type="dxa"/>
+            <w:tcW w:w="3519" w:type="dxa"/>
             <w:tcBorders/>
             <w:vAlign w:val="center"/>
           </w:tcPr>
@@ -15032,7 +15020,7 @@
         <w:trPr/>
         <w:tc>
           <w:tcPr>
-            <w:tcW w:w="2423" w:type="dxa"/>
+            <w:tcW w:w="2429" w:type="dxa"/>
             <w:tcBorders/>
             <w:vAlign w:val="center"/>
           </w:tcPr>
@@ -15078,7 +15066,7 @@
         </w:tc>
         <w:tc>
           <w:tcPr>
-            <w:tcW w:w="1753" w:type="dxa"/>
+            <w:tcW w:w="1751" w:type="dxa"/>
             <w:tcBorders/>
             <w:vAlign w:val="center"/>
           </w:tcPr>
@@ -15101,7 +15089,7 @@
         </w:tc>
         <w:tc>
           <w:tcPr>
-            <w:tcW w:w="3553" w:type="dxa"/>
+            <w:tcW w:w="3519" w:type="dxa"/>
             <w:tcBorders/>
             <w:vAlign w:val="center"/>
           </w:tcPr>
@@ -15589,7 +15577,7 @@
     </w:p>
     <w:tbl>
       <w:tblPr>
-        <w:tblW w:w="11253" w:type="dxa"/>
+        <w:tblW w:w="10938" w:type="dxa"/>
         <w:jc w:val="left"/>
         <w:tblInd w:w="0" w:type="dxa"/>
         <w:tblLayout w:type="fixed"/>
@@ -15602,8 +15590,8 @@
       </w:tblPr>
       <w:tblGrid>
         <w:gridCol w:w="3751"/>
-        <w:gridCol w:w="3091"/>
-        <w:gridCol w:w="4411"/>
+        <w:gridCol w:w="2941"/>
+        <w:gridCol w:w="4246"/>
       </w:tblGrid>
       <w:tr>
         <w:trPr>
@@ -15633,7 +15621,7 @@
         </w:tc>
         <w:tc>
           <w:tcPr>
-            <w:tcW w:w="3091" w:type="dxa"/>
+            <w:tcW w:w="2941" w:type="dxa"/>
             <w:tcBorders/>
             <w:vAlign w:val="center"/>
           </w:tcPr>
@@ -15655,7 +15643,7 @@
         </w:tc>
         <w:tc>
           <w:tcPr>
-            <w:tcW w:w="4411" w:type="dxa"/>
+            <w:tcW w:w="4246" w:type="dxa"/>
             <w:tcBorders/>
             <w:vAlign w:val="center"/>
           </w:tcPr>
@@ -15703,7 +15691,7 @@
         </w:tc>
         <w:tc>
           <w:tcPr>
-            <w:tcW w:w="3091" w:type="dxa"/>
+            <w:tcW w:w="2941" w:type="dxa"/>
             <w:tcBorders/>
             <w:vAlign w:val="center"/>
           </w:tcPr>
@@ -15724,7 +15712,7 @@
         </w:tc>
         <w:tc>
           <w:tcPr>
-            <w:tcW w:w="4411" w:type="dxa"/>
+            <w:tcW w:w="4246" w:type="dxa"/>
             <w:tcBorders/>
             <w:vAlign w:val="center"/>
           </w:tcPr>
@@ -15771,7 +15759,7 @@
         </w:tc>
         <w:tc>
           <w:tcPr>
-            <w:tcW w:w="3091" w:type="dxa"/>
+            <w:tcW w:w="2941" w:type="dxa"/>
             <w:tcBorders/>
             <w:vAlign w:val="center"/>
           </w:tcPr>
@@ -15792,7 +15780,7 @@
         </w:tc>
         <w:tc>
           <w:tcPr>
-            <w:tcW w:w="4411" w:type="dxa"/>
+            <w:tcW w:w="4246" w:type="dxa"/>
             <w:tcBorders/>
             <w:vAlign w:val="center"/>
           </w:tcPr>
@@ -16273,7 +16261,7 @@
     </w:p>
     <w:tbl>
       <w:tblPr>
-        <w:tblW w:w="11825" w:type="dxa"/>
+        <w:tblW w:w="11795" w:type="dxa"/>
         <w:jc w:val="left"/>
         <w:tblInd w:w="0" w:type="dxa"/>
         <w:tblLayout w:type="fixed"/>
@@ -16285,9 +16273,9 @@
         </w:tblCellMar>
       </w:tblPr>
       <w:tblGrid>
-        <w:gridCol w:w="1186"/>
-        <w:gridCol w:w="8267"/>
-        <w:gridCol w:w="2372"/>
+        <w:gridCol w:w="1171"/>
+        <w:gridCol w:w="8347"/>
+        <w:gridCol w:w="2277"/>
       </w:tblGrid>
       <w:tr>
         <w:trPr>
@@ -16295,7 +16283,7 @@
         </w:trPr>
         <w:tc>
           <w:tcPr>
-            <w:tcW w:w="1186" w:type="dxa"/>
+            <w:tcW w:w="1171" w:type="dxa"/>
             <w:tcBorders/>
             <w:vAlign w:val="center"/>
           </w:tcPr>
@@ -16317,7 +16305,7 @@
         </w:tc>
         <w:tc>
           <w:tcPr>
-            <w:tcW w:w="8267" w:type="dxa"/>
+            <w:tcW w:w="8347" w:type="dxa"/>
             <w:tcBorders/>
             <w:vAlign w:val="center"/>
           </w:tcPr>
@@ -16339,7 +16327,7 @@
         </w:tc>
         <w:tc>
           <w:tcPr>
-            <w:tcW w:w="2372" w:type="dxa"/>
+            <w:tcW w:w="2277" w:type="dxa"/>
             <w:tcBorders/>
             <w:vAlign w:val="center"/>
           </w:tcPr>
@@ -16374,7 +16362,7 @@
         <w:trPr/>
         <w:tc>
           <w:tcPr>
-            <w:tcW w:w="1186" w:type="dxa"/>
+            <w:tcW w:w="1171" w:type="dxa"/>
             <w:tcBorders/>
             <w:vAlign w:val="center"/>
           </w:tcPr>
@@ -16397,7 +16385,7 @@
         </w:tc>
         <w:tc>
           <w:tcPr>
-            <w:tcW w:w="8267" w:type="dxa"/>
+            <w:tcW w:w="8347" w:type="dxa"/>
             <w:tcBorders/>
             <w:vAlign w:val="center"/>
           </w:tcPr>
@@ -16428,7 +16416,7 @@
         </w:tc>
         <w:tc>
           <w:tcPr>
-            <w:tcW w:w="2372" w:type="dxa"/>
+            <w:tcW w:w="2277" w:type="dxa"/>
             <w:tcBorders/>
             <w:vAlign w:val="center"/>
           </w:tcPr>
@@ -16472,7 +16460,7 @@
         <w:trPr/>
         <w:tc>
           <w:tcPr>
-            <w:tcW w:w="1186" w:type="dxa"/>
+            <w:tcW w:w="1171" w:type="dxa"/>
             <w:tcBorders/>
             <w:vAlign w:val="center"/>
           </w:tcPr>
@@ -16495,7 +16483,7 @@
         </w:tc>
         <w:tc>
           <w:tcPr>
-            <w:tcW w:w="8267" w:type="dxa"/>
+            <w:tcW w:w="8347" w:type="dxa"/>
             <w:tcBorders/>
             <w:vAlign w:val="center"/>
           </w:tcPr>
@@ -16526,7 +16514,7 @@
         </w:tc>
         <w:tc>
           <w:tcPr>
-            <w:tcW w:w="2372" w:type="dxa"/>
+            <w:tcW w:w="2277" w:type="dxa"/>
             <w:tcBorders/>
             <w:vAlign w:val="center"/>
           </w:tcPr>
@@ -16570,7 +16558,7 @@
         <w:trPr/>
         <w:tc>
           <w:tcPr>
-            <w:tcW w:w="1186" w:type="dxa"/>
+            <w:tcW w:w="1171" w:type="dxa"/>
             <w:tcBorders/>
             <w:vAlign w:val="center"/>
           </w:tcPr>
@@ -16593,7 +16581,7 @@
         </w:tc>
         <w:tc>
           <w:tcPr>
-            <w:tcW w:w="8267" w:type="dxa"/>
+            <w:tcW w:w="8347" w:type="dxa"/>
             <w:tcBorders/>
             <w:vAlign w:val="center"/>
           </w:tcPr>
@@ -16614,7 +16602,7 @@
         </w:tc>
         <w:tc>
           <w:tcPr>
-            <w:tcW w:w="2372" w:type="dxa"/>
+            <w:tcW w:w="2277" w:type="dxa"/>
             <w:tcBorders/>
             <w:vAlign w:val="center"/>
           </w:tcPr>
@@ -16644,7 +16632,7 @@
         <w:trPr/>
         <w:tc>
           <w:tcPr>
-            <w:tcW w:w="1186" w:type="dxa"/>
+            <w:tcW w:w="1171" w:type="dxa"/>
             <w:tcBorders/>
             <w:vAlign w:val="center"/>
           </w:tcPr>
@@ -16667,7 +16655,7 @@
         </w:tc>
         <w:tc>
           <w:tcPr>
-            <w:tcW w:w="8267" w:type="dxa"/>
+            <w:tcW w:w="8347" w:type="dxa"/>
             <w:tcBorders/>
             <w:vAlign w:val="center"/>
           </w:tcPr>
@@ -16750,7 +16738,7 @@
         </w:tc>
         <w:tc>
           <w:tcPr>
-            <w:tcW w:w="2372" w:type="dxa"/>
+            <w:tcW w:w="2277" w:type="dxa"/>
             <w:tcBorders/>
             <w:vAlign w:val="center"/>
           </w:tcPr>
@@ -16774,7 +16762,7 @@
         <w:trPr/>
         <w:tc>
           <w:tcPr>
-            <w:tcW w:w="1186" w:type="dxa"/>
+            <w:tcW w:w="1171" w:type="dxa"/>
             <w:tcBorders/>
             <w:vAlign w:val="center"/>
           </w:tcPr>
@@ -16797,7 +16785,7 @@
         </w:tc>
         <w:tc>
           <w:tcPr>
-            <w:tcW w:w="8267" w:type="dxa"/>
+            <w:tcW w:w="8347" w:type="dxa"/>
             <w:tcBorders/>
             <w:vAlign w:val="center"/>
           </w:tcPr>
@@ -16818,7 +16806,7 @@
         </w:tc>
         <w:tc>
           <w:tcPr>
-            <w:tcW w:w="2372" w:type="dxa"/>
+            <w:tcW w:w="2277" w:type="dxa"/>
             <w:tcBorders/>
             <w:vAlign w:val="center"/>
           </w:tcPr>
@@ -16898,7 +16886,7 @@
     </w:p>
     <w:tbl>
       <w:tblPr>
-        <w:tblW w:w="11825" w:type="dxa"/>
+        <w:tblW w:w="11795" w:type="dxa"/>
         <w:jc w:val="left"/>
         <w:tblInd w:w="0" w:type="dxa"/>
         <w:tblLayout w:type="fixed"/>
@@ -16910,8 +16898,8 @@
         </w:tblCellMar>
       </w:tblPr>
       <w:tblGrid>
-        <w:gridCol w:w="5241"/>
-        <w:gridCol w:w="6584"/>
+        <w:gridCol w:w="5290"/>
+        <w:gridCol w:w="6505"/>
       </w:tblGrid>
       <w:tr>
         <w:trPr>
@@ -16919,7 +16907,7 @@
         </w:trPr>
         <w:tc>
           <w:tcPr>
-            <w:tcW w:w="5241" w:type="dxa"/>
+            <w:tcW w:w="5290" w:type="dxa"/>
             <w:tcBorders/>
             <w:vAlign w:val="center"/>
           </w:tcPr>
@@ -16941,7 +16929,7 @@
         </w:tc>
         <w:tc>
           <w:tcPr>
-            <w:tcW w:w="6584" w:type="dxa"/>
+            <w:tcW w:w="6505" w:type="dxa"/>
             <w:tcBorders/>
             <w:vAlign w:val="center"/>
           </w:tcPr>
@@ -16966,7 +16954,7 @@
         <w:trPr/>
         <w:tc>
           <w:tcPr>
-            <w:tcW w:w="5241" w:type="dxa"/>
+            <w:tcW w:w="5290" w:type="dxa"/>
             <w:tcBorders/>
             <w:vAlign w:val="center"/>
           </w:tcPr>
@@ -16989,7 +16977,7 @@
         </w:tc>
         <w:tc>
           <w:tcPr>
-            <w:tcW w:w="6584" w:type="dxa"/>
+            <w:tcW w:w="6505" w:type="dxa"/>
             <w:tcBorders/>
             <w:vAlign w:val="center"/>
           </w:tcPr>
@@ -17013,7 +17001,7 @@
         <w:trPr/>
         <w:tc>
           <w:tcPr>
-            <w:tcW w:w="5241" w:type="dxa"/>
+            <w:tcW w:w="5290" w:type="dxa"/>
             <w:tcBorders/>
             <w:vAlign w:val="center"/>
           </w:tcPr>
@@ -17036,7 +17024,7 @@
         </w:tc>
         <w:tc>
           <w:tcPr>
-            <w:tcW w:w="6584" w:type="dxa"/>
+            <w:tcW w:w="6505" w:type="dxa"/>
             <w:tcBorders/>
             <w:vAlign w:val="center"/>
           </w:tcPr>
@@ -17070,7 +17058,7 @@
         <w:trPr/>
         <w:tc>
           <w:tcPr>
-            <w:tcW w:w="5241" w:type="dxa"/>
+            <w:tcW w:w="5290" w:type="dxa"/>
             <w:tcBorders/>
             <w:vAlign w:val="center"/>
           </w:tcPr>
@@ -17093,7 +17081,7 @@
         </w:tc>
         <w:tc>
           <w:tcPr>
-            <w:tcW w:w="6584" w:type="dxa"/>
+            <w:tcW w:w="6505" w:type="dxa"/>
             <w:tcBorders/>
             <w:vAlign w:val="center"/>
           </w:tcPr>
@@ -17117,7 +17105,7 @@
         <w:trPr/>
         <w:tc>
           <w:tcPr>
-            <w:tcW w:w="5241" w:type="dxa"/>
+            <w:tcW w:w="5290" w:type="dxa"/>
             <w:tcBorders/>
             <w:vAlign w:val="center"/>
           </w:tcPr>
@@ -17140,7 +17128,7 @@
         </w:tc>
         <w:tc>
           <w:tcPr>
-            <w:tcW w:w="6584" w:type="dxa"/>
+            <w:tcW w:w="6505" w:type="dxa"/>
             <w:tcBorders/>
             <w:vAlign w:val="center"/>
           </w:tcPr>
@@ -17164,7 +17152,7 @@
         <w:trPr/>
         <w:tc>
           <w:tcPr>
-            <w:tcW w:w="5241" w:type="dxa"/>
+            <w:tcW w:w="5290" w:type="dxa"/>
             <w:tcBorders/>
             <w:vAlign w:val="center"/>
           </w:tcPr>
@@ -17187,7 +17175,7 @@
         </w:tc>
         <w:tc>
           <w:tcPr>
-            <w:tcW w:w="6584" w:type="dxa"/>
+            <w:tcW w:w="6505" w:type="dxa"/>
             <w:tcBorders/>
             <w:vAlign w:val="center"/>
           </w:tcPr>
@@ -17211,7 +17199,7 @@
         <w:trPr/>
         <w:tc>
           <w:tcPr>
-            <w:tcW w:w="5241" w:type="dxa"/>
+            <w:tcW w:w="5290" w:type="dxa"/>
             <w:tcBorders/>
             <w:vAlign w:val="center"/>
           </w:tcPr>
@@ -17234,7 +17222,7 @@
         </w:tc>
         <w:tc>
           <w:tcPr>
-            <w:tcW w:w="6584" w:type="dxa"/>
+            <w:tcW w:w="6505" w:type="dxa"/>
             <w:tcBorders/>
             <w:vAlign w:val="center"/>
           </w:tcPr>
@@ -17258,7 +17246,7 @@
         <w:trPr/>
         <w:tc>
           <w:tcPr>
-            <w:tcW w:w="5241" w:type="dxa"/>
+            <w:tcW w:w="5290" w:type="dxa"/>
             <w:tcBorders/>
             <w:vAlign w:val="center"/>
           </w:tcPr>
@@ -17291,7 +17279,7 @@
         </w:tc>
         <w:tc>
           <w:tcPr>
-            <w:tcW w:w="6584" w:type="dxa"/>
+            <w:tcW w:w="6505" w:type="dxa"/>
             <w:tcBorders/>
             <w:vAlign w:val="center"/>
           </w:tcPr>
@@ -17335,7 +17323,7 @@
         <w:trPr/>
         <w:tc>
           <w:tcPr>
-            <w:tcW w:w="5241" w:type="dxa"/>
+            <w:tcW w:w="5290" w:type="dxa"/>
             <w:tcBorders/>
             <w:vAlign w:val="center"/>
           </w:tcPr>
@@ -17368,7 +17356,7 @@
         </w:tc>
         <w:tc>
           <w:tcPr>
-            <w:tcW w:w="6584" w:type="dxa"/>
+            <w:tcW w:w="6505" w:type="dxa"/>
             <w:tcBorders/>
             <w:vAlign w:val="center"/>
           </w:tcPr>
@@ -17422,7 +17410,7 @@
         <w:trPr/>
         <w:tc>
           <w:tcPr>
-            <w:tcW w:w="5241" w:type="dxa"/>
+            <w:tcW w:w="5290" w:type="dxa"/>
             <w:tcBorders/>
             <w:vAlign w:val="center"/>
           </w:tcPr>
@@ -17445,7 +17433,7 @@
         </w:tc>
         <w:tc>
           <w:tcPr>
-            <w:tcW w:w="6584" w:type="dxa"/>
+            <w:tcW w:w="6505" w:type="dxa"/>
             <w:tcBorders/>
             <w:vAlign w:val="center"/>
           </w:tcPr>
@@ -17499,7 +17487,7 @@
         <w:trPr/>
         <w:tc>
           <w:tcPr>
-            <w:tcW w:w="5241" w:type="dxa"/>
+            <w:tcW w:w="5290" w:type="dxa"/>
             <w:tcBorders/>
             <w:vAlign w:val="center"/>
           </w:tcPr>
@@ -17522,7 +17510,7 @@
         </w:tc>
         <w:tc>
           <w:tcPr>
-            <w:tcW w:w="6584" w:type="dxa"/>
+            <w:tcW w:w="6505" w:type="dxa"/>
             <w:tcBorders/>
             <w:vAlign w:val="center"/>
           </w:tcPr>
@@ -17562,7 +17550,7 @@
         <w:trPr/>
         <w:tc>
           <w:tcPr>
-            <w:tcW w:w="5241" w:type="dxa"/>
+            <w:tcW w:w="5290" w:type="dxa"/>
             <w:tcBorders/>
             <w:vAlign w:val="center"/>
           </w:tcPr>
@@ -17585,7 +17573,7 @@
         </w:tc>
         <w:tc>
           <w:tcPr>
-            <w:tcW w:w="6584" w:type="dxa"/>
+            <w:tcW w:w="6505" w:type="dxa"/>
             <w:tcBorders/>
             <w:vAlign w:val="center"/>
           </w:tcPr>
@@ -17635,7 +17623,7 @@
         <w:trPr/>
         <w:tc>
           <w:tcPr>
-            <w:tcW w:w="5241" w:type="dxa"/>
+            <w:tcW w:w="5290" w:type="dxa"/>
             <w:tcBorders/>
             <w:vAlign w:val="center"/>
           </w:tcPr>
@@ -17658,7 +17646,7 @@
         </w:tc>
         <w:tc>
           <w:tcPr>
-            <w:tcW w:w="6584" w:type="dxa"/>
+            <w:tcW w:w="6505" w:type="dxa"/>
             <w:tcBorders/>
             <w:vAlign w:val="center"/>
           </w:tcPr>
@@ -17682,7 +17670,7 @@
         <w:trPr/>
         <w:tc>
           <w:tcPr>
-            <w:tcW w:w="5241" w:type="dxa"/>
+            <w:tcW w:w="5290" w:type="dxa"/>
             <w:tcBorders/>
             <w:vAlign w:val="center"/>
           </w:tcPr>
@@ -17715,7 +17703,7 @@
         </w:tc>
         <w:tc>
           <w:tcPr>
-            <w:tcW w:w="6584" w:type="dxa"/>
+            <w:tcW w:w="6505" w:type="dxa"/>
             <w:tcBorders/>
             <w:vAlign w:val="center"/>
           </w:tcPr>
@@ -17739,7 +17727,7 @@
         <w:trPr/>
         <w:tc>
           <w:tcPr>
-            <w:tcW w:w="5241" w:type="dxa"/>
+            <w:tcW w:w="5290" w:type="dxa"/>
             <w:tcBorders/>
             <w:vAlign w:val="center"/>
           </w:tcPr>
@@ -17782,7 +17770,7 @@
         </w:tc>
         <w:tc>
           <w:tcPr>
-            <w:tcW w:w="6584" w:type="dxa"/>
+            <w:tcW w:w="6505" w:type="dxa"/>
             <w:tcBorders/>
             <w:vAlign w:val="center"/>
           </w:tcPr>
@@ -17806,7 +17794,7 @@
         <w:trPr/>
         <w:tc>
           <w:tcPr>
-            <w:tcW w:w="5241" w:type="dxa"/>
+            <w:tcW w:w="5290" w:type="dxa"/>
             <w:tcBorders/>
             <w:vAlign w:val="center"/>
           </w:tcPr>
@@ -17839,7 +17827,7 @@
         </w:tc>
         <w:tc>
           <w:tcPr>
-            <w:tcW w:w="6584" w:type="dxa"/>
+            <w:tcW w:w="6505" w:type="dxa"/>
             <w:tcBorders/>
             <w:vAlign w:val="center"/>
           </w:tcPr>
@@ -17873,7 +17861,7 @@
         <w:trPr/>
         <w:tc>
           <w:tcPr>
-            <w:tcW w:w="5241" w:type="dxa"/>
+            <w:tcW w:w="5290" w:type="dxa"/>
             <w:tcBorders/>
             <w:vAlign w:val="center"/>
           </w:tcPr>
@@ -17896,7 +17884,7 @@
         </w:tc>
         <w:tc>
           <w:tcPr>
-            <w:tcW w:w="6584" w:type="dxa"/>
+            <w:tcW w:w="6505" w:type="dxa"/>
             <w:tcBorders/>
             <w:vAlign w:val="center"/>
           </w:tcPr>
@@ -17926,7 +17914,7 @@
         <w:trPr/>
         <w:tc>
           <w:tcPr>
-            <w:tcW w:w="5241" w:type="dxa"/>
+            <w:tcW w:w="5290" w:type="dxa"/>
             <w:tcBorders/>
             <w:vAlign w:val="center"/>
           </w:tcPr>
@@ -17949,7 +17937,7 @@
         </w:tc>
         <w:tc>
           <w:tcPr>
-            <w:tcW w:w="6584" w:type="dxa"/>
+            <w:tcW w:w="6505" w:type="dxa"/>
             <w:tcBorders/>
             <w:vAlign w:val="center"/>
           </w:tcPr>
@@ -17983,7 +17971,7 @@
         <w:trPr/>
         <w:tc>
           <w:tcPr>
-            <w:tcW w:w="5241" w:type="dxa"/>
+            <w:tcW w:w="5290" w:type="dxa"/>
             <w:tcBorders/>
             <w:vAlign w:val="center"/>
           </w:tcPr>
@@ -18006,7 +17994,7 @@
         </w:tc>
         <w:tc>
           <w:tcPr>
-            <w:tcW w:w="6584" w:type="dxa"/>
+            <w:tcW w:w="6505" w:type="dxa"/>
             <w:tcBorders/>
             <w:vAlign w:val="center"/>
           </w:tcPr>
@@ -18036,7 +18024,7 @@
         <w:trPr/>
         <w:tc>
           <w:tcPr>
-            <w:tcW w:w="5241" w:type="dxa"/>
+            <w:tcW w:w="5290" w:type="dxa"/>
             <w:tcBorders/>
             <w:vAlign w:val="center"/>
           </w:tcPr>
@@ -18059,7 +18047,7 @@
         </w:tc>
         <w:tc>
           <w:tcPr>
-            <w:tcW w:w="6584" w:type="dxa"/>
+            <w:tcW w:w="6505" w:type="dxa"/>
             <w:tcBorders/>
             <w:vAlign w:val="center"/>
           </w:tcPr>
@@ -18103,7 +18091,7 @@
         <w:trPr/>
         <w:tc>
           <w:tcPr>
-            <w:tcW w:w="5241" w:type="dxa"/>
+            <w:tcW w:w="5290" w:type="dxa"/>
             <w:tcBorders/>
             <w:vAlign w:val="center"/>
           </w:tcPr>
@@ -18126,7 +18114,7 @@
         </w:tc>
         <w:tc>
           <w:tcPr>
-            <w:tcW w:w="6584" w:type="dxa"/>
+            <w:tcW w:w="6505" w:type="dxa"/>
             <w:tcBorders/>
             <w:vAlign w:val="center"/>
           </w:tcPr>

</xml_diff>

<commit_message>
L-0710: review round 1 (Codex) fixes - the diff baseline's own guards
- base-at is used only when it is an ancestor of HEAD (a baseline left on
  another branch could diff to nothing and hide a change).
- A zero-command turn moves base-at only when nothing committed differs
  from the base (git diff --quiet BASE HEAD), so a committed change no rule
  matched today stays in scope for a rule added later.
- A base-at write that fails refuses the turn (exit 2) instead of exiting 0.
- "0 rules ran" is said on the unmapped-fail exit 2 too.
- verify_record report re-says a pre-L-0710 chronic reason with the CI tail.
- Notice and CONFIG/guide wording: /crew:done needs the VERIFIED receipt or
  a clean /crew:verify --all.

Both flavours; 5 new cases in test_verify_gate_stop_fits_budget.py and 9
new sabotage entries (20 in all), each confirmed RED.

Claude-Session: https://claude.ai/code/session_01GYbTAPVer2KNpK6NmGbo5p
</commit_message>
<xml_diff>
--- a/docs/guides/crew/crew-troubleshooting.docx
+++ b/docs/guides/crew/crew-troubleshooting.docx
@@ -7578,7 +7578,7 @@
       </w:r>
       <w:r>
         <w:rPr/>
-        <w:t xml:space="preserve"> moves, so a later commit is still in scope. </w:t>
+        <w:t xml:space="preserve"> moves (when nothing committed differs from the base), so a later commit is still in scope. If that file cannot be written the turn exits 2 and says so. </w:t>
       </w:r>
     </w:p>
     <w:p>
@@ -7635,7 +7635,7 @@
       </w:r>
       <w:r>
         <w:rPr/>
-        <w:t xml:space="preserve"> refuses until its receipt for HEAD is VERIFIED. Push the branch, or run </w:t>
+        <w:t xml:space="preserve"> refuses until its receipt for HEAD is VERIFIED or a local run passes it. Push the branch, or run </w:t>
       </w:r>
       <w:r>
         <w:rPr>

</xml_diff>

<commit_message>
L-0710: review round 1 (Codex) fix - a clean local pass reads 'no rules recorded', not 'every rule pass'
verify_record keeps only outstanding rules, so crew_status prints
'verify   no rules recorded' after a clean pass. done.md check 2's local
path, and every doc restating it, now says nothing outstanding plus the
marker at HEAD.
</commit_message>
<xml_diff>
--- a/docs/guides/crew/crew-troubleshooting.docx
+++ b/docs/guides/crew/crew-troubleshooting.docx
@@ -4542,17 +4542,17 @@
       </w:r>
       <w:r>
         <w:rPr/>
-        <w:t xml:space="preserve"> here, which leaves every rule </w:t>
-      </w:r>
-      <w:r>
-        <w:rPr>
-          <w:rStyle w:val="SourceText"/>
-        </w:rPr>
-        <w:t>pass</w:t>
-      </w:r>
-      <w:r>
-        <w:rPr/>
-        <w:t xml:space="preserve"> with </w:t>
+        <w:t xml:space="preserve"> here, which empties the record (</w:t>
+      </w:r>
+      <w:r>
+        <w:rPr>
+          <w:rStyle w:val="SourceText"/>
+        </w:rPr>
+        <w:t>verify no rules recorded</w:t>
+      </w:r>
+      <w:r>
+        <w:rPr/>
+        <w:t xml:space="preserve">) and writes </w:t>
       </w:r>
       <w:r>
         <w:rPr>
@@ -4562,7 +4562,7 @@
       </w:r>
       <w:r>
         <w:rPr/>
-        <w:t xml:space="preserve"> at HEAD. </w:t>
+        <w:t xml:space="preserve"> = HEAD. </w:t>
       </w:r>
       <w:r>
         <w:rPr>

</xml_diff>

<commit_message>
L-0710: review round 2 (Codex) fix, owner ruling - check 2's local path needs GATE VERIFIED
An empty verify record plus a marker at HEAD both survive an uncommitted
edit (a failing Stop run persists nothing and never moves the marker).
done.md check 2 now runs review_gate.gate_state, which also compares the
working tree's fingerprint, and requires GATE VERIFIED. New
test_done_check2_gate.py runs the printed command on a throwaway repo
(clean: VERIFIED; uncommitted edit: UNVERIFIED while marker-only passes)
and goes red if check 2 reverts to the marker alone or stops requiring
the VERIFIED line (both confirmed by hand). Mapped by a new verify.json
rule. Docs follow.
</commit_message>
<xml_diff>
--- a/docs/guides/crew/crew-troubleshooting.docx
+++ b/docs/guides/crew/crew-troubleshooting.docx
@@ -4552,17 +4552,27 @@
       </w:r>
       <w:r>
         <w:rPr/>
-        <w:t xml:space="preserve">) and writes </w:t>
-      </w:r>
-      <w:r>
-        <w:rPr>
-          <w:rStyle w:val="SourceText"/>
-        </w:rPr>
-        <w:t>.crew/.verify-verified-at</w:t>
-      </w:r>
-      <w:r>
-        <w:rPr/>
-        <w:t xml:space="preserve"> = HEAD. </w:t>
+        <w:t xml:space="preserve">) and leaves the gate's </w:t>
+      </w:r>
+      <w:r>
+        <w:rPr>
+          <w:rStyle w:val="SourceText"/>
+        </w:rPr>
+        <w:t>GATE VERIFIED</w:t>
+      </w:r>
+      <w:r>
+        <w:rPr/>
+        <w:t xml:space="preserve"> answer for this tree. An uncommitted edit after that pass turns it back to </w:t>
+      </w:r>
+      <w:r>
+        <w:rPr>
+          <w:rStyle w:val="SourceText"/>
+        </w:rPr>
+        <w:t>GATE UNVERIFIED</w:t>
+      </w:r>
+      <w:r>
+        <w:rPr/>
+        <w:t xml:space="preserve">: commit, then re-run. </w:t>
       </w:r>
       <w:r>
         <w:rPr>

</xml_diff>

<commit_message>
L-0711 review round 4: the scope line's last three unknowns
Owner ruling 2026-10-08 on Codex round 4 (0 BLOCK, 3 FIX):

- An INDEX.md that exists but cannot be read is could-not-tell:
  crew_state.read_work reads it as empty, so unresolved_index_ticket
  checks the read first. test_an_unreadable_index_is_could_not_tell.
- A merged main that is could-not-tell (detached HEAD, no integration
  ref) puts merged_suffix on the outside-scope line, as the audit puts
  its own could-not-tell line on a pass; never a bare clean line.
  test_merged_main_could_not_tell_reaches_the_scope_line.
- Every line goes through one sink, _line, which escapes non-printables
  with completion_audit.shown, so a file name carrying a newline cannot
  forge a second verdict. test_a_file_name_cannot_forge_a_scope_line.

Each test was run red against its reverted fix. Docs: CHANGELOG, plugin
README, troubleshooting guide (rebuilt), codemap note and its rule.
</commit_message>
<xml_diff>
--- a/docs/guides/crew/crew-troubleshooting.docx
+++ b/docs/guides/crew/crew-troubleshooting.docx
@@ -6477,7 +6477,27 @@
       </w:r>
       <w:r>
         <w:rPr/>
-        <w:t xml:space="preserve"> folder does not exist (fix the INDEX row or restore the folder). Before L-0711 the line said every 1.0 ticket's file was missing. It is report-only: the refusal is </w:t>
+        <w:t xml:space="preserve"> folder does not exist (fix the INDEX row or restore the folder), or an </w:t>
+      </w:r>
+      <w:r>
+        <w:rPr>
+          <w:rStyle w:val="SourceText"/>
+        </w:rPr>
+        <w:t>INDEX.md</w:t>
+      </w:r>
+      <w:r>
+        <w:rPr/>
+        <w:t xml:space="preserve"> that cannot be read. A clean line can also carry </w:t>
+      </w:r>
+      <w:r>
+        <w:rPr>
+          <w:rStyle w:val="SourceText"/>
+        </w:rPr>
+        <w:t>(merged main: could not tell - ...)</w:t>
+      </w:r>
+      <w:r>
+        <w:rPr/>
+        <w:t xml:space="preserve">, for example on a detached HEAD: nothing was left out as main's, the same as the audit. Before L-0711 the line said every 1.0 ticket's file was missing. It is report-only: the refusal is </w:t>
       </w:r>
       <w:r>
         <w:rPr>

</xml_diff>

<commit_message>
L-0739: the review bundle carries committed .work/ text changes; check E refuses only what it cannot show
A repository that tracks .work/ (TSS) committed notes inside every reviewed
range, and check E failed each such receipt for good: the bundle could never
show those bytes (REL-769B4A66, REL-69AB9DD7).

review_patch appends the committed text changes under .work/ and
.crew/metrics.md, base -> HEAD, read from the commit trees only (status
A/M/D, mode 100644, not binary, not matched by the repo's own ignore rules).
An empty section leaves the bundle bytes unchanged, so existing receipts stay
valid. Check E's first range passes those only when the receipt's bundle
carried them (reviewed-head rebuild or today's bundle has its hash); anything
else is "outside the bundle" with its reason and remedy. reviewed_bundle and
the delta gate's interdiff carry the same section. Ranges 2 and 3 unchanged.

Sabotage: three check E entries re-anchored; eight L-0739 entries, each red.
</commit_message>
<xml_diff>
--- a/docs/guides/crew/crew-troubleshooting.docx
+++ b/docs/guides/crew/crew-troubleshooting.docx
@@ -4378,6 +4378,76 @@
       <w:r>
         <w:rPr/>
         <w:t xml:space="preserve"> - the merge train is not armed in this clone, so the gate keeps nothing yet); a code map, rules file or diagram may move only its anchor sha after review. </w:t>
+      </w:r>
+      <w:r>
+        <w:rPr>
+          <w:rStyle w:val="SourceText"/>
+        </w:rPr>
+        <w:t>excluded path changed: &lt;path&gt; (receipt base -&gt; reviewed head)</w:t>
+      </w:r>
+      <w:r>
+        <w:rPr/>
+        <w:t xml:space="preserve"> in a repository that commits </w:t>
+      </w:r>
+      <w:r>
+        <w:rPr>
+          <w:rStyle w:val="SourceText"/>
+        </w:rPr>
+        <w:t>.work/</w:t>
+      </w:r>
+      <w:r>
+        <w:rPr/>
+        <w:t xml:space="preserve"> notes: since L-0739 the bundle carries a committed text change there, so a receipt minted by an older crew says </w:t>
+      </w:r>
+      <w:r>
+        <w:rPr>
+          <w:rStyle w:val="SourceText"/>
+        </w:rPr>
+        <w:t>outside the bundle; re-review so it is included</w:t>
+      </w:r>
+      <w:r>
+        <w:rPr/>
+        <w:t xml:space="preserve"> - run </w:t>
+      </w:r>
+      <w:r>
+        <w:rPr>
+          <w:rStyle w:val="SourceText"/>
+        </w:rPr>
+        <w:t>/crew:review</w:t>
+      </w:r>
+      <w:r>
+        <w:rPr/>
+        <w:t xml:space="preserve"> again and the new round shows it. </w:t>
+      </w:r>
+      <w:r>
+        <w:rPr>
+          <w:rStyle w:val="SourceText"/>
+        </w:rPr>
+        <w:t>outside the bundle, which cannot show it</w:t>
+      </w:r>
+      <w:r>
+        <w:rPr/>
+        <w:t xml:space="preserve"> (a binary, executable, symlink or gitlink file, a force-added file the repository ignores, or a </w:t>
+      </w:r>
+      <w:r>
+        <w:rPr>
+          <w:rStyle w:val="SourceText"/>
+        </w:rPr>
+        <w:t>graphify-out/</w:t>
+      </w:r>
+      <w:r>
+        <w:rPr/>
+        <w:t xml:space="preserve"> file) has one remedy: restore the path in a new commit, then re-review. Run the review from another checkout of the deploy commit, so its </w:t>
+      </w:r>
+      <w:r>
+        <w:rPr>
+          <w:rStyle w:val="SourceText"/>
+        </w:rPr>
+        <w:t>review.json</w:t>
+      </w:r>
+      <w:r>
+        <w:rPr/>
+        <w:t xml:space="preserve"> and metrics row do not dirty the tree promote-gate checks. </w:t>
       </w:r>
       <w:r>
         <w:rPr>

</xml_diff>

<commit_message>
L-0753: done.md, docs.md, README and guides describe the own-diff checks and the same-tree receipt
</commit_message>
<xml_diff>
--- a/docs/guides/crew/crew-troubleshooting.docx
+++ b/docs/guides/crew/crew-troubleshooting.docx
@@ -4632,7 +4632,37 @@
       </w:r>
       <w:r>
         <w:rPr/>
-        <w:t xml:space="preserve"> names HEAD; or run </w:t>
+        <w:t xml:space="preserve"> names HEAD. After the PR merged, close from a branch at </w:t>
+      </w:r>
+      <w:r>
+        <w:rPr>
+          <w:rStyle w:val="SourceText"/>
+        </w:rPr>
+        <w:t>origin/main</w:t>
+      </w:r>
+      <w:r>
+        <w:rPr/>
+        <w:t xml:space="preserve">: the merge has no run of its own, and the PR head's run counts when its tree is exactly the merge's (it reads </w:t>
+      </w:r>
+      <w:r>
+        <w:rPr>
+          <w:rStyle w:val="SourceText"/>
+        </w:rPr>
+        <w:t>through &lt;sha&gt;, which has the same tree</w:t>
+      </w:r>
+      <w:r>
+        <w:rPr/>
+        <w:t xml:space="preserve">); if </w:t>
+      </w:r>
+      <w:r>
+        <w:rPr>
+          <w:rStyle w:val="SourceText"/>
+        </w:rPr>
+        <w:t>main</w:t>
+      </w:r>
+      <w:r>
+        <w:rPr/>
+        <w:t xml:space="preserve"> moved before the merge, the trees differ and the bytes were never gated. Or run </w:t>
       </w:r>
       <w:r>
         <w:rPr>

</xml_diff>

<commit_message>
L-0772: fix the Codex round-2 findings
BLOCK: env-guard.sh checks the layer is one strict JSON object (awk), so
a malformed object with no envGuard key arms it; a shell or interpreter
with no script, no code flag and no body it was handed is could-not-tell
wherever the pipe is (bash -c bash, a group, a redirect); a name assigned
from a credential is a credential for the rest of the command
(env T="$TOKEN" printenv T, T=$TOKEN; echo $T).
FIX: a config path the reader was refused a look at is not absent, in
env_guard._layer_arms (lstat), env-guard.sh (the nearest existing ancestor
must be searchable) and env-guard.ps1 (Get-Item, not Test-Path);
check-marketplace's hook counter the same; the crew version returns to
main's until land time, as the ticket's version rule says.
NIT: the ratchet diagram's write-table and intersection counts (16, 15).
Also: an assignment after a reserved word (do T=$X cmd) is read as one.
</commit_message>
<xml_diff>
--- a/docs/guides/crew/crew-troubleshooting.docx
+++ b/docs/guides/crew/crew-troubleshooting.docx
@@ -12187,13 +12187,33 @@
       </w:r>
       <w:r>
         <w:rPr/>
-        <w:t>), code fed to a shell or interpreter through a pipe (</w:t>
+        <w:t>), a shell or interpreter left to read its code from stdin (</w:t>
       </w:r>
       <w:r>
         <w:rPr>
           <w:rStyle w:val="SourceText"/>
         </w:rPr>
         <w:t>echo env | bash</w:t>
+      </w:r>
+      <w:r>
+        <w:rPr/>
+        <w:t xml:space="preserve">, </w:t>
+      </w:r>
+      <w:r>
+        <w:rPr>
+          <w:rStyle w:val="SourceText"/>
+        </w:rPr>
+        <w:t>bash &lt; f</w:t>
+      </w:r>
+      <w:r>
+        <w:rPr/>
+        <w:t xml:space="preserve">, a bare </w:t>
+      </w:r>
+      <w:r>
+        <w:rPr>
+          <w:rStyle w:val="SourceText"/>
+        </w:rPr>
+        <w:t>python3</w:t>
       </w:r>
       <w:r>
         <w:rPr/>
@@ -12277,7 +12297,7 @@
       </w:r>
       <w:r>
         <w:rPr/>
-        <w:t xml:space="preserve"> the shell fallback reads the config file itself and arms the guard for a file it cannot judge: unreadable, not a JSON object, holding a </w:t>
+        <w:t xml:space="preserve"> the shell fallback reads the config file itself and arms the guard for a file it cannot judge: unreadable, under a directory it cannot enter, not one strict JSON object (a trailing comma, a comment, a bare word), holding a </w:t>
       </w:r>
       <w:r>
         <w:rPr>
@@ -12287,7 +12307,7 @@
       </w:r>
       <w:r>
         <w:rPr/>
-        <w:t xml:space="preserve"> escape, a trailing comma or a comment, or with </w:t>
+        <w:t xml:space="preserve"> escape, or with </w:t>
       </w:r>
       <w:r>
         <w:rPr>

</xml_diff>

<commit_message>
L-0796: review round 1 - close fd 4 in rule subshell, units, detail pointer, ps1 coverage (crew 1.2.39)
BLOCK: the saved stderr pipe (fd 4) is closed in the rule subshell, so a rule
that backgrounds a process no longer holds the hook open (8s -> 1s measured).
BLOCK: ps1 behavioural tests (unknown notice, unwritable log, session, unchanged
line) plus four ps1 sabotage entries, each red.
FIX: the unchanged-since-last-Stop line names .crew/.verify-gate.log and
/crew:verify --all in both flavours.
NIT: ps1 treats any exit other than 0 after CrewReady as failing, like sh.
NIT: verdict names units: cmd for FAILED/PASSED, rule(s) for NOT VERIFIED.

Docs: README.md, CONFIG.md, troubleshooting guide src + rebuilt HTML/DOCX/PDF, CHANGELOG, codemap, generated rule, BUDGETS count
</commit_message>
<xml_diff>
--- a/docs/guides/crew/crew-troubleshooting.docx
+++ b/docs/guides/crew/crew-troubleshooting.docx
@@ -8386,7 +8386,7 @@
         <w:rPr>
           <w:rStyle w:val="SourceText"/>
         </w:rPr>
-        <w:t>verify-gate: FAILED 1 | PASSED 14 | NOT VERIFIED 5 (reach 2, over-budget 1, dirty tree 0, deferred 1, skipped 1, other 0) | credited 3 | budget 41s/60s | detail: .crew/.verify-gate.log</w:t>
+        <w:t>verify-gate: FAILED 1 cmd | PASSED 14 cmd | NOT VERIFIED 5 rule(s) (reach 2, over-budget 1, dirty tree 0, deferred 1, skipped 1, other 0) | credited 3 | budget 41s/60s | detail: .crew/.verify-gate.log</w:t>
       </w:r>
     </w:p>
     <w:p>
@@ -8530,51 +8530,13 @@
       </w:pPr>
       <w:r>
         <w:rPr>
-          <w:rStyle w:val="SourceText"/>
-        </w:rPr>
-        <w:t>NOT VERIFIED</w:t>
-      </w:r>
-      <w:r>
-        <w:rPr>
           <w:rStyle w:val="Strong"/>
         </w:rPr>
-        <w:t xml:space="preserve"> is not </w:t>
-      </w:r>
-      <w:r>
-        <w:rPr>
-          <w:rStyle w:val="SourceText"/>
-        </w:rPr>
-        <w:t>PASSED</w:t>
-      </w:r>
-      <w:r>
-        <w:rPr>
-          <w:rStyle w:val="Strong"/>
-        </w:rPr>
-        <w:t>.</w:t>
-      </w:r>
-      <w:r>
-        <w:rPr/>
-        <w:t xml:space="preserve"> A deferred, skipped, reach-excluded, over-budget or dirty-tree rule is counted under NOT VERIFIED; </w:t>
-      </w:r>
-      <w:r>
-        <w:rPr>
-          <w:rStyle w:val="SourceText"/>
-        </w:rPr>
-        <w:t>other</w:t>
-      </w:r>
-      <w:r>
-        <w:rPr/>
-        <w:t xml:space="preserve"> is a rule the gate could not classify. Run </w:t>
-      </w:r>
-      <w:r>
-        <w:rPr>
-          <w:rStyle w:val="SourceText"/>
-        </w:rPr>
-        <w:t>/crew:verify --all</w:t>
-      </w:r>
-      <w:r>
-        <w:rPr/>
-        <w:t xml:space="preserve"> to run them. </w:t>
+        <w:t>Units.</w:t>
+      </w:r>
+      <w:r>
+        <w:rPr/>
+        <w:t xml:space="preserve"> FAILED, PASSED and credited count commands; NOT VERIFIED counts rules, and its breakdown (reach, over-budget, dirty tree, deferred, skipped, other) is in rules too. Do not add the two together. </w:t>
       </w:r>
     </w:p>
     <w:p>
@@ -8598,11 +8560,87 @@
         <w:rPr>
           <w:rStyle w:val="SourceText"/>
         </w:rPr>
-        <w:t>verify-gate: unchanged since last Stop (N failing, M NOT VERIFIED): &lt;command&gt;</w:t>
-      </w:r>
-      <w:r>
-        <w:rPr/>
-        <w:t xml:space="preserve">: the same session is failing the same way it reported on the last Stop, so the full block is not repeated. The turn is still blocked (exit 2). A new session, a changed failure, or deleting </w:t>
+        <w:t>NOT VERIFIED</w:t>
+      </w:r>
+      <w:r>
+        <w:rPr>
+          <w:rStyle w:val="Strong"/>
+        </w:rPr>
+        <w:t xml:space="preserve"> is not </w:t>
+      </w:r>
+      <w:r>
+        <w:rPr>
+          <w:rStyle w:val="SourceText"/>
+        </w:rPr>
+        <w:t>PASSED</w:t>
+      </w:r>
+      <w:r>
+        <w:rPr>
+          <w:rStyle w:val="Strong"/>
+        </w:rPr>
+        <w:t>.</w:t>
+      </w:r>
+      <w:r>
+        <w:rPr/>
+        <w:t xml:space="preserve"> A deferred, skipped, reach-excluded, over-budget or dirty-tree rule is counted under NOT VERIFIED; </w:t>
+      </w:r>
+      <w:r>
+        <w:rPr>
+          <w:rStyle w:val="SourceText"/>
+        </w:rPr>
+        <w:t>other</w:t>
+      </w:r>
+      <w:r>
+        <w:rPr/>
+        <w:t xml:space="preserve"> is a rule the gate could not classify. Run </w:t>
+      </w:r>
+      <w:r>
+        <w:rPr>
+          <w:rStyle w:val="SourceText"/>
+        </w:rPr>
+        <w:t>/crew:verify --all</w:t>
+      </w:r>
+      <w:r>
+        <w:rPr/>
+        <w:t xml:space="preserve"> to run them. </w:t>
+      </w:r>
+    </w:p>
+    <w:p>
+      <w:pPr>
+        <w:pStyle w:val="BodyText"/>
+        <w:numPr>
+          <w:ilvl w:val="0"/>
+          <w:numId w:val="18"/>
+        </w:numPr>
+        <w:tabs>
+          <w:tab w:val="clear" w:pos="1134"/>
+          <w:tab w:val="left" w:pos="829" w:leader="none"/>
+        </w:tabs>
+        <w:bidi w:val="0"/>
+        <w:spacing w:before="120" w:after="0"/>
+        <w:ind w:hanging="283" w:left="829"/>
+        <w:jc w:val="left"/>
+        <w:rPr/>
+      </w:pPr>
+      <w:r>
+        <w:rPr>
+          <w:rStyle w:val="SourceText"/>
+        </w:rPr>
+        <w:t>verify-gate: unchanged since last Stop (N failing, M NOT VERIFIED): &lt;command&gt; | detail: &lt;log&gt; | ...</w:t>
+      </w:r>
+      <w:r>
+        <w:rPr/>
+        <w:t xml:space="preserve">: the same session is failing the same way it reported on the last Stop, so the full block is not repeated. The line names </w:t>
+      </w:r>
+      <w:r>
+        <w:rPr>
+          <w:rStyle w:val="SourceText"/>
+        </w:rPr>
+        <w:t>.crew/.verify-gate.log</w:t>
+      </w:r>
+      <w:r>
+        <w:rPr/>
+        <w:t xml:space="preserve">, which holds this run's failing output. The turn is still blocked (exit 2). A new session, a changed failure, or deleting </w:t>
       </w:r>
       <w:r>
         <w:rPr>

</xml_diff>

<commit_message>
L-0796: review round 2 - revert crew-context.ps1 sabotage, no unchanged line while the log is unwritable, item(s) unit, Stop-path docs (crew 1.2.39)
</commit_message>
<xml_diff>
--- a/docs/guides/crew/crew-troubleshooting.docx
+++ b/docs/guides/crew/crew-troubleshooting.docx
@@ -8293,7 +8293,47 @@
       </w:r>
       <w:r>
         <w:rPr/>
-        <w:t xml:space="preserve">: that rule costs more than the whole budget, so Stop never runs it. The </w:t>
+        <w:t xml:space="preserve"> (since crew 1.2.39 the quiet Stop path counts these in the verdict line's </w:t>
+      </w:r>
+      <w:r>
+        <w:rPr>
+          <w:rStyle w:val="SourceText"/>
+        </w:rPr>
+        <w:t>over-budget</w:t>
+      </w:r>
+      <w:r>
+        <w:rPr/>
+        <w:t xml:space="preserve"> and </w:t>
+      </w:r>
+      <w:r>
+        <w:rPr>
+          <w:rStyle w:val="SourceText"/>
+        </w:rPr>
+        <w:t>deferred</w:t>
+      </w:r>
+      <w:r>
+        <w:rPr/>
+        <w:t xml:space="preserve"> figures and writes the per-rule text to </w:t>
+      </w:r>
+      <w:r>
+        <w:rPr>
+          <w:rStyle w:val="SourceText"/>
+        </w:rPr>
+        <w:t>.crew/.verify-gate.log</w:t>
+      </w:r>
+      <w:r>
+        <w:rPr/>
+        <w:t xml:space="preserve">; </w:t>
+      </w:r>
+      <w:r>
+        <w:rPr>
+          <w:rStyle w:val="SourceText"/>
+        </w:rPr>
+        <w:t>--verbose</w:t>
+      </w:r>
+      <w:r>
+        <w:rPr/>
+        <w:t xml:space="preserve"> prints it): that rule costs more than the whole budget, so Stop never runs it. The </w:t>
       </w:r>
       <w:r>
         <w:rPr>
@@ -8386,7 +8426,7 @@
         <w:rPr>
           <w:rStyle w:val="SourceText"/>
         </w:rPr>
-        <w:t>verify-gate: FAILED 1 cmd | PASSED 14 cmd | NOT VERIFIED 5 rule(s) (reach 2, over-budget 1, dirty tree 0, deferred 1, skipped 1, other 0) | credited 3 | budget 41s/60s | detail: .crew/.verify-gate.log</w:t>
+        <w:t>verify-gate: FAILED 1 cmd | PASSED 14 cmd | NOT VERIFIED 5 item(s) (reach 2, over-budget 1, dirty tree 0, deferred 1, skipped 1, other 0) | credited 3 | budget 41s/60s | detail: .crew/.verify-gate.log</w:t>
       </w:r>
     </w:p>
     <w:p>
@@ -8536,7 +8576,7 @@
       </w:r>
       <w:r>
         <w:rPr/>
-        <w:t xml:space="preserve"> FAILED, PASSED and credited count commands; NOT VERIFIED counts rules, and its breakdown (reach, over-budget, dirty tree, deferred, skipped, other) is in rules too. Do not add the two together. </w:t>
+        <w:t xml:space="preserve"> FAILED, PASSED and credited count commands; NOT VERIFIED counts items: a rule for reach, over-budget, dirty tree and deferred, but a command for skipped (exit 77) and for credits withdrawn because the tree moved (under other). Do not add the two units together. </w:t>
       </w:r>
     </w:p>
     <w:p>
@@ -8640,7 +8680,7 @@
       </w:r>
       <w:r>
         <w:rPr/>
-        <w:t xml:space="preserve">, which holds this run's failing output. The turn is still blocked (exit 2). A new session, a changed failure, or deleting </w:t>
+        <w:t xml:space="preserve">, which holds this run's full output. If that log cannot be written the gate never prints this line: it prints the full block instead. The turn is still blocked (exit 2). A new session, a changed failure, or deleting </w:t>
       </w:r>
       <w:r>
         <w:rPr>

</xml_diff>

<commit_message>
L-0796: bump crew to 1.2.40, leave verify.md to a follow-up (harness-alone rule), BUDGETS count
</commit_message>
<xml_diff>
--- a/docs/guides/crew/crew-troubleshooting.docx
+++ b/docs/guides/crew/crew-troubleshooting.docx
@@ -8293,7 +8293,7 @@
       </w:r>
       <w:r>
         <w:rPr/>
-        <w:t xml:space="preserve"> (since crew 1.2.39 the quiet Stop path counts these in the verdict line's </w:t>
+        <w:t xml:space="preserve"> (since crew 1.2.40 the quiet Stop path counts these in the verdict line's </w:t>
       </w:r>
       <w:r>
         <w:rPr>
@@ -8402,7 +8402,7 @@
       </w:pPr>
       <w:r>
         <w:rPr/>
-        <w:t xml:space="preserve">Since crew 1.2.39 (L-0796) the Stop gate is quiet. It prints one verdict line, then each failure exactly as before, and keeps the rest in </w:t>
+        <w:t xml:space="preserve">Since crew 1.2.40 (L-0796) the Stop gate is quiet. It prints one verdict line, then each failure exactly as before, and keeps the rest in </w:t>
       </w:r>
       <w:r>
         <w:rPr>

</xml_diff>

<commit_message>
L-0796: bump crew to 1.2.41 after review round 3, BUDGETS count, test oracle
</commit_message>
<xml_diff>
--- a/docs/guides/crew/crew-troubleshooting.docx
+++ b/docs/guides/crew/crew-troubleshooting.docx
@@ -8293,7 +8293,7 @@
       </w:r>
       <w:r>
         <w:rPr/>
-        <w:t xml:space="preserve"> (since crew 1.2.40 the quiet Stop path counts these in the verdict line's </w:t>
+        <w:t xml:space="preserve"> (since crew 1.2.41 the quiet Stop path counts these in the verdict line's </w:t>
       </w:r>
       <w:r>
         <w:rPr>
@@ -8402,7 +8402,7 @@
       </w:pPr>
       <w:r>
         <w:rPr/>
-        <w:t xml:space="preserve">Since crew 1.2.40 (L-0796) the Stop gate is quiet. It prints one verdict line, then each failure exactly as before, and keeps the rest in </w:t>
+        <w:t xml:space="preserve">Since crew 1.2.41 (L-0796) the Stop gate is quiet. It prints one verdict line, then each failure exactly as before, and keeps the rest in </w:t>
       </w:r>
       <w:r>
         <w:rPr>

</xml_diff>

<commit_message>
L-0796: review round 1 - lock back-off keeps the holder's log, reach-excluded always/default counted, repeat check hashes unrun identities, ambiguous session id, ps1 scope child buffered; crew 1.2.39
</commit_message>
<xml_diff>
--- a/docs/guides/crew/crew-troubleshooting.docx
+++ b/docs/guides/crew/crew-troubleshooting.docx
@@ -8293,7 +8293,7 @@
       </w:r>
       <w:r>
         <w:rPr/>
-        <w:t xml:space="preserve"> (since crew 1.2.41 the quiet Stop path counts these in the verdict line's </w:t>
+        <w:t xml:space="preserve"> (since crew 1.2.39 the quiet Stop path counts these in the verdict line's </w:t>
       </w:r>
       <w:r>
         <w:rPr>
@@ -8402,7 +8402,7 @@
       </w:pPr>
       <w:r>
         <w:rPr/>
-        <w:t xml:space="preserve">Since crew 1.2.41 (L-0796) the Stop gate is quiet. It prints one verdict line, then each failure exactly as before, and keeps the rest in </w:t>
+        <w:t xml:space="preserve">Since crew 1.2.39 (L-0796) the Stop gate is quiet. It prints one verdict line, then each failure exactly as before, and keeps the rest in </w:t>
       </w:r>
       <w:r>
         <w:rPr>

</xml_diff>

<commit_message>
L-0850: ADR 0009, hook docs, guides, diagram line references (pre-version)
</commit_message>
<xml_diff>
--- a/docs/guides/crew/crew-troubleshooting.docx
+++ b/docs/guides/crew/crew-troubleshooting.docx
@@ -520,7 +520,7 @@
       </w:pPr>
       <w:r>
         <w:rPr/>
-        <w:t xml:space="preserve">Every hook crew registers, from </w:t>
+        <w:t xml:space="preserve">Every hook crew runs, and the config key that turns its behaviour up or down. </w:t>
       </w:r>
       <w:r>
         <w:rPr>
@@ -530,7 +530,27 @@
       </w:r>
       <w:r>
         <w:rPr/>
-        <w:t>, and the config key that turns its behaviour up or down. All events are registered once for bash and once for PowerShell (</w:t>
+        <w:t xml:space="preserve"> registers one launcher per event per shell (</w:t>
+      </w:r>
+      <w:r>
+        <w:rPr>
+          <w:rStyle w:val="SourceText"/>
+        </w:rPr>
+        <w:t>crew-hook.sh</w:t>
+      </w:r>
+      <w:r>
+        <w:rPr/>
+        <w:t xml:space="preserve">, and </w:t>
+      </w:r>
+      <w:r>
+        <w:rPr>
+          <w:rStyle w:val="SourceText"/>
+        </w:rPr>
+        <w:t>crew-hook.ps1</w:t>
+      </w:r>
+      <w:r>
+        <w:rPr/>
+        <w:t xml:space="preserve"> with </w:t>
       </w:r>
       <w:r>
         <w:rPr>
@@ -540,13 +560,33 @@
       </w:r>
       <w:r>
         <w:rPr/>
-        <w:t xml:space="preserve">), so a Windows machine with both </w:t>
-      </w:r>
-      <w:r>
-        <w:rPr>
-          <w:rStyle w:val="SourceText"/>
-        </w:rPr>
-        <w:t>bash</w:t>
+        <w:t xml:space="preserve">); the launcher starts one dispatcher, </w:t>
+      </w:r>
+      <w:r>
+        <w:rPr>
+          <w:rStyle w:val="SourceText"/>
+        </w:rPr>
+        <w:t>crew_hook.py &lt;Event&gt;</w:t>
+      </w:r>
+      <w:r>
+        <w:rPr/>
+        <w:t xml:space="preserve">, which runs that event's scripts below at once and combines what they print. On Windows only the PowerShell launcher runs, so no event fires twice. When the launcher or dispatcher itself fails in a repo crew governs, </w:t>
+      </w:r>
+      <w:r>
+        <w:rPr>
+          <w:rStyle w:val="SourceText"/>
+        </w:rPr>
+        <w:t>PreToolUse</w:t>
+      </w:r>
+      <w:r>
+        <w:rPr/>
+        <w:t xml:space="preserve">, </w:t>
+      </w:r>
+      <w:r>
+        <w:rPr>
+          <w:rStyle w:val="SourceText"/>
+        </w:rPr>
+        <w:t>UserPromptSubmit</w:t>
       </w:r>
       <w:r>
         <w:rPr/>
@@ -556,21 +596,21 @@
         <w:rPr>
           <w:rStyle w:val="SourceText"/>
         </w:rPr>
-        <w:t>pwsh</w:t>
-      </w:r>
-      <w:r>
-        <w:rPr/>
-        <w:t xml:space="preserve"> on </w:t>
-      </w:r>
-      <w:r>
-        <w:rPr>
-          <w:rStyle w:val="SourceText"/>
-        </w:rPr>
-        <w:t>PATH</w:t>
-      </w:r>
-      <w:r>
-        <w:rPr/>
-        <w:t xml:space="preserve"> fires both halves of every pair — that is what "even counts" in the file means, not a bug.</w:t>
+        <w:t>Stop</w:t>
+      </w:r>
+      <w:r>
+        <w:rPr/>
+        <w:t xml:space="preserve"> refuse with </w:t>
+      </w:r>
+      <w:r>
+        <w:rPr>
+          <w:rStyle w:val="SourceText"/>
+        </w:rPr>
+        <w:t>crew-hook: ... failing closed (armed repo)</w:t>
+      </w:r>
+      <w:r>
+        <w:rPr/>
+        <w:t xml:space="preserve"> and the cause, rather than let the call through unjudged.</w:t>
       </w:r>
     </w:p>
     <w:tbl>

</xml_diff>

<commit_message>
L-0867: sendkeys refusal names crew 1.2.61
</commit_message>
<xml_diff>
--- a/docs/guides/crew/crew-troubleshooting.docx
+++ b/docs/guides/crew/crew-troubleshooting.docx
@@ -16127,7 +16127,7 @@
       </w:r>
       <w:r>
         <w:rPr/>
-        <w:t xml:space="preserve"> The Windows keystroke method was removed in crew 1.2.60 (L-0727): a config that names it is refused with "sendkeys was removed in crew 1.2.60 (L-0727); use notify or tmux", and </w:t>
+        <w:t xml:space="preserve"> The Windows keystroke method was removed in crew 1.2.61 (L-0727): a config that names it is refused with "sendkeys was removed in crew 1.2.61 (L-0727); use notify or tmux", and </w:t>
       </w:r>
       <w:r>
         <w:rPr>
@@ -22808,7 +22808,7 @@
       </w:r>
       <w:r>
         <w:rPr/>
-        <w:t xml:space="preserve"> method was removed in crew 1.2.60). It types once per handoff (a marker under </w:t>
+        <w:t xml:space="preserve"> method was removed in crew 1.2.61). It types once per handoff (a marker under </w:t>
       </w:r>
       <w:r>
         <w:rPr>
@@ -23308,7 +23308,7 @@
             </w:r>
             <w:r>
               <w:rPr/>
-              <w:t xml:space="preserve"> was removed in crew 1.2.60 and is refused)</w:t>
+              <w:t xml:space="preserve"> was removed in crew 1.2.61 and is refused)</w:t>
             </w:r>
           </w:p>
         </w:tc>
@@ -26059,7 +26059,7 @@
               <w:rPr>
                 <w:rStyle w:val="Strong"/>
               </w:rPr>
-              <w:t>Removed in crew 1.2.60 (L-0727 slice 3).</w:t>
+              <w:t>Removed in crew 1.2.61 (L-0727 slice 3).</w:t>
             </w:r>
             <w:r>
               <w:rPr/>
@@ -26083,7 +26083,7 @@
             </w:r>
             <w:r>
               <w:rPr/>
-              <w:t>, which is deleted. A config that names it is refused with "sendkeys was removed in crew 1.2.60 (L-0727); use notify or tmux".</w:t>
+              <w:t>, which is deleted. A config that names it is refused with "sendkeys was removed in crew 1.2.61 (L-0727); use notify or tmux".</w:t>
             </w:r>
           </w:p>
         </w:tc>

</xml_diff>

<commit_message>
L-0868: verify rule, rationale, troubleshooting docs; keep the sabotage_resume anchor line
handoff-write.sh's crew_resume.py precompact call stays unwrapped: tests/sabotage_resume.py (HARNESS) anchors on its exact text, so it moves with the tooling PR.

Docs: troubleshooting guide source and rebuilt HTML/DOCX/PDF, docs/crew/reference/26-troubleshooting.md.
</commit_message>
<xml_diff>
--- a/docs/guides/crew/crew-troubleshooting.docx
+++ b/docs/guides/crew/crew-troubleshooting.docx
@@ -21919,6 +21919,214 @@
       <w:r>
         <w:rPr/>
         <w:t xml:space="preserve"> first. </w:t>
+      </w:r>
+    </w:p>
+    <w:p>
+      <w:pPr>
+        <w:pStyle w:val="BodyText"/>
+        <w:numPr>
+          <w:ilvl w:val="0"/>
+          <w:numId w:val="43"/>
+        </w:numPr>
+        <w:tabs>
+          <w:tab w:val="clear" w:pos="1134"/>
+          <w:tab w:val="left" w:pos="829" w:leader="none"/>
+        </w:tabs>
+        <w:bidi w:val="0"/>
+        <w:spacing w:before="120" w:after="0"/>
+        <w:ind w:hanging="283" w:left="829"/>
+        <w:jc w:val="left"/>
+        <w:rPr/>
+      </w:pPr>
+      <w:r>
+        <w:rPr>
+          <w:rStyle w:val="SourceText"/>
+        </w:rPr>
+        <w:t>can't open file 'D:\tmp\...\crew_autocycle.py'</w:t>
+      </w:r>
+      <w:r>
+        <w:rPr>
+          <w:rStyle w:val="Strong"/>
+        </w:rPr>
+        <w:t xml:space="preserve"> (or any </w:t>
+      </w:r>
+      <w:r>
+        <w:rPr>
+          <w:rStyle w:val="SourceText"/>
+        </w:rPr>
+        <w:t>.py</w:t>
+      </w:r>
+      <w:r>
+        <w:rPr>
+          <w:rStyle w:val="Strong"/>
+        </w:rPr>
+        <w:t xml:space="preserve"> under </w:t>
+      </w:r>
+      <w:r>
+        <w:rPr>
+          <w:rStyle w:val="SourceText"/>
+        </w:rPr>
+        <w:t>hooks/scripts</w:t>
+      </w:r>
+      <w:r>
+        <w:rPr>
+          <w:rStyle w:val="Strong"/>
+        </w:rPr>
+        <w:t>).</w:t>
+      </w:r>
+      <w:r>
+        <w:rPr/>
+        <w:t xml:space="preserve"> Git Bash rewrites a POSIX-looking script argument (</w:t>
+      </w:r>
+      <w:r>
+        <w:rPr>
+          <w:rStyle w:val="SourceText"/>
+        </w:rPr>
+        <w:t>/tmp/...</w:t>
+      </w:r>
+      <w:r>
+        <w:rPr/>
+        <w:t xml:space="preserve">, </w:t>
+      </w:r>
+      <w:r>
+        <w:rPr>
+          <w:rStyle w:val="SourceText"/>
+        </w:rPr>
+        <w:t>/d/...</w:t>
+      </w:r>
+      <w:r>
+        <w:rPr/>
+        <w:t xml:space="preserve">) into a Windows path when it starts a native </w:t>
+      </w:r>
+      <w:r>
+        <w:rPr>
+          <w:rStyle w:val="SourceText"/>
+        </w:rPr>
+        <w:t>python.exe</w:t>
+      </w:r>
+      <w:r>
+        <w:rPr/>
+        <w:t xml:space="preserve">, but only while </w:t>
+      </w:r>
+      <w:r>
+        <w:rPr>
+          <w:rStyle w:val="SourceText"/>
+        </w:rPr>
+        <w:t>MSYS_NO_PATHCONV</w:t>
+      </w:r>
+      <w:r>
+        <w:rPr/>
+        <w:t xml:space="preserve"> is unset. Set, even to an empty string by a shell profile, a CI runner or a parent process, the argument reaches Python as written and Windows resolves it against the current drive. Since L-0868 every </w:t>
+      </w:r>
+      <w:r>
+        <w:rPr>
+          <w:rStyle w:val="SourceText"/>
+        </w:rPr>
+        <w:t>.sh</w:t>
+      </w:r>
+      <w:r>
+        <w:rPr/>
+        <w:t xml:space="preserve"> hook except the review-harness ones passes its script path through </w:t>
+      </w:r>
+      <w:r>
+        <w:rPr>
+          <w:rStyle w:val="SourceText"/>
+        </w:rPr>
+        <w:t>crew_native_path</w:t>
+      </w:r>
+      <w:r>
+        <w:rPr/>
+        <w:t xml:space="preserve"> (</w:t>
+      </w:r>
+      <w:r>
+        <w:rPr>
+          <w:rStyle w:val="SourceText"/>
+        </w:rPr>
+        <w:t>cygpath -m</w:t>
+      </w:r>
+      <w:r>
+        <w:rPr/>
+        <w:t>, which needs no argument conversion), so the variable no longer matters for them. The harness hooks (</w:t>
+      </w:r>
+      <w:r>
+        <w:rPr>
+          <w:rStyle w:val="SourceText"/>
+        </w:rPr>
+        <w:t>verify-gate.sh</w:t>
+      </w:r>
+      <w:r>
+        <w:rPr/>
+        <w:t xml:space="preserve">, </w:t>
+      </w:r>
+      <w:r>
+        <w:rPr>
+          <w:rStyle w:val="SourceText"/>
+        </w:rPr>
+        <w:t>approval-hook.sh</w:t>
+      </w:r>
+      <w:r>
+        <w:rPr/>
+        <w:t xml:space="preserve">, </w:t>
+      </w:r>
+      <w:r>
+        <w:rPr>
+          <w:rStyle w:val="SourceText"/>
+        </w:rPr>
+        <w:t>scope-guard.sh</w:t>
+      </w:r>
+      <w:r>
+        <w:rPr/>
+        <w:t xml:space="preserve">, </w:t>
+      </w:r>
+      <w:r>
+        <w:rPr>
+          <w:rStyle w:val="SourceText"/>
+        </w:rPr>
+        <w:t>completion-audit.sh</w:t>
+      </w:r>
+      <w:r>
+        <w:rPr/>
+        <w:t xml:space="preserve">, </w:t>
+      </w:r>
+      <w:r>
+        <w:rPr>
+          <w:rStyle w:val="SourceText"/>
+        </w:rPr>
+        <w:t>crew-hook.sh</w:t>
+      </w:r>
+      <w:r>
+        <w:rPr/>
+        <w:t xml:space="preserve">) and the PreCompact </w:t>
+      </w:r>
+      <w:r>
+        <w:rPr>
+          <w:rStyle w:val="SourceText"/>
+        </w:rPr>
+        <w:t>crew_resume.py</w:t>
+      </w:r>
+      <w:r>
+        <w:rPr/>
+        <w:t xml:space="preserve"> record still depend on conversion until a follow-up lands: if one fails this way, unset </w:t>
+      </w:r>
+      <w:r>
+        <w:rPr>
+          <w:rStyle w:val="SourceText"/>
+        </w:rPr>
+        <w:t>MSYS_NO_PATHCONV</w:t>
+      </w:r>
+      <w:r>
+        <w:rPr/>
+        <w:t xml:space="preserve"> for the session (</w:t>
+      </w:r>
+      <w:r>
+        <w:rPr>
+          <w:rStyle w:val="SourceText"/>
+        </w:rPr>
+        <w:t>env -u MSYS_NO_PATHCONV claude</w:t>
+      </w:r>
+      <w:r>
+        <w:rPr/>
+        <w:t xml:space="preserve">). </w:t>
       </w:r>
     </w:p>
     <w:p>

</xml_diff>

<commit_message>
L-0868: round 1 FIX/NIT - state the handoff-write deferral in the docs, harden the source scan
Docs: troubleshooting guide source and rebuilt HTML/DOCX/PDF, reference 26, verify rationale.
</commit_message>
<xml_diff>
--- a/docs/guides/crew/crew-troubleshooting.docx
+++ b/docs/guides/crew/crew-troubleshooting.docx
@@ -22026,7 +22026,7 @@
       </w:r>
       <w:r>
         <w:rPr/>
-        <w:t xml:space="preserve"> hook except the review-harness ones passes its script path through </w:t>
+        <w:t xml:space="preserve"> hook except the review-harness ones (and that one record) passes its script path through </w:t>
       </w:r>
       <w:r>
         <w:rPr>
@@ -22106,7 +22106,17 @@
       </w:r>
       <w:r>
         <w:rPr/>
-        <w:t xml:space="preserve"> record still depend on conversion until a follow-up lands: if one fails this way, unset </w:t>
+        <w:t xml:space="preserve"> record in </w:t>
+      </w:r>
+      <w:r>
+        <w:rPr>
+          <w:rStyle w:val="SourceText"/>
+        </w:rPr>
+        <w:t>handoff-write.sh</w:t>
+      </w:r>
+      <w:r>
+        <w:rPr/>
+        <w:t xml:space="preserve"> still depend on conversion until a follow-up lands: if one fails this way, unset </w:t>
       </w:r>
       <w:r>
         <w:rPr>

</xml_diff>

<commit_message>
L-0869: rebuild troubleshooting guide DOCX and PDF (LibreOffice)
</commit_message>
<xml_diff>
--- a/docs/guides/crew/crew-troubleshooting.docx
+++ b/docs/guides/crew/crew-troubleshooting.docx
@@ -8411,16 +8411,6 @@
       </w:r>
       <w:r>
         <w:rPr/>
-        <w:t xml:space="preserve"> / </w:t>
-      </w:r>
-      <w:r>
-        <w:rPr>
-          <w:rStyle w:val="SourceText"/>
-        </w:rPr>
-        <w:t>.ps1</w:t>
-      </w:r>
-      <w:r>
-        <w:rPr/>
         <w:t xml:space="preserve"> (L-0710). The Stop gate runs only the rules mapped to what changed since its marker, cheapest first, inside </w:t>
       </w:r>
       <w:r>
@@ -8993,16 +8983,6 @@
       </w:r>
       <w:r>
         <w:rPr/>
-        <w:t xml:space="preserve"> / </w:t>
-      </w:r>
-      <w:r>
-        <w:rPr>
-          <w:rStyle w:val="SourceText"/>
-        </w:rPr>
-        <w:t>.ps1</w:t>
-      </w:r>
-      <w:r>
-        <w:rPr/>
         <w:t xml:space="preserve"> (T-0082). A rule counts as passed only when its wrapper ended with status 0 </w:t>
       </w:r>
       <w:r>
@@ -9203,17 +9183,17 @@
       </w:r>
       <w:r>
         <w:rPr/>
-        <w:t xml:space="preserve"> (</w:t>
-      </w:r>
-      <w:r>
-        <w:rPr>
-          <w:rStyle w:val="SourceText"/>
-        </w:rPr>
-        <w:t>.ps1</w:t>
-      </w:r>
-      <w:r>
-        <w:rPr/>
-        <w:t xml:space="preserve"> only): the resolved bash vanished or would not launch for this rule. Before T-0082 this rule silently inherited the previous rule's pass. </w:t>
+        <w:t xml:space="preserve"> (the deleted </w:t>
+      </w:r>
+      <w:r>
+        <w:rPr>
+          <w:rStyle w:val="SourceText"/>
+        </w:rPr>
+        <w:t>verify-gate.ps1</w:t>
+      </w:r>
+      <w:r>
+        <w:rPr/>
+        <w:t xml:space="preserve"> only; no current message): the resolved bash vanished or would not launch for this rule. Before T-0082 this rule silently inherited the previous rule's pass. </w:t>
       </w:r>
     </w:p>
     <w:p>
@@ -9278,27 +9258,7 @@
       </w:r>
       <w:r>
         <w:rPr/>
-        <w:t xml:space="preserve"> (</w:t>
-      </w:r>
-      <w:r>
-        <w:rPr>
-          <w:rStyle w:val="SourceText"/>
-        </w:rPr>
-        <w:t>.sh</w:t>
-      </w:r>
-      <w:r>
-        <w:rPr/>
-        <w:t xml:space="preserve"> only): the gate itself was signalled mid-rule; it still exits 128+N. A killed </w:t>
-      </w:r>
-      <w:r>
-        <w:rPr>
-          <w:rStyle w:val="SourceText"/>
-        </w:rPr>
-        <w:t>.ps1</w:t>
-      </w:r>
-      <w:r>
-        <w:rPr/>
-        <w:t xml:space="preserve"> gate prints nothing (PowerShell has no signal trap); the marker not advancing covers it. </w:t>
+        <w:t xml:space="preserve"> the gate itself was signalled mid-rule; it still exits 128+N. </w:t>
       </w:r>
     </w:p>
     <w:p>

</xml_diff>

<commit_message>
L-0869: gate fixes (flavour fixtures, harness rule paths, sentinel, sabotage harness, guide wording, lint, dead gate_bash)
</commit_message>
<xml_diff>
--- a/docs/guides/crew/crew-troubleshooting.docx
+++ b/docs/guides/crew/crew-troubleshooting.docx
@@ -9183,17 +9183,7 @@
       </w:r>
       <w:r>
         <w:rPr/>
-        <w:t xml:space="preserve"> (the deleted </w:t>
-      </w:r>
-      <w:r>
-        <w:rPr>
-          <w:rStyle w:val="SourceText"/>
-        </w:rPr>
-        <w:t>verify-gate.ps1</w:t>
-      </w:r>
-      <w:r>
-        <w:rPr/>
-        <w:t xml:space="preserve"> only; no current message): the resolved bash vanished or would not launch for this rule. Before T-0082 this rule silently inherited the previous rule's pass. </w:t>
+        <w:t xml:space="preserve"> (the PowerShell gate, deleted in L-0869, only; no current message): the resolved bash vanished or would not launch for this rule. Before T-0082 this rule silently inherited the previous rule's pass. </w:t>
       </w:r>
     </w:p>
     <w:p>

</xml_diff>

<commit_message>
L-0868: docs name the path-argument widening (troubleshooting guide rebuilt)
</commit_message>
<xml_diff>
--- a/docs/guides/crew/crew-troubleshooting.docx
+++ b/docs/guides/crew/crew-troubleshooting.docx
@@ -22026,7 +22026,27 @@
       </w:r>
       <w:r>
         <w:rPr/>
-        <w:t xml:space="preserve"> hook except the review-harness ones (and that one record) passes its script path through </w:t>
+        <w:t xml:space="preserve"> hook except the review-harness ones (and that one record) passes its script path and its path arguments (</w:t>
+      </w:r>
+      <w:r>
+        <w:rPr>
+          <w:rStyle w:val="SourceText"/>
+        </w:rPr>
+        <w:t>--root</w:t>
+      </w:r>
+      <w:r>
+        <w:rPr/>
+        <w:t xml:space="preserve">, </w:t>
+      </w:r>
+      <w:r>
+        <w:rPr>
+          <w:rStyle w:val="SourceText"/>
+        </w:rPr>
+        <w:t>sys.path</w:t>
+      </w:r>
+      <w:r>
+        <w:rPr/>
+        <w:t xml:space="preserve"> and config data paths) through </w:t>
       </w:r>
       <w:r>
         <w:rPr>

</xml_diff>

<commit_message>
L-0868: leave handoff-read.sh:42 unwrapped (sabotage_context.py anchors on it, deferred to L-0874); pylint fix
</commit_message>
<xml_diff>
--- a/docs/guides/crew/crew-troubleshooting.docx
+++ b/docs/guides/crew/crew-troubleshooting.docx
@@ -22036,43 +22036,43 @@
       </w:r>
       <w:r>
         <w:rPr/>
+        <w:t xml:space="preserve"> and config data paths) through </w:t>
+      </w:r>
+      <w:r>
+        <w:rPr>
+          <w:rStyle w:val="SourceText"/>
+        </w:rPr>
+        <w:t>crew_native_path</w:t>
+      </w:r>
+      <w:r>
+        <w:rPr/>
+        <w:t xml:space="preserve"> (</w:t>
+      </w:r>
+      <w:r>
+        <w:rPr>
+          <w:rStyle w:val="SourceText"/>
+        </w:rPr>
+        <w:t>cygpath -m</w:t>
+      </w:r>
+      <w:r>
+        <w:rPr/>
+        <w:t>, which needs no argument conversion), so the variable no longer matters for them. The harness hooks (</w:t>
+      </w:r>
+      <w:r>
+        <w:rPr>
+          <w:rStyle w:val="SourceText"/>
+        </w:rPr>
+        <w:t>verify-gate.sh</w:t>
+      </w:r>
+      <w:r>
+        <w:rPr/>
         <w:t xml:space="preserve">, </w:t>
       </w:r>
       <w:r>
         <w:rPr>
           <w:rStyle w:val="SourceText"/>
         </w:rPr>
-        <w:t>sys.path</w:t>
-      </w:r>
-      <w:r>
-        <w:rPr/>
-        <w:t xml:space="preserve"> and config data paths) through </w:t>
-      </w:r>
-      <w:r>
-        <w:rPr>
-          <w:rStyle w:val="SourceText"/>
-        </w:rPr>
-        <w:t>crew_native_path</w:t>
-      </w:r>
-      <w:r>
-        <w:rPr/>
-        <w:t xml:space="preserve"> (</w:t>
-      </w:r>
-      <w:r>
-        <w:rPr>
-          <w:rStyle w:val="SourceText"/>
-        </w:rPr>
-        <w:t>cygpath -m</w:t>
-      </w:r>
-      <w:r>
-        <w:rPr/>
-        <w:t>, which needs no argument conversion), so the variable no longer matters for them. The harness hooks (</w:t>
-      </w:r>
-      <w:r>
-        <w:rPr>
-          <w:rStyle w:val="SourceText"/>
-        </w:rPr>
-        <w:t>verify-gate.sh</w:t>
+        <w:t>approval-hook.sh</w:t>
       </w:r>
       <w:r>
         <w:rPr/>
@@ -22082,7 +22082,7 @@
         <w:rPr>
           <w:rStyle w:val="SourceText"/>
         </w:rPr>
-        <w:t>approval-hook.sh</w:t>
+        <w:t>scope-guard.sh</w:t>
       </w:r>
       <w:r>
         <w:rPr/>
@@ -22092,7 +22092,7 @@
         <w:rPr>
           <w:rStyle w:val="SourceText"/>
         </w:rPr>
-        <w:t>scope-guard.sh</w:t>
+        <w:t>completion-audit.sh</w:t>
       </w:r>
       <w:r>
         <w:rPr/>
@@ -22102,21 +22102,11 @@
         <w:rPr>
           <w:rStyle w:val="SourceText"/>
         </w:rPr>
-        <w:t>completion-audit.sh</w:t>
-      </w:r>
-      <w:r>
-        <w:rPr/>
-        <w:t xml:space="preserve">, </w:t>
-      </w:r>
-      <w:r>
-        <w:rPr>
-          <w:rStyle w:val="SourceText"/>
-        </w:rPr>
         <w:t>crew-hook.sh</w:t>
       </w:r>
       <w:r>
         <w:rPr/>
-        <w:t xml:space="preserve">) and the PreCompact </w:t>
+        <w:t xml:space="preserve">) the PreCompact </w:t>
       </w:r>
       <w:r>
         <w:rPr>
@@ -22133,6 +22123,26 @@
           <w:rStyle w:val="SourceText"/>
         </w:rPr>
         <w:t>handoff-write.sh</w:t>
+      </w:r>
+      <w:r>
+        <w:rPr/>
+        <w:t xml:space="preserve"> and the </w:t>
+      </w:r>
+      <w:r>
+        <w:rPr>
+          <w:rStyle w:val="SourceText"/>
+        </w:rPr>
+        <w:t>crew_context</w:t>
+      </w:r>
+      <w:r>
+        <w:rPr/>
+        <w:t xml:space="preserve"> probe at </w:t>
+      </w:r>
+      <w:r>
+        <w:rPr>
+          <w:rStyle w:val="SourceText"/>
+        </w:rPr>
+        <w:t>handoff-read.sh:42</w:t>
       </w:r>
       <w:r>
         <w:rPr/>

</xml_diff>

<commit_message>
L-0868: rebuild troubleshooting guide
</commit_message>
<xml_diff>
--- a/docs/guides/crew/crew-troubleshooting.docx
+++ b/docs/guides/crew/crew-troubleshooting.docx
@@ -22123,26 +22123,6 @@
           <w:rStyle w:val="SourceText"/>
         </w:rPr>
         <w:t>handoff-write.sh</w:t>
-      </w:r>
-      <w:r>
-        <w:rPr/>
-        <w:t xml:space="preserve"> and the </w:t>
-      </w:r>
-      <w:r>
-        <w:rPr>
-          <w:rStyle w:val="SourceText"/>
-        </w:rPr>
-        <w:t>crew_context</w:t>
-      </w:r>
-      <w:r>
-        <w:rPr/>
-        <w:t xml:space="preserve"> probe at </w:t>
-      </w:r>
-      <w:r>
-        <w:rPr>
-          <w:rStyle w:val="SourceText"/>
-        </w:rPr>
-        <w:t>handoff-read.sh:42</w:t>
       </w:r>
       <w:r>
         <w:rPr/>

</xml_diff>

<commit_message>
L-0888: rebuild the troubleshooting guide
</commit_message>
<xml_diff>
--- a/docs/guides/crew/crew-troubleshooting.docx
+++ b/docs/guides/crew/crew-troubleshooting.docx
@@ -8591,7 +8591,7 @@
       </w:r>
       <w:r>
         <w:rPr/>
-        <w:t xml:space="preserve"> (L-0888, crew 1.2.81). </w:t>
+        <w:t xml:space="preserve"> (L-0888, crew 1.2.84). </w:t>
       </w:r>
       <w:r>
         <w:rPr>
@@ -8641,7 +8641,17 @@
       </w:r>
       <w:r>
         <w:rPr/>
-        <w:t>) therefore runs it only for a repo this machine trusts. Otherwise it prints one line, runs nothing, writes no pass record and exits 0:</w:t>
+        <w:t>) therefore runs it only for a repo this machine trusts. Otherwise it prints one line, runs nothing, writes no pass record and exits 0 (</w:t>
+      </w:r>
+      <w:r>
+        <w:rPr>
+          <w:rStyle w:val="SourceText"/>
+        </w:rPr>
+        <w:t>--price</w:t>
+      </w:r>
+      <w:r>
+        <w:rPr/>
+        <w:t xml:space="preserve"> exits 1, since nothing was priced):</w:t>
       </w:r>
     </w:p>
     <w:p>

</xml_diff>

<commit_message>
L-0888: third successor plan - runtime-built trust verbs refused, lock released by rename-then-verify, swap windows documented as residuals
</commit_message>
<xml_diff>
--- a/docs/guides/crew/crew-troubleshooting.docx
+++ b/docs/guides/crew/crew-troubleshooting.docx
@@ -8934,7 +8934,47 @@
       </w:r>
       <w:r>
         <w:rPr/>
-        <w:t xml:space="preserve"> is refused by the scope guard: only a person at a terminal trusts a repo. The hash binds the verify map, not the scripts its rules call. </w:t>
+        <w:t xml:space="preserve"> is refused by the scope guard: only a person at a terminal trusts a repo, and so is a verb or store path a command assembles as it runs (a variable, joined strings, a dynamic import, a call into the module's writers, </w:t>
+      </w:r>
+      <w:r>
+        <w:rPr>
+          <w:rStyle w:val="SourceText"/>
+        </w:rPr>
+        <w:t>CREW_VERIFY_TRUST_FILE</w:t>
+      </w:r>
+      <w:r>
+        <w:rPr/>
+        <w:t xml:space="preserve">, an unset </w:t>
+      </w:r>
+      <w:r>
+        <w:rPr>
+          <w:rStyle w:val="SourceText"/>
+        </w:rPr>
+        <w:t>CLAUDECODE</w:t>
+      </w:r>
+      <w:r>
+        <w:rPr/>
+        <w:t xml:space="preserve">). That guard is a textual tripwire, not a sandbox: the boundary is your OS user. The hash binds the verify map, not the scripts its rules call. Two swap windows are accepted residuals: </w:t>
+      </w:r>
+      <w:r>
+        <w:rPr>
+          <w:rStyle w:val="SourceText"/>
+        </w:rPr>
+        <w:t>--price</w:t>
+      </w:r>
+      <w:r>
+        <w:rPr/>
+        <w:t xml:space="preserve"> opens its map, and </w:t>
+      </w:r>
+      <w:r>
+        <w:rPr>
+          <w:rStyle w:val="SourceText"/>
+        </w:rPr>
+        <w:t>bash</w:t>
+      </w:r>
+      <w:r>
+        <w:rPr/>
+        <w:t xml:space="preserve"> reopens the smoke script, after the trust check, so a process running as you that swaps the file in that interval runs the swapped bytes (you can edit the store too). </w:t>
       </w:r>
       <w:r>
         <w:rPr>

</xml_diff>

<commit_message>
L-0888: fourth successor plan - refuse a repo-authored trust store location, drop testTrustAll from shipped code, name-independent trust verb guard
A project's .claude/settings.json env block reaches Stop hooks (measured,
claude 2.1.304), so CREW_VERIFY_TRUST_FILE, CLAUDE_CONFIG_DIR and HOME are
repo-controllable. verify_trust.py now refuses a relative store or one inside
the repo being checked (UNKNOWN). testTrustAll is gone; the suites take the
gate's trust from a conftest-owned sitecustomize. scope_guard.py refuses a trust
verb handed to a script read from stdin, copied, or named by a wildcard.
</commit_message>
<xml_diff>
--- a/docs/guides/crew/crew-troubleshooting.docx
+++ b/docs/guides/crew/crew-troubleshooting.docx
@@ -8954,7 +8954,7 @@
       </w:r>
       <w:r>
         <w:rPr/>
-        <w:t xml:space="preserve">). That guard is a textual tripwire, not a sandbox: the boundary is your OS user. The hash binds the verify map, not the scripts its rules call. Two swap windows are accepted residuals: </w:t>
+        <w:t xml:space="preserve">), and a trust verb handed to a script by any name (read from stdin, a copy under another name, a wildcard path). That guard is a textual tripwire, not a sandbox: the boundary is your OS user. The hash binds the verify map, not the scripts its rules call. Two swap windows are accepted residuals: </w:t>
       </w:r>
       <w:r>
         <w:rPr>
@@ -8984,7 +8984,67 @@
       </w:r>
       <w:r>
         <w:rPr/>
-        <w:t xml:space="preserve"> is exempt.</w:t>
+        <w:t xml:space="preserve"> is exempt. A project's </w:t>
+      </w:r>
+      <w:r>
+        <w:rPr>
+          <w:rStyle w:val="SourceText"/>
+        </w:rPr>
+        <w:t>.claude/settings.json</w:t>
+      </w:r>
+      <w:r>
+        <w:rPr/>
+        <w:t xml:space="preserve"> </w:t>
+      </w:r>
+      <w:r>
+        <w:rPr>
+          <w:rStyle w:val="SourceText"/>
+        </w:rPr>
+        <w:t>env</w:t>
+      </w:r>
+      <w:r>
+        <w:rPr/>
+        <w:t xml:space="preserve"> block reaches hook processes (measured 2026-10-25, claude 2.1.304), so a store location that is relative, or resolves inside the repo being checked (</w:t>
+      </w:r>
+      <w:r>
+        <w:rPr>
+          <w:rStyle w:val="SourceText"/>
+        </w:rPr>
+        <w:t>CREW_VERIFY_TRUST_FILE</w:t>
+      </w:r>
+      <w:r>
+        <w:rPr/>
+        <w:t xml:space="preserve">, </w:t>
+      </w:r>
+      <w:r>
+        <w:rPr>
+          <w:rStyle w:val="SourceText"/>
+        </w:rPr>
+        <w:t>CLAUDE_CONFIG_DIR</w:t>
+      </w:r>
+      <w:r>
+        <w:rPr/>
+        <w:t xml:space="preserve">, </w:t>
+      </w:r>
+      <w:r>
+        <w:rPr>
+          <w:rStyle w:val="SourceText"/>
+        </w:rPr>
+        <w:t>HOME</w:t>
+      </w:r>
+      <w:r>
+        <w:rPr/>
+        <w:t xml:space="preserve">), is refused as UNKNOWN and trusts nothing; the old </w:t>
+      </w:r>
+      <w:r>
+        <w:rPr>
+          <w:rStyle w:val="SourceText"/>
+        </w:rPr>
+        <w:t>testTrustAll</w:t>
+      </w:r>
+      <w:r>
+        <w:rPr/>
+        <w:t xml:space="preserve"> store flag is gone and no store content trusts a repo without an approval or an allowlisted owner.</w:t>
       </w:r>
     </w:p>
     <w:p>

</xml_diff>

<commit_message>
L-0888: fifth plan docs, BUDGETS count, regenerated config reference and troubleshooting guide, crew 1.2.85 (past main 1.2.83)
</commit_message>
<xml_diff>
--- a/docs/guides/crew/crew-troubleshooting.docx
+++ b/docs/guides/crew/crew-troubleshooting.docx
@@ -8591,7 +8591,7 @@
       </w:r>
       <w:r>
         <w:rPr/>
-        <w:t xml:space="preserve"> (L-0888, crew 1.2.86). </w:t>
+        <w:t xml:space="preserve"> (L-0888, crew 1.2.85). </w:t>
       </w:r>
       <w:r>
         <w:rPr>
@@ -9044,7 +9044,27 @@
       </w:r>
       <w:r>
         <w:rPr/>
-        <w:t xml:space="preserve"> store flag is gone and no store content trusts a repo without an approval or an allowlisted owner.</w:t>
+        <w:t xml:space="preserve"> store flag is gone and no store content trusts a repo without an approval or an allowlisted owner. The trust check runs as </w:t>
+      </w:r>
+      <w:r>
+        <w:rPr>
+          <w:rStyle w:val="SourceText"/>
+        </w:rPr>
+        <w:t>python -E -s</w:t>
+      </w:r>
+      <w:r>
+        <w:rPr/>
+        <w:t xml:space="preserve"> under a scrubbed environment and a fixed PATH, so a </w:t>
+      </w:r>
+      <w:r>
+        <w:rPr>
+          <w:rStyle w:val="SourceText"/>
+        </w:rPr>
+        <w:t>PYTHONPATH</w:t>
+      </w:r>
+      <w:r>
+        <w:rPr/>
+        <w:t xml:space="preserve"> set there cannot answer for it.</w:t>
       </w:r>
     </w:p>
     <w:p>

</xml_diff>